<commit_message>
Intègre les corrections des points 1 à 3 et déplace le point terrains en fin de document
- Points 1 à 3 repris de la version relue : points de vigilance
  complétés (organisation, implication), bilan chiffré des inscriptions,
  remise du calendrier.
- « Programmes, terrains et listes d'élèves » passe du point 4 au
  point 16, l'ordre du jour et le renvoi interne sont renumérotés.

Co-Authored-By: Claude Opus 5 <noreply@anthropic.com>
Claude-Session: https://claude.ai/code/session_01RsDkbcD3KwyPviDTcs72WZ
</commit_message>
<xml_diff>
--- a/Reunion_moniteurs_2026-2027.docx
+++ b/Reunion_moniteurs_2026-2027.docx
@@ -400,7 +400,7 @@
                 <w:sz w:val="21"/>
                 <w:szCs w:val="21"/>
               </w:rPr>
-              <w:t xml:space="preserve">Programmes, terrains et listes d’élèves</w:t>
+              <w:t xml:space="preserve">Balles et matériel : la cagnotte</w:t>
             </w:r>
           </w:p>
         </w:tc>
@@ -459,7 +459,7 @@
                 <w:sz w:val="21"/>
                 <w:szCs w:val="21"/>
               </w:rPr>
-              <w:t xml:space="preserve">Balles et matériel : la cagnotte</w:t>
+              <w:t xml:space="preserve">Vacances et remplacements</w:t>
             </w:r>
           </w:p>
         </w:tc>
@@ -518,7 +518,7 @@
                 <w:sz w:val="21"/>
                 <w:szCs w:val="21"/>
               </w:rPr>
-              <w:t xml:space="preserve">Vacances et remplacements</w:t>
+              <w:t xml:space="preserve">Ponctualité, présences et League Cup</w:t>
             </w:r>
           </w:p>
         </w:tc>
@@ -577,7 +577,7 @@
                 <w:sz w:val="21"/>
                 <w:szCs w:val="21"/>
               </w:rPr>
-              <w:t xml:space="preserve">Ponctualité, présences et League Cup</w:t>
+              <w:t xml:space="preserve">Les règles de base</w:t>
             </w:r>
           </w:p>
         </w:tc>
@@ -636,7 +636,7 @@
                 <w:sz w:val="21"/>
                 <w:szCs w:val="21"/>
               </w:rPr>
-              <w:t xml:space="preserve">Les règles de base</w:t>
+              <w:t xml:space="preserve">Formations</w:t>
             </w:r>
           </w:p>
         </w:tc>
@@ -695,7 +695,7 @@
                 <w:sz w:val="21"/>
                 <w:szCs w:val="21"/>
               </w:rPr>
-              <w:t xml:space="preserve">Formations</w:t>
+              <w:t xml:space="preserve">Tenue vestimentaire et savoir-être</w:t>
             </w:r>
           </w:p>
         </w:tc>
@@ -754,7 +754,7 @@
                 <w:sz w:val="21"/>
                 <w:szCs w:val="21"/>
               </w:rPr>
-              <w:t xml:space="preserve">Tenue vestimentaire et savoir-être</w:t>
+              <w:t xml:space="preserve">Esprit d’équipe</w:t>
             </w:r>
           </w:p>
         </w:tc>
@@ -813,7 +813,7 @@
                 <w:sz w:val="21"/>
                 <w:szCs w:val="21"/>
               </w:rPr>
-              <w:t xml:space="preserve">Esprit d’équipe</w:t>
+              <w:t xml:space="preserve">Le kot : ordre et accès</w:t>
             </w:r>
           </w:p>
         </w:tc>
@@ -872,7 +872,7 @@
                 <w:sz w:val="21"/>
                 <w:szCs w:val="21"/>
               </w:rPr>
-              <w:t xml:space="preserve">Le kot : ordre et accès</w:t>
+              <w:t xml:space="preserve">Les cours privés</w:t>
             </w:r>
           </w:p>
         </w:tc>
@@ -931,7 +931,7 @@
                 <w:sz w:val="21"/>
                 <w:szCs w:val="21"/>
               </w:rPr>
-              <w:t xml:space="preserve">Les cours privés</w:t>
+              <w:t xml:space="preserve">Assurances et responsabilité</w:t>
             </w:r>
           </w:p>
         </w:tc>
@@ -990,7 +990,7 @@
                 <w:sz w:val="21"/>
                 <w:szCs w:val="21"/>
               </w:rPr>
-              <w:t xml:space="preserve">Assurances et responsabilité</w:t>
+              <w:t xml:space="preserve">Programme pédagogique</w:t>
             </w:r>
           </w:p>
         </w:tc>
@@ -1049,7 +1049,7 @@
                 <w:sz w:val="21"/>
                 <w:szCs w:val="21"/>
               </w:rPr>
-              <w:t xml:space="preserve">Programme pédagogique</w:t>
+              <w:t xml:space="preserve">Remarques, suggestions, tour de table</w:t>
             </w:r>
           </w:p>
         </w:tc>
@@ -1108,7 +1108,7 @@
                 <w:sz w:val="21"/>
                 <w:szCs w:val="21"/>
               </w:rPr>
-              <w:t xml:space="preserve">Remarques, suggestions, tour de table</w:t>
+              <w:t xml:space="preserve">Programmes, terrains et listes d’élèves</w:t>
             </w:r>
           </w:p>
         </w:tc>
@@ -1178,7 +1178,7 @@
           <w:sz w:val="21"/>
           <w:szCs w:val="21"/>
         </w:rPr>
-        <w:t xml:space="preserve">Les quatre points de vigilance</w:t>
+        <w:t xml:space="preserve">Les points de vigilance</w:t>
       </w:r>
     </w:p>
     <w:p>
@@ -1208,7 +1208,7 @@
           <w:sz w:val="21"/>
           <w:szCs w:val="21"/>
         </w:rPr>
-        <w:t xml:space="preserve">présence active sur le terrain du début à la fin du cours. La sécurité des enfants passe avant tout le reste.</w:t>
+        <w:t xml:space="preserve">présence active sur le terrain du début à la fin des rotations et des cours. La sécurité des enfants passe avant tout le reste.</w:t>
       </w:r>
     </w:p>
     <w:p>
@@ -1268,7 +1268,7 @@
           <w:sz w:val="21"/>
           <w:szCs w:val="21"/>
         </w:rPr>
-        <w:t xml:space="preserve">c’est le point qui revient le plus dans les retours des parents. Voir le point 8.</w:t>
+        <w:t xml:space="preserve">c’est le point qui revient le plus dans les retours des parents. Voir le point 7.</w:t>
       </w:r>
     </w:p>
     <w:p>
@@ -1298,7 +1298,48 @@
           <w:sz w:val="21"/>
           <w:szCs w:val="21"/>
         </w:rPr>
-        <w:t xml:space="preserve">au-delà des heures de cours, la vie du club, les tournois, les événements.</w:t>
+        <w:t xml:space="preserve">montrer une envie, une motivation d’être avec les enfants et de les faire progresser.</w:t>
+      </w:r>
+    </w:p>
+    <w:p>
+      <w:pPr>
+        <w:pStyle w:val="ListParagraph"/>
+        <w:numPr>
+          <w:ilvl w:val="0"/>
+          <w:numId w:val="2"/>
+        </w:numPr>
+        <w:spacing w:after="60" w:line="264"/>
+      </w:pPr>
+      <w:r>
+        <w:rPr>
+          <w:rFonts w:ascii="Calibri" w:cs="Calibri" w:eastAsia="Calibri" w:hAnsi="Calibri"/>
+          <w:b/>
+          <w:bCs/>
+          <w:color w:val="2E2E2E"/>
+          <w:sz w:val="21"/>
+          <w:szCs w:val="21"/>
+        </w:rPr>
+        <w:t xml:space="preserve">Organisation : </w:t>
+      </w:r>
+      <w:r>
+        <w:rPr>
+          <w:rFonts w:ascii="Calibri" w:cs="Calibri" w:eastAsia="Calibri" w:hAnsi="Calibri"/>
+          <w:color w:val="2E2E2E"/>
+          <w:sz w:val="21"/>
+          <w:szCs w:val="21"/>
+        </w:rPr>
+        <w:t xml:space="preserve">un document vous sera remis avant le début de chaque stage. </w:t>
+      </w:r>
+      <w:r>
+        <w:rPr>
+          <w:rFonts w:ascii="Calibri" w:cs="Calibri" w:eastAsia="Calibri" w:hAnsi="Calibri"/>
+          <w:b/>
+          <w:bCs/>
+          <w:color w:val="2E2E2E"/>
+          <w:sz w:val="21"/>
+          <w:szCs w:val="21"/>
+        </w:rPr>
+        <w:t xml:space="preserve">Obligation de le relire chaque semaine !</w:t>
       </w:r>
     </w:p>
     <w:p>
@@ -1330,13 +1371,11 @@
       <w:r>
         <w:rPr>
           <w:rFonts w:ascii="Calibri" w:cs="Calibri" w:eastAsia="Calibri" w:hAnsi="Calibri"/>
-          <w:i/>
-          <w:iCs/>
-          <w:color w:val="6E6E6E"/>
-          <w:sz w:val="20"/>
-          <w:szCs w:val="20"/>
-        </w:rPr>
-        <w:t xml:space="preserve">À compléter : les réussites de la saison (résultats, stages complets, retours positifs des parents)</w:t>
+          <w:color w:val="2E2E2E"/>
+          <w:sz w:val="21"/>
+          <w:szCs w:val="21"/>
+        </w:rPr>
+        <w:t xml:space="preserve">Bonne affluence, et de bons retours des parents en général.</w:t>
       </w:r>
     </w:p>
     <w:p>
@@ -1368,13 +1407,22 @@
       <w:r>
         <w:rPr>
           <w:rFonts w:ascii="Calibri" w:cs="Calibri" w:eastAsia="Calibri" w:hAnsi="Calibri"/>
-          <w:i/>
-          <w:iCs/>
-          <w:color w:val="6E6E6E"/>
-          <w:sz w:val="20"/>
-          <w:szCs w:val="20"/>
-        </w:rPr>
-        <w:t xml:space="preserve">À compléter : les situations concrètes rencontrées l’an dernier, pour en discuter ensemble</w:t>
+          <w:color w:val="2E2E2E"/>
+          <w:sz w:val="21"/>
+          <w:szCs w:val="21"/>
+        </w:rPr>
+        <w:t xml:space="preserve">La semaine qui a suivi mon retour de vacances a été la pire de toute l’année. </w:t>
+      </w:r>
+      <w:r>
+        <w:rPr>
+          <w:rFonts w:ascii="Calibri" w:cs="Calibri" w:eastAsia="Calibri" w:hAnsi="Calibri"/>
+          <w:b/>
+          <w:bCs/>
+          <w:color w:val="2E2E2E"/>
+          <w:sz w:val="21"/>
+          <w:szCs w:val="21"/>
+        </w:rPr>
+        <w:t xml:space="preserve">Pour quelle raison ? Un relâchement pendant mon absence ? Vos suggestions ?</w:t>
       </w:r>
     </w:p>
     <w:p>
@@ -1420,55 +1468,51 @@
       <w:r>
         <w:rPr>
           <w:rFonts w:ascii="Calibri" w:cs="Calibri" w:eastAsia="Calibri" w:hAnsi="Calibri"/>
-          <w:i/>
-          <w:iCs/>
-          <w:color w:val="6E6E6E"/>
-          <w:sz w:val="20"/>
-          <w:szCs w:val="20"/>
-        </w:rPr>
-        <w:t xml:space="preserve">À compléter : nombre d’inscrits et évolution par rapport à la saison dernière</w:t>
-      </w:r>
-    </w:p>
-    <w:p>
-      <w:pPr>
-        <w:pStyle w:val="ListParagraph"/>
-        <w:numPr>
-          <w:ilvl w:val="0"/>
-          <w:numId w:val="2"/>
-        </w:numPr>
-        <w:spacing w:after="60" w:line="264"/>
-      </w:pPr>
-      <w:r>
-        <w:rPr>
-          <w:rFonts w:ascii="Calibri" w:cs="Calibri" w:eastAsia="Calibri" w:hAnsi="Calibri"/>
-          <w:i/>
-          <w:iCs/>
-          <w:color w:val="6E6E6E"/>
-          <w:sz w:val="20"/>
-          <w:szCs w:val="20"/>
-        </w:rPr>
-        <w:t xml:space="preserve">À compléter : répartition par groupe, par niveau et par jour</w:t>
-      </w:r>
-    </w:p>
-    <w:p>
-      <w:pPr>
-        <w:pStyle w:val="ListParagraph"/>
-        <w:numPr>
-          <w:ilvl w:val="0"/>
-          <w:numId w:val="2"/>
-        </w:numPr>
-        <w:spacing w:after="60" w:line="264"/>
-      </w:pPr>
-      <w:r>
-        <w:rPr>
-          <w:rFonts w:ascii="Calibri" w:cs="Calibri" w:eastAsia="Calibri" w:hAnsi="Calibri"/>
-          <w:i/>
-          <w:iCs/>
-          <w:color w:val="6E6E6E"/>
-          <w:sz w:val="20"/>
-          <w:szCs w:val="20"/>
-        </w:rPr>
-        <w:t xml:space="preserve">À compléter : groupes complets, places restantes, listes d’attente</w:t>
+          <w:color w:val="2E2E2E"/>
+          <w:sz w:val="21"/>
+          <w:szCs w:val="21"/>
+        </w:rPr>
+        <w:t xml:space="preserve">Nombre d’inscrits constant, avec un taux de réinscription supérieur à 80 %.</w:t>
+      </w:r>
+    </w:p>
+    <w:p>
+      <w:pPr>
+        <w:pStyle w:val="ListParagraph"/>
+        <w:numPr>
+          <w:ilvl w:val="0"/>
+          <w:numId w:val="2"/>
+        </w:numPr>
+        <w:spacing w:after="60" w:line="264"/>
+      </w:pPr>
+      <w:r>
+        <w:rPr>
+          <w:rFonts w:ascii="Calibri" w:cs="Calibri" w:eastAsia="Calibri" w:hAnsi="Calibri"/>
+          <w:color w:val="2E2E2E"/>
+          <w:sz w:val="21"/>
+          <w:szCs w:val="21"/>
+        </w:rPr>
+        <w:t xml:space="preserve">Comme chaque année, j’ai essayé de constituer les groupes les plus homogènes possibles. Il faudra voir si des changements s’imposent après le premier cours.</w:t>
+      </w:r>
+    </w:p>
+    <w:p>
+      <w:pPr>
+        <w:pStyle w:val="ListParagraph"/>
+        <w:numPr>
+          <w:ilvl w:val="0"/>
+          <w:numId w:val="2"/>
+        </w:numPr>
+        <w:spacing w:after="60" w:line="264"/>
+      </w:pPr>
+      <w:r>
+        <w:rPr>
+          <w:rFonts w:ascii="Calibri" w:cs="Calibri" w:eastAsia="Calibri" w:hAnsi="Calibri"/>
+          <w:b/>
+          <w:bCs/>
+          <w:color w:val="C0392B"/>
+          <w:sz w:val="21"/>
+          <w:szCs w:val="21"/>
+        </w:rPr>
+        <w:t xml:space="preserve">N’attendez pas des semaines avant de me prévenir qu’il y a des soucis dans un groupe !</w:t>
       </w:r>
     </w:p>
     <w:p>
@@ -1528,55 +1572,11 @@
       <w:r>
         <w:rPr>
           <w:rFonts w:ascii="Calibri" w:cs="Calibri" w:eastAsia="Calibri" w:hAnsi="Calibri"/>
-          <w:i/>
-          <w:iCs/>
-          <w:color w:val="6E6E6E"/>
-          <w:sz w:val="20"/>
-          <w:szCs w:val="20"/>
-        </w:rPr>
-        <w:t xml:space="preserve">À compléter : date de début des cours</w:t>
-      </w:r>
-    </w:p>
-    <w:p>
-      <w:pPr>
-        <w:pStyle w:val="ListParagraph"/>
-        <w:numPr>
-          <w:ilvl w:val="0"/>
-          <w:numId w:val="2"/>
-        </w:numPr>
-        <w:spacing w:after="60" w:line="264"/>
-      </w:pPr>
-      <w:r>
-        <w:rPr>
-          <w:rFonts w:ascii="Calibri" w:cs="Calibri" w:eastAsia="Calibri" w:hAnsi="Calibri"/>
-          <w:i/>
-          <w:iCs/>
-          <w:color w:val="6E6E6E"/>
-          <w:sz w:val="20"/>
-          <w:szCs w:val="20"/>
-        </w:rPr>
-        <w:t xml:space="preserve">À compléter : congés : Toussaint, Noël, Carnaval, Pâques</w:t>
-      </w:r>
-    </w:p>
-    <w:p>
-      <w:pPr>
-        <w:pStyle w:val="ListParagraph"/>
-        <w:numPr>
-          <w:ilvl w:val="0"/>
-          <w:numId w:val="2"/>
-        </w:numPr>
-        <w:spacing w:after="60" w:line="264"/>
-      </w:pPr>
-      <w:r>
-        <w:rPr>
-          <w:rFonts w:ascii="Calibri" w:cs="Calibri" w:eastAsia="Calibri" w:hAnsi="Calibri"/>
-          <w:i/>
-          <w:iCs/>
-          <w:color w:val="6E6E6E"/>
-          <w:sz w:val="20"/>
-          <w:szCs w:val="20"/>
-        </w:rPr>
-        <w:t xml:space="preserve">À compléter : date de fin de saison, tournoi interne et fête de clôture</w:t>
+          <w:color w:val="2E2E2E"/>
+          <w:sz w:val="21"/>
+          <w:szCs w:val="21"/>
+        </w:rPr>
+        <w:t xml:space="preserve">Remise du calendrier à chacun.</w:t>
       </w:r>
     </w:p>
     <w:p>
@@ -1597,205 +1597,6 @@
           <w:szCs w:val="26"/>
         </w:rPr>
         <w:t xml:space="preserve">4. </w:t>
-      </w:r>
-      <w:r>
-        <w:rPr>
-          <w:rFonts w:ascii="Calibri" w:cs="Calibri" w:eastAsia="Calibri" w:hAnsi="Calibri"/>
-          <w:b/>
-          <w:bCs/>
-          <w:color w:val="C0392B"/>
-          <w:sz w:val="26"/>
-          <w:szCs w:val="26"/>
-        </w:rPr>
-        <w:t xml:space="preserve">Programmes, terrains et listes d’élèves</w:t>
-      </w:r>
-    </w:p>
-    <w:tbl>
-      <w:tblPr>
-        <w:tblW w:type="dxa" w:w="9637"/>
-        <w:tblBorders>
-          <w:top w:val="single" w:color="8A9E28" w:sz="6"/>
-          <w:left w:val="single" w:color="C0392B" w:sz="24"/>
-          <w:bottom w:val="single" w:color="8A9E28" w:sz="6"/>
-          <w:right w:val="single" w:color="8A9E28" w:sz="6"/>
-          <w:insideH w:val="none" w:color="FFFFFF" w:sz="0"/>
-          <w:insideV w:val="none" w:color="FFFFFF" w:sz="0"/>
-        </w:tblBorders>
-      </w:tblPr>
-      <w:tblGrid>
-        <w:gridCol w:w="9637"/>
-      </w:tblGrid>
-      <w:tr>
-        <w:tc>
-          <w:tcPr>
-            <w:tcW w:type="dxa" w:w="9637"/>
-            <w:shd w:fill="F4F6EA" w:color="auto" w:val="clear"/>
-            <w:tcMar>
-              <w:top w:type="dxa" w:w="170"/>
-              <w:left w:type="dxa" w:w="226"/>
-              <w:bottom w:type="dxa" w:w="170"/>
-              <w:right w:type="dxa" w:w="226"/>
-            </w:tcMar>
-          </w:tcPr>
-          <w:p>
-            <w:pPr>
-              <w:spacing w:after="80" w:before="0" w:line="276"/>
-            </w:pPr>
-            <w:r>
-              <w:rPr>
-                <w:rFonts w:ascii="Calibri" w:cs="Calibri" w:eastAsia="Calibri" w:hAnsi="Calibri"/>
-                <w:b/>
-                <w:bCs/>
-                <w:color w:val="C0392B"/>
-                <w:sz w:val="22"/>
-                <w:szCs w:val="22"/>
-              </w:rPr>
-              <w:t xml:space="preserve">ATTENTION – LES TERRAINS ONT CHANGÉ.</w:t>
-            </w:r>
-          </w:p>
-          <w:p>
-            <w:pPr>
-              <w:spacing w:after="80" w:before="0" w:line="276"/>
-            </w:pPr>
-            <w:r>
-              <w:rPr>
-                <w:rFonts w:ascii="Calibri" w:cs="Calibri" w:eastAsia="Calibri" w:hAnsi="Calibri"/>
-                <w:color w:val="2E2E2E"/>
-                <w:sz w:val="21"/>
-                <w:szCs w:val="21"/>
-              </w:rPr>
-              <w:t xml:space="preserve">Vérifiez votre affectation avant chaque cours : ce n’est plus celle de l’an dernier.</w:t>
-            </w:r>
-          </w:p>
-          <w:p>
-            <w:pPr>
-              <w:spacing w:after="0" w:before="0" w:line="276"/>
-            </w:pPr>
-            <w:r>
-              <w:rPr>
-                <w:rFonts w:ascii="Calibri" w:cs="Calibri" w:eastAsia="Calibri" w:hAnsi="Calibri"/>
-                <w:b/>
-                <w:bCs/>
-                <w:color w:val="2E2E2E"/>
-                <w:sz w:val="21"/>
-                <w:szCs w:val="21"/>
-              </w:rPr>
-              <w:t xml:space="preserve">N’utilisez QUE la dernière version du programme que je vous envoie.</w:t>
-            </w:r>
-          </w:p>
-        </w:tc>
-      </w:tr>
-    </w:tbl>
-    <w:p>
-      <w:pPr>
-        <w:spacing w:after="120" w:before="0" w:line="276"/>
-      </w:pPr>
-      <w:r>
-        <w:rPr>
-          <w:rFonts w:ascii="Calibri" w:cs="Calibri" w:eastAsia="Calibri" w:hAnsi="Calibri"/>
-          <w:color w:val="2E2E2E"/>
-          <w:sz w:val="21"/>
-          <w:szCs w:val="21"/>
-        </w:rPr>
-        <w:t xml:space="preserve"/>
-      </w:r>
-    </w:p>
-    <w:p>
-      <w:pPr>
-        <w:pStyle w:val="ListParagraph"/>
-        <w:numPr>
-          <w:ilvl w:val="0"/>
-          <w:numId w:val="2"/>
-        </w:numPr>
-        <w:spacing w:after="60" w:line="264"/>
-      </w:pPr>
-      <w:r>
-        <w:rPr>
-          <w:rFonts w:ascii="Calibri" w:cs="Calibri" w:eastAsia="Calibri" w:hAnsi="Calibri"/>
-          <w:color w:val="2E2E2E"/>
-          <w:sz w:val="21"/>
-          <w:szCs w:val="21"/>
-        </w:rPr>
-        <w:t xml:space="preserve">Les listes d’élèves peuvent encore bouger jusqu’au dernier moment : arrivées, départs, changements de groupe.</w:t>
-      </w:r>
-    </w:p>
-    <w:p>
-      <w:pPr>
-        <w:pStyle w:val="ListParagraph"/>
-        <w:numPr>
-          <w:ilvl w:val="0"/>
-          <w:numId w:val="2"/>
-        </w:numPr>
-        <w:spacing w:after="60" w:line="264"/>
-      </w:pPr>
-      <w:r>
-        <w:rPr>
-          <w:rFonts w:ascii="Calibri" w:cs="Calibri" w:eastAsia="Calibri" w:hAnsi="Calibri"/>
-          <w:color w:val="2E2E2E"/>
-          <w:sz w:val="21"/>
-          <w:szCs w:val="21"/>
-        </w:rPr>
-        <w:t xml:space="preserve">Une mise à jour est envoyée chaque matin, avant le début des cours.</w:t>
-      </w:r>
-    </w:p>
-    <w:p>
-      <w:pPr>
-        <w:pStyle w:val="ListParagraph"/>
-        <w:numPr>
-          <w:ilvl w:val="0"/>
-          <w:numId w:val="2"/>
-        </w:numPr>
-        <w:spacing w:after="60" w:line="264"/>
-      </w:pPr>
-      <w:r>
-        <w:rPr>
-          <w:rFonts w:ascii="Calibri" w:cs="Calibri" w:eastAsia="Calibri" w:hAnsi="Calibri"/>
-          <w:color w:val="2E2E2E"/>
-          <w:sz w:val="21"/>
-          <w:szCs w:val="21"/>
-        </w:rPr>
-        <w:t xml:space="preserve">Une ancienne version = un élève qui attend sur le mauvais terrain. Supprimez les anciennes.</w:t>
-      </w:r>
-    </w:p>
-    <w:p>
-      <w:pPr>
-        <w:pStyle w:val="ListParagraph"/>
-        <w:numPr>
-          <w:ilvl w:val="0"/>
-          <w:numId w:val="2"/>
-        </w:numPr>
-        <w:spacing w:after="60" w:line="264"/>
-      </w:pPr>
-      <w:r>
-        <w:rPr>
-          <w:rFonts w:ascii="Calibri" w:cs="Calibri" w:eastAsia="Calibri" w:hAnsi="Calibri"/>
-          <w:i/>
-          <w:iCs/>
-          <w:color w:val="6E6E6E"/>
-          <w:sz w:val="20"/>
-          <w:szCs w:val="20"/>
-        </w:rPr>
-        <w:t xml:space="preserve">À compléter : préciser le canal d’envoi des mises à jour (e-mail, WhatsApp, autre)</w:t>
-      </w:r>
-    </w:p>
-    <w:p>
-      <w:pPr>
-        <w:keepNext/>
-        <w:pBdr>
-          <w:bottom w:val="single" w:color="8A9E28" w:sz="8" w:space="4"/>
-        </w:pBdr>
-        <w:spacing w:after="140" w:before="320"/>
-      </w:pPr>
-      <w:r>
-        <w:rPr>
-          <w:rFonts w:ascii="Calibri" w:cs="Calibri" w:eastAsia="Calibri" w:hAnsi="Calibri"/>
-          <w:b/>
-          <w:bCs/>
-          <w:color w:val="8A9E28"/>
-          <w:sz w:val="26"/>
-          <w:szCs w:val="26"/>
-        </w:rPr>
-        <w:t xml:space="preserve">5. </w:t>
       </w:r>
       <w:r>
         <w:rPr>
@@ -2168,7 +1969,7 @@
           <w:sz w:val="26"/>
           <w:szCs w:val="26"/>
         </w:rPr>
-        <w:t xml:space="preserve">6. </w:t>
+        <w:t xml:space="preserve">5. </w:t>
       </w:r>
       <w:r>
         <w:rPr>
@@ -2296,7 +2097,7 @@
           <w:sz w:val="26"/>
           <w:szCs w:val="26"/>
         </w:rPr>
-        <w:t xml:space="preserve">7. </w:t>
+        <w:t xml:space="preserve">6. </w:t>
       </w:r>
       <w:r>
         <w:rPr>
@@ -2437,7 +2238,7 @@
           <w:sz w:val="26"/>
           <w:szCs w:val="26"/>
         </w:rPr>
-        <w:t xml:space="preserve">8. </w:t>
+        <w:t xml:space="preserve">7. </w:t>
       </w:r>
       <w:r>
         <w:rPr>
@@ -2630,7 +2431,7 @@
           <w:sz w:val="26"/>
           <w:szCs w:val="26"/>
         </w:rPr>
-        <w:t xml:space="preserve">9. </w:t>
+        <w:t xml:space="preserve">8. </w:t>
       </w:r>
       <w:r>
         <w:rPr>
@@ -2764,7 +2565,7 @@
           <w:sz w:val="26"/>
           <w:szCs w:val="26"/>
         </w:rPr>
-        <w:t xml:space="preserve">10. </w:t>
+        <w:t xml:space="preserve">9. </w:t>
       </w:r>
       <w:r>
         <w:rPr>
@@ -2960,7 +2761,7 @@
           <w:sz w:val="26"/>
           <w:szCs w:val="26"/>
         </w:rPr>
-        <w:t xml:space="preserve">11. </w:t>
+        <w:t xml:space="preserve">10. </w:t>
       </w:r>
       <w:r>
         <w:rPr>
@@ -3069,7 +2870,7 @@
           <w:sz w:val="26"/>
           <w:szCs w:val="26"/>
         </w:rPr>
-        <w:t xml:space="preserve">12. </w:t>
+        <w:t xml:space="preserve">11. </w:t>
       </w:r>
       <w:r>
         <w:rPr>
@@ -3178,7 +2979,7 @@
           <w:sz w:val="26"/>
           <w:szCs w:val="26"/>
         </w:rPr>
-        <w:t xml:space="preserve">13. </w:t>
+        <w:t xml:space="preserve">12. </w:t>
       </w:r>
       <w:r>
         <w:rPr>
@@ -3331,7 +3132,7 @@
           <w:sz w:val="26"/>
           <w:szCs w:val="26"/>
         </w:rPr>
-        <w:t xml:space="preserve">14. </w:t>
+        <w:t xml:space="preserve">13. </w:t>
       </w:r>
       <w:r>
         <w:rPr>
@@ -3488,7 +3289,7 @@
           <w:sz w:val="26"/>
           <w:szCs w:val="26"/>
         </w:rPr>
-        <w:t xml:space="preserve">15. </w:t>
+        <w:t xml:space="preserve">14. </w:t>
       </w:r>
       <w:r>
         <w:rPr>
@@ -3554,7 +3355,7 @@
           <w:sz w:val="26"/>
           <w:szCs w:val="26"/>
         </w:rPr>
-        <w:t xml:space="preserve">16. </w:t>
+        <w:t xml:space="preserve">15. </w:t>
       </w:r>
       <w:r>
         <w:rPr>
@@ -3580,6 +3381,205 @@
           <w:szCs w:val="21"/>
         </w:rPr>
         <w:t xml:space="preserve">La parole est à vous. Questions, propositions, difficultés rencontrées l’an dernier : c’est le moment.</w:t>
+      </w:r>
+    </w:p>
+    <w:p>
+      <w:pPr>
+        <w:keepNext/>
+        <w:pBdr>
+          <w:bottom w:val="single" w:color="8A9E28" w:sz="8" w:space="4"/>
+        </w:pBdr>
+        <w:spacing w:after="140" w:before="320"/>
+      </w:pPr>
+      <w:r>
+        <w:rPr>
+          <w:rFonts w:ascii="Calibri" w:cs="Calibri" w:eastAsia="Calibri" w:hAnsi="Calibri"/>
+          <w:b/>
+          <w:bCs/>
+          <w:color w:val="8A9E28"/>
+          <w:sz w:val="26"/>
+          <w:szCs w:val="26"/>
+        </w:rPr>
+        <w:t xml:space="preserve">16. </w:t>
+      </w:r>
+      <w:r>
+        <w:rPr>
+          <w:rFonts w:ascii="Calibri" w:cs="Calibri" w:eastAsia="Calibri" w:hAnsi="Calibri"/>
+          <w:b/>
+          <w:bCs/>
+          <w:color w:val="C0392B"/>
+          <w:sz w:val="26"/>
+          <w:szCs w:val="26"/>
+        </w:rPr>
+        <w:t xml:space="preserve">Programmes, terrains et listes d’élèves</w:t>
+      </w:r>
+    </w:p>
+    <w:tbl>
+      <w:tblPr>
+        <w:tblW w:type="dxa" w:w="9637"/>
+        <w:tblBorders>
+          <w:top w:val="single" w:color="8A9E28" w:sz="6"/>
+          <w:left w:val="single" w:color="C0392B" w:sz="24"/>
+          <w:bottom w:val="single" w:color="8A9E28" w:sz="6"/>
+          <w:right w:val="single" w:color="8A9E28" w:sz="6"/>
+          <w:insideH w:val="none" w:color="FFFFFF" w:sz="0"/>
+          <w:insideV w:val="none" w:color="FFFFFF" w:sz="0"/>
+        </w:tblBorders>
+      </w:tblPr>
+      <w:tblGrid>
+        <w:gridCol w:w="9637"/>
+      </w:tblGrid>
+      <w:tr>
+        <w:tc>
+          <w:tcPr>
+            <w:tcW w:type="dxa" w:w="9637"/>
+            <w:shd w:fill="F4F6EA" w:color="auto" w:val="clear"/>
+            <w:tcMar>
+              <w:top w:type="dxa" w:w="170"/>
+              <w:left w:type="dxa" w:w="226"/>
+              <w:bottom w:type="dxa" w:w="170"/>
+              <w:right w:type="dxa" w:w="226"/>
+            </w:tcMar>
+          </w:tcPr>
+          <w:p>
+            <w:pPr>
+              <w:spacing w:after="80" w:before="0" w:line="276"/>
+            </w:pPr>
+            <w:r>
+              <w:rPr>
+                <w:rFonts w:ascii="Calibri" w:cs="Calibri" w:eastAsia="Calibri" w:hAnsi="Calibri"/>
+                <w:b/>
+                <w:bCs/>
+                <w:color w:val="C0392B"/>
+                <w:sz w:val="22"/>
+                <w:szCs w:val="22"/>
+              </w:rPr>
+              <w:t xml:space="preserve">ATTENTION – LES TERRAINS ONT CHANGÉ.</w:t>
+            </w:r>
+          </w:p>
+          <w:p>
+            <w:pPr>
+              <w:spacing w:after="80" w:before="0" w:line="276"/>
+            </w:pPr>
+            <w:r>
+              <w:rPr>
+                <w:rFonts w:ascii="Calibri" w:cs="Calibri" w:eastAsia="Calibri" w:hAnsi="Calibri"/>
+                <w:color w:val="2E2E2E"/>
+                <w:sz w:val="21"/>
+                <w:szCs w:val="21"/>
+              </w:rPr>
+              <w:t xml:space="preserve">Vérifiez votre affectation avant chaque cours : ce n’est plus celle de l’an dernier.</w:t>
+            </w:r>
+          </w:p>
+          <w:p>
+            <w:pPr>
+              <w:spacing w:after="0" w:before="0" w:line="276"/>
+            </w:pPr>
+            <w:r>
+              <w:rPr>
+                <w:rFonts w:ascii="Calibri" w:cs="Calibri" w:eastAsia="Calibri" w:hAnsi="Calibri"/>
+                <w:b/>
+                <w:bCs/>
+                <w:color w:val="2E2E2E"/>
+                <w:sz w:val="21"/>
+                <w:szCs w:val="21"/>
+              </w:rPr>
+              <w:t xml:space="preserve">N’utilisez QUE la dernière version du programme que je vous envoie.</w:t>
+            </w:r>
+          </w:p>
+        </w:tc>
+      </w:tr>
+    </w:tbl>
+    <w:p>
+      <w:pPr>
+        <w:spacing w:after="120" w:before="0" w:line="276"/>
+      </w:pPr>
+      <w:r>
+        <w:rPr>
+          <w:rFonts w:ascii="Calibri" w:cs="Calibri" w:eastAsia="Calibri" w:hAnsi="Calibri"/>
+          <w:color w:val="2E2E2E"/>
+          <w:sz w:val="21"/>
+          <w:szCs w:val="21"/>
+        </w:rPr>
+        <w:t xml:space="preserve"/>
+      </w:r>
+    </w:p>
+    <w:p>
+      <w:pPr>
+        <w:pStyle w:val="ListParagraph"/>
+        <w:numPr>
+          <w:ilvl w:val="0"/>
+          <w:numId w:val="2"/>
+        </w:numPr>
+        <w:spacing w:after="60" w:line="264"/>
+      </w:pPr>
+      <w:r>
+        <w:rPr>
+          <w:rFonts w:ascii="Calibri" w:cs="Calibri" w:eastAsia="Calibri" w:hAnsi="Calibri"/>
+          <w:color w:val="2E2E2E"/>
+          <w:sz w:val="21"/>
+          <w:szCs w:val="21"/>
+        </w:rPr>
+        <w:t xml:space="preserve">Les listes d’élèves peuvent encore bouger jusqu’au dernier moment : arrivées, départs, changements de groupe.</w:t>
+      </w:r>
+    </w:p>
+    <w:p>
+      <w:pPr>
+        <w:pStyle w:val="ListParagraph"/>
+        <w:numPr>
+          <w:ilvl w:val="0"/>
+          <w:numId w:val="2"/>
+        </w:numPr>
+        <w:spacing w:after="60" w:line="264"/>
+      </w:pPr>
+      <w:r>
+        <w:rPr>
+          <w:rFonts w:ascii="Calibri" w:cs="Calibri" w:eastAsia="Calibri" w:hAnsi="Calibri"/>
+          <w:color w:val="2E2E2E"/>
+          <w:sz w:val="21"/>
+          <w:szCs w:val="21"/>
+        </w:rPr>
+        <w:t xml:space="preserve">Une mise à jour est envoyée chaque matin, avant le début des cours.</w:t>
+      </w:r>
+    </w:p>
+    <w:p>
+      <w:pPr>
+        <w:pStyle w:val="ListParagraph"/>
+        <w:numPr>
+          <w:ilvl w:val="0"/>
+          <w:numId w:val="2"/>
+        </w:numPr>
+        <w:spacing w:after="60" w:line="264"/>
+      </w:pPr>
+      <w:r>
+        <w:rPr>
+          <w:rFonts w:ascii="Calibri" w:cs="Calibri" w:eastAsia="Calibri" w:hAnsi="Calibri"/>
+          <w:color w:val="2E2E2E"/>
+          <w:sz w:val="21"/>
+          <w:szCs w:val="21"/>
+        </w:rPr>
+        <w:t xml:space="preserve">Une ancienne version = un élève qui attend sur le mauvais terrain. Supprimez les anciennes.</w:t>
+      </w:r>
+    </w:p>
+    <w:p>
+      <w:pPr>
+        <w:pStyle w:val="ListParagraph"/>
+        <w:numPr>
+          <w:ilvl w:val="0"/>
+          <w:numId w:val="2"/>
+        </w:numPr>
+        <w:spacing w:after="60" w:line="264"/>
+      </w:pPr>
+      <w:r>
+        <w:rPr>
+          <w:rFonts w:ascii="Calibri" w:cs="Calibri" w:eastAsia="Calibri" w:hAnsi="Calibri"/>
+          <w:i/>
+          <w:iCs/>
+          <w:color w:val="6E6E6E"/>
+          <w:sz w:val="20"/>
+          <w:szCs w:val="20"/>
+        </w:rPr>
+        <w:t xml:space="preserve">À compléter : préciser le canal d’envoi des mises à jour (e-mail, WhatsApp, autre)</w:t>
       </w:r>
     </w:p>
     <w:p>

</xml_diff>

<commit_message>
Remplace la cagnotte par le système des paniers personnels
La cagnotte collective est supprimée. Le point 4 décrit le nouveau
fonctionnement : paniers nominatifs de 60 balles pour cinq moniteurs,
balles marquées à l'initiale, deux paniers « A » communs, comptage
toutes les 7 semaines et déduction salariale à prix coûtant. Les balles
rouges, oranges et vertes suivent le même principe au prorata
d'utilisation.

Co-Authored-By: Claude Opus 5 <noreply@anthropic.com>
Claude-Session: https://claude.ai/code/session_01RsDkbcD3KwyPviDTcs72WZ
</commit_message>
<xml_diff>
--- a/Reunion_moniteurs_2026-2027.docx
+++ b/Reunion_moniteurs_2026-2027.docx
@@ -400,7 +400,7 @@
                 <w:sz w:val="21"/>
                 <w:szCs w:val="21"/>
               </w:rPr>
-              <w:t xml:space="preserve">Balles et matériel : la cagnotte</w:t>
+              <w:t xml:space="preserve">Balles et matériel : le nouveau système</w:t>
             </w:r>
           </w:p>
         </w:tc>
@@ -1580,6 +1580,11 @@
       </w:r>
     </w:p>
     <w:p>
+      <w:r>
+        <w:br w:type="page"/>
+      </w:r>
+    </w:p>
+    <w:p>
       <w:pPr>
         <w:keepNext/>
         <w:pBdr>
@@ -1607,7 +1612,7 @@
           <w:sz w:val="26"/>
           <w:szCs w:val="26"/>
         </w:rPr>
-        <w:t xml:space="preserve">Balles et matériel : la cagnotte</w:t>
+        <w:t xml:space="preserve">Balles et matériel : le nouveau système</w:t>
       </w:r>
     </w:p>
     <w:p>
@@ -1621,7 +1626,24 @@
           <w:sz w:val="21"/>
           <w:szCs w:val="21"/>
         </w:rPr>
-        <w:t xml:space="preserve">Le système mis en place l’an dernier est reconduit. Une cagnotte démarre à 2 500 € en début de saison et sert à vous récompenser en fin d’année. Elle diminue à chaque négligence constatée.</w:t>
+        <w:t xml:space="preserve">La cagnotte est supprimée. Elle n’a pas fonctionné : les balles et le matériel traînaient toujours autant sur les terrains. À partir de cette saison, chacun est responsable de ses propres balles, et une balle perdue se paie.</w:t>
+      </w:r>
+    </w:p>
+    <w:p>
+      <w:pPr>
+        <w:keepNext/>
+        <w:spacing w:after="60" w:before="140"/>
+      </w:pPr>
+      <w:r>
+        <w:rPr>
+          <w:rFonts w:ascii="Calibri" w:cs="Calibri" w:eastAsia="Calibri" w:hAnsi="Calibri"/>
+          <w:b/>
+          <w:bCs/>
+          <w:color w:val="8A9E28"/>
+          <w:sz w:val="21"/>
+          <w:szCs w:val="21"/>
+        </w:rPr>
+        <w:t xml:space="preserve">Les paniers</w:t>
       </w:r>
     </w:p>
     <w:tbl>
@@ -1637,8 +1659,9 @@
         </w:tblBorders>
       </w:tblPr>
       <w:tblGrid>
-        <w:gridCol w:w="6803"/>
-        <w:gridCol w:w="2834"/>
+        <w:gridCol w:w="1587"/>
+        <w:gridCol w:w="5669"/>
+        <w:gridCol w:w="2381"/>
       </w:tblGrid>
       <w:tr>
         <w:trPr>
@@ -1646,7 +1669,7 @@
         </w:trPr>
         <w:tc>
           <w:tcPr>
-            <w:tcW w:type="dxa" w:w="6803"/>
+            <w:tcW w:type="dxa" w:w="1587"/>
             <w:shd w:fill="8A9E28" w:color="auto" w:val="clear"/>
             <w:tcMar>
               <w:top w:type="dxa" w:w="113"/>
@@ -1659,6 +1682,7 @@
           <w:p>
             <w:pPr>
               <w:spacing w:after="0" w:before="0" w:line="276"/>
+              <w:jc w:val="center"/>
             </w:pPr>
             <w:r>
               <w:rPr>
@@ -1669,13 +1693,13 @@
                 <w:sz w:val="21"/>
                 <w:szCs w:val="21"/>
               </w:rPr>
-              <w:t xml:space="preserve">Ce qui fait baisser la cagnotte</w:t>
-            </w:r>
-          </w:p>
-        </w:tc>
-        <w:tc>
-          <w:tcPr>
-            <w:tcW w:type="dxa" w:w="2834"/>
+              <w:t xml:space="preserve">Marquage</w:t>
+            </w:r>
+          </w:p>
+        </w:tc>
+        <w:tc>
+          <w:tcPr>
+            <w:tcW w:type="dxa" w:w="5669"/>
             <w:shd w:fill="8A9E28" w:color="auto" w:val="clear"/>
             <w:tcMar>
               <w:top w:type="dxa" w:w="113"/>
@@ -1688,7 +1712,6 @@
           <w:p>
             <w:pPr>
               <w:spacing w:after="0" w:before="0" w:line="276"/>
-              <w:jc w:val="center"/>
             </w:pPr>
             <w:r>
               <w:rPr>
@@ -1699,7 +1722,37 @@
                 <w:sz w:val="21"/>
                 <w:szCs w:val="21"/>
               </w:rPr>
-              <w:t xml:space="preserve">Montant déduit</w:t>
+              <w:t xml:space="preserve">Panier de</w:t>
+            </w:r>
+          </w:p>
+        </w:tc>
+        <w:tc>
+          <w:tcPr>
+            <w:tcW w:type="dxa" w:w="2381"/>
+            <w:shd w:fill="8A9E28" w:color="auto" w:val="clear"/>
+            <w:tcMar>
+              <w:top w:type="dxa" w:w="113"/>
+              <w:left w:type="dxa" w:w="170"/>
+              <w:bottom w:type="dxa" w:w="113"/>
+              <w:right w:type="dxa" w:w="170"/>
+            </w:tcMar>
+            <w:vAlign w:val="center"/>
+          </w:tcPr>
+          <w:p>
+            <w:pPr>
+              <w:spacing w:after="0" w:before="0" w:line="276"/>
+              <w:jc w:val="center"/>
+            </w:pPr>
+            <w:r>
+              <w:rPr>
+                <w:rFonts w:ascii="Calibri" w:cs="Calibri" w:eastAsia="Calibri" w:hAnsi="Calibri"/>
+                <w:b/>
+                <w:bCs/>
+                <w:color w:val="FFFFFF"/>
+                <w:sz w:val="21"/>
+                <w:szCs w:val="21"/>
+              </w:rPr>
+              <w:t xml:space="preserve">Contenu</w:t>
             </w:r>
           </w:p>
         </w:tc>
@@ -1707,34 +1760,7 @@
       <w:tr>
         <w:tc>
           <w:tcPr>
-            <w:tcW w:type="dxa" w:w="6803"/>
-            <w:shd w:fill="FFFFFF" w:color="auto" w:val="clear"/>
-            <w:tcMar>
-              <w:top w:type="dxa" w:w="113"/>
-              <w:left w:type="dxa" w:w="170"/>
-              <w:bottom w:type="dxa" w:w="113"/>
-              <w:right w:type="dxa" w:w="170"/>
-            </w:tcMar>
-            <w:vAlign w:val="center"/>
-          </w:tcPr>
-          <w:p>
-            <w:pPr>
-              <w:spacing w:after="0" w:before="0" w:line="276"/>
-            </w:pPr>
-            <w:r>
-              <w:rPr>
-                <w:rFonts w:ascii="Calibri" w:cs="Calibri" w:eastAsia="Calibri" w:hAnsi="Calibri"/>
-                <w:color w:val="2E2E2E"/>
-                <w:sz w:val="21"/>
-                <w:szCs w:val="21"/>
-              </w:rPr>
-              <w:t xml:space="preserve">Chaque balle retrouvée traînant sur ou autour des terrains</w:t>
-            </w:r>
-          </w:p>
-        </w:tc>
-        <w:tc>
-          <w:tcPr>
-            <w:tcW w:type="dxa" w:w="2834"/>
+            <w:tcW w:type="dxa" w:w="1587"/>
             <w:shd w:fill="FAFAF5" w:color="auto" w:val="clear"/>
             <w:tcMar>
               <w:top w:type="dxa" w:w="113"/>
@@ -1755,10 +1781,65 @@
                 <w:b/>
                 <w:bCs/>
                 <w:color w:val="C0392B"/>
-                <w:sz w:val="21"/>
-                <w:szCs w:val="21"/>
-              </w:rPr>
-              <w:t xml:space="preserve">– 1 €</w:t>
+                <w:sz w:val="24"/>
+                <w:szCs w:val="24"/>
+              </w:rPr>
+              <w:t xml:space="preserve">Y</w:t>
+            </w:r>
+          </w:p>
+        </w:tc>
+        <w:tc>
+          <w:tcPr>
+            <w:tcW w:type="dxa" w:w="5669"/>
+            <w:shd w:fill="FFFFFF" w:color="auto" w:val="clear"/>
+            <w:tcMar>
+              <w:top w:type="dxa" w:w="113"/>
+              <w:left w:type="dxa" w:w="170"/>
+              <w:bottom w:type="dxa" w:w="113"/>
+              <w:right w:type="dxa" w:w="170"/>
+            </w:tcMar>
+            <w:vAlign w:val="center"/>
+          </w:tcPr>
+          <w:p>
+            <w:pPr>
+              <w:spacing w:after="0" w:before="0" w:line="276"/>
+            </w:pPr>
+            <w:r>
+              <w:rPr>
+                <w:rFonts w:ascii="Calibri" w:cs="Calibri" w:eastAsia="Calibri" w:hAnsi="Calibri"/>
+                <w:color w:val="2E2E2E"/>
+                <w:sz w:val="21"/>
+                <w:szCs w:val="21"/>
+              </w:rPr>
+              <w:t xml:space="preserve">Yassine</w:t>
+            </w:r>
+          </w:p>
+        </w:tc>
+        <w:tc>
+          <w:tcPr>
+            <w:tcW w:type="dxa" w:w="2381"/>
+            <w:shd w:fill="FFFFFF" w:color="auto" w:val="clear"/>
+            <w:tcMar>
+              <w:top w:type="dxa" w:w="113"/>
+              <w:left w:type="dxa" w:w="170"/>
+              <w:bottom w:type="dxa" w:w="113"/>
+              <w:right w:type="dxa" w:w="170"/>
+            </w:tcMar>
+            <w:vAlign w:val="center"/>
+          </w:tcPr>
+          <w:p>
+            <w:pPr>
+              <w:spacing w:after="0" w:before="0" w:line="276"/>
+              <w:jc w:val="center"/>
+            </w:pPr>
+            <w:r>
+              <w:rPr>
+                <w:rFonts w:ascii="Calibri" w:cs="Calibri" w:eastAsia="Calibri" w:hAnsi="Calibri"/>
+                <w:color w:val="2E2E2E"/>
+                <w:sz w:val="21"/>
+                <w:szCs w:val="21"/>
+              </w:rPr>
+              <w:t xml:space="preserve">60 balles</w:t>
             </w:r>
           </w:p>
         </w:tc>
@@ -1766,34 +1847,7 @@
       <w:tr>
         <w:tc>
           <w:tcPr>
-            <w:tcW w:type="dxa" w:w="6803"/>
-            <w:shd w:fill="FFFFFF" w:color="auto" w:val="clear"/>
-            <w:tcMar>
-              <w:top w:type="dxa" w:w="113"/>
-              <w:left w:type="dxa" w:w="170"/>
-              <w:bottom w:type="dxa" w:w="113"/>
-              <w:right w:type="dxa" w:w="170"/>
-            </w:tcMar>
-            <w:vAlign w:val="center"/>
-          </w:tcPr>
-          <w:p>
-            <w:pPr>
-              <w:spacing w:after="0" w:before="0" w:line="276"/>
-            </w:pPr>
-            <w:r>
-              <w:rPr>
-                <w:rFonts w:ascii="Calibri" w:cs="Calibri" w:eastAsia="Calibri" w:hAnsi="Calibri"/>
-                <w:color w:val="2E2E2E"/>
-                <w:sz w:val="21"/>
-                <w:szCs w:val="21"/>
-              </w:rPr>
-              <w:t xml:space="preserve">Chaque matériel retrouvé dehors ou non rangé dans le kot</w:t>
-            </w:r>
-          </w:p>
-        </w:tc>
-        <w:tc>
-          <w:tcPr>
-            <w:tcW w:type="dxa" w:w="2834"/>
+            <w:tcW w:type="dxa" w:w="1587"/>
             <w:shd w:fill="FAFAF5" w:color="auto" w:val="clear"/>
             <w:tcMar>
               <w:top w:type="dxa" w:w="113"/>
@@ -1814,10 +1868,65 @@
                 <w:b/>
                 <w:bCs/>
                 <w:color w:val="C0392B"/>
-                <w:sz w:val="21"/>
-                <w:szCs w:val="21"/>
-              </w:rPr>
-              <w:t xml:space="preserve">– 5 €</w:t>
+                <w:sz w:val="24"/>
+                <w:szCs w:val="24"/>
+              </w:rPr>
+              <w:t xml:space="preserve">E</w:t>
+            </w:r>
+          </w:p>
+        </w:tc>
+        <w:tc>
+          <w:tcPr>
+            <w:tcW w:type="dxa" w:w="5669"/>
+            <w:shd w:fill="FFFFFF" w:color="auto" w:val="clear"/>
+            <w:tcMar>
+              <w:top w:type="dxa" w:w="113"/>
+              <w:left w:type="dxa" w:w="170"/>
+              <w:bottom w:type="dxa" w:w="113"/>
+              <w:right w:type="dxa" w:w="170"/>
+            </w:tcMar>
+            <w:vAlign w:val="center"/>
+          </w:tcPr>
+          <w:p>
+            <w:pPr>
+              <w:spacing w:after="0" w:before="0" w:line="276"/>
+            </w:pPr>
+            <w:r>
+              <w:rPr>
+                <w:rFonts w:ascii="Calibri" w:cs="Calibri" w:eastAsia="Calibri" w:hAnsi="Calibri"/>
+                <w:color w:val="2E2E2E"/>
+                <w:sz w:val="21"/>
+                <w:szCs w:val="21"/>
+              </w:rPr>
+              <w:t xml:space="preserve">Elias</w:t>
+            </w:r>
+          </w:p>
+        </w:tc>
+        <w:tc>
+          <w:tcPr>
+            <w:tcW w:type="dxa" w:w="2381"/>
+            <w:shd w:fill="FFFFFF" w:color="auto" w:val="clear"/>
+            <w:tcMar>
+              <w:top w:type="dxa" w:w="113"/>
+              <w:left w:type="dxa" w:w="170"/>
+              <w:bottom w:type="dxa" w:w="113"/>
+              <w:right w:type="dxa" w:w="170"/>
+            </w:tcMar>
+            <w:vAlign w:val="center"/>
+          </w:tcPr>
+          <w:p>
+            <w:pPr>
+              <w:spacing w:after="0" w:before="0" w:line="276"/>
+              <w:jc w:val="center"/>
+            </w:pPr>
+            <w:r>
+              <w:rPr>
+                <w:rFonts w:ascii="Calibri" w:cs="Calibri" w:eastAsia="Calibri" w:hAnsi="Calibri"/>
+                <w:color w:val="2E2E2E"/>
+                <w:sz w:val="21"/>
+                <w:szCs w:val="21"/>
+              </w:rPr>
+              <w:t xml:space="preserve">60 balles</w:t>
             </w:r>
           </w:p>
         </w:tc>
@@ -1825,34 +1934,7 @@
       <w:tr>
         <w:tc>
           <w:tcPr>
-            <w:tcW w:type="dxa" w:w="6803"/>
-            <w:shd w:fill="FFFFFF" w:color="auto" w:val="clear"/>
-            <w:tcMar>
-              <w:top w:type="dxa" w:w="113"/>
-              <w:left w:type="dxa" w:w="170"/>
-              <w:bottom w:type="dxa" w:w="113"/>
-              <w:right w:type="dxa" w:w="170"/>
-            </w:tcMar>
-            <w:vAlign w:val="center"/>
-          </w:tcPr>
-          <w:p>
-            <w:pPr>
-              <w:spacing w:after="0" w:before="0" w:line="276"/>
-            </w:pPr>
-            <w:r>
-              <w:rPr>
-                <w:rFonts w:ascii="Calibri" w:cs="Calibri" w:eastAsia="Calibri" w:hAnsi="Calibri"/>
-                <w:color w:val="2E2E2E"/>
-                <w:sz w:val="21"/>
-                <w:szCs w:val="21"/>
-              </w:rPr>
-              <w:t xml:space="preserve">Moniteur qui n’est pas en tenue Babolat ou à l’effigie du club</w:t>
-            </w:r>
-          </w:p>
-        </w:tc>
-        <w:tc>
-          <w:tcPr>
-            <w:tcW w:type="dxa" w:w="2834"/>
+            <w:tcW w:type="dxa" w:w="1587"/>
             <w:shd w:fill="FAFAF5" w:color="auto" w:val="clear"/>
             <w:tcMar>
               <w:top w:type="dxa" w:w="113"/>
@@ -1873,10 +1955,337 @@
                 <w:b/>
                 <w:bCs/>
                 <w:color w:val="C0392B"/>
-                <w:sz w:val="21"/>
-                <w:szCs w:val="21"/>
-              </w:rPr>
-              <w:t xml:space="preserve">– 5 €</w:t>
+                <w:sz w:val="24"/>
+                <w:szCs w:val="24"/>
+              </w:rPr>
+              <w:t xml:space="preserve">T</w:t>
+            </w:r>
+          </w:p>
+        </w:tc>
+        <w:tc>
+          <w:tcPr>
+            <w:tcW w:type="dxa" w:w="5669"/>
+            <w:shd w:fill="FFFFFF" w:color="auto" w:val="clear"/>
+            <w:tcMar>
+              <w:top w:type="dxa" w:w="113"/>
+              <w:left w:type="dxa" w:w="170"/>
+              <w:bottom w:type="dxa" w:w="113"/>
+              <w:right w:type="dxa" w:w="170"/>
+            </w:tcMar>
+            <w:vAlign w:val="center"/>
+          </w:tcPr>
+          <w:p>
+            <w:pPr>
+              <w:spacing w:after="0" w:before="0" w:line="276"/>
+            </w:pPr>
+            <w:r>
+              <w:rPr>
+                <w:rFonts w:ascii="Calibri" w:cs="Calibri" w:eastAsia="Calibri" w:hAnsi="Calibri"/>
+                <w:color w:val="2E2E2E"/>
+                <w:sz w:val="21"/>
+                <w:szCs w:val="21"/>
+              </w:rPr>
+              <w:t xml:space="preserve">Taha</w:t>
+            </w:r>
+          </w:p>
+        </w:tc>
+        <w:tc>
+          <w:tcPr>
+            <w:tcW w:type="dxa" w:w="2381"/>
+            <w:shd w:fill="FFFFFF" w:color="auto" w:val="clear"/>
+            <w:tcMar>
+              <w:top w:type="dxa" w:w="113"/>
+              <w:left w:type="dxa" w:w="170"/>
+              <w:bottom w:type="dxa" w:w="113"/>
+              <w:right w:type="dxa" w:w="170"/>
+            </w:tcMar>
+            <w:vAlign w:val="center"/>
+          </w:tcPr>
+          <w:p>
+            <w:pPr>
+              <w:spacing w:after="0" w:before="0" w:line="276"/>
+              <w:jc w:val="center"/>
+            </w:pPr>
+            <w:r>
+              <w:rPr>
+                <w:rFonts w:ascii="Calibri" w:cs="Calibri" w:eastAsia="Calibri" w:hAnsi="Calibri"/>
+                <w:color w:val="2E2E2E"/>
+                <w:sz w:val="21"/>
+                <w:szCs w:val="21"/>
+              </w:rPr>
+              <w:t xml:space="preserve">60 balles</w:t>
+            </w:r>
+          </w:p>
+        </w:tc>
+      </w:tr>
+      <w:tr>
+        <w:tc>
+          <w:tcPr>
+            <w:tcW w:type="dxa" w:w="1587"/>
+            <w:shd w:fill="FAFAF5" w:color="auto" w:val="clear"/>
+            <w:tcMar>
+              <w:top w:type="dxa" w:w="113"/>
+              <w:left w:type="dxa" w:w="170"/>
+              <w:bottom w:type="dxa" w:w="113"/>
+              <w:right w:type="dxa" w:w="170"/>
+            </w:tcMar>
+            <w:vAlign w:val="center"/>
+          </w:tcPr>
+          <w:p>
+            <w:pPr>
+              <w:spacing w:after="0" w:before="0" w:line="276"/>
+              <w:jc w:val="center"/>
+            </w:pPr>
+            <w:r>
+              <w:rPr>
+                <w:rFonts w:ascii="Calibri" w:cs="Calibri" w:eastAsia="Calibri" w:hAnsi="Calibri"/>
+                <w:b/>
+                <w:bCs/>
+                <w:color w:val="C0392B"/>
+                <w:sz w:val="24"/>
+                <w:szCs w:val="24"/>
+              </w:rPr>
+              <w:t xml:space="preserve">J</w:t>
+            </w:r>
+          </w:p>
+        </w:tc>
+        <w:tc>
+          <w:tcPr>
+            <w:tcW w:type="dxa" w:w="5669"/>
+            <w:shd w:fill="FFFFFF" w:color="auto" w:val="clear"/>
+            <w:tcMar>
+              <w:top w:type="dxa" w:w="113"/>
+              <w:left w:type="dxa" w:w="170"/>
+              <w:bottom w:type="dxa" w:w="113"/>
+              <w:right w:type="dxa" w:w="170"/>
+            </w:tcMar>
+            <w:vAlign w:val="center"/>
+          </w:tcPr>
+          <w:p>
+            <w:pPr>
+              <w:spacing w:after="0" w:before="0" w:line="276"/>
+            </w:pPr>
+            <w:r>
+              <w:rPr>
+                <w:rFonts w:ascii="Calibri" w:cs="Calibri" w:eastAsia="Calibri" w:hAnsi="Calibri"/>
+                <w:color w:val="2E2E2E"/>
+                <w:sz w:val="21"/>
+                <w:szCs w:val="21"/>
+              </w:rPr>
+              <w:t xml:space="preserve">Julien</w:t>
+            </w:r>
+          </w:p>
+        </w:tc>
+        <w:tc>
+          <w:tcPr>
+            <w:tcW w:type="dxa" w:w="2381"/>
+            <w:shd w:fill="FFFFFF" w:color="auto" w:val="clear"/>
+            <w:tcMar>
+              <w:top w:type="dxa" w:w="113"/>
+              <w:left w:type="dxa" w:w="170"/>
+              <w:bottom w:type="dxa" w:w="113"/>
+              <w:right w:type="dxa" w:w="170"/>
+            </w:tcMar>
+            <w:vAlign w:val="center"/>
+          </w:tcPr>
+          <w:p>
+            <w:pPr>
+              <w:spacing w:after="0" w:before="0" w:line="276"/>
+              <w:jc w:val="center"/>
+            </w:pPr>
+            <w:r>
+              <w:rPr>
+                <w:rFonts w:ascii="Calibri" w:cs="Calibri" w:eastAsia="Calibri" w:hAnsi="Calibri"/>
+                <w:color w:val="2E2E2E"/>
+                <w:sz w:val="21"/>
+                <w:szCs w:val="21"/>
+              </w:rPr>
+              <w:t xml:space="preserve">60 balles</w:t>
+            </w:r>
+          </w:p>
+        </w:tc>
+      </w:tr>
+      <w:tr>
+        <w:tc>
+          <w:tcPr>
+            <w:tcW w:type="dxa" w:w="1587"/>
+            <w:shd w:fill="FAFAF5" w:color="auto" w:val="clear"/>
+            <w:tcMar>
+              <w:top w:type="dxa" w:w="113"/>
+              <w:left w:type="dxa" w:w="170"/>
+              <w:bottom w:type="dxa" w:w="113"/>
+              <w:right w:type="dxa" w:w="170"/>
+            </w:tcMar>
+            <w:vAlign w:val="center"/>
+          </w:tcPr>
+          <w:p>
+            <w:pPr>
+              <w:spacing w:after="0" w:before="0" w:line="276"/>
+              <w:jc w:val="center"/>
+            </w:pPr>
+            <w:r>
+              <w:rPr>
+                <w:rFonts w:ascii="Calibri" w:cs="Calibri" w:eastAsia="Calibri" w:hAnsi="Calibri"/>
+                <w:b/>
+                <w:bCs/>
+                <w:color w:val="C0392B"/>
+                <w:sz w:val="24"/>
+                <w:szCs w:val="24"/>
+              </w:rPr>
+              <w:t xml:space="preserve">M</w:t>
+            </w:r>
+          </w:p>
+        </w:tc>
+        <w:tc>
+          <w:tcPr>
+            <w:tcW w:type="dxa" w:w="5669"/>
+            <w:shd w:fill="FFFFFF" w:color="auto" w:val="clear"/>
+            <w:tcMar>
+              <w:top w:type="dxa" w:w="113"/>
+              <w:left w:type="dxa" w:w="170"/>
+              <w:bottom w:type="dxa" w:w="113"/>
+              <w:right w:type="dxa" w:w="170"/>
+            </w:tcMar>
+            <w:vAlign w:val="center"/>
+          </w:tcPr>
+          <w:p>
+            <w:pPr>
+              <w:spacing w:after="0" w:before="0" w:line="276"/>
+            </w:pPr>
+            <w:r>
+              <w:rPr>
+                <w:rFonts w:ascii="Calibri" w:cs="Calibri" w:eastAsia="Calibri" w:hAnsi="Calibri"/>
+                <w:color w:val="2E2E2E"/>
+                <w:sz w:val="21"/>
+                <w:szCs w:val="21"/>
+              </w:rPr>
+              <w:t xml:space="preserve">Mario</w:t>
+            </w:r>
+          </w:p>
+        </w:tc>
+        <w:tc>
+          <w:tcPr>
+            <w:tcW w:type="dxa" w:w="2381"/>
+            <w:shd w:fill="FFFFFF" w:color="auto" w:val="clear"/>
+            <w:tcMar>
+              <w:top w:type="dxa" w:w="113"/>
+              <w:left w:type="dxa" w:w="170"/>
+              <w:bottom w:type="dxa" w:w="113"/>
+              <w:right w:type="dxa" w:w="170"/>
+            </w:tcMar>
+            <w:vAlign w:val="center"/>
+          </w:tcPr>
+          <w:p>
+            <w:pPr>
+              <w:spacing w:after="0" w:before="0" w:line="276"/>
+              <w:jc w:val="center"/>
+            </w:pPr>
+            <w:r>
+              <w:rPr>
+                <w:rFonts w:ascii="Calibri" w:cs="Calibri" w:eastAsia="Calibri" w:hAnsi="Calibri"/>
+                <w:color w:val="2E2E2E"/>
+                <w:sz w:val="21"/>
+                <w:szCs w:val="21"/>
+              </w:rPr>
+              <w:t xml:space="preserve">60 balles</w:t>
+            </w:r>
+          </w:p>
+        </w:tc>
+      </w:tr>
+      <w:tr>
+        <w:tc>
+          <w:tcPr>
+            <w:tcW w:type="dxa" w:w="1587"/>
+            <w:shd w:fill="FAFAF5" w:color="auto" w:val="clear"/>
+            <w:tcMar>
+              <w:top w:type="dxa" w:w="113"/>
+              <w:left w:type="dxa" w:w="170"/>
+              <w:bottom w:type="dxa" w:w="113"/>
+              <w:right w:type="dxa" w:w="170"/>
+            </w:tcMar>
+            <w:vAlign w:val="center"/>
+          </w:tcPr>
+          <w:p>
+            <w:pPr>
+              <w:spacing w:after="0" w:before="0" w:line="276"/>
+              <w:jc w:val="center"/>
+            </w:pPr>
+            <w:r>
+              <w:rPr>
+                <w:rFonts w:ascii="Calibri" w:cs="Calibri" w:eastAsia="Calibri" w:hAnsi="Calibri"/>
+                <w:b/>
+                <w:bCs/>
+                <w:color w:val="C0392B"/>
+                <w:sz w:val="24"/>
+                <w:szCs w:val="24"/>
+              </w:rPr>
+              <w:t xml:space="preserve">A</w:t>
+            </w:r>
+          </w:p>
+        </w:tc>
+        <w:tc>
+          <w:tcPr>
+            <w:tcW w:type="dxa" w:w="5669"/>
+            <w:shd w:fill="FFFFFF" w:color="auto" w:val="clear"/>
+            <w:tcMar>
+              <w:top w:type="dxa" w:w="113"/>
+              <w:left w:type="dxa" w:w="170"/>
+              <w:bottom w:type="dxa" w:w="113"/>
+              <w:right w:type="dxa" w:w="170"/>
+            </w:tcMar>
+            <w:vAlign w:val="center"/>
+          </w:tcPr>
+          <w:p>
+            <w:pPr>
+              <w:spacing w:after="0" w:before="0" w:line="276"/>
+            </w:pPr>
+            <w:r>
+              <w:rPr>
+                <w:rFonts w:ascii="Calibri" w:cs="Calibri" w:eastAsia="Calibri" w:hAnsi="Calibri"/>
+                <w:b/>
+                <w:bCs/>
+                <w:color w:val="2E2E2E"/>
+                <w:sz w:val="21"/>
+                <w:szCs w:val="21"/>
+              </w:rPr>
+              <w:t xml:space="preserve">Les autres moniteurs</w:t>
+            </w:r>
+            <w:r>
+              <w:rPr>
+                <w:rFonts w:ascii="Calibri" w:cs="Calibri" w:eastAsia="Calibri" w:hAnsi="Calibri"/>
+                <w:color w:val="2E2E2E"/>
+                <w:sz w:val="21"/>
+                <w:szCs w:val="21"/>
+              </w:rPr>
+              <w:t xml:space="preserve"> — deux paniers communs</w:t>
+            </w:r>
+          </w:p>
+        </w:tc>
+        <w:tc>
+          <w:tcPr>
+            <w:tcW w:type="dxa" w:w="2381"/>
+            <w:shd w:fill="FFFFFF" w:color="auto" w:val="clear"/>
+            <w:tcMar>
+              <w:top w:type="dxa" w:w="113"/>
+              <w:left w:type="dxa" w:w="170"/>
+              <w:bottom w:type="dxa" w:w="113"/>
+              <w:right w:type="dxa" w:w="170"/>
+            </w:tcMar>
+            <w:vAlign w:val="center"/>
+          </w:tcPr>
+          <w:p>
+            <w:pPr>
+              <w:spacing w:after="0" w:before="0" w:line="276"/>
+              <w:jc w:val="center"/>
+            </w:pPr>
+            <w:r>
+              <w:rPr>
+                <w:rFonts w:ascii="Calibri" w:cs="Calibri" w:eastAsia="Calibri" w:hAnsi="Calibri"/>
+                <w:color w:val="2E2E2E"/>
+                <w:sz w:val="21"/>
+                <w:szCs w:val="21"/>
+              </w:rPr>
+              <w:t xml:space="preserve">60 balles chacun</w:t>
             </w:r>
           </w:p>
         </w:tc>
@@ -1898,358 +2307,59 @@
     </w:p>
     <w:p>
       <w:pPr>
-        <w:spacing w:after="120" w:before="0" w:line="276"/>
-      </w:pPr>
-      <w:r>
-        <w:rPr>
-          <w:rFonts w:ascii="Calibri" w:cs="Calibri" w:eastAsia="Calibri" w:hAnsi="Calibri"/>
-          <w:color w:val="2E2E2E"/>
-          <w:sz w:val="21"/>
-          <w:szCs w:val="21"/>
-        </w:rPr>
-        <w:t xml:space="preserve">Le solde restant en fin de saison est réparti entre les moniteurs. Si le budget de 2 500 € venait à être dépassé — ce que je n’espère pas — nous passerions à un système où les balles deviennent payantes pour vous.</w:t>
-      </w:r>
-    </w:p>
-    <w:p>
-      <w:pPr>
-        <w:pStyle w:val="ListParagraph"/>
-        <w:numPr>
-          <w:ilvl w:val="0"/>
-          <w:numId w:val="2"/>
-        </w:numPr>
-        <w:spacing w:after="60" w:line="264"/>
-      </w:pPr>
-      <w:r>
-        <w:rPr>
-          <w:rFonts w:ascii="Calibri" w:cs="Calibri" w:eastAsia="Calibri" w:hAnsi="Calibri"/>
-          <w:i/>
-          <w:iCs/>
-          <w:color w:val="6E6E6E"/>
-          <w:sz w:val="20"/>
-          <w:szCs w:val="20"/>
-        </w:rPr>
-        <w:t xml:space="preserve">À compléter : bilan chiffré de la cagnotte de la saison dernière</w:t>
-      </w:r>
-    </w:p>
-    <w:p>
-      <w:pPr>
-        <w:pStyle w:val="ListParagraph"/>
-        <w:numPr>
-          <w:ilvl w:val="0"/>
-          <w:numId w:val="2"/>
-        </w:numPr>
-        <w:spacing w:after="60" w:line="264"/>
-      </w:pPr>
-      <w:r>
-        <w:rPr>
-          <w:rFonts w:ascii="Calibri" w:cs="Calibri" w:eastAsia="Calibri" w:hAnsi="Calibri"/>
-          <w:i/>
-          <w:iCs/>
-          <w:color w:val="6E6E6E"/>
-          <w:sz w:val="20"/>
-          <w:szCs w:val="20"/>
-        </w:rPr>
-        <w:t xml:space="preserve">À compléter : modalités exactes de répartition du solde en fin de saison</w:t>
-      </w:r>
-    </w:p>
-    <w:p>
-      <w:pPr>
-        <w:keepNext/>
-        <w:pBdr>
-          <w:bottom w:val="single" w:color="8A9E28" w:sz="8" w:space="4"/>
-        </w:pBdr>
-        <w:spacing w:after="140" w:before="320"/>
-      </w:pPr>
-      <w:r>
-        <w:rPr>
-          <w:rFonts w:ascii="Calibri" w:cs="Calibri" w:eastAsia="Calibri" w:hAnsi="Calibri"/>
-          <w:b/>
-          <w:bCs/>
-          <w:color w:val="8A9E28"/>
-          <w:sz w:val="26"/>
-          <w:szCs w:val="26"/>
-        </w:rPr>
-        <w:t xml:space="preserve">5. </w:t>
-      </w:r>
-      <w:r>
-        <w:rPr>
-          <w:rFonts w:ascii="Calibri" w:cs="Calibri" w:eastAsia="Calibri" w:hAnsi="Calibri"/>
-          <w:b/>
-          <w:bCs/>
-          <w:color w:val="C0392B"/>
-          <w:sz w:val="26"/>
-          <w:szCs w:val="26"/>
-        </w:rPr>
-        <w:t xml:space="preserve">Vacances et remplacements</w:t>
-      </w:r>
-    </w:p>
-    <w:p>
-      <w:pPr>
-        <w:pStyle w:val="ListParagraph"/>
-        <w:numPr>
-          <w:ilvl w:val="0"/>
-          <w:numId w:val="2"/>
-        </w:numPr>
-        <w:spacing w:after="60" w:line="264"/>
-      </w:pPr>
-      <w:r>
-        <w:rPr>
-          <w:rFonts w:ascii="Calibri" w:cs="Calibri" w:eastAsia="Calibri" w:hAnsi="Calibri"/>
-          <w:color w:val="2E2E2E"/>
-          <w:sz w:val="21"/>
-          <w:szCs w:val="21"/>
-        </w:rPr>
-        <w:t xml:space="preserve">Prévenez le plus tôt possible, et toujours par écrit.</w:t>
-      </w:r>
-    </w:p>
-    <w:p>
-      <w:pPr>
-        <w:pStyle w:val="ListParagraph"/>
-        <w:numPr>
-          <w:ilvl w:val="0"/>
-          <w:numId w:val="2"/>
-        </w:numPr>
-        <w:spacing w:after="60" w:line="264"/>
-      </w:pPr>
-      <w:r>
-        <w:rPr>
-          <w:rFonts w:ascii="Calibri" w:cs="Calibri" w:eastAsia="Calibri" w:hAnsi="Calibri"/>
-          <w:color w:val="2E2E2E"/>
-          <w:sz w:val="21"/>
-          <w:szCs w:val="21"/>
-        </w:rPr>
-        <w:t xml:space="preserve">Proposez vous-même un remplaçant au sein de l’équipe : c’est à vous de trouver la solution, pas au club.</w:t>
-      </w:r>
-    </w:p>
-    <w:p>
-      <w:pPr>
-        <w:pStyle w:val="ListParagraph"/>
-        <w:numPr>
-          <w:ilvl w:val="0"/>
-          <w:numId w:val="2"/>
-        </w:numPr>
-        <w:spacing w:after="60" w:line="264"/>
-      </w:pPr>
-      <w:r>
-        <w:rPr>
-          <w:rFonts w:ascii="Calibri" w:cs="Calibri" w:eastAsia="Calibri" w:hAnsi="Calibri"/>
-          <w:color w:val="2E2E2E"/>
-          <w:sz w:val="21"/>
-          <w:szCs w:val="21"/>
-        </w:rPr>
-        <w:t xml:space="preserve">Un remplacement n’est effectif qu’une fois confirmé par Marc.</w:t>
-      </w:r>
-    </w:p>
-    <w:p>
-      <w:pPr>
-        <w:pStyle w:val="ListParagraph"/>
-        <w:numPr>
-          <w:ilvl w:val="0"/>
-          <w:numId w:val="2"/>
-        </w:numPr>
-        <w:spacing w:after="60" w:line="264"/>
-      </w:pPr>
-      <w:r>
-        <w:rPr>
-          <w:rFonts w:ascii="Calibri" w:cs="Calibri" w:eastAsia="Calibri" w:hAnsi="Calibri"/>
-          <w:color w:val="2E2E2E"/>
-          <w:sz w:val="21"/>
-          <w:szCs w:val="21"/>
-        </w:rPr>
-        <w:t xml:space="preserve">Le remplaçant doit recevoir le programme du cours et la liste des élèves.</w:t>
-      </w:r>
-    </w:p>
-    <w:p>
-      <w:pPr>
-        <w:pStyle w:val="ListParagraph"/>
-        <w:numPr>
-          <w:ilvl w:val="0"/>
-          <w:numId w:val="2"/>
-        </w:numPr>
-        <w:spacing w:after="60" w:line="264"/>
-      </w:pPr>
-      <w:r>
-        <w:rPr>
-          <w:rFonts w:ascii="Calibri" w:cs="Calibri" w:eastAsia="Calibri" w:hAnsi="Calibri"/>
-          <w:i/>
-          <w:iCs/>
-          <w:color w:val="6E6E6E"/>
-          <w:sz w:val="20"/>
-          <w:szCs w:val="20"/>
-        </w:rPr>
-        <w:t xml:space="preserve">À compléter : délai minimum de prévenance (une semaine ? deux ?)</w:t>
-      </w:r>
-    </w:p>
-    <w:p>
-      <w:pPr>
-        <w:keepNext/>
-        <w:pBdr>
-          <w:bottom w:val="single" w:color="8A9E28" w:sz="8" w:space="4"/>
-        </w:pBdr>
-        <w:spacing w:after="140" w:before="320"/>
-      </w:pPr>
-      <w:r>
-        <w:rPr>
-          <w:rFonts w:ascii="Calibri" w:cs="Calibri" w:eastAsia="Calibri" w:hAnsi="Calibri"/>
-          <w:b/>
-          <w:bCs/>
-          <w:color w:val="8A9E28"/>
-          <w:sz w:val="26"/>
-          <w:szCs w:val="26"/>
-        </w:rPr>
-        <w:t xml:space="preserve">6. </w:t>
-      </w:r>
-      <w:r>
-        <w:rPr>
-          <w:rFonts w:ascii="Calibri" w:cs="Calibri" w:eastAsia="Calibri" w:hAnsi="Calibri"/>
-          <w:b/>
-          <w:bCs/>
-          <w:color w:val="C0392B"/>
-          <w:sz w:val="26"/>
-          <w:szCs w:val="26"/>
-        </w:rPr>
-        <w:t xml:space="preserve">Ponctualité, présences et League Cup</w:t>
-      </w:r>
-    </w:p>
-    <w:p>
-      <w:pPr>
-        <w:pStyle w:val="ListParagraph"/>
-        <w:numPr>
-          <w:ilvl w:val="0"/>
-          <w:numId w:val="2"/>
-        </w:numPr>
-        <w:spacing w:after="60" w:line="264"/>
-      </w:pPr>
-      <w:r>
-        <w:rPr>
-          <w:rFonts w:ascii="Calibri" w:cs="Calibri" w:eastAsia="Calibri" w:hAnsi="Calibri"/>
-          <w:color w:val="2E2E2E"/>
-          <w:sz w:val="21"/>
-          <w:szCs w:val="21"/>
-        </w:rPr>
-        <w:t xml:space="preserve">Arriver en avance, pas à l’heure : le cours commence à l’heure dite, pas au moment où vous ouvrez le kot.</w:t>
-      </w:r>
-    </w:p>
-    <w:p>
-      <w:pPr>
-        <w:pStyle w:val="ListParagraph"/>
-        <w:numPr>
-          <w:ilvl w:val="0"/>
-          <w:numId w:val="2"/>
-        </w:numPr>
-        <w:spacing w:after="60" w:line="264"/>
-      </w:pPr>
-      <w:r>
-        <w:rPr>
-          <w:rFonts w:ascii="Calibri" w:cs="Calibri" w:eastAsia="Calibri" w:hAnsi="Calibri"/>
-          <w:b/>
-          <w:bCs/>
-          <w:color w:val="2E2E2E"/>
-          <w:sz w:val="21"/>
-          <w:szCs w:val="21"/>
-        </w:rPr>
-        <w:t xml:space="preserve">League Cup : les deux moniteurs doivent être présents</w:t>
-      </w:r>
-      <w:r>
-        <w:rPr>
-          <w:rFonts w:ascii="Calibri" w:cs="Calibri" w:eastAsia="Calibri" w:hAnsi="Calibri"/>
-          <w:color w:val="2E2E2E"/>
-          <w:sz w:val="21"/>
-          <w:szCs w:val="21"/>
-        </w:rPr>
-        <w:t xml:space="preserve">, ou prévenir en cas d’absence. C’est non négociable.</w:t>
-      </w:r>
-    </w:p>
-    <w:p>
-      <w:pPr>
-        <w:pStyle w:val="ListParagraph"/>
-        <w:numPr>
-          <w:ilvl w:val="0"/>
-          <w:numId w:val="2"/>
-        </w:numPr>
-        <w:spacing w:after="60" w:line="264"/>
-      </w:pPr>
-      <w:r>
-        <w:rPr>
-          <w:rFonts w:ascii="Calibri" w:cs="Calibri" w:eastAsia="Calibri" w:hAnsi="Calibri"/>
-          <w:color w:val="2E2E2E"/>
-          <w:sz w:val="21"/>
-          <w:szCs w:val="21"/>
-        </w:rPr>
-        <w:t xml:space="preserve">Toute absence non annoncée met un collègue en difficulté et se voit immédiatement côté parents.</w:t>
-      </w:r>
-    </w:p>
-    <w:p>
-      <w:pPr>
-        <w:pStyle w:val="ListParagraph"/>
-        <w:numPr>
-          <w:ilvl w:val="0"/>
-          <w:numId w:val="2"/>
-        </w:numPr>
-        <w:spacing w:after="60" w:line="264"/>
-      </w:pPr>
-      <w:r>
-        <w:rPr>
-          <w:rFonts w:ascii="Calibri" w:cs="Calibri" w:eastAsia="Calibri" w:hAnsi="Calibri"/>
-          <w:i/>
-          <w:iCs/>
-          <w:color w:val="6E6E6E"/>
-          <w:sz w:val="20"/>
-          <w:szCs w:val="20"/>
-        </w:rPr>
-        <w:t xml:space="preserve">À compléter : nombre de minutes d’avance attendues avant le début du cours</w:t>
-      </w:r>
-    </w:p>
-    <w:p>
-      <w:pPr>
-        <w:pStyle w:val="ListParagraph"/>
-        <w:numPr>
-          <w:ilvl w:val="0"/>
-          <w:numId w:val="2"/>
-        </w:numPr>
-        <w:spacing w:after="60" w:line="264"/>
-      </w:pPr>
-      <w:r>
-        <w:rPr>
-          <w:rFonts w:ascii="Calibri" w:cs="Calibri" w:eastAsia="Calibri" w:hAnsi="Calibri"/>
-          <w:i/>
-          <w:iCs/>
-          <w:color w:val="6E6E6E"/>
-          <w:sz w:val="20"/>
-          <w:szCs w:val="20"/>
-        </w:rPr>
-        <w:t xml:space="preserve">À compléter : dates des League Cup de la saison</w:t>
-      </w:r>
-    </w:p>
-    <w:p>
-      <w:pPr>
-        <w:keepNext/>
-        <w:pBdr>
-          <w:bottom w:val="single" w:color="8A9E28" w:sz="8" w:space="4"/>
-        </w:pBdr>
-        <w:spacing w:after="140" w:before="320"/>
-      </w:pPr>
-      <w:r>
-        <w:rPr>
-          <w:rFonts w:ascii="Calibri" w:cs="Calibri" w:eastAsia="Calibri" w:hAnsi="Calibri"/>
-          <w:b/>
-          <w:bCs/>
-          <w:color w:val="8A9E28"/>
-          <w:sz w:val="26"/>
-          <w:szCs w:val="26"/>
-        </w:rPr>
-        <w:t xml:space="preserve">7. </w:t>
-      </w:r>
-      <w:r>
-        <w:rPr>
-          <w:rFonts w:ascii="Calibri" w:cs="Calibri" w:eastAsia="Calibri" w:hAnsi="Calibri"/>
-          <w:b/>
-          <w:bCs/>
-          <w:color w:val="C0392B"/>
-          <w:sz w:val="26"/>
-          <w:szCs w:val="26"/>
-        </w:rPr>
-        <w:t xml:space="preserve">Les règles de base</w:t>
+        <w:pStyle w:val="ListParagraph"/>
+        <w:numPr>
+          <w:ilvl w:val="0"/>
+          <w:numId w:val="2"/>
+        </w:numPr>
+        <w:spacing w:after="60" w:line="264"/>
+      </w:pPr>
+      <w:r>
+        <w:rPr>
+          <w:rFonts w:ascii="Calibri" w:cs="Calibri" w:eastAsia="Calibri" w:hAnsi="Calibri"/>
+          <w:color w:val="2E2E2E"/>
+          <w:sz w:val="21"/>
+          <w:szCs w:val="21"/>
+        </w:rPr>
+        <w:t xml:space="preserve">Les balles sont marquées de la première lettre de votre prénom. Une balle qui traîne dit immédiatement à qui elle appartient.</w:t>
+      </w:r>
+    </w:p>
+    <w:p>
+      <w:pPr>
+        <w:pStyle w:val="ListParagraph"/>
+        <w:numPr>
+          <w:ilvl w:val="0"/>
+          <w:numId w:val="2"/>
+        </w:numPr>
+        <w:spacing w:after="60" w:line="264"/>
+      </w:pPr>
+      <w:r>
+        <w:rPr>
+          <w:rFonts w:ascii="Calibri" w:cs="Calibri" w:eastAsia="Calibri" w:hAnsi="Calibri"/>
+          <w:color w:val="2E2E2E"/>
+          <w:sz w:val="21"/>
+          <w:szCs w:val="21"/>
+        </w:rPr>
+        <w:t xml:space="preserve">Votre panier est le vôtre : vous le gérez, vous le rangez, vous le retrouvez complet.</w:t>
+      </w:r>
+    </w:p>
+    <w:p>
+      <w:pPr>
+        <w:pStyle w:val="ListParagraph"/>
+        <w:numPr>
+          <w:ilvl w:val="0"/>
+          <w:numId w:val="2"/>
+        </w:numPr>
+        <w:spacing w:after="60" w:line="264"/>
+      </w:pPr>
+      <w:r>
+        <w:rPr>
+          <w:rFonts w:ascii="Calibri" w:cs="Calibri" w:eastAsia="Calibri" w:hAnsi="Calibri"/>
+          <w:color w:val="2E2E2E"/>
+          <w:sz w:val="21"/>
+          <w:szCs w:val="21"/>
+        </w:rPr>
+        <w:t xml:space="preserve">Les moniteurs sans panier personnel utilisent les deux paniers « A ».</w:t>
       </w:r>
     </w:p>
     <w:p>
@@ -2266,97 +2376,95 @@
           <w:sz w:val="21"/>
           <w:szCs w:val="21"/>
         </w:rPr>
-        <w:t xml:space="preserve">Sur le terrain</w:t>
-      </w:r>
-    </w:p>
-    <w:p>
-      <w:pPr>
-        <w:pStyle w:val="ListParagraph"/>
-        <w:numPr>
-          <w:ilvl w:val="0"/>
-          <w:numId w:val="2"/>
-        </w:numPr>
-        <w:spacing w:after="60" w:line="264"/>
-      </w:pPr>
-      <w:r>
-        <w:rPr>
-          <w:rFonts w:ascii="Calibri" w:cs="Calibri" w:eastAsia="Calibri" w:hAnsi="Calibri"/>
-          <w:b/>
-          <w:bCs/>
-          <w:color w:val="2E2E2E"/>
-          <w:sz w:val="21"/>
-          <w:szCs w:val="21"/>
-        </w:rPr>
-        <w:t xml:space="preserve">Téléphone : </w:t>
-      </w:r>
-      <w:r>
-        <w:rPr>
-          <w:rFonts w:ascii="Calibri" w:cs="Calibri" w:eastAsia="Calibri" w:hAnsi="Calibri"/>
-          <w:color w:val="2E2E2E"/>
-          <w:sz w:val="21"/>
-          <w:szCs w:val="21"/>
-        </w:rPr>
-        <w:t xml:space="preserve">rangé, hors de vue, pas d’utilisation pendant le cours. Sauf urgence réelle.</w:t>
-      </w:r>
-    </w:p>
-    <w:p>
-      <w:pPr>
-        <w:pStyle w:val="ListParagraph"/>
-        <w:numPr>
-          <w:ilvl w:val="0"/>
-          <w:numId w:val="2"/>
-        </w:numPr>
-        <w:spacing w:after="60" w:line="264"/>
-      </w:pPr>
-      <w:r>
-        <w:rPr>
-          <w:rFonts w:ascii="Calibri" w:cs="Calibri" w:eastAsia="Calibri" w:hAnsi="Calibri"/>
-          <w:b/>
-          <w:bCs/>
-          <w:color w:val="2E2E2E"/>
-          <w:sz w:val="21"/>
-          <w:szCs w:val="21"/>
-        </w:rPr>
-        <w:t xml:space="preserve">Ne pas quitter le terrain </w:t>
-      </w:r>
-      <w:r>
-        <w:rPr>
-          <w:rFonts w:ascii="Calibri" w:cs="Calibri" w:eastAsia="Calibri" w:hAnsi="Calibri"/>
-          <w:color w:val="2E2E2E"/>
-          <w:sz w:val="21"/>
-          <w:szCs w:val="21"/>
-        </w:rPr>
-        <w:t xml:space="preserve">pendant un cours : les enfants ne restent jamais seuls.</w:t>
-      </w:r>
-    </w:p>
-    <w:p>
-      <w:pPr>
-        <w:pStyle w:val="ListParagraph"/>
-        <w:numPr>
-          <w:ilvl w:val="0"/>
-          <w:numId w:val="2"/>
-        </w:numPr>
-        <w:spacing w:after="60" w:line="264"/>
-      </w:pPr>
-      <w:r>
-        <w:rPr>
-          <w:rFonts w:ascii="Calibri" w:cs="Calibri" w:eastAsia="Calibri" w:hAnsi="Calibri"/>
-          <w:b/>
-          <w:bCs/>
-          <w:color w:val="2E2E2E"/>
-          <w:sz w:val="21"/>
-          <w:szCs w:val="21"/>
-        </w:rPr>
-        <w:t xml:space="preserve">Commencer et terminer à l’heure. </w:t>
-      </w:r>
-      <w:r>
-        <w:rPr>
-          <w:rFonts w:ascii="Calibri" w:cs="Calibri" w:eastAsia="Calibri" w:hAnsi="Calibri"/>
-          <w:color w:val="2E2E2E"/>
-          <w:sz w:val="21"/>
-          <w:szCs w:val="21"/>
-        </w:rPr>
-        <w:t xml:space="preserve">Un cours qui déborde décale tout le monde.</w:t>
+        <w:t xml:space="preserve">Le comptage, toutes les 7 semaines</w:t>
+      </w:r>
+    </w:p>
+    <w:p>
+      <w:pPr>
+        <w:pStyle w:val="ListParagraph"/>
+        <w:numPr>
+          <w:ilvl w:val="0"/>
+          <w:numId w:val="2"/>
+        </w:numPr>
+        <w:spacing w:after="60" w:line="264"/>
+      </w:pPr>
+      <w:r>
+        <w:rPr>
+          <w:rFonts w:ascii="Calibri" w:cs="Calibri" w:eastAsia="Calibri" w:hAnsi="Calibri"/>
+          <w:color w:val="2E2E2E"/>
+          <w:sz w:val="21"/>
+          <w:szCs w:val="21"/>
+        </w:rPr>
+        <w:t xml:space="preserve">On compte les balles restantes dans chaque panier. Chaque balle manquante est déduite du salaire à </w:t>
+      </w:r>
+      <w:r>
+        <w:rPr>
+          <w:rFonts w:ascii="Calibri" w:cs="Calibri" w:eastAsia="Calibri" w:hAnsi="Calibri"/>
+          <w:b/>
+          <w:bCs/>
+          <w:color w:val="C0392B"/>
+          <w:sz w:val="21"/>
+          <w:szCs w:val="21"/>
+        </w:rPr>
+        <w:t xml:space="preserve">1,95 €</w:t>
+      </w:r>
+      <w:r>
+        <w:rPr>
+          <w:rFonts w:ascii="Calibri" w:cs="Calibri" w:eastAsia="Calibri" w:hAnsi="Calibri"/>
+          <w:color w:val="2E2E2E"/>
+          <w:sz w:val="21"/>
+          <w:szCs w:val="21"/>
+        </w:rPr>
+        <w:t xml:space="preserve">, soit le prix coûtant d’une balle.</w:t>
+      </w:r>
+    </w:p>
+    <w:p>
+      <w:pPr>
+        <w:pStyle w:val="ListParagraph"/>
+        <w:numPr>
+          <w:ilvl w:val="0"/>
+          <w:numId w:val="2"/>
+        </w:numPr>
+        <w:spacing w:after="60" w:line="264"/>
+      </w:pPr>
+      <w:r>
+        <w:rPr>
+          <w:rFonts w:ascii="Calibri" w:cs="Calibri" w:eastAsia="Calibri" w:hAnsi="Calibri"/>
+          <w:color w:val="2E2E2E"/>
+          <w:sz w:val="21"/>
+          <w:szCs w:val="21"/>
+        </w:rPr>
+        <w:t xml:space="preserve">Le club ne gagne rien sur ce système : il cesse simplement de payer vos balles à votre place.</w:t>
+      </w:r>
+    </w:p>
+    <w:p>
+      <w:pPr>
+        <w:pStyle w:val="ListParagraph"/>
+        <w:numPr>
+          <w:ilvl w:val="0"/>
+          <w:numId w:val="2"/>
+        </w:numPr>
+        <w:spacing w:after="60" w:line="264"/>
+      </w:pPr>
+      <w:r>
+        <w:rPr>
+          <w:rFonts w:ascii="Calibri" w:cs="Calibri" w:eastAsia="Calibri" w:hAnsi="Calibri"/>
+          <w:b/>
+          <w:bCs/>
+          <w:color w:val="2E2E2E"/>
+          <w:sz w:val="21"/>
+          <w:szCs w:val="21"/>
+        </w:rPr>
+        <w:t xml:space="preserve">Paniers « A » : </w:t>
+      </w:r>
+      <w:r>
+        <w:rPr>
+          <w:rFonts w:ascii="Calibri" w:cs="Calibri" w:eastAsia="Calibri" w:hAnsi="Calibri"/>
+          <w:color w:val="2E2E2E"/>
+          <w:sz w:val="21"/>
+          <w:szCs w:val="21"/>
+        </w:rPr>
+        <w:t xml:space="preserve">le montant manquant est réparti entre les moniteurs concernés, au prorata du nombre d’heures pendant lesquelles chacun a utilisé ces paniers.</w:t>
       </w:r>
     </w:p>
     <w:p>
@@ -2373,65 +2481,45 @@
           <w:sz w:val="21"/>
           <w:szCs w:val="21"/>
         </w:rPr>
-        <w:t xml:space="preserve">Entre les cours</w:t>
-      </w:r>
-    </w:p>
-    <w:p>
-      <w:pPr>
-        <w:pStyle w:val="ListParagraph"/>
-        <w:numPr>
-          <w:ilvl w:val="0"/>
-          <w:numId w:val="2"/>
-        </w:numPr>
-        <w:spacing w:after="60" w:line="264"/>
-      </w:pPr>
-      <w:r>
-        <w:rPr>
-          <w:rFonts w:ascii="Calibri" w:cs="Calibri" w:eastAsia="Calibri" w:hAnsi="Calibri"/>
-          <w:color w:val="2E2E2E"/>
-          <w:sz w:val="21"/>
-          <w:szCs w:val="21"/>
-        </w:rPr>
-        <w:t xml:space="preserve">Les pauses restent courtes : le cours suivant commence à l’heure prévue.</w:t>
-      </w:r>
-    </w:p>
-    <w:p>
-      <w:pPr>
-        <w:pStyle w:val="ListParagraph"/>
-        <w:numPr>
-          <w:ilvl w:val="0"/>
-          <w:numId w:val="2"/>
-        </w:numPr>
-        <w:spacing w:after="60" w:line="264"/>
-      </w:pPr>
-      <w:r>
-        <w:rPr>
-          <w:rFonts w:ascii="Calibri" w:cs="Calibri" w:eastAsia="Calibri" w:hAnsi="Calibri"/>
-          <w:color w:val="2E2E2E"/>
-          <w:sz w:val="21"/>
-          <w:szCs w:val="21"/>
-        </w:rPr>
-        <w:t xml:space="preserve">Cigarettes : jamais devant les élèves, jamais sur les terrains, jamais en tenue de moniteur à l’entrée du club.</w:t>
-      </w:r>
-    </w:p>
-    <w:p>
-      <w:pPr>
-        <w:keepNext/>
-        <w:pBdr>
-          <w:bottom w:val="single" w:color="8A9E28" w:sz="8" w:space="4"/>
-        </w:pBdr>
-        <w:spacing w:after="140" w:before="320"/>
-      </w:pPr>
-      <w:r>
-        <w:rPr>
-          <w:rFonts w:ascii="Calibri" w:cs="Calibri" w:eastAsia="Calibri" w:hAnsi="Calibri"/>
-          <w:b/>
-          <w:bCs/>
-          <w:color w:val="8A9E28"/>
-          <w:sz w:val="26"/>
-          <w:szCs w:val="26"/>
-        </w:rPr>
-        <w:t xml:space="preserve">8. </w:t>
+        <w:t xml:space="preserve">Les balles rouges, oranges et vertes</w:t>
+      </w:r>
+    </w:p>
+    <w:p>
+      <w:pPr>
+        <w:pStyle w:val="ListParagraph"/>
+        <w:numPr>
+          <w:ilvl w:val="0"/>
+          <w:numId w:val="2"/>
+        </w:numPr>
+        <w:spacing w:after="60" w:line="264"/>
+      </w:pPr>
+      <w:r>
+        <w:rPr>
+          <w:rFonts w:ascii="Calibri" w:cs="Calibri" w:eastAsia="Calibri" w:hAnsi="Calibri"/>
+          <w:color w:val="2E2E2E"/>
+          <w:sz w:val="21"/>
+          <w:szCs w:val="21"/>
+        </w:rPr>
+        <w:t xml:space="preserve">Pas de panier personnel pour ces balles : tout le monde est dans le même système.</w:t>
+      </w:r>
+    </w:p>
+    <w:p>
+      <w:pPr>
+        <w:pStyle w:val="ListParagraph"/>
+        <w:numPr>
+          <w:ilvl w:val="0"/>
+          <w:numId w:val="2"/>
+        </w:numPr>
+        <w:spacing w:after="60" w:line="264"/>
+      </w:pPr>
+      <w:r>
+        <w:rPr>
+          <w:rFonts w:ascii="Calibri" w:cs="Calibri" w:eastAsia="Calibri" w:hAnsi="Calibri"/>
+          <w:color w:val="2E2E2E"/>
+          <w:sz w:val="21"/>
+          <w:szCs w:val="21"/>
+        </w:rPr>
+        <w:t xml:space="preserve">Comptage toutes les 7 semaines également. Chaque balle manquante est déduite à </w:t>
       </w:r>
       <w:r>
         <w:rPr>
@@ -2439,144 +2527,33 @@
           <w:b/>
           <w:bCs/>
           <w:color w:val="C0392B"/>
-          <w:sz w:val="26"/>
-          <w:szCs w:val="26"/>
-        </w:rPr>
-        <w:t xml:space="preserve">Formations</w:t>
-      </w:r>
-    </w:p>
-    <w:p>
-      <w:pPr>
-        <w:pStyle w:val="ListParagraph"/>
-        <w:numPr>
-          <w:ilvl w:val="0"/>
-          <w:numId w:val="2"/>
-        </w:numPr>
-        <w:spacing w:after="60" w:line="264"/>
-      </w:pPr>
-      <w:r>
-        <w:rPr>
-          <w:rFonts w:ascii="Calibri" w:cs="Calibri" w:eastAsia="Calibri" w:hAnsi="Calibri"/>
-          <w:color w:val="2E2E2E"/>
-          <w:sz w:val="21"/>
-          <w:szCs w:val="21"/>
-        </w:rPr>
-        <w:t xml:space="preserve">Le club rembourse la formation et une hausse salariale suit l’obtention du niveau.</w:t>
-      </w:r>
-    </w:p>
-    <w:p>
-      <w:pPr>
-        <w:pStyle w:val="ListParagraph"/>
-        <w:numPr>
-          <w:ilvl w:val="0"/>
-          <w:numId w:val="2"/>
-        </w:numPr>
-        <w:spacing w:after="60" w:line="264"/>
-      </w:pPr>
-      <w:r>
-        <w:rPr>
-          <w:rFonts w:ascii="Calibri" w:cs="Calibri" w:eastAsia="Calibri" w:hAnsi="Calibri"/>
-          <w:b/>
-          <w:bCs/>
-          <w:color w:val="C0392B"/>
-          <w:sz w:val="21"/>
-          <w:szCs w:val="21"/>
-        </w:rPr>
-        <w:t xml:space="preserve">Question posée à chacun : qui s’engage à faire son niveau 1 cette saison ?</w:t>
-      </w:r>
-    </w:p>
-    <w:p>
-      <w:pPr>
-        <w:pStyle w:val="ListParagraph"/>
-        <w:numPr>
-          <w:ilvl w:val="0"/>
-          <w:numId w:val="2"/>
-        </w:numPr>
-        <w:spacing w:after="60" w:line="264"/>
-      </w:pPr>
-      <w:r>
-        <w:rPr>
-          <w:rFonts w:ascii="Calibri" w:cs="Calibri" w:eastAsia="Calibri" w:hAnsi="Calibri"/>
-          <w:i/>
-          <w:iCs/>
-          <w:color w:val="6E6E6E"/>
-          <w:sz w:val="20"/>
-          <w:szCs w:val="20"/>
-        </w:rPr>
-        <w:t xml:space="preserve">À compléter : conditions exactes du remboursement (avance, remboursement après réussite, engagement de durée)</w:t>
-      </w:r>
-    </w:p>
-    <w:p>
-      <w:pPr>
-        <w:pStyle w:val="ListParagraph"/>
-        <w:numPr>
-          <w:ilvl w:val="0"/>
-          <w:numId w:val="2"/>
-        </w:numPr>
-        <w:spacing w:after="60" w:line="264"/>
-      </w:pPr>
-      <w:r>
-        <w:rPr>
-          <w:rFonts w:ascii="Calibri" w:cs="Calibri" w:eastAsia="Calibri" w:hAnsi="Calibri"/>
-          <w:i/>
-          <w:iCs/>
-          <w:color w:val="6E6E6E"/>
-          <w:sz w:val="20"/>
-          <w:szCs w:val="20"/>
-        </w:rPr>
-        <w:t xml:space="preserve">À compléter : barème salarial par niveau de formation</w:t>
-      </w:r>
-    </w:p>
-    <w:p>
-      <w:pPr>
-        <w:pStyle w:val="ListParagraph"/>
-        <w:numPr>
-          <w:ilvl w:val="0"/>
-          <w:numId w:val="2"/>
-        </w:numPr>
-        <w:spacing w:after="60" w:line="264"/>
-      </w:pPr>
-      <w:r>
-        <w:rPr>
-          <w:rFonts w:ascii="Calibri" w:cs="Calibri" w:eastAsia="Calibri" w:hAnsi="Calibri"/>
-          <w:i/>
-          <w:iCs/>
-          <w:color w:val="6E6E6E"/>
-          <w:sz w:val="20"/>
-          <w:szCs w:val="20"/>
-        </w:rPr>
-        <w:t xml:space="preserve">À compléter : dates et lieux des sessions de formation</w:t>
-      </w:r>
-    </w:p>
-    <w:p>
-      <w:pPr>
-        <w:keepNext/>
-        <w:pBdr>
-          <w:bottom w:val="single" w:color="8A9E28" w:sz="8" w:space="4"/>
-        </w:pBdr>
-        <w:spacing w:after="140" w:before="320"/>
-      </w:pPr>
-      <w:r>
-        <w:rPr>
-          <w:rFonts w:ascii="Calibri" w:cs="Calibri" w:eastAsia="Calibri" w:hAnsi="Calibri"/>
-          <w:b/>
-          <w:bCs/>
-          <w:color w:val="8A9E28"/>
-          <w:sz w:val="26"/>
-          <w:szCs w:val="26"/>
-        </w:rPr>
-        <w:t xml:space="preserve">9. </w:t>
-      </w:r>
-      <w:r>
-        <w:rPr>
-          <w:rFonts w:ascii="Calibri" w:cs="Calibri" w:eastAsia="Calibri" w:hAnsi="Calibri"/>
-          <w:b/>
-          <w:bCs/>
-          <w:color w:val="C0392B"/>
-          <w:sz w:val="26"/>
-          <w:szCs w:val="26"/>
-        </w:rPr>
-        <w:t xml:space="preserve">Tenue vestimentaire et savoir-être</w:t>
+          <w:sz w:val="21"/>
+          <w:szCs w:val="21"/>
+        </w:rPr>
+        <w:t xml:space="preserve">1 €</w:t>
+      </w:r>
+      <w:r>
+        <w:rPr>
+          <w:rFonts w:ascii="Calibri" w:cs="Calibri" w:eastAsia="Calibri" w:hAnsi="Calibri"/>
+          <w:color w:val="2E2E2E"/>
+          <w:sz w:val="21"/>
+          <w:szCs w:val="21"/>
+        </w:rPr>
+        <w:t xml:space="preserve">, réparti entre les moniteurs au prorata de l’utilisation que chacun fait de ces balles.</w:t>
+      </w:r>
+    </w:p>
+    <w:p>
+      <w:pPr>
+        <w:spacing w:after="100" w:before="0" w:line="276"/>
+      </w:pPr>
+      <w:r>
+        <w:rPr>
+          <w:rFonts w:ascii="Calibri" w:cs="Calibri" w:eastAsia="Calibri" w:hAnsi="Calibri"/>
+          <w:color w:val="2E2E2E"/>
+          <w:sz w:val="21"/>
+          <w:szCs w:val="21"/>
+        </w:rPr>
+        <w:t xml:space="preserve"/>
       </w:r>
     </w:p>
     <w:tbl>
@@ -2619,7 +2596,7 @@
                 <w:sz w:val="22"/>
                 <w:szCs w:val="22"/>
               </w:rPr>
-              <w:t xml:space="preserve">La tenue est OBLIGATOIRE à chaque cours.</w:t>
+              <w:t xml:space="preserve">Le réflexe qui change tout : le tour du terrain.</w:t>
             </w:r>
           </w:p>
           <w:p>
@@ -2633,7 +2610,7 @@
                 <w:sz w:val="21"/>
                 <w:szCs w:val="21"/>
               </w:rPr>
-              <w:t xml:space="preserve">Tenue Babolat ou vêtements à l’effigie du club. Pas d’exception, pas d’oubli.</w:t>
+              <w:t xml:space="preserve">Après chaque cours : fond de court, abords du filet, derrière les bâches, terrains voisins. Une balle laissée aujourd’hui est une balle manquante au comptage — et 1,95 € de votre poche.</w:t>
             </w:r>
           </w:p>
         </w:tc>
@@ -2641,7 +2618,7 @@
     </w:tbl>
     <w:p>
       <w:pPr>
-        <w:spacing w:after="120" w:before="0" w:line="276"/>
+        <w:spacing w:after="140" w:before="0" w:line="276"/>
       </w:pPr>
       <w:r>
         <w:rPr>
@@ -2655,93 +2632,65 @@
     </w:p>
     <w:p>
       <w:pPr>
-        <w:keepNext/>
-        <w:spacing w:after="60" w:before="140"/>
-      </w:pPr>
-      <w:r>
-        <w:rPr>
-          <w:rFonts w:ascii="Calibri" w:cs="Calibri" w:eastAsia="Calibri" w:hAnsi="Calibri"/>
-          <w:b/>
-          <w:bCs/>
-          <w:color w:val="8A9E28"/>
-          <w:sz w:val="21"/>
-          <w:szCs w:val="21"/>
-        </w:rPr>
-        <w:t xml:space="preserve">Les raquettes</w:t>
-      </w:r>
-    </w:p>
-    <w:p>
-      <w:pPr>
-        <w:pStyle w:val="ListParagraph"/>
-        <w:numPr>
-          <w:ilvl w:val="0"/>
-          <w:numId w:val="2"/>
-        </w:numPr>
-        <w:spacing w:after="60" w:line="264"/>
-      </w:pPr>
-      <w:r>
-        <w:rPr>
-          <w:rFonts w:ascii="Calibri" w:cs="Calibri" w:eastAsia="Calibri" w:hAnsi="Calibri"/>
-          <w:color w:val="2E2E2E"/>
-          <w:sz w:val="21"/>
-          <w:szCs w:val="21"/>
-        </w:rPr>
-        <w:t xml:space="preserve">Les raquettes qui se trouvent dans le kot sont réservées aux élèves. Elles ne sont pas là pour vous dépanner.</w:t>
-      </w:r>
-    </w:p>
-    <w:p>
-      <w:pPr>
-        <w:keepNext/>
-        <w:spacing w:after="60" w:before="140"/>
-      </w:pPr>
-      <w:r>
-        <w:rPr>
-          <w:rFonts w:ascii="Calibri" w:cs="Calibri" w:eastAsia="Calibri" w:hAnsi="Calibri"/>
-          <w:b/>
-          <w:bCs/>
-          <w:color w:val="8A9E28"/>
-          <w:sz w:val="21"/>
-          <w:szCs w:val="21"/>
-        </w:rPr>
-        <w:t xml:space="preserve">Le savoir-être</w:t>
-      </w:r>
-    </w:p>
-    <w:p>
-      <w:pPr>
-        <w:pStyle w:val="ListParagraph"/>
-        <w:numPr>
-          <w:ilvl w:val="0"/>
-          <w:numId w:val="2"/>
-        </w:numPr>
-        <w:spacing w:after="60" w:line="264"/>
-      </w:pPr>
-      <w:r>
-        <w:rPr>
-          <w:rFonts w:ascii="Calibri" w:cs="Calibri" w:eastAsia="Calibri" w:hAnsi="Calibri"/>
-          <w:color w:val="2E2E2E"/>
-          <w:sz w:val="21"/>
-          <w:szCs w:val="21"/>
-        </w:rPr>
-        <w:t xml:space="preserve">Vocabulaire et attitude corrects avec les élèves, les parents et les membres du club.</w:t>
-      </w:r>
-    </w:p>
-    <w:p>
-      <w:pPr>
-        <w:pStyle w:val="ListParagraph"/>
-        <w:numPr>
-          <w:ilvl w:val="0"/>
-          <w:numId w:val="2"/>
-        </w:numPr>
-        <w:spacing w:after="60" w:line="264"/>
-      </w:pPr>
-      <w:r>
-        <w:rPr>
-          <w:rFonts w:ascii="Calibri" w:cs="Calibri" w:eastAsia="Calibri" w:hAnsi="Calibri"/>
-          <w:color w:val="2E2E2E"/>
-          <w:sz w:val="21"/>
-          <w:szCs w:val="21"/>
-        </w:rPr>
-        <w:t xml:space="preserve">Vous représentez le club dès que vous franchissez la grille, pas seulement pendant votre heure de cours.</w:t>
+        <w:pStyle w:val="ListParagraph"/>
+        <w:numPr>
+          <w:ilvl w:val="0"/>
+          <w:numId w:val="2"/>
+        </w:numPr>
+        <w:spacing w:after="60" w:line="264"/>
+      </w:pPr>
+      <w:r>
+        <w:rPr>
+          <w:rFonts w:ascii="Calibri" w:cs="Calibri" w:eastAsia="Calibri" w:hAnsi="Calibri"/>
+          <w:i/>
+          <w:iCs/>
+          <w:color w:val="6E6E6E"/>
+          <w:sz w:val="20"/>
+          <w:szCs w:val="20"/>
+        </w:rPr>
+        <w:t xml:space="preserve">À compléter : dates des cinq comptages de la saison</w:t>
+      </w:r>
+    </w:p>
+    <w:p>
+      <w:pPr>
+        <w:pStyle w:val="ListParagraph"/>
+        <w:numPr>
+          <w:ilvl w:val="0"/>
+          <w:numId w:val="2"/>
+        </w:numPr>
+        <w:spacing w:after="60" w:line="264"/>
+      </w:pPr>
+      <w:r>
+        <w:rPr>
+          <w:rFonts w:ascii="Calibri" w:cs="Calibri" w:eastAsia="Calibri" w:hAnsi="Calibri"/>
+          <w:i/>
+          <w:iCs/>
+          <w:color w:val="6E6E6E"/>
+          <w:sz w:val="20"/>
+          <w:szCs w:val="20"/>
+        </w:rPr>
+        <w:t xml:space="preserve">À compléter : confirmer le nombre de balles dans chaque panier « A »</w:t>
+      </w:r>
+    </w:p>
+    <w:p>
+      <w:pPr>
+        <w:pStyle w:val="ListParagraph"/>
+        <w:numPr>
+          <w:ilvl w:val="0"/>
+          <w:numId w:val="2"/>
+        </w:numPr>
+        <w:spacing w:after="60" w:line="264"/>
+      </w:pPr>
+      <w:r>
+        <w:rPr>
+          <w:rFonts w:ascii="Calibri" w:cs="Calibri" w:eastAsia="Calibri" w:hAnsi="Calibri"/>
+          <w:i/>
+          <w:iCs/>
+          <w:color w:val="6E6E6E"/>
+          <w:sz w:val="20"/>
+          <w:szCs w:val="20"/>
+        </w:rPr>
+        <w:t xml:space="preserve">À compléter : qui note les heures d’utilisation des paniers « A » et des balles rouges, oranges et vertes, et où</w:t>
       </w:r>
     </w:p>
     <w:p>
@@ -2761,7 +2710,7 @@
           <w:sz w:val="26"/>
           <w:szCs w:val="26"/>
         </w:rPr>
-        <w:t xml:space="preserve">10. </w:t>
+        <w:t xml:space="preserve">5. </w:t>
       </w:r>
       <w:r>
         <w:rPr>
@@ -2772,64 +2721,83 @@
           <w:sz w:val="26"/>
           <w:szCs w:val="26"/>
         </w:rPr>
-        <w:t xml:space="preserve">Esprit d’équipe</w:t>
-      </w:r>
-    </w:p>
-    <w:p>
-      <w:pPr>
-        <w:pStyle w:val="ListParagraph"/>
-        <w:numPr>
-          <w:ilvl w:val="0"/>
-          <w:numId w:val="2"/>
-        </w:numPr>
-        <w:spacing w:after="60" w:line="264"/>
-      </w:pPr>
-      <w:r>
-        <w:rPr>
-          <w:rFonts w:ascii="Calibri" w:cs="Calibri" w:eastAsia="Calibri" w:hAnsi="Calibri"/>
-          <w:color w:val="2E2E2E"/>
-          <w:sz w:val="21"/>
-          <w:szCs w:val="21"/>
-        </w:rPr>
-        <w:t xml:space="preserve">On se soutient : un collègue en difficulté sur un groupe, on l’aide.</w:t>
-      </w:r>
-    </w:p>
-    <w:p>
-      <w:pPr>
-        <w:pStyle w:val="ListParagraph"/>
-        <w:numPr>
-          <w:ilvl w:val="0"/>
-          <w:numId w:val="2"/>
-        </w:numPr>
-        <w:spacing w:after="60" w:line="264"/>
-      </w:pPr>
-      <w:r>
-        <w:rPr>
-          <w:rFonts w:ascii="Calibri" w:cs="Calibri" w:eastAsia="Calibri" w:hAnsi="Calibri"/>
-          <w:color w:val="2E2E2E"/>
-          <w:sz w:val="21"/>
-          <w:szCs w:val="21"/>
-        </w:rPr>
-        <w:t xml:space="preserve">On partage ce qui fonctionne : exercices, jeux, façons de gérer un groupe difficile.</w:t>
-      </w:r>
-    </w:p>
-    <w:p>
-      <w:pPr>
-        <w:pStyle w:val="ListParagraph"/>
-        <w:numPr>
-          <w:ilvl w:val="0"/>
-          <w:numId w:val="2"/>
-        </w:numPr>
-        <w:spacing w:after="60" w:line="264"/>
-      </w:pPr>
-      <w:r>
-        <w:rPr>
-          <w:rFonts w:ascii="Calibri" w:cs="Calibri" w:eastAsia="Calibri" w:hAnsi="Calibri"/>
-          <w:color w:val="2E2E2E"/>
-          <w:sz w:val="21"/>
-          <w:szCs w:val="21"/>
-        </w:rPr>
-        <w:t xml:space="preserve">Les désaccords se règlent entre nous, jamais devant les élèves ou les parents.</w:t>
+        <w:t xml:space="preserve">Vacances et remplacements</w:t>
+      </w:r>
+    </w:p>
+    <w:p>
+      <w:pPr>
+        <w:pStyle w:val="ListParagraph"/>
+        <w:numPr>
+          <w:ilvl w:val="0"/>
+          <w:numId w:val="2"/>
+        </w:numPr>
+        <w:spacing w:after="60" w:line="264"/>
+      </w:pPr>
+      <w:r>
+        <w:rPr>
+          <w:rFonts w:ascii="Calibri" w:cs="Calibri" w:eastAsia="Calibri" w:hAnsi="Calibri"/>
+          <w:color w:val="2E2E2E"/>
+          <w:sz w:val="21"/>
+          <w:szCs w:val="21"/>
+        </w:rPr>
+        <w:t xml:space="preserve">Prévenez le plus tôt possible, et toujours par écrit.</w:t>
+      </w:r>
+    </w:p>
+    <w:p>
+      <w:pPr>
+        <w:pStyle w:val="ListParagraph"/>
+        <w:numPr>
+          <w:ilvl w:val="0"/>
+          <w:numId w:val="2"/>
+        </w:numPr>
+        <w:spacing w:after="60" w:line="264"/>
+      </w:pPr>
+      <w:r>
+        <w:rPr>
+          <w:rFonts w:ascii="Calibri" w:cs="Calibri" w:eastAsia="Calibri" w:hAnsi="Calibri"/>
+          <w:color w:val="2E2E2E"/>
+          <w:sz w:val="21"/>
+          <w:szCs w:val="21"/>
+        </w:rPr>
+        <w:t xml:space="preserve">Proposez vous-même un remplaçant au sein de l’équipe : c’est à vous de trouver la solution, pas au club.</w:t>
+      </w:r>
+    </w:p>
+    <w:p>
+      <w:pPr>
+        <w:pStyle w:val="ListParagraph"/>
+        <w:numPr>
+          <w:ilvl w:val="0"/>
+          <w:numId w:val="2"/>
+        </w:numPr>
+        <w:spacing w:after="60" w:line="264"/>
+      </w:pPr>
+      <w:r>
+        <w:rPr>
+          <w:rFonts w:ascii="Calibri" w:cs="Calibri" w:eastAsia="Calibri" w:hAnsi="Calibri"/>
+          <w:color w:val="2E2E2E"/>
+          <w:sz w:val="21"/>
+          <w:szCs w:val="21"/>
+        </w:rPr>
+        <w:t xml:space="preserve">Un remplacement n’est effectif qu’une fois confirmé par Marc.</w:t>
+      </w:r>
+    </w:p>
+    <w:p>
+      <w:pPr>
+        <w:pStyle w:val="ListParagraph"/>
+        <w:numPr>
+          <w:ilvl w:val="0"/>
+          <w:numId w:val="2"/>
+        </w:numPr>
+        <w:spacing w:after="60" w:line="264"/>
+      </w:pPr>
+      <w:r>
+        <w:rPr>
+          <w:rFonts w:ascii="Calibri" w:cs="Calibri" w:eastAsia="Calibri" w:hAnsi="Calibri"/>
+          <w:color w:val="2E2E2E"/>
+          <w:sz w:val="21"/>
+          <w:szCs w:val="21"/>
+        </w:rPr>
+        <w:t xml:space="preserve">Le remplaçant doit recevoir le programme du cours et la liste des élèves.</w:t>
       </w:r>
     </w:p>
     <w:p>
@@ -2850,7 +2818,7 @@
           <w:sz w:val="20"/>
           <w:szCs w:val="20"/>
         </w:rPr>
-        <w:t xml:space="preserve">À compléter : canal de communication de l’équipe pour la saison</w:t>
+        <w:t xml:space="preserve">À compléter : délai minimum de prévenance (une semaine ? deux ?)</w:t>
       </w:r>
     </w:p>
     <w:p>
@@ -2870,7 +2838,7 @@
           <w:sz w:val="26"/>
           <w:szCs w:val="26"/>
         </w:rPr>
-        <w:t xml:space="preserve">11. </w:t>
+        <w:t xml:space="preserve">6. </w:t>
       </w:r>
       <w:r>
         <w:rPr>
@@ -2881,64 +2849,75 @@
           <w:sz w:val="26"/>
           <w:szCs w:val="26"/>
         </w:rPr>
-        <w:t xml:space="preserve">Le kot : ordre et accès</w:t>
-      </w:r>
-    </w:p>
-    <w:p>
-      <w:pPr>
-        <w:pStyle w:val="ListParagraph"/>
-        <w:numPr>
-          <w:ilvl w:val="0"/>
-          <w:numId w:val="2"/>
-        </w:numPr>
-        <w:spacing w:after="60" w:line="264"/>
-      </w:pPr>
-      <w:r>
-        <w:rPr>
-          <w:rFonts w:ascii="Calibri" w:cs="Calibri" w:eastAsia="Calibri" w:hAnsi="Calibri"/>
-          <w:color w:val="2E2E2E"/>
-          <w:sz w:val="21"/>
-          <w:szCs w:val="21"/>
-        </w:rPr>
-        <w:t xml:space="preserve">Rangement après chaque cours : paniers, cônes, filets, plots. Le kot se rend dans l’état où on l’a trouvé.</w:t>
-      </w:r>
-    </w:p>
-    <w:p>
-      <w:pPr>
-        <w:pStyle w:val="ListParagraph"/>
-        <w:numPr>
-          <w:ilvl w:val="0"/>
-          <w:numId w:val="2"/>
-        </w:numPr>
-        <w:spacing w:after="60" w:line="264"/>
-      </w:pPr>
-      <w:r>
-        <w:rPr>
-          <w:rFonts w:ascii="Calibri" w:cs="Calibri" w:eastAsia="Calibri" w:hAnsi="Calibri"/>
-          <w:color w:val="2E2E2E"/>
-          <w:sz w:val="21"/>
-          <w:szCs w:val="21"/>
-        </w:rPr>
-        <w:t xml:space="preserve">Pas d’affaires personnelles laissées sur place.</w:t>
-      </w:r>
-    </w:p>
-    <w:p>
-      <w:pPr>
-        <w:pStyle w:val="ListParagraph"/>
-        <w:numPr>
-          <w:ilvl w:val="0"/>
-          <w:numId w:val="2"/>
-        </w:numPr>
-        <w:spacing w:after="60" w:line="264"/>
-      </w:pPr>
-      <w:r>
-        <w:rPr>
-          <w:rFonts w:ascii="Calibri" w:cs="Calibri" w:eastAsia="Calibri" w:hAnsi="Calibri"/>
-          <w:color w:val="2E2E2E"/>
-          <w:sz w:val="21"/>
-          <w:szCs w:val="21"/>
-        </w:rPr>
-        <w:t xml:space="preserve">Rappel : tout matériel retrouvé non rangé coûte 5 € à la cagnotte.</w:t>
+        <w:t xml:space="preserve">Ponctualité, présences et League Cup</w:t>
+      </w:r>
+    </w:p>
+    <w:p>
+      <w:pPr>
+        <w:pStyle w:val="ListParagraph"/>
+        <w:numPr>
+          <w:ilvl w:val="0"/>
+          <w:numId w:val="2"/>
+        </w:numPr>
+        <w:spacing w:after="60" w:line="264"/>
+      </w:pPr>
+      <w:r>
+        <w:rPr>
+          <w:rFonts w:ascii="Calibri" w:cs="Calibri" w:eastAsia="Calibri" w:hAnsi="Calibri"/>
+          <w:color w:val="2E2E2E"/>
+          <w:sz w:val="21"/>
+          <w:szCs w:val="21"/>
+        </w:rPr>
+        <w:t xml:space="preserve">Arriver en avance, pas à l’heure : le cours commence à l’heure dite, pas au moment où vous ouvrez le kot.</w:t>
+      </w:r>
+    </w:p>
+    <w:p>
+      <w:pPr>
+        <w:pStyle w:val="ListParagraph"/>
+        <w:numPr>
+          <w:ilvl w:val="0"/>
+          <w:numId w:val="2"/>
+        </w:numPr>
+        <w:spacing w:after="60" w:line="264"/>
+      </w:pPr>
+      <w:r>
+        <w:rPr>
+          <w:rFonts w:ascii="Calibri" w:cs="Calibri" w:eastAsia="Calibri" w:hAnsi="Calibri"/>
+          <w:b/>
+          <w:bCs/>
+          <w:color w:val="2E2E2E"/>
+          <w:sz w:val="21"/>
+          <w:szCs w:val="21"/>
+        </w:rPr>
+        <w:t xml:space="preserve">League Cup : les deux moniteurs doivent être présents</w:t>
+      </w:r>
+      <w:r>
+        <w:rPr>
+          <w:rFonts w:ascii="Calibri" w:cs="Calibri" w:eastAsia="Calibri" w:hAnsi="Calibri"/>
+          <w:color w:val="2E2E2E"/>
+          <w:sz w:val="21"/>
+          <w:szCs w:val="21"/>
+        </w:rPr>
+        <w:t xml:space="preserve">, ou prévenir en cas d’absence. C’est non négociable.</w:t>
+      </w:r>
+    </w:p>
+    <w:p>
+      <w:pPr>
+        <w:pStyle w:val="ListParagraph"/>
+        <w:numPr>
+          <w:ilvl w:val="0"/>
+          <w:numId w:val="2"/>
+        </w:numPr>
+        <w:spacing w:after="60" w:line="264"/>
+      </w:pPr>
+      <w:r>
+        <w:rPr>
+          <w:rFonts w:ascii="Calibri" w:cs="Calibri" w:eastAsia="Calibri" w:hAnsi="Calibri"/>
+          <w:color w:val="2E2E2E"/>
+          <w:sz w:val="21"/>
+          <w:szCs w:val="21"/>
+        </w:rPr>
+        <w:t xml:space="preserve">Toute absence non annoncée met un collègue en difficulté et se voit immédiatement côté parents.</w:t>
       </w:r>
     </w:p>
     <w:p>
@@ -2959,7 +2938,28 @@
           <w:sz w:val="20"/>
           <w:szCs w:val="20"/>
         </w:rPr>
-        <w:t xml:space="preserve">À compléter : qui dispose d’une clé, et règles de restitution en fin de saison</w:t>
+        <w:t xml:space="preserve">À compléter : nombre de minutes d’avance attendues avant le début du cours</w:t>
+      </w:r>
+    </w:p>
+    <w:p>
+      <w:pPr>
+        <w:pStyle w:val="ListParagraph"/>
+        <w:numPr>
+          <w:ilvl w:val="0"/>
+          <w:numId w:val="2"/>
+        </w:numPr>
+        <w:spacing w:after="60" w:line="264"/>
+      </w:pPr>
+      <w:r>
+        <w:rPr>
+          <w:rFonts w:ascii="Calibri" w:cs="Calibri" w:eastAsia="Calibri" w:hAnsi="Calibri"/>
+          <w:i/>
+          <w:iCs/>
+          <w:color w:val="6E6E6E"/>
+          <w:sz w:val="20"/>
+          <w:szCs w:val="20"/>
+        </w:rPr>
+        <w:t xml:space="preserve">À compléter : dates des League Cup de la saison</w:t>
       </w:r>
     </w:p>
     <w:p>
@@ -2979,7 +2979,7 @@
           <w:sz w:val="26"/>
           <w:szCs w:val="26"/>
         </w:rPr>
-        <w:t xml:space="preserve">12. </w:t>
+        <w:t xml:space="preserve">7. </w:t>
       </w:r>
       <w:r>
         <w:rPr>
@@ -2990,21 +2990,7 @@
           <w:sz w:val="26"/>
           <w:szCs w:val="26"/>
         </w:rPr>
-        <w:t xml:space="preserve">Les cours privés</w:t>
-      </w:r>
-    </w:p>
-    <w:p>
-      <w:pPr>
-        <w:spacing w:after="120" w:before="0" w:line="276"/>
-      </w:pPr>
-      <w:r>
-        <w:rPr>
-          <w:rFonts w:ascii="Calibri" w:cs="Calibri" w:eastAsia="Calibri" w:hAnsi="Calibri"/>
-          <w:color w:val="2E2E2E"/>
-          <w:sz w:val="21"/>
-          <w:szCs w:val="21"/>
-        </w:rPr>
-        <w:t xml:space="preserve">Lorsqu’une demande de cours privé arrive au club, je transmets aux parents vos tarifs, votre niveau de formation et vos années d’expérience. Le choix leur revient ensuite.</w:t>
+        <w:t xml:space="preserve">Les règles de base</w:t>
       </w:r>
     </w:p>
     <w:p>
@@ -3021,6 +3007,761 @@
           <w:sz w:val="21"/>
           <w:szCs w:val="21"/>
         </w:rPr>
+        <w:t xml:space="preserve">Sur le terrain</w:t>
+      </w:r>
+    </w:p>
+    <w:p>
+      <w:pPr>
+        <w:pStyle w:val="ListParagraph"/>
+        <w:numPr>
+          <w:ilvl w:val="0"/>
+          <w:numId w:val="2"/>
+        </w:numPr>
+        <w:spacing w:after="60" w:line="264"/>
+      </w:pPr>
+      <w:r>
+        <w:rPr>
+          <w:rFonts w:ascii="Calibri" w:cs="Calibri" w:eastAsia="Calibri" w:hAnsi="Calibri"/>
+          <w:b/>
+          <w:bCs/>
+          <w:color w:val="2E2E2E"/>
+          <w:sz w:val="21"/>
+          <w:szCs w:val="21"/>
+        </w:rPr>
+        <w:t xml:space="preserve">Téléphone : </w:t>
+      </w:r>
+      <w:r>
+        <w:rPr>
+          <w:rFonts w:ascii="Calibri" w:cs="Calibri" w:eastAsia="Calibri" w:hAnsi="Calibri"/>
+          <w:color w:val="2E2E2E"/>
+          <w:sz w:val="21"/>
+          <w:szCs w:val="21"/>
+        </w:rPr>
+        <w:t xml:space="preserve">rangé, hors de vue, pas d’utilisation pendant le cours. Sauf urgence réelle.</w:t>
+      </w:r>
+    </w:p>
+    <w:p>
+      <w:pPr>
+        <w:pStyle w:val="ListParagraph"/>
+        <w:numPr>
+          <w:ilvl w:val="0"/>
+          <w:numId w:val="2"/>
+        </w:numPr>
+        <w:spacing w:after="60" w:line="264"/>
+      </w:pPr>
+      <w:r>
+        <w:rPr>
+          <w:rFonts w:ascii="Calibri" w:cs="Calibri" w:eastAsia="Calibri" w:hAnsi="Calibri"/>
+          <w:b/>
+          <w:bCs/>
+          <w:color w:val="2E2E2E"/>
+          <w:sz w:val="21"/>
+          <w:szCs w:val="21"/>
+        </w:rPr>
+        <w:t xml:space="preserve">Ne pas quitter le terrain </w:t>
+      </w:r>
+      <w:r>
+        <w:rPr>
+          <w:rFonts w:ascii="Calibri" w:cs="Calibri" w:eastAsia="Calibri" w:hAnsi="Calibri"/>
+          <w:color w:val="2E2E2E"/>
+          <w:sz w:val="21"/>
+          <w:szCs w:val="21"/>
+        </w:rPr>
+        <w:t xml:space="preserve">pendant un cours : les enfants ne restent jamais seuls.</w:t>
+      </w:r>
+    </w:p>
+    <w:p>
+      <w:pPr>
+        <w:pStyle w:val="ListParagraph"/>
+        <w:numPr>
+          <w:ilvl w:val="0"/>
+          <w:numId w:val="2"/>
+        </w:numPr>
+        <w:spacing w:after="60" w:line="264"/>
+      </w:pPr>
+      <w:r>
+        <w:rPr>
+          <w:rFonts w:ascii="Calibri" w:cs="Calibri" w:eastAsia="Calibri" w:hAnsi="Calibri"/>
+          <w:b/>
+          <w:bCs/>
+          <w:color w:val="2E2E2E"/>
+          <w:sz w:val="21"/>
+          <w:szCs w:val="21"/>
+        </w:rPr>
+        <w:t xml:space="preserve">Commencer et terminer à l’heure. </w:t>
+      </w:r>
+      <w:r>
+        <w:rPr>
+          <w:rFonts w:ascii="Calibri" w:cs="Calibri" w:eastAsia="Calibri" w:hAnsi="Calibri"/>
+          <w:color w:val="2E2E2E"/>
+          <w:sz w:val="21"/>
+          <w:szCs w:val="21"/>
+        </w:rPr>
+        <w:t xml:space="preserve">Un cours qui déborde décale tout le monde.</w:t>
+      </w:r>
+    </w:p>
+    <w:p>
+      <w:pPr>
+        <w:keepNext/>
+        <w:spacing w:after="60" w:before="140"/>
+      </w:pPr>
+      <w:r>
+        <w:rPr>
+          <w:rFonts w:ascii="Calibri" w:cs="Calibri" w:eastAsia="Calibri" w:hAnsi="Calibri"/>
+          <w:b/>
+          <w:bCs/>
+          <w:color w:val="8A9E28"/>
+          <w:sz w:val="21"/>
+          <w:szCs w:val="21"/>
+        </w:rPr>
+        <w:t xml:space="preserve">Entre les cours</w:t>
+      </w:r>
+    </w:p>
+    <w:p>
+      <w:pPr>
+        <w:pStyle w:val="ListParagraph"/>
+        <w:numPr>
+          <w:ilvl w:val="0"/>
+          <w:numId w:val="2"/>
+        </w:numPr>
+        <w:spacing w:after="60" w:line="264"/>
+      </w:pPr>
+      <w:r>
+        <w:rPr>
+          <w:rFonts w:ascii="Calibri" w:cs="Calibri" w:eastAsia="Calibri" w:hAnsi="Calibri"/>
+          <w:color w:val="2E2E2E"/>
+          <w:sz w:val="21"/>
+          <w:szCs w:val="21"/>
+        </w:rPr>
+        <w:t xml:space="preserve">Les pauses restent courtes : le cours suivant commence à l’heure prévue.</w:t>
+      </w:r>
+    </w:p>
+    <w:p>
+      <w:pPr>
+        <w:pStyle w:val="ListParagraph"/>
+        <w:numPr>
+          <w:ilvl w:val="0"/>
+          <w:numId w:val="2"/>
+        </w:numPr>
+        <w:spacing w:after="60" w:line="264"/>
+      </w:pPr>
+      <w:r>
+        <w:rPr>
+          <w:rFonts w:ascii="Calibri" w:cs="Calibri" w:eastAsia="Calibri" w:hAnsi="Calibri"/>
+          <w:color w:val="2E2E2E"/>
+          <w:sz w:val="21"/>
+          <w:szCs w:val="21"/>
+        </w:rPr>
+        <w:t xml:space="preserve">Cigarettes : jamais devant les élèves, jamais sur les terrains, jamais en tenue de moniteur à l’entrée du club.</w:t>
+      </w:r>
+    </w:p>
+    <w:p>
+      <w:pPr>
+        <w:keepNext/>
+        <w:pBdr>
+          <w:bottom w:val="single" w:color="8A9E28" w:sz="8" w:space="4"/>
+        </w:pBdr>
+        <w:spacing w:after="140" w:before="320"/>
+      </w:pPr>
+      <w:r>
+        <w:rPr>
+          <w:rFonts w:ascii="Calibri" w:cs="Calibri" w:eastAsia="Calibri" w:hAnsi="Calibri"/>
+          <w:b/>
+          <w:bCs/>
+          <w:color w:val="8A9E28"/>
+          <w:sz w:val="26"/>
+          <w:szCs w:val="26"/>
+        </w:rPr>
+        <w:t xml:space="preserve">8. </w:t>
+      </w:r>
+      <w:r>
+        <w:rPr>
+          <w:rFonts w:ascii="Calibri" w:cs="Calibri" w:eastAsia="Calibri" w:hAnsi="Calibri"/>
+          <w:b/>
+          <w:bCs/>
+          <w:color w:val="C0392B"/>
+          <w:sz w:val="26"/>
+          <w:szCs w:val="26"/>
+        </w:rPr>
+        <w:t xml:space="preserve">Formations</w:t>
+      </w:r>
+    </w:p>
+    <w:p>
+      <w:pPr>
+        <w:pStyle w:val="ListParagraph"/>
+        <w:numPr>
+          <w:ilvl w:val="0"/>
+          <w:numId w:val="2"/>
+        </w:numPr>
+        <w:spacing w:after="60" w:line="264"/>
+      </w:pPr>
+      <w:r>
+        <w:rPr>
+          <w:rFonts w:ascii="Calibri" w:cs="Calibri" w:eastAsia="Calibri" w:hAnsi="Calibri"/>
+          <w:color w:val="2E2E2E"/>
+          <w:sz w:val="21"/>
+          <w:szCs w:val="21"/>
+        </w:rPr>
+        <w:t xml:space="preserve">Le club rembourse la formation et une hausse salariale suit l’obtention du niveau.</w:t>
+      </w:r>
+    </w:p>
+    <w:p>
+      <w:pPr>
+        <w:pStyle w:val="ListParagraph"/>
+        <w:numPr>
+          <w:ilvl w:val="0"/>
+          <w:numId w:val="2"/>
+        </w:numPr>
+        <w:spacing w:after="60" w:line="264"/>
+      </w:pPr>
+      <w:r>
+        <w:rPr>
+          <w:rFonts w:ascii="Calibri" w:cs="Calibri" w:eastAsia="Calibri" w:hAnsi="Calibri"/>
+          <w:b/>
+          <w:bCs/>
+          <w:color w:val="C0392B"/>
+          <w:sz w:val="21"/>
+          <w:szCs w:val="21"/>
+        </w:rPr>
+        <w:t xml:space="preserve">Question posée à chacun : qui s’engage à faire son niveau 1 cette saison ?</w:t>
+      </w:r>
+    </w:p>
+    <w:p>
+      <w:pPr>
+        <w:pStyle w:val="ListParagraph"/>
+        <w:numPr>
+          <w:ilvl w:val="0"/>
+          <w:numId w:val="2"/>
+        </w:numPr>
+        <w:spacing w:after="60" w:line="264"/>
+      </w:pPr>
+      <w:r>
+        <w:rPr>
+          <w:rFonts w:ascii="Calibri" w:cs="Calibri" w:eastAsia="Calibri" w:hAnsi="Calibri"/>
+          <w:i/>
+          <w:iCs/>
+          <w:color w:val="6E6E6E"/>
+          <w:sz w:val="20"/>
+          <w:szCs w:val="20"/>
+        </w:rPr>
+        <w:t xml:space="preserve">À compléter : conditions exactes du remboursement (avance, remboursement après réussite, engagement de durée)</w:t>
+      </w:r>
+    </w:p>
+    <w:p>
+      <w:pPr>
+        <w:pStyle w:val="ListParagraph"/>
+        <w:numPr>
+          <w:ilvl w:val="0"/>
+          <w:numId w:val="2"/>
+        </w:numPr>
+        <w:spacing w:after="60" w:line="264"/>
+      </w:pPr>
+      <w:r>
+        <w:rPr>
+          <w:rFonts w:ascii="Calibri" w:cs="Calibri" w:eastAsia="Calibri" w:hAnsi="Calibri"/>
+          <w:i/>
+          <w:iCs/>
+          <w:color w:val="6E6E6E"/>
+          <w:sz w:val="20"/>
+          <w:szCs w:val="20"/>
+        </w:rPr>
+        <w:t xml:space="preserve">À compléter : barème salarial par niveau de formation</w:t>
+      </w:r>
+    </w:p>
+    <w:p>
+      <w:pPr>
+        <w:pStyle w:val="ListParagraph"/>
+        <w:numPr>
+          <w:ilvl w:val="0"/>
+          <w:numId w:val="2"/>
+        </w:numPr>
+        <w:spacing w:after="60" w:line="264"/>
+      </w:pPr>
+      <w:r>
+        <w:rPr>
+          <w:rFonts w:ascii="Calibri" w:cs="Calibri" w:eastAsia="Calibri" w:hAnsi="Calibri"/>
+          <w:i/>
+          <w:iCs/>
+          <w:color w:val="6E6E6E"/>
+          <w:sz w:val="20"/>
+          <w:szCs w:val="20"/>
+        </w:rPr>
+        <w:t xml:space="preserve">À compléter : dates et lieux des sessions de formation</w:t>
+      </w:r>
+    </w:p>
+    <w:p>
+      <w:pPr>
+        <w:keepNext/>
+        <w:pBdr>
+          <w:bottom w:val="single" w:color="8A9E28" w:sz="8" w:space="4"/>
+        </w:pBdr>
+        <w:spacing w:after="140" w:before="320"/>
+      </w:pPr>
+      <w:r>
+        <w:rPr>
+          <w:rFonts w:ascii="Calibri" w:cs="Calibri" w:eastAsia="Calibri" w:hAnsi="Calibri"/>
+          <w:b/>
+          <w:bCs/>
+          <w:color w:val="8A9E28"/>
+          <w:sz w:val="26"/>
+          <w:szCs w:val="26"/>
+        </w:rPr>
+        <w:t xml:space="preserve">9. </w:t>
+      </w:r>
+      <w:r>
+        <w:rPr>
+          <w:rFonts w:ascii="Calibri" w:cs="Calibri" w:eastAsia="Calibri" w:hAnsi="Calibri"/>
+          <w:b/>
+          <w:bCs/>
+          <w:color w:val="C0392B"/>
+          <w:sz w:val="26"/>
+          <w:szCs w:val="26"/>
+        </w:rPr>
+        <w:t xml:space="preserve">Tenue vestimentaire et savoir-être</w:t>
+      </w:r>
+    </w:p>
+    <w:tbl>
+      <w:tblPr>
+        <w:tblW w:type="dxa" w:w="9637"/>
+        <w:tblBorders>
+          <w:top w:val="single" w:color="8A9E28" w:sz="6"/>
+          <w:left w:val="single" w:color="C0392B" w:sz="24"/>
+          <w:bottom w:val="single" w:color="8A9E28" w:sz="6"/>
+          <w:right w:val="single" w:color="8A9E28" w:sz="6"/>
+          <w:insideH w:val="none" w:color="FFFFFF" w:sz="0"/>
+          <w:insideV w:val="none" w:color="FFFFFF" w:sz="0"/>
+        </w:tblBorders>
+      </w:tblPr>
+      <w:tblGrid>
+        <w:gridCol w:w="9637"/>
+      </w:tblGrid>
+      <w:tr>
+        <w:tc>
+          <w:tcPr>
+            <w:tcW w:type="dxa" w:w="9637"/>
+            <w:shd w:fill="F4F6EA" w:color="auto" w:val="clear"/>
+            <w:tcMar>
+              <w:top w:type="dxa" w:w="170"/>
+              <w:left w:type="dxa" w:w="226"/>
+              <w:bottom w:type="dxa" w:w="170"/>
+              <w:right w:type="dxa" w:w="226"/>
+            </w:tcMar>
+          </w:tcPr>
+          <w:p>
+            <w:pPr>
+              <w:spacing w:after="80" w:before="0" w:line="276"/>
+            </w:pPr>
+            <w:r>
+              <w:rPr>
+                <w:rFonts w:ascii="Calibri" w:cs="Calibri" w:eastAsia="Calibri" w:hAnsi="Calibri"/>
+                <w:b/>
+                <w:bCs/>
+                <w:color w:val="C0392B"/>
+                <w:sz w:val="22"/>
+                <w:szCs w:val="22"/>
+              </w:rPr>
+              <w:t xml:space="preserve">La tenue est OBLIGATOIRE à chaque cours.</w:t>
+            </w:r>
+          </w:p>
+          <w:p>
+            <w:pPr>
+              <w:spacing w:after="0" w:before="0" w:line="276"/>
+            </w:pPr>
+            <w:r>
+              <w:rPr>
+                <w:rFonts w:ascii="Calibri" w:cs="Calibri" w:eastAsia="Calibri" w:hAnsi="Calibri"/>
+                <w:color w:val="2E2E2E"/>
+                <w:sz w:val="21"/>
+                <w:szCs w:val="21"/>
+              </w:rPr>
+              <w:t xml:space="preserve">Tenue Babolat ou vêtements à l’effigie du club. Pas d’exception, pas d’oubli.</w:t>
+            </w:r>
+          </w:p>
+        </w:tc>
+      </w:tr>
+    </w:tbl>
+    <w:p>
+      <w:pPr>
+        <w:spacing w:after="120" w:before="0" w:line="276"/>
+      </w:pPr>
+      <w:r>
+        <w:rPr>
+          <w:rFonts w:ascii="Calibri" w:cs="Calibri" w:eastAsia="Calibri" w:hAnsi="Calibri"/>
+          <w:color w:val="2E2E2E"/>
+          <w:sz w:val="21"/>
+          <w:szCs w:val="21"/>
+        </w:rPr>
+        <w:t xml:space="preserve"/>
+      </w:r>
+    </w:p>
+    <w:p>
+      <w:pPr>
+        <w:keepNext/>
+        <w:spacing w:after="60" w:before="140"/>
+      </w:pPr>
+      <w:r>
+        <w:rPr>
+          <w:rFonts w:ascii="Calibri" w:cs="Calibri" w:eastAsia="Calibri" w:hAnsi="Calibri"/>
+          <w:b/>
+          <w:bCs/>
+          <w:color w:val="8A9E28"/>
+          <w:sz w:val="21"/>
+          <w:szCs w:val="21"/>
+        </w:rPr>
+        <w:t xml:space="preserve">Les raquettes</w:t>
+      </w:r>
+    </w:p>
+    <w:p>
+      <w:pPr>
+        <w:pStyle w:val="ListParagraph"/>
+        <w:numPr>
+          <w:ilvl w:val="0"/>
+          <w:numId w:val="2"/>
+        </w:numPr>
+        <w:spacing w:after="60" w:line="264"/>
+      </w:pPr>
+      <w:r>
+        <w:rPr>
+          <w:rFonts w:ascii="Calibri" w:cs="Calibri" w:eastAsia="Calibri" w:hAnsi="Calibri"/>
+          <w:color w:val="2E2E2E"/>
+          <w:sz w:val="21"/>
+          <w:szCs w:val="21"/>
+        </w:rPr>
+        <w:t xml:space="preserve">Les raquettes qui se trouvent dans le kot sont réservées aux élèves. Elles ne sont pas là pour vous dépanner.</w:t>
+      </w:r>
+    </w:p>
+    <w:p>
+      <w:pPr>
+        <w:keepNext/>
+        <w:spacing w:after="60" w:before="140"/>
+      </w:pPr>
+      <w:r>
+        <w:rPr>
+          <w:rFonts w:ascii="Calibri" w:cs="Calibri" w:eastAsia="Calibri" w:hAnsi="Calibri"/>
+          <w:b/>
+          <w:bCs/>
+          <w:color w:val="8A9E28"/>
+          <w:sz w:val="21"/>
+          <w:szCs w:val="21"/>
+        </w:rPr>
+        <w:t xml:space="preserve">Le savoir-être</w:t>
+      </w:r>
+    </w:p>
+    <w:p>
+      <w:pPr>
+        <w:pStyle w:val="ListParagraph"/>
+        <w:numPr>
+          <w:ilvl w:val="0"/>
+          <w:numId w:val="2"/>
+        </w:numPr>
+        <w:spacing w:after="60" w:line="264"/>
+      </w:pPr>
+      <w:r>
+        <w:rPr>
+          <w:rFonts w:ascii="Calibri" w:cs="Calibri" w:eastAsia="Calibri" w:hAnsi="Calibri"/>
+          <w:color w:val="2E2E2E"/>
+          <w:sz w:val="21"/>
+          <w:szCs w:val="21"/>
+        </w:rPr>
+        <w:t xml:space="preserve">Vocabulaire et attitude corrects avec les élèves, les parents et les membres du club.</w:t>
+      </w:r>
+    </w:p>
+    <w:p>
+      <w:pPr>
+        <w:pStyle w:val="ListParagraph"/>
+        <w:numPr>
+          <w:ilvl w:val="0"/>
+          <w:numId w:val="2"/>
+        </w:numPr>
+        <w:spacing w:after="60" w:line="264"/>
+      </w:pPr>
+      <w:r>
+        <w:rPr>
+          <w:rFonts w:ascii="Calibri" w:cs="Calibri" w:eastAsia="Calibri" w:hAnsi="Calibri"/>
+          <w:color w:val="2E2E2E"/>
+          <w:sz w:val="21"/>
+          <w:szCs w:val="21"/>
+        </w:rPr>
+        <w:t xml:space="preserve">Vous représentez le club dès que vous franchissez la grille, pas seulement pendant votre heure de cours.</w:t>
+      </w:r>
+    </w:p>
+    <w:p>
+      <w:pPr>
+        <w:keepNext/>
+        <w:pBdr>
+          <w:bottom w:val="single" w:color="8A9E28" w:sz="8" w:space="4"/>
+        </w:pBdr>
+        <w:spacing w:after="140" w:before="320"/>
+      </w:pPr>
+      <w:r>
+        <w:rPr>
+          <w:rFonts w:ascii="Calibri" w:cs="Calibri" w:eastAsia="Calibri" w:hAnsi="Calibri"/>
+          <w:b/>
+          <w:bCs/>
+          <w:color w:val="8A9E28"/>
+          <w:sz w:val="26"/>
+          <w:szCs w:val="26"/>
+        </w:rPr>
+        <w:t xml:space="preserve">10. </w:t>
+      </w:r>
+      <w:r>
+        <w:rPr>
+          <w:rFonts w:ascii="Calibri" w:cs="Calibri" w:eastAsia="Calibri" w:hAnsi="Calibri"/>
+          <w:b/>
+          <w:bCs/>
+          <w:color w:val="C0392B"/>
+          <w:sz w:val="26"/>
+          <w:szCs w:val="26"/>
+        </w:rPr>
+        <w:t xml:space="preserve">Esprit d’équipe</w:t>
+      </w:r>
+    </w:p>
+    <w:p>
+      <w:pPr>
+        <w:pStyle w:val="ListParagraph"/>
+        <w:numPr>
+          <w:ilvl w:val="0"/>
+          <w:numId w:val="2"/>
+        </w:numPr>
+        <w:spacing w:after="60" w:line="264"/>
+      </w:pPr>
+      <w:r>
+        <w:rPr>
+          <w:rFonts w:ascii="Calibri" w:cs="Calibri" w:eastAsia="Calibri" w:hAnsi="Calibri"/>
+          <w:color w:val="2E2E2E"/>
+          <w:sz w:val="21"/>
+          <w:szCs w:val="21"/>
+        </w:rPr>
+        <w:t xml:space="preserve">On se soutient : un collègue en difficulté sur un groupe, on l’aide.</w:t>
+      </w:r>
+    </w:p>
+    <w:p>
+      <w:pPr>
+        <w:pStyle w:val="ListParagraph"/>
+        <w:numPr>
+          <w:ilvl w:val="0"/>
+          <w:numId w:val="2"/>
+        </w:numPr>
+        <w:spacing w:after="60" w:line="264"/>
+      </w:pPr>
+      <w:r>
+        <w:rPr>
+          <w:rFonts w:ascii="Calibri" w:cs="Calibri" w:eastAsia="Calibri" w:hAnsi="Calibri"/>
+          <w:color w:val="2E2E2E"/>
+          <w:sz w:val="21"/>
+          <w:szCs w:val="21"/>
+        </w:rPr>
+        <w:t xml:space="preserve">On partage ce qui fonctionne : exercices, jeux, façons de gérer un groupe difficile.</w:t>
+      </w:r>
+    </w:p>
+    <w:p>
+      <w:pPr>
+        <w:pStyle w:val="ListParagraph"/>
+        <w:numPr>
+          <w:ilvl w:val="0"/>
+          <w:numId w:val="2"/>
+        </w:numPr>
+        <w:spacing w:after="60" w:line="264"/>
+      </w:pPr>
+      <w:r>
+        <w:rPr>
+          <w:rFonts w:ascii="Calibri" w:cs="Calibri" w:eastAsia="Calibri" w:hAnsi="Calibri"/>
+          <w:color w:val="2E2E2E"/>
+          <w:sz w:val="21"/>
+          <w:szCs w:val="21"/>
+        </w:rPr>
+        <w:t xml:space="preserve">Les désaccords se règlent entre nous, jamais devant les élèves ou les parents.</w:t>
+      </w:r>
+    </w:p>
+    <w:p>
+      <w:pPr>
+        <w:pStyle w:val="ListParagraph"/>
+        <w:numPr>
+          <w:ilvl w:val="0"/>
+          <w:numId w:val="2"/>
+        </w:numPr>
+        <w:spacing w:after="60" w:line="264"/>
+      </w:pPr>
+      <w:r>
+        <w:rPr>
+          <w:rFonts w:ascii="Calibri" w:cs="Calibri" w:eastAsia="Calibri" w:hAnsi="Calibri"/>
+          <w:i/>
+          <w:iCs/>
+          <w:color w:val="6E6E6E"/>
+          <w:sz w:val="20"/>
+          <w:szCs w:val="20"/>
+        </w:rPr>
+        <w:t xml:space="preserve">À compléter : canal de communication de l’équipe pour la saison</w:t>
+      </w:r>
+    </w:p>
+    <w:p>
+      <w:pPr>
+        <w:keepNext/>
+        <w:pBdr>
+          <w:bottom w:val="single" w:color="8A9E28" w:sz="8" w:space="4"/>
+        </w:pBdr>
+        <w:spacing w:after="140" w:before="320"/>
+      </w:pPr>
+      <w:r>
+        <w:rPr>
+          <w:rFonts w:ascii="Calibri" w:cs="Calibri" w:eastAsia="Calibri" w:hAnsi="Calibri"/>
+          <w:b/>
+          <w:bCs/>
+          <w:color w:val="8A9E28"/>
+          <w:sz w:val="26"/>
+          <w:szCs w:val="26"/>
+        </w:rPr>
+        <w:t xml:space="preserve">11. </w:t>
+      </w:r>
+      <w:r>
+        <w:rPr>
+          <w:rFonts w:ascii="Calibri" w:cs="Calibri" w:eastAsia="Calibri" w:hAnsi="Calibri"/>
+          <w:b/>
+          <w:bCs/>
+          <w:color w:val="C0392B"/>
+          <w:sz w:val="26"/>
+          <w:szCs w:val="26"/>
+        </w:rPr>
+        <w:t xml:space="preserve">Le kot : ordre et accès</w:t>
+      </w:r>
+    </w:p>
+    <w:p>
+      <w:pPr>
+        <w:pStyle w:val="ListParagraph"/>
+        <w:numPr>
+          <w:ilvl w:val="0"/>
+          <w:numId w:val="2"/>
+        </w:numPr>
+        <w:spacing w:after="60" w:line="264"/>
+      </w:pPr>
+      <w:r>
+        <w:rPr>
+          <w:rFonts w:ascii="Calibri" w:cs="Calibri" w:eastAsia="Calibri" w:hAnsi="Calibri"/>
+          <w:color w:val="2E2E2E"/>
+          <w:sz w:val="21"/>
+          <w:szCs w:val="21"/>
+        </w:rPr>
+        <w:t xml:space="preserve">Rangement après chaque cours : paniers, cônes, filets, plots. Le kot se rend dans l’état où on l’a trouvé.</w:t>
+      </w:r>
+    </w:p>
+    <w:p>
+      <w:pPr>
+        <w:pStyle w:val="ListParagraph"/>
+        <w:numPr>
+          <w:ilvl w:val="0"/>
+          <w:numId w:val="2"/>
+        </w:numPr>
+        <w:spacing w:after="60" w:line="264"/>
+      </w:pPr>
+      <w:r>
+        <w:rPr>
+          <w:rFonts w:ascii="Calibri" w:cs="Calibri" w:eastAsia="Calibri" w:hAnsi="Calibri"/>
+          <w:color w:val="2E2E2E"/>
+          <w:sz w:val="21"/>
+          <w:szCs w:val="21"/>
+        </w:rPr>
+        <w:t xml:space="preserve">Pas d’affaires personnelles laissées sur place.</w:t>
+      </w:r>
+    </w:p>
+    <w:p>
+      <w:pPr>
+        <w:pStyle w:val="ListParagraph"/>
+        <w:numPr>
+          <w:ilvl w:val="0"/>
+          <w:numId w:val="2"/>
+        </w:numPr>
+        <w:spacing w:after="60" w:line="264"/>
+      </w:pPr>
+      <w:r>
+        <w:rPr>
+          <w:rFonts w:ascii="Calibri" w:cs="Calibri" w:eastAsia="Calibri" w:hAnsi="Calibri"/>
+          <w:color w:val="2E2E2E"/>
+          <w:sz w:val="21"/>
+          <w:szCs w:val="21"/>
+        </w:rPr>
+        <w:t xml:space="preserve">Le matériel commun (paniers, cônes, filets, plots) reste sous la responsabilité de tous : on le range après chaque cours.</w:t>
+      </w:r>
+    </w:p>
+    <w:p>
+      <w:pPr>
+        <w:pStyle w:val="ListParagraph"/>
+        <w:numPr>
+          <w:ilvl w:val="0"/>
+          <w:numId w:val="2"/>
+        </w:numPr>
+        <w:spacing w:after="60" w:line="264"/>
+      </w:pPr>
+      <w:r>
+        <w:rPr>
+          <w:rFonts w:ascii="Calibri" w:cs="Calibri" w:eastAsia="Calibri" w:hAnsi="Calibri"/>
+          <w:i/>
+          <w:iCs/>
+          <w:color w:val="6E6E6E"/>
+          <w:sz w:val="20"/>
+          <w:szCs w:val="20"/>
+        </w:rPr>
+        <w:t xml:space="preserve">À compléter : qui dispose d’une clé, et règles de restitution en fin de saison</w:t>
+      </w:r>
+    </w:p>
+    <w:p>
+      <w:pPr>
+        <w:keepNext/>
+        <w:pBdr>
+          <w:bottom w:val="single" w:color="8A9E28" w:sz="8" w:space="4"/>
+        </w:pBdr>
+        <w:spacing w:after="140" w:before="320"/>
+      </w:pPr>
+      <w:r>
+        <w:rPr>
+          <w:rFonts w:ascii="Calibri" w:cs="Calibri" w:eastAsia="Calibri" w:hAnsi="Calibri"/>
+          <w:b/>
+          <w:bCs/>
+          <w:color w:val="8A9E28"/>
+          <w:sz w:val="26"/>
+          <w:szCs w:val="26"/>
+        </w:rPr>
+        <w:t xml:space="preserve">12. </w:t>
+      </w:r>
+      <w:r>
+        <w:rPr>
+          <w:rFonts w:ascii="Calibri" w:cs="Calibri" w:eastAsia="Calibri" w:hAnsi="Calibri"/>
+          <w:b/>
+          <w:bCs/>
+          <w:color w:val="C0392B"/>
+          <w:sz w:val="26"/>
+          <w:szCs w:val="26"/>
+        </w:rPr>
+        <w:t xml:space="preserve">Les cours privés</w:t>
+      </w:r>
+    </w:p>
+    <w:p>
+      <w:pPr>
+        <w:spacing w:after="120" w:before="0" w:line="276"/>
+      </w:pPr>
+      <w:r>
+        <w:rPr>
+          <w:rFonts w:ascii="Calibri" w:cs="Calibri" w:eastAsia="Calibri" w:hAnsi="Calibri"/>
+          <w:color w:val="2E2E2E"/>
+          <w:sz w:val="21"/>
+          <w:szCs w:val="21"/>
+        </w:rPr>
+        <w:t xml:space="preserve">Lorsqu’une demande de cours privé arrive au club, je transmets aux parents vos tarifs, votre niveau de formation et vos années d’expérience. Le choix leur revient ensuite.</w:t>
+      </w:r>
+    </w:p>
+    <w:p>
+      <w:pPr>
+        <w:keepNext/>
+        <w:spacing w:after="60" w:before="140"/>
+      </w:pPr>
+      <w:r>
+        <w:rPr>
+          <w:rFonts w:ascii="Calibri" w:cs="Calibri" w:eastAsia="Calibri" w:hAnsi="Calibri"/>
+          <w:b/>
+          <w:bCs/>
+          <w:color w:val="8A9E28"/>
+          <w:sz w:val="21"/>
+          <w:szCs w:val="21"/>
+        </w:rPr>
         <w:t xml:space="preserve">Le terrain</w:t>
       </w:r>
     </w:p>
@@ -3042,7 +3783,7 @@
           <w:sz w:val="21"/>
           <w:szCs w:val="21"/>
         </w:rPr>
-        <w:t xml:space="preserve">15 € de l’heure</w:t>
+        <w:t xml:space="preserve">15 € de l’heure</w:t>
       </w:r>
       <w:r>
         <w:rPr>

</xml_diff>

<commit_message>
Restructure le point 4 : constat d'échec puis nouveau système
Reprend la structure du document relu : l'ancien dispositif est cité en
encadré gris comme rappel, suivi du constat d'échec, puis du nouveau
système sur sa propre page. Ajoute le calendrier des quatre comptages
(7, 7, 6 et 8 semaines) avec une colonne à remplir, et aligne les balles
rouges, oranges et vertes sur ce même calendrier.

Co-Authored-By: Claude Opus 5 <noreply@anthropic.com>
Claude-Session: https://claude.ai/code/session_01RsDkbcD3KwyPviDTcs72WZ
</commit_message>
<xml_diff>
--- a/Reunion_moniteurs_2026-2027.docx
+++ b/Reunion_moniteurs_2026-2027.docx
@@ -400,7 +400,7 @@
                 <w:sz w:val="21"/>
                 <w:szCs w:val="21"/>
               </w:rPr>
-              <w:t xml:space="preserve">Balles et matériel : le nouveau système</w:t>
+              <w:t xml:space="preserve">Balles et matériel</w:t>
             </w:r>
           </w:p>
         </w:tc>
@@ -1612,7 +1612,243 @@
           <w:sz w:val="26"/>
           <w:szCs w:val="26"/>
         </w:rPr>
-        <w:t xml:space="preserve">Balles et matériel : le nouveau système</w:t>
+        <w:t xml:space="preserve">Balles et matériel</w:t>
+      </w:r>
+    </w:p>
+    <w:p>
+      <w:pPr>
+        <w:spacing w:after="160" w:before="0" w:line="276"/>
+      </w:pPr>
+      <w:r>
+        <w:rPr>
+          <w:rFonts w:ascii="Calibri" w:cs="Calibri" w:eastAsia="Calibri" w:hAnsi="Calibri"/>
+          <w:b/>
+          <w:bCs/>
+          <w:color w:val="2E2E2E"/>
+          <w:sz w:val="22"/>
+          <w:szCs w:val="22"/>
+        </w:rPr>
+        <w:t xml:space="preserve">Le système mis en place l’an dernier est un échec.</w:t>
+      </w:r>
+    </w:p>
+    <w:p>
+      <w:pPr>
+        <w:spacing w:after="70" w:before="0" w:line="276"/>
+      </w:pPr>
+      <w:r>
+        <w:rPr>
+          <w:rFonts w:ascii="Calibri" w:cs="Calibri" w:eastAsia="Calibri" w:hAnsi="Calibri"/>
+          <w:b/>
+          <w:bCs/>
+          <w:color w:val="6E6E6E"/>
+          <w:sz w:val="16"/>
+          <w:szCs w:val="16"/>
+        </w:rPr>
+        <w:t xml:space="preserve">CE QUI AVAIT ÉTÉ DÉCIDÉ L’AN DERNIER</w:t>
+      </w:r>
+    </w:p>
+    <w:tbl>
+      <w:tblPr>
+        <w:tblW w:type="dxa" w:w="9637"/>
+        <w:tblBorders>
+          <w:top w:val="none" w:color="FFFFFF" w:sz="0"/>
+          <w:left w:val="single" w:color="BBBBBB" w:sz="18"/>
+          <w:bottom w:val="none" w:color="FFFFFF" w:sz="0"/>
+          <w:right w:val="none" w:color="FFFFFF" w:sz="0"/>
+          <w:insideH w:val="none" w:color="FFFFFF" w:sz="0"/>
+          <w:insideV w:val="none" w:color="FFFFFF" w:sz="0"/>
+        </w:tblBorders>
+      </w:tblPr>
+      <w:tblGrid>
+        <w:gridCol w:w="9637"/>
+      </w:tblGrid>
+      <w:tr>
+        <w:tc>
+          <w:tcPr>
+            <w:tcW w:type="dxa" w:w="9637"/>
+            <w:shd w:fill="F7F7F5" w:color="auto" w:val="clear"/>
+            <w:tcMar>
+              <w:top w:type="dxa" w:w="170"/>
+              <w:left w:type="dxa" w:w="226"/>
+              <w:bottom w:type="dxa" w:w="170"/>
+              <w:right w:type="dxa" w:w="226"/>
+            </w:tcMar>
+          </w:tcPr>
+          <w:p>
+            <w:pPr>
+              <w:spacing w:after="70" w:before="0" w:line="276"/>
+            </w:pPr>
+            <w:r>
+              <w:rPr>
+                <w:rFonts w:ascii="Calibri" w:cs="Calibri" w:eastAsia="Calibri" w:hAnsi="Calibri"/>
+                <w:i/>
+                <w:iCs/>
+                <w:color w:val="6E6E6E"/>
+                <w:sz w:val="21"/>
+                <w:szCs w:val="21"/>
+              </w:rPr>
+              <w:t xml:space="preserve">« Une cagnotte démarre à 2 500 € en début de saison et sert à vous récompenser en fin d’année. Elle diminue à chaque négligence constatée :</w:t>
+            </w:r>
+          </w:p>
+          <w:p>
+            <w:pPr>
+              <w:spacing w:after="70" w:before="0" w:line="276"/>
+            </w:pPr>
+            <w:r>
+              <w:rPr>
+                <w:rFonts w:ascii="Calibri" w:cs="Calibri" w:eastAsia="Calibri" w:hAnsi="Calibri"/>
+                <w:b/>
+                <w:bCs/>
+                <w:i/>
+                <w:iCs/>
+                <w:color w:val="6E6E6E"/>
+                <w:sz w:val="21"/>
+                <w:szCs w:val="21"/>
+              </w:rPr>
+              <w:t xml:space="preserve">– 1 € </w:t>
+            </w:r>
+            <w:r>
+              <w:rPr>
+                <w:rFonts w:ascii="Calibri" w:cs="Calibri" w:eastAsia="Calibri" w:hAnsi="Calibri"/>
+                <w:i/>
+                <w:iCs/>
+                <w:color w:val="6E6E6E"/>
+                <w:sz w:val="21"/>
+                <w:szCs w:val="21"/>
+              </w:rPr>
+              <w:t xml:space="preserve">par balle retrouvée traînant sur ou autour des terrains</w:t>
+            </w:r>
+          </w:p>
+          <w:p>
+            <w:pPr>
+              <w:spacing w:after="70" w:before="0" w:line="276"/>
+            </w:pPr>
+            <w:r>
+              <w:rPr>
+                <w:rFonts w:ascii="Calibri" w:cs="Calibri" w:eastAsia="Calibri" w:hAnsi="Calibri"/>
+                <w:b/>
+                <w:bCs/>
+                <w:i/>
+                <w:iCs/>
+                <w:color w:val="6E6E6E"/>
+                <w:sz w:val="21"/>
+                <w:szCs w:val="21"/>
+              </w:rPr>
+              <w:t xml:space="preserve">– 5 € </w:t>
+            </w:r>
+            <w:r>
+              <w:rPr>
+                <w:rFonts w:ascii="Calibri" w:cs="Calibri" w:eastAsia="Calibri" w:hAnsi="Calibri"/>
+                <w:i/>
+                <w:iCs/>
+                <w:color w:val="6E6E6E"/>
+                <w:sz w:val="21"/>
+                <w:szCs w:val="21"/>
+              </w:rPr>
+              <w:t xml:space="preserve">par matériel retrouvé dehors ou non rangé dans le kot</w:t>
+            </w:r>
+          </w:p>
+          <w:p>
+            <w:pPr>
+              <w:spacing w:after="70" w:before="0" w:line="276"/>
+            </w:pPr>
+            <w:r>
+              <w:rPr>
+                <w:rFonts w:ascii="Calibri" w:cs="Calibri" w:eastAsia="Calibri" w:hAnsi="Calibri"/>
+                <w:b/>
+                <w:bCs/>
+                <w:i/>
+                <w:iCs/>
+                <w:color w:val="6E6E6E"/>
+                <w:sz w:val="21"/>
+                <w:szCs w:val="21"/>
+              </w:rPr>
+              <w:t xml:space="preserve">– 5 € </w:t>
+            </w:r>
+            <w:r>
+              <w:rPr>
+                <w:rFonts w:ascii="Calibri" w:cs="Calibri" w:eastAsia="Calibri" w:hAnsi="Calibri"/>
+                <w:i/>
+                <w:iCs/>
+                <w:color w:val="6E6E6E"/>
+                <w:sz w:val="21"/>
+                <w:szCs w:val="21"/>
+              </w:rPr>
+              <w:t xml:space="preserve">si le moniteur n’est pas en tenue Babolat ou à l’effigie du club</w:t>
+            </w:r>
+          </w:p>
+          <w:p>
+            <w:pPr>
+              <w:spacing w:after="0" w:before="0" w:line="276"/>
+            </w:pPr>
+            <w:r>
+              <w:rPr>
+                <w:rFonts w:ascii="Calibri" w:cs="Calibri" w:eastAsia="Calibri" w:hAnsi="Calibri"/>
+                <w:i/>
+                <w:iCs/>
+                <w:color w:val="6E6E6E"/>
+                <w:sz w:val="21"/>
+                <w:szCs w:val="21"/>
+              </w:rPr>
+              <w:t xml:space="preserve">Le solde restant en fin de saison est réparti entre les moniteurs. Si le budget de 2 500 € venait à être dépassé, nous passerions à un système où les balles deviennent payantes pour vous. »</w:t>
+            </w:r>
+          </w:p>
+        </w:tc>
+      </w:tr>
+    </w:tbl>
+    <w:p>
+      <w:pPr>
+        <w:spacing w:after="140" w:before="0" w:line="276"/>
+      </w:pPr>
+      <w:r>
+        <w:rPr>
+          <w:rFonts w:ascii="Calibri" w:cs="Calibri" w:eastAsia="Calibri" w:hAnsi="Calibri"/>
+          <w:color w:val="2E2E2E"/>
+          <w:sz w:val="21"/>
+          <w:szCs w:val="21"/>
+        </w:rPr>
+        <w:t xml:space="preserve"/>
+      </w:r>
+    </w:p>
+    <w:p>
+      <w:pPr>
+        <w:spacing w:after="300" w:before="0" w:line="276"/>
+      </w:pPr>
+      <w:r>
+        <w:rPr>
+          <w:rFonts w:ascii="Calibri" w:cs="Calibri" w:eastAsia="Calibri" w:hAnsi="Calibri"/>
+          <w:b/>
+          <w:bCs/>
+          <w:color w:val="C0392B"/>
+          <w:sz w:val="22"/>
+          <w:szCs w:val="22"/>
+        </w:rPr>
+        <w:t xml:space="preserve">Résultat : toujours la même négligence. Le système ne fonctionne pas.</w:t>
+      </w:r>
+    </w:p>
+    <w:p>
+      <w:r>
+        <w:br w:type="page"/>
+      </w:r>
+    </w:p>
+    <w:p>
+      <w:pPr>
+        <w:keepNext/>
+        <w:pBdr>
+          <w:bottom w:val="single" w:color="8A9E28" w:sz="8" w:space="4"/>
+        </w:pBdr>
+        <w:spacing w:after="140" w:before="320"/>
+      </w:pPr>
+      <w:r>
+        <w:rPr>
+          <w:rFonts w:ascii="Calibri" w:cs="Calibri" w:eastAsia="Calibri" w:hAnsi="Calibri"/>
+          <w:b/>
+          <w:bCs/>
+          <w:color w:val="C0392B"/>
+          <w:sz w:val="26"/>
+          <w:szCs w:val="26"/>
+        </w:rPr>
+        <w:t xml:space="preserve">Le nouveau système</w:t>
       </w:r>
     </w:p>
     <w:p>
@@ -1626,7 +1862,7 @@
           <w:sz w:val="21"/>
           <w:szCs w:val="21"/>
         </w:rPr>
-        <w:t xml:space="preserve">La cagnotte est supprimée. Elle n’a pas fonctionné : les balles et le matériel traînaient toujours autant sur les terrains. À partir de cette saison, chacun est responsable de ses propres balles, et une balle perdue se paie.</w:t>
+        <w:t xml:space="preserve">Fini la cagnotte collective. Chacun est désormais responsable de ses propres balles, et une balle perdue se paie.</w:t>
       </w:r>
     </w:p>
     <w:p>
@@ -2376,26 +2612,519 @@
           <w:sz w:val="21"/>
           <w:szCs w:val="21"/>
         </w:rPr>
-        <w:t xml:space="preserve">Le comptage, toutes les 7 semaines</w:t>
-      </w:r>
-    </w:p>
-    <w:p>
-      <w:pPr>
-        <w:pStyle w:val="ListParagraph"/>
-        <w:numPr>
-          <w:ilvl w:val="0"/>
-          <w:numId w:val="2"/>
-        </w:numPr>
-        <w:spacing w:after="60" w:line="264"/>
-      </w:pPr>
-      <w:r>
-        <w:rPr>
-          <w:rFonts w:ascii="Calibri" w:cs="Calibri" w:eastAsia="Calibri" w:hAnsi="Calibri"/>
-          <w:color w:val="2E2E2E"/>
-          <w:sz w:val="21"/>
-          <w:szCs w:val="21"/>
-        </w:rPr>
-        <w:t xml:space="preserve">On compte les balles restantes dans chaque panier. Chaque balle manquante est déduite du salaire à </w:t>
+        <w:t xml:space="preserve">Le comptage</w:t>
+      </w:r>
+    </w:p>
+    <w:p>
+      <w:pPr>
+        <w:spacing w:after="120" w:before="0" w:line="276"/>
+      </w:pPr>
+      <w:r>
+        <w:rPr>
+          <w:rFonts w:ascii="Calibri" w:cs="Calibri" w:eastAsia="Calibri" w:hAnsi="Calibri"/>
+          <w:color w:val="2E2E2E"/>
+          <w:sz w:val="21"/>
+          <w:szCs w:val="21"/>
+        </w:rPr>
+        <w:t xml:space="preserve">Quatre comptages sur la saison, à la fin de chaque période.</w:t>
+      </w:r>
+    </w:p>
+    <w:tbl>
+      <w:tblPr>
+        <w:tblW w:type="dxa" w:w="7652"/>
+        <w:tblBorders>
+          <w:top w:val="single" w:color="CCCCCC" w:sz="4"/>
+          <w:left w:val="single" w:color="CCCCCC" w:sz="4"/>
+          <w:bottom w:val="single" w:color="CCCCCC" w:sz="4"/>
+          <w:right w:val="single" w:color="CCCCCC" w:sz="4"/>
+          <w:insideH w:val="single" w:color="CCCCCC" w:sz="4"/>
+          <w:insideV w:val="single" w:color="CCCCCC" w:sz="4"/>
+        </w:tblBorders>
+      </w:tblPr>
+      <w:tblGrid>
+        <w:gridCol w:w="1700"/>
+        <w:gridCol w:w="2551"/>
+        <w:gridCol w:w="3401"/>
+      </w:tblGrid>
+      <w:tr>
+        <w:trPr>
+          <w:tblHeader/>
+        </w:trPr>
+        <w:tc>
+          <w:tcPr>
+            <w:tcW w:type="dxa" w:w="1700"/>
+            <w:shd w:fill="8A9E28" w:color="auto" w:val="clear"/>
+            <w:tcMar>
+              <w:top w:type="dxa" w:w="113"/>
+              <w:left w:type="dxa" w:w="170"/>
+              <w:bottom w:type="dxa" w:w="113"/>
+              <w:right w:type="dxa" w:w="170"/>
+            </w:tcMar>
+            <w:vAlign w:val="center"/>
+          </w:tcPr>
+          <w:p>
+            <w:pPr>
+              <w:spacing w:after="0" w:before="0" w:line="276"/>
+              <w:jc w:val="center"/>
+            </w:pPr>
+            <w:r>
+              <w:rPr>
+                <w:rFonts w:ascii="Calibri" w:cs="Calibri" w:eastAsia="Calibri" w:hAnsi="Calibri"/>
+                <w:b/>
+                <w:bCs/>
+                <w:color w:val="FFFFFF"/>
+                <w:sz w:val="21"/>
+                <w:szCs w:val="21"/>
+              </w:rPr>
+              <w:t xml:space="preserve">Période</w:t>
+            </w:r>
+          </w:p>
+        </w:tc>
+        <w:tc>
+          <w:tcPr>
+            <w:tcW w:type="dxa" w:w="2551"/>
+            <w:shd w:fill="8A9E28" w:color="auto" w:val="clear"/>
+            <w:tcMar>
+              <w:top w:type="dxa" w:w="113"/>
+              <w:left w:type="dxa" w:w="170"/>
+              <w:bottom w:type="dxa" w:w="113"/>
+              <w:right w:type="dxa" w:w="170"/>
+            </w:tcMar>
+            <w:vAlign w:val="center"/>
+          </w:tcPr>
+          <w:p>
+            <w:pPr>
+              <w:spacing w:after="0" w:before="0" w:line="276"/>
+              <w:jc w:val="center"/>
+            </w:pPr>
+            <w:r>
+              <w:rPr>
+                <w:rFonts w:ascii="Calibri" w:cs="Calibri" w:eastAsia="Calibri" w:hAnsi="Calibri"/>
+                <w:b/>
+                <w:bCs/>
+                <w:color w:val="FFFFFF"/>
+                <w:sz w:val="21"/>
+                <w:szCs w:val="21"/>
+              </w:rPr>
+              <w:t xml:space="preserve">Durée</w:t>
+            </w:r>
+          </w:p>
+        </w:tc>
+        <w:tc>
+          <w:tcPr>
+            <w:tcW w:type="dxa" w:w="3401"/>
+            <w:shd w:fill="8A9E28" w:color="auto" w:val="clear"/>
+            <w:tcMar>
+              <w:top w:type="dxa" w:w="113"/>
+              <w:left w:type="dxa" w:w="170"/>
+              <w:bottom w:type="dxa" w:w="113"/>
+              <w:right w:type="dxa" w:w="170"/>
+            </w:tcMar>
+            <w:vAlign w:val="center"/>
+          </w:tcPr>
+          <w:p>
+            <w:pPr>
+              <w:spacing w:after="0" w:before="0" w:line="276"/>
+              <w:jc w:val="center"/>
+            </w:pPr>
+            <w:r>
+              <w:rPr>
+                <w:rFonts w:ascii="Calibri" w:cs="Calibri" w:eastAsia="Calibri" w:hAnsi="Calibri"/>
+                <w:b/>
+                <w:bCs/>
+                <w:color w:val="FFFFFF"/>
+                <w:sz w:val="21"/>
+                <w:szCs w:val="21"/>
+              </w:rPr>
+              <w:t xml:space="preserve">Date du comptage</w:t>
+            </w:r>
+          </w:p>
+        </w:tc>
+      </w:tr>
+      <w:tr>
+        <w:tc>
+          <w:tcPr>
+            <w:tcW w:type="dxa" w:w="1700"/>
+            <w:shd w:fill="FAFAF5" w:color="auto" w:val="clear"/>
+            <w:tcMar>
+              <w:top w:type="dxa" w:w="113"/>
+              <w:left w:type="dxa" w:w="170"/>
+              <w:bottom w:type="dxa" w:w="113"/>
+              <w:right w:type="dxa" w:w="170"/>
+            </w:tcMar>
+            <w:vAlign w:val="center"/>
+          </w:tcPr>
+          <w:p>
+            <w:pPr>
+              <w:spacing w:after="0" w:before="0" w:line="276"/>
+              <w:jc w:val="center"/>
+            </w:pPr>
+            <w:r>
+              <w:rPr>
+                <w:rFonts w:ascii="Calibri" w:cs="Calibri" w:eastAsia="Calibri" w:hAnsi="Calibri"/>
+                <w:b/>
+                <w:bCs/>
+                <w:color w:val="C0392B"/>
+                <w:sz w:val="21"/>
+                <w:szCs w:val="21"/>
+              </w:rPr>
+              <w:t xml:space="preserve">1</w:t>
+            </w:r>
+          </w:p>
+        </w:tc>
+        <w:tc>
+          <w:tcPr>
+            <w:tcW w:type="dxa" w:w="2551"/>
+            <w:shd w:fill="FFFFFF" w:color="auto" w:val="clear"/>
+            <w:tcMar>
+              <w:top w:type="dxa" w:w="113"/>
+              <w:left w:type="dxa" w:w="170"/>
+              <w:bottom w:type="dxa" w:w="113"/>
+              <w:right w:type="dxa" w:w="170"/>
+            </w:tcMar>
+            <w:vAlign w:val="center"/>
+          </w:tcPr>
+          <w:p>
+            <w:pPr>
+              <w:spacing w:after="0" w:before="0" w:line="276"/>
+              <w:jc w:val="center"/>
+            </w:pPr>
+            <w:r>
+              <w:rPr>
+                <w:rFonts w:ascii="Calibri" w:cs="Calibri" w:eastAsia="Calibri" w:hAnsi="Calibri"/>
+                <w:color w:val="2E2E2E"/>
+                <w:sz w:val="21"/>
+                <w:szCs w:val="21"/>
+              </w:rPr>
+              <w:t xml:space="preserve">7 semaines</w:t>
+            </w:r>
+          </w:p>
+        </w:tc>
+        <w:tc>
+          <w:tcPr>
+            <w:tcW w:type="dxa" w:w="3401"/>
+            <w:shd w:fill="FFFFFF" w:color="auto" w:val="clear"/>
+            <w:tcMar>
+              <w:top w:type="dxa" w:w="113"/>
+              <w:left w:type="dxa" w:w="170"/>
+              <w:bottom w:type="dxa" w:w="113"/>
+              <w:right w:type="dxa" w:w="170"/>
+            </w:tcMar>
+            <w:vAlign w:val="center"/>
+          </w:tcPr>
+          <w:p>
+            <w:pPr>
+              <w:spacing w:after="0" w:before="0" w:line="276"/>
+              <w:jc w:val="center"/>
+            </w:pPr>
+            <w:r>
+              <w:rPr>
+                <w:rFonts w:ascii="Calibri" w:cs="Calibri" w:eastAsia="Calibri" w:hAnsi="Calibri"/>
+                <w:color w:val="AAAAAA"/>
+                <w:sz w:val="21"/>
+                <w:szCs w:val="21"/>
+              </w:rPr>
+              <w:t xml:space="preserve">……………………</w:t>
+            </w:r>
+          </w:p>
+        </w:tc>
+      </w:tr>
+      <w:tr>
+        <w:tc>
+          <w:tcPr>
+            <w:tcW w:type="dxa" w:w="1700"/>
+            <w:shd w:fill="FAFAF5" w:color="auto" w:val="clear"/>
+            <w:tcMar>
+              <w:top w:type="dxa" w:w="113"/>
+              <w:left w:type="dxa" w:w="170"/>
+              <w:bottom w:type="dxa" w:w="113"/>
+              <w:right w:type="dxa" w:w="170"/>
+            </w:tcMar>
+            <w:vAlign w:val="center"/>
+          </w:tcPr>
+          <w:p>
+            <w:pPr>
+              <w:spacing w:after="0" w:before="0" w:line="276"/>
+              <w:jc w:val="center"/>
+            </w:pPr>
+            <w:r>
+              <w:rPr>
+                <w:rFonts w:ascii="Calibri" w:cs="Calibri" w:eastAsia="Calibri" w:hAnsi="Calibri"/>
+                <w:b/>
+                <w:bCs/>
+                <w:color w:val="C0392B"/>
+                <w:sz w:val="21"/>
+                <w:szCs w:val="21"/>
+              </w:rPr>
+              <w:t xml:space="preserve">2</w:t>
+            </w:r>
+          </w:p>
+        </w:tc>
+        <w:tc>
+          <w:tcPr>
+            <w:tcW w:type="dxa" w:w="2551"/>
+            <w:shd w:fill="FFFFFF" w:color="auto" w:val="clear"/>
+            <w:tcMar>
+              <w:top w:type="dxa" w:w="113"/>
+              <w:left w:type="dxa" w:w="170"/>
+              <w:bottom w:type="dxa" w:w="113"/>
+              <w:right w:type="dxa" w:w="170"/>
+            </w:tcMar>
+            <w:vAlign w:val="center"/>
+          </w:tcPr>
+          <w:p>
+            <w:pPr>
+              <w:spacing w:after="0" w:before="0" w:line="276"/>
+              <w:jc w:val="center"/>
+            </w:pPr>
+            <w:r>
+              <w:rPr>
+                <w:rFonts w:ascii="Calibri" w:cs="Calibri" w:eastAsia="Calibri" w:hAnsi="Calibri"/>
+                <w:color w:val="2E2E2E"/>
+                <w:sz w:val="21"/>
+                <w:szCs w:val="21"/>
+              </w:rPr>
+              <w:t xml:space="preserve">7 semaines</w:t>
+            </w:r>
+          </w:p>
+        </w:tc>
+        <w:tc>
+          <w:tcPr>
+            <w:tcW w:type="dxa" w:w="3401"/>
+            <w:shd w:fill="FFFFFF" w:color="auto" w:val="clear"/>
+            <w:tcMar>
+              <w:top w:type="dxa" w:w="113"/>
+              <w:left w:type="dxa" w:w="170"/>
+              <w:bottom w:type="dxa" w:w="113"/>
+              <w:right w:type="dxa" w:w="170"/>
+            </w:tcMar>
+            <w:vAlign w:val="center"/>
+          </w:tcPr>
+          <w:p>
+            <w:pPr>
+              <w:spacing w:after="0" w:before="0" w:line="276"/>
+              <w:jc w:val="center"/>
+            </w:pPr>
+            <w:r>
+              <w:rPr>
+                <w:rFonts w:ascii="Calibri" w:cs="Calibri" w:eastAsia="Calibri" w:hAnsi="Calibri"/>
+                <w:color w:val="AAAAAA"/>
+                <w:sz w:val="21"/>
+                <w:szCs w:val="21"/>
+              </w:rPr>
+              <w:t xml:space="preserve">……………………</w:t>
+            </w:r>
+          </w:p>
+        </w:tc>
+      </w:tr>
+      <w:tr>
+        <w:tc>
+          <w:tcPr>
+            <w:tcW w:type="dxa" w:w="1700"/>
+            <w:shd w:fill="FAFAF5" w:color="auto" w:val="clear"/>
+            <w:tcMar>
+              <w:top w:type="dxa" w:w="113"/>
+              <w:left w:type="dxa" w:w="170"/>
+              <w:bottom w:type="dxa" w:w="113"/>
+              <w:right w:type="dxa" w:w="170"/>
+            </w:tcMar>
+            <w:vAlign w:val="center"/>
+          </w:tcPr>
+          <w:p>
+            <w:pPr>
+              <w:spacing w:after="0" w:before="0" w:line="276"/>
+              <w:jc w:val="center"/>
+            </w:pPr>
+            <w:r>
+              <w:rPr>
+                <w:rFonts w:ascii="Calibri" w:cs="Calibri" w:eastAsia="Calibri" w:hAnsi="Calibri"/>
+                <w:b/>
+                <w:bCs/>
+                <w:color w:val="C0392B"/>
+                <w:sz w:val="21"/>
+                <w:szCs w:val="21"/>
+              </w:rPr>
+              <w:t xml:space="preserve">3</w:t>
+            </w:r>
+          </w:p>
+        </w:tc>
+        <w:tc>
+          <w:tcPr>
+            <w:tcW w:type="dxa" w:w="2551"/>
+            <w:shd w:fill="FFFFFF" w:color="auto" w:val="clear"/>
+            <w:tcMar>
+              <w:top w:type="dxa" w:w="113"/>
+              <w:left w:type="dxa" w:w="170"/>
+              <w:bottom w:type="dxa" w:w="113"/>
+              <w:right w:type="dxa" w:w="170"/>
+            </w:tcMar>
+            <w:vAlign w:val="center"/>
+          </w:tcPr>
+          <w:p>
+            <w:pPr>
+              <w:spacing w:after="0" w:before="0" w:line="276"/>
+              <w:jc w:val="center"/>
+            </w:pPr>
+            <w:r>
+              <w:rPr>
+                <w:rFonts w:ascii="Calibri" w:cs="Calibri" w:eastAsia="Calibri" w:hAnsi="Calibri"/>
+                <w:color w:val="2E2E2E"/>
+                <w:sz w:val="21"/>
+                <w:szCs w:val="21"/>
+              </w:rPr>
+              <w:t xml:space="preserve">6 semaines</w:t>
+            </w:r>
+          </w:p>
+        </w:tc>
+        <w:tc>
+          <w:tcPr>
+            <w:tcW w:type="dxa" w:w="3401"/>
+            <w:shd w:fill="FFFFFF" w:color="auto" w:val="clear"/>
+            <w:tcMar>
+              <w:top w:type="dxa" w:w="113"/>
+              <w:left w:type="dxa" w:w="170"/>
+              <w:bottom w:type="dxa" w:w="113"/>
+              <w:right w:type="dxa" w:w="170"/>
+            </w:tcMar>
+            <w:vAlign w:val="center"/>
+          </w:tcPr>
+          <w:p>
+            <w:pPr>
+              <w:spacing w:after="0" w:before="0" w:line="276"/>
+              <w:jc w:val="center"/>
+            </w:pPr>
+            <w:r>
+              <w:rPr>
+                <w:rFonts w:ascii="Calibri" w:cs="Calibri" w:eastAsia="Calibri" w:hAnsi="Calibri"/>
+                <w:color w:val="AAAAAA"/>
+                <w:sz w:val="21"/>
+                <w:szCs w:val="21"/>
+              </w:rPr>
+              <w:t xml:space="preserve">……………………</w:t>
+            </w:r>
+          </w:p>
+        </w:tc>
+      </w:tr>
+      <w:tr>
+        <w:tc>
+          <w:tcPr>
+            <w:tcW w:type="dxa" w:w="1700"/>
+            <w:shd w:fill="FAFAF5" w:color="auto" w:val="clear"/>
+            <w:tcMar>
+              <w:top w:type="dxa" w:w="113"/>
+              <w:left w:type="dxa" w:w="170"/>
+              <w:bottom w:type="dxa" w:w="113"/>
+              <w:right w:type="dxa" w:w="170"/>
+            </w:tcMar>
+            <w:vAlign w:val="center"/>
+          </w:tcPr>
+          <w:p>
+            <w:pPr>
+              <w:spacing w:after="0" w:before="0" w:line="276"/>
+              <w:jc w:val="center"/>
+            </w:pPr>
+            <w:r>
+              <w:rPr>
+                <w:rFonts w:ascii="Calibri" w:cs="Calibri" w:eastAsia="Calibri" w:hAnsi="Calibri"/>
+                <w:b/>
+                <w:bCs/>
+                <w:color w:val="C0392B"/>
+                <w:sz w:val="21"/>
+                <w:szCs w:val="21"/>
+              </w:rPr>
+              <w:t xml:space="preserve">4</w:t>
+            </w:r>
+          </w:p>
+        </w:tc>
+        <w:tc>
+          <w:tcPr>
+            <w:tcW w:type="dxa" w:w="2551"/>
+            <w:shd w:fill="FFFFFF" w:color="auto" w:val="clear"/>
+            <w:tcMar>
+              <w:top w:type="dxa" w:w="113"/>
+              <w:left w:type="dxa" w:w="170"/>
+              <w:bottom w:type="dxa" w:w="113"/>
+              <w:right w:type="dxa" w:w="170"/>
+            </w:tcMar>
+            <w:vAlign w:val="center"/>
+          </w:tcPr>
+          <w:p>
+            <w:pPr>
+              <w:spacing w:after="0" w:before="0" w:line="276"/>
+              <w:jc w:val="center"/>
+            </w:pPr>
+            <w:r>
+              <w:rPr>
+                <w:rFonts w:ascii="Calibri" w:cs="Calibri" w:eastAsia="Calibri" w:hAnsi="Calibri"/>
+                <w:color w:val="2E2E2E"/>
+                <w:sz w:val="21"/>
+                <w:szCs w:val="21"/>
+              </w:rPr>
+              <w:t xml:space="preserve">8 semaines</w:t>
+            </w:r>
+          </w:p>
+        </w:tc>
+        <w:tc>
+          <w:tcPr>
+            <w:tcW w:type="dxa" w:w="3401"/>
+            <w:shd w:fill="FFFFFF" w:color="auto" w:val="clear"/>
+            <w:tcMar>
+              <w:top w:type="dxa" w:w="113"/>
+              <w:left w:type="dxa" w:w="170"/>
+              <w:bottom w:type="dxa" w:w="113"/>
+              <w:right w:type="dxa" w:w="170"/>
+            </w:tcMar>
+            <w:vAlign w:val="center"/>
+          </w:tcPr>
+          <w:p>
+            <w:pPr>
+              <w:spacing w:after="0" w:before="0" w:line="276"/>
+              <w:jc w:val="center"/>
+            </w:pPr>
+            <w:r>
+              <w:rPr>
+                <w:rFonts w:ascii="Calibri" w:cs="Calibri" w:eastAsia="Calibri" w:hAnsi="Calibri"/>
+                <w:color w:val="AAAAAA"/>
+                <w:sz w:val="21"/>
+                <w:szCs w:val="21"/>
+              </w:rPr>
+              <w:t xml:space="preserve">……………………</w:t>
+            </w:r>
+          </w:p>
+        </w:tc>
+      </w:tr>
+    </w:tbl>
+    <w:p>
+      <w:pPr>
+        <w:spacing w:after="140" w:before="0" w:line="276"/>
+      </w:pPr>
+      <w:r>
+        <w:rPr>
+          <w:rFonts w:ascii="Calibri" w:cs="Calibri" w:eastAsia="Calibri" w:hAnsi="Calibri"/>
+          <w:color w:val="2E2E2E"/>
+          <w:sz w:val="21"/>
+          <w:szCs w:val="21"/>
+        </w:rPr>
+        <w:t xml:space="preserve"/>
+      </w:r>
+    </w:p>
+    <w:p>
+      <w:pPr>
+        <w:pStyle w:val="ListParagraph"/>
+        <w:numPr>
+          <w:ilvl w:val="0"/>
+          <w:numId w:val="2"/>
+        </w:numPr>
+        <w:spacing w:after="60" w:line="264"/>
+      </w:pPr>
+      <w:r>
+        <w:rPr>
+          <w:rFonts w:ascii="Calibri" w:cs="Calibri" w:eastAsia="Calibri" w:hAnsi="Calibri"/>
+          <w:color w:val="2E2E2E"/>
+          <w:sz w:val="21"/>
+          <w:szCs w:val="21"/>
+        </w:rPr>
+        <w:t xml:space="preserve">À chaque comptage, on compte les balles restantes dans votre panier. Chaque balle manquante est déduite du salaire à </w:t>
       </w:r>
       <w:r>
         <w:rPr>
@@ -2519,7 +3248,7 @@
           <w:sz w:val="21"/>
           <w:szCs w:val="21"/>
         </w:rPr>
-        <w:t xml:space="preserve">Comptage toutes les 7 semaines également. Chaque balle manquante est déduite à </w:t>
+        <w:t xml:space="preserve">Comptage à la fin de chaque période également. Chaque balle manquante est déduite à </w:t>
       </w:r>
       <w:r>
         <w:rPr>
@@ -2648,7 +3377,7 @@
           <w:sz w:val="20"/>
           <w:szCs w:val="20"/>
         </w:rPr>
-        <w:t xml:space="preserve">À compléter : dates des cinq comptages de la saison</w:t>
+        <w:t xml:space="preserve">À compléter : dates exactes des quatre comptages, à reporter dans le tableau ci-dessus</w:t>
       </w:r>
     </w:p>
     <w:p>

</xml_diff>

<commit_message>
Réécrit le point 5 : la déclaration du remplacement passe au remplaçant
Le remplaçant encode lui-même sa ligne dans le fichier partagé, avec la
règle « pas de ligne, pas de paiement », et le moniteur remplacé ne
facture plus cette heure. Les parents ne sont plus prévenus à l'avance.
Intègre par ailleurs les corrections relues sur les points 4, 6 et 7.

Co-Authored-By: Claude Opus 5 <noreply@anthropic.com>
Claude-Session: https://claude.ai/code/session_01RsDkbcD3KwyPviDTcs72WZ
</commit_message>
<xml_diff>
--- a/Reunion_moniteurs_2026-2027.docx
+++ b/Reunion_moniteurs_2026-2027.docx
@@ -518,7 +518,7 @@
                 <w:sz w:val="21"/>
                 <w:szCs w:val="21"/>
               </w:rPr>
-              <w:t xml:space="preserve">Ponctualité, présences et League Cup</w:t>
+              <w:t xml:space="preserve">Ponctualité, présences, League Cup et rassemblements</w:t>
             </w:r>
           </w:p>
         </w:tc>
@@ -2631,7 +2631,7 @@
     </w:p>
     <w:tbl>
       <w:tblPr>
-        <w:tblW w:type="dxa" w:w="7652"/>
+        <w:tblW w:type="dxa" w:w="6236"/>
         <w:tblBorders>
           <w:top w:val="single" w:color="CCCCCC" w:sz="4"/>
           <w:left w:val="single" w:color="CCCCCC" w:sz="4"/>
@@ -2642,9 +2642,8 @@
         </w:tblBorders>
       </w:tblPr>
       <w:tblGrid>
-        <w:gridCol w:w="1700"/>
         <w:gridCol w:w="2551"/>
-        <w:gridCol w:w="3401"/>
+        <w:gridCol w:w="3685"/>
       </w:tblGrid>
       <w:tr>
         <w:trPr>
@@ -2652,7 +2651,7 @@
         </w:trPr>
         <w:tc>
           <w:tcPr>
-            <w:tcW w:type="dxa" w:w="1700"/>
+            <w:tcW w:type="dxa" w:w="2551"/>
             <w:shd w:fill="8A9E28" w:color="auto" w:val="clear"/>
             <w:tcMar>
               <w:top w:type="dxa" w:w="113"/>
@@ -2682,7 +2681,7 @@
         </w:tc>
         <w:tc>
           <w:tcPr>
-            <w:tcW w:type="dxa" w:w="2551"/>
+            <w:tcW w:type="dxa" w:w="3685"/>
             <w:shd w:fill="8A9E28" w:color="auto" w:val="clear"/>
             <w:tcMar>
               <w:top w:type="dxa" w:w="113"/>
@@ -2710,41 +2709,11 @@
             </w:r>
           </w:p>
         </w:tc>
-        <w:tc>
-          <w:tcPr>
-            <w:tcW w:type="dxa" w:w="3401"/>
-            <w:shd w:fill="8A9E28" w:color="auto" w:val="clear"/>
-            <w:tcMar>
-              <w:top w:type="dxa" w:w="113"/>
-              <w:left w:type="dxa" w:w="170"/>
-              <w:bottom w:type="dxa" w:w="113"/>
-              <w:right w:type="dxa" w:w="170"/>
-            </w:tcMar>
-            <w:vAlign w:val="center"/>
-          </w:tcPr>
-          <w:p>
-            <w:pPr>
-              <w:spacing w:after="0" w:before="0" w:line="276"/>
-              <w:jc w:val="center"/>
-            </w:pPr>
-            <w:r>
-              <w:rPr>
-                <w:rFonts w:ascii="Calibri" w:cs="Calibri" w:eastAsia="Calibri" w:hAnsi="Calibri"/>
-                <w:b/>
-                <w:bCs/>
-                <w:color w:val="FFFFFF"/>
-                <w:sz w:val="21"/>
-                <w:szCs w:val="21"/>
-              </w:rPr>
-              <w:t xml:space="preserve">Date du comptage</w:t>
-            </w:r>
-          </w:p>
-        </w:tc>
       </w:tr>
       <w:tr>
         <w:tc>
           <w:tcPr>
-            <w:tcW w:type="dxa" w:w="1700"/>
+            <w:tcW w:type="dxa" w:w="2551"/>
             <w:shd w:fill="FAFAF5" w:color="auto" w:val="clear"/>
             <w:tcMar>
               <w:top w:type="dxa" w:w="113"/>
@@ -2774,7 +2743,7 @@
         </w:tc>
         <w:tc>
           <w:tcPr>
-            <w:tcW w:type="dxa" w:w="2551"/>
+            <w:tcW w:type="dxa" w:w="3685"/>
             <w:shd w:fill="FFFFFF" w:color="auto" w:val="clear"/>
             <w:tcMar>
               <w:top w:type="dxa" w:w="113"/>
@@ -2797,34 +2766,6 @@
                 <w:szCs w:val="21"/>
               </w:rPr>
               <w:t xml:space="preserve">7 semaines</w:t>
-            </w:r>
-          </w:p>
-        </w:tc>
-        <w:tc>
-          <w:tcPr>
-            <w:tcW w:type="dxa" w:w="3401"/>
-            <w:shd w:fill="FFFFFF" w:color="auto" w:val="clear"/>
-            <w:tcMar>
-              <w:top w:type="dxa" w:w="113"/>
-              <w:left w:type="dxa" w:w="170"/>
-              <w:bottom w:type="dxa" w:w="113"/>
-              <w:right w:type="dxa" w:w="170"/>
-            </w:tcMar>
-            <w:vAlign w:val="center"/>
-          </w:tcPr>
-          <w:p>
-            <w:pPr>
-              <w:spacing w:after="0" w:before="0" w:line="276"/>
-              <w:jc w:val="center"/>
-            </w:pPr>
-            <w:r>
-              <w:rPr>
-                <w:rFonts w:ascii="Calibri" w:cs="Calibri" w:eastAsia="Calibri" w:hAnsi="Calibri"/>
-                <w:color w:val="AAAAAA"/>
-                <w:sz w:val="21"/>
-                <w:szCs w:val="21"/>
-              </w:rPr>
-              <w:t xml:space="preserve">……………………</w:t>
             </w:r>
           </w:p>
         </w:tc>
@@ -2832,7 +2773,7 @@
       <w:tr>
         <w:tc>
           <w:tcPr>
-            <w:tcW w:type="dxa" w:w="1700"/>
+            <w:tcW w:type="dxa" w:w="2551"/>
             <w:shd w:fill="FAFAF5" w:color="auto" w:val="clear"/>
             <w:tcMar>
               <w:top w:type="dxa" w:w="113"/>
@@ -2862,7 +2803,7 @@
         </w:tc>
         <w:tc>
           <w:tcPr>
-            <w:tcW w:type="dxa" w:w="2551"/>
+            <w:tcW w:type="dxa" w:w="3685"/>
             <w:shd w:fill="FFFFFF" w:color="auto" w:val="clear"/>
             <w:tcMar>
               <w:top w:type="dxa" w:w="113"/>
@@ -2885,34 +2826,6 @@
                 <w:szCs w:val="21"/>
               </w:rPr>
               <w:t xml:space="preserve">7 semaines</w:t>
-            </w:r>
-          </w:p>
-        </w:tc>
-        <w:tc>
-          <w:tcPr>
-            <w:tcW w:type="dxa" w:w="3401"/>
-            <w:shd w:fill="FFFFFF" w:color="auto" w:val="clear"/>
-            <w:tcMar>
-              <w:top w:type="dxa" w:w="113"/>
-              <w:left w:type="dxa" w:w="170"/>
-              <w:bottom w:type="dxa" w:w="113"/>
-              <w:right w:type="dxa" w:w="170"/>
-            </w:tcMar>
-            <w:vAlign w:val="center"/>
-          </w:tcPr>
-          <w:p>
-            <w:pPr>
-              <w:spacing w:after="0" w:before="0" w:line="276"/>
-              <w:jc w:val="center"/>
-            </w:pPr>
-            <w:r>
-              <w:rPr>
-                <w:rFonts w:ascii="Calibri" w:cs="Calibri" w:eastAsia="Calibri" w:hAnsi="Calibri"/>
-                <w:color w:val="AAAAAA"/>
-                <w:sz w:val="21"/>
-                <w:szCs w:val="21"/>
-              </w:rPr>
-              <w:t xml:space="preserve">……………………</w:t>
             </w:r>
           </w:p>
         </w:tc>
@@ -2920,7 +2833,7 @@
       <w:tr>
         <w:tc>
           <w:tcPr>
-            <w:tcW w:type="dxa" w:w="1700"/>
+            <w:tcW w:type="dxa" w:w="2551"/>
             <w:shd w:fill="FAFAF5" w:color="auto" w:val="clear"/>
             <w:tcMar>
               <w:top w:type="dxa" w:w="113"/>
@@ -2950,7 +2863,7 @@
         </w:tc>
         <w:tc>
           <w:tcPr>
-            <w:tcW w:type="dxa" w:w="2551"/>
+            <w:tcW w:type="dxa" w:w="3685"/>
             <w:shd w:fill="FFFFFF" w:color="auto" w:val="clear"/>
             <w:tcMar>
               <w:top w:type="dxa" w:w="113"/>
@@ -2973,34 +2886,6 @@
                 <w:szCs w:val="21"/>
               </w:rPr>
               <w:t xml:space="preserve">6 semaines</w:t>
-            </w:r>
-          </w:p>
-        </w:tc>
-        <w:tc>
-          <w:tcPr>
-            <w:tcW w:type="dxa" w:w="3401"/>
-            <w:shd w:fill="FFFFFF" w:color="auto" w:val="clear"/>
-            <w:tcMar>
-              <w:top w:type="dxa" w:w="113"/>
-              <w:left w:type="dxa" w:w="170"/>
-              <w:bottom w:type="dxa" w:w="113"/>
-              <w:right w:type="dxa" w:w="170"/>
-            </w:tcMar>
-            <w:vAlign w:val="center"/>
-          </w:tcPr>
-          <w:p>
-            <w:pPr>
-              <w:spacing w:after="0" w:before="0" w:line="276"/>
-              <w:jc w:val="center"/>
-            </w:pPr>
-            <w:r>
-              <w:rPr>
-                <w:rFonts w:ascii="Calibri" w:cs="Calibri" w:eastAsia="Calibri" w:hAnsi="Calibri"/>
-                <w:color w:val="AAAAAA"/>
-                <w:sz w:val="21"/>
-                <w:szCs w:val="21"/>
-              </w:rPr>
-              <w:t xml:space="preserve">……………………</w:t>
             </w:r>
           </w:p>
         </w:tc>
@@ -3008,7 +2893,7 @@
       <w:tr>
         <w:tc>
           <w:tcPr>
-            <w:tcW w:type="dxa" w:w="1700"/>
+            <w:tcW w:type="dxa" w:w="2551"/>
             <w:shd w:fill="FAFAF5" w:color="auto" w:val="clear"/>
             <w:tcMar>
               <w:top w:type="dxa" w:w="113"/>
@@ -3038,7 +2923,7 @@
         </w:tc>
         <w:tc>
           <w:tcPr>
-            <w:tcW w:type="dxa" w:w="2551"/>
+            <w:tcW w:type="dxa" w:w="3685"/>
             <w:shd w:fill="FFFFFF" w:color="auto" w:val="clear"/>
             <w:tcMar>
               <w:top w:type="dxa" w:w="113"/>
@@ -3061,34 +2946,6 @@
                 <w:szCs w:val="21"/>
               </w:rPr>
               <w:t xml:space="preserve">8 semaines</w:t>
-            </w:r>
-          </w:p>
-        </w:tc>
-        <w:tc>
-          <w:tcPr>
-            <w:tcW w:type="dxa" w:w="3401"/>
-            <w:shd w:fill="FFFFFF" w:color="auto" w:val="clear"/>
-            <w:tcMar>
-              <w:top w:type="dxa" w:w="113"/>
-              <w:left w:type="dxa" w:w="170"/>
-              <w:bottom w:type="dxa" w:w="113"/>
-              <w:right w:type="dxa" w:w="170"/>
-            </w:tcMar>
-            <w:vAlign w:val="center"/>
-          </w:tcPr>
-          <w:p>
-            <w:pPr>
-              <w:spacing w:after="0" w:before="0" w:line="276"/>
-              <w:jc w:val="center"/>
-            </w:pPr>
-            <w:r>
-              <w:rPr>
-                <w:rFonts w:ascii="Calibri" w:cs="Calibri" w:eastAsia="Calibri" w:hAnsi="Calibri"/>
-                <w:color w:val="AAAAAA"/>
-                <w:sz w:val="21"/>
-                <w:szCs w:val="21"/>
-              </w:rPr>
-              <w:t xml:space="preserve">……………………</w:t>
             </w:r>
           </w:p>
         </w:tc>
@@ -3163,7 +3020,7 @@
           <w:sz w:val="21"/>
           <w:szCs w:val="21"/>
         </w:rPr>
-        <w:t xml:space="preserve">Le club ne gagne rien sur ce système : il cesse simplement de payer vos balles à votre place.</w:t>
+        <w:t xml:space="preserve">Le club ne gagne rien sur ce système : il responsabilise davantage la gestion des balles par les moniteurs.</w:t>
       </w:r>
     </w:p>
     <w:p>
@@ -3361,6 +3218,144 @@
     </w:p>
     <w:p>
       <w:pPr>
+        <w:keepNext/>
+        <w:pBdr>
+          <w:bottom w:val="single" w:color="8A9E28" w:sz="8" w:space="4"/>
+        </w:pBdr>
+        <w:spacing w:after="140" w:before="320"/>
+      </w:pPr>
+      <w:r>
+        <w:rPr>
+          <w:rFonts w:ascii="Calibri" w:cs="Calibri" w:eastAsia="Calibri" w:hAnsi="Calibri"/>
+          <w:b/>
+          <w:bCs/>
+          <w:color w:val="8A9E28"/>
+          <w:sz w:val="26"/>
+          <w:szCs w:val="26"/>
+        </w:rPr>
+        <w:t xml:space="preserve">5. </w:t>
+      </w:r>
+      <w:r>
+        <w:rPr>
+          <w:rFonts w:ascii="Calibri" w:cs="Calibri" w:eastAsia="Calibri" w:hAnsi="Calibri"/>
+          <w:b/>
+          <w:bCs/>
+          <w:color w:val="C0392B"/>
+          <w:sz w:val="26"/>
+          <w:szCs w:val="26"/>
+        </w:rPr>
+        <w:t xml:space="preserve">Vacances et remplacements</w:t>
+      </w:r>
+    </w:p>
+    <w:p>
+      <w:pPr>
+        <w:spacing w:after="120" w:before="0" w:line="276"/>
+      </w:pPr>
+      <w:r>
+        <w:rPr>
+          <w:rFonts w:ascii="Calibri" w:cs="Calibri" w:eastAsia="Calibri" w:hAnsi="Calibri"/>
+          <w:color w:val="2E2E2E"/>
+          <w:sz w:val="21"/>
+          <w:szCs w:val="21"/>
+        </w:rPr>
+        <w:t xml:space="preserve">Le fichier partagé de l’an dernier n’était pas rempli, et la raison est simple : on demandait au moniteur absent de l’encoder, alors que cette heure-là, il ne la facture pas. Cette saison, la déclaration passe à celui qui est payé.</w:t>
+      </w:r>
+    </w:p>
+    <w:p>
+      <w:pPr>
+        <w:keepNext/>
+        <w:spacing w:after="60" w:before="140"/>
+      </w:pPr>
+      <w:r>
+        <w:rPr>
+          <w:rFonts w:ascii="Calibri" w:cs="Calibri" w:eastAsia="Calibri" w:hAnsi="Calibri"/>
+          <w:b/>
+          <w:bCs/>
+          <w:color w:val="8A9E28"/>
+          <w:sz w:val="21"/>
+          <w:szCs w:val="21"/>
+        </w:rPr>
+        <w:t xml:space="preserve">Prévenir</w:t>
+      </w:r>
+    </w:p>
+    <w:p>
+      <w:pPr>
+        <w:pStyle w:val="ListParagraph"/>
+        <w:numPr>
+          <w:ilvl w:val="0"/>
+          <w:numId w:val="2"/>
+        </w:numPr>
+        <w:spacing w:after="60" w:line="264"/>
+      </w:pPr>
+      <w:r>
+        <w:rPr>
+          <w:rFonts w:ascii="Calibri" w:cs="Calibri" w:eastAsia="Calibri" w:hAnsi="Calibri"/>
+          <w:color w:val="2E2E2E"/>
+          <w:sz w:val="21"/>
+          <w:szCs w:val="21"/>
+        </w:rPr>
+        <w:t xml:space="preserve">Prévenez le plus tôt possible, et toujours par écrit.</w:t>
+      </w:r>
+    </w:p>
+    <w:p>
+      <w:pPr>
+        <w:pStyle w:val="ListParagraph"/>
+        <w:numPr>
+          <w:ilvl w:val="0"/>
+          <w:numId w:val="2"/>
+        </w:numPr>
+        <w:spacing w:after="60" w:line="264"/>
+      </w:pPr>
+      <w:r>
+        <w:rPr>
+          <w:rFonts w:ascii="Calibri" w:cs="Calibri" w:eastAsia="Calibri" w:hAnsi="Calibri"/>
+          <w:color w:val="2E2E2E"/>
+          <w:sz w:val="21"/>
+          <w:szCs w:val="21"/>
+        </w:rPr>
+        <w:t xml:space="preserve">Proposez vous-même un remplaçant au sein de l’équipe : c’est à vous de trouver la solution, pas au club.</w:t>
+      </w:r>
+    </w:p>
+    <w:p>
+      <w:pPr>
+        <w:pStyle w:val="ListParagraph"/>
+        <w:numPr>
+          <w:ilvl w:val="0"/>
+          <w:numId w:val="2"/>
+        </w:numPr>
+        <w:spacing w:after="60" w:line="264"/>
+      </w:pPr>
+      <w:r>
+        <w:rPr>
+          <w:rFonts w:ascii="Calibri" w:cs="Calibri" w:eastAsia="Calibri" w:hAnsi="Calibri"/>
+          <w:color w:val="2E2E2E"/>
+          <w:sz w:val="21"/>
+          <w:szCs w:val="21"/>
+        </w:rPr>
+        <w:t xml:space="preserve">Un remplacement n’est effectif qu’une fois confirmé par Thibault.</w:t>
+      </w:r>
+    </w:p>
+    <w:p>
+      <w:pPr>
+        <w:pStyle w:val="ListParagraph"/>
+        <w:numPr>
+          <w:ilvl w:val="0"/>
+          <w:numId w:val="2"/>
+        </w:numPr>
+        <w:spacing w:after="60" w:line="264"/>
+      </w:pPr>
+      <w:r>
+        <w:rPr>
+          <w:rFonts w:ascii="Calibri" w:cs="Calibri" w:eastAsia="Calibri" w:hAnsi="Calibri"/>
+          <w:color w:val="2E2E2E"/>
+          <w:sz w:val="21"/>
+          <w:szCs w:val="21"/>
+        </w:rPr>
+        <w:t xml:space="preserve">Le remplaçant doit recevoir le programme du cours et la liste des élèves.</w:t>
+      </w:r>
+    </w:p>
+    <w:p>
+      <w:pPr>
         <w:pStyle w:val="ListParagraph"/>
         <w:numPr>
           <w:ilvl w:val="0"/>
@@ -3377,49 +3372,225 @@
           <w:sz w:val="20"/>
           <w:szCs w:val="20"/>
         </w:rPr>
-        <w:t xml:space="preserve">À compléter : dates exactes des quatre comptages, à reporter dans le tableau ci-dessus</w:t>
-      </w:r>
-    </w:p>
-    <w:p>
-      <w:pPr>
-        <w:pStyle w:val="ListParagraph"/>
-        <w:numPr>
-          <w:ilvl w:val="0"/>
-          <w:numId w:val="2"/>
-        </w:numPr>
-        <w:spacing w:after="60" w:line="264"/>
-      </w:pPr>
-      <w:r>
-        <w:rPr>
-          <w:rFonts w:ascii="Calibri" w:cs="Calibri" w:eastAsia="Calibri" w:hAnsi="Calibri"/>
-          <w:i/>
-          <w:iCs/>
-          <w:color w:val="6E6E6E"/>
-          <w:sz w:val="20"/>
-          <w:szCs w:val="20"/>
-        </w:rPr>
-        <w:t xml:space="preserve">À compléter : confirmer le nombre de balles dans chaque panier « A »</w:t>
-      </w:r>
-    </w:p>
-    <w:p>
-      <w:pPr>
-        <w:pStyle w:val="ListParagraph"/>
-        <w:numPr>
-          <w:ilvl w:val="0"/>
-          <w:numId w:val="2"/>
-        </w:numPr>
-        <w:spacing w:after="60" w:line="264"/>
-      </w:pPr>
-      <w:r>
-        <w:rPr>
-          <w:rFonts w:ascii="Calibri" w:cs="Calibri" w:eastAsia="Calibri" w:hAnsi="Calibri"/>
-          <w:i/>
-          <w:iCs/>
-          <w:color w:val="6E6E6E"/>
-          <w:sz w:val="20"/>
-          <w:szCs w:val="20"/>
-        </w:rPr>
-        <w:t xml:space="preserve">À compléter : qui note les heures d’utilisation des paniers « A » et des balles rouges, oranges et vertes, et où</w:t>
+        <w:t xml:space="preserve">À compléter : délai minimum de prévenance (une semaine ? deux ?)</w:t>
+      </w:r>
+    </w:p>
+    <w:p>
+      <w:pPr>
+        <w:keepNext/>
+        <w:spacing w:after="60" w:before="140"/>
+      </w:pPr>
+      <w:r>
+        <w:rPr>
+          <w:rFonts w:ascii="Calibri" w:cs="Calibri" w:eastAsia="Calibri" w:hAnsi="Calibri"/>
+          <w:b/>
+          <w:bCs/>
+          <w:color w:val="8A9E28"/>
+          <w:sz w:val="21"/>
+          <w:szCs w:val="21"/>
+        </w:rPr>
+        <w:t xml:space="preserve">Déclarer : c’est le remplaçant qui encode</w:t>
+      </w:r>
+    </w:p>
+    <w:p>
+      <w:pPr>
+        <w:pStyle w:val="ListParagraph"/>
+        <w:numPr>
+          <w:ilvl w:val="0"/>
+          <w:numId w:val="2"/>
+        </w:numPr>
+        <w:spacing w:after="60" w:line="264"/>
+      </w:pPr>
+      <w:r>
+        <w:rPr>
+          <w:rFonts w:ascii="Calibri" w:cs="Calibri" w:eastAsia="Calibri" w:hAnsi="Calibri"/>
+          <w:color w:val="2E2E2E"/>
+          <w:sz w:val="21"/>
+          <w:szCs w:val="21"/>
+        </w:rPr>
+        <w:t xml:space="preserve">Le remplaçant encode lui-même sa ligne dans le fichier Excel partagé, le jour même : </w:t>
+      </w:r>
+      <w:r>
+        <w:rPr>
+          <w:rFonts w:ascii="Calibri" w:cs="Calibri" w:eastAsia="Calibri" w:hAnsi="Calibri"/>
+          <w:b/>
+          <w:bCs/>
+          <w:color w:val="2E2E2E"/>
+          <w:sz w:val="21"/>
+          <w:szCs w:val="21"/>
+        </w:rPr>
+        <w:t xml:space="preserve">date, heure, terrain, groupe, et le nom du moniteur remplacé</w:t>
+      </w:r>
+      <w:r>
+        <w:rPr>
+          <w:rFonts w:ascii="Calibri" w:cs="Calibri" w:eastAsia="Calibri" w:hAnsi="Calibri"/>
+          <w:color w:val="2E2E2E"/>
+          <w:sz w:val="21"/>
+          <w:szCs w:val="21"/>
+        </w:rPr>
+        <w:t xml:space="preserve">.</w:t>
+      </w:r>
+    </w:p>
+    <w:p>
+      <w:pPr>
+        <w:pStyle w:val="ListParagraph"/>
+        <w:numPr>
+          <w:ilvl w:val="0"/>
+          <w:numId w:val="2"/>
+        </w:numPr>
+        <w:spacing w:after="60" w:line="264"/>
+      </w:pPr>
+      <w:r>
+        <w:rPr>
+          <w:rFonts w:ascii="Calibri" w:cs="Calibri" w:eastAsia="Calibri" w:hAnsi="Calibri"/>
+          <w:color w:val="2E2E2E"/>
+          <w:sz w:val="21"/>
+          <w:szCs w:val="21"/>
+        </w:rPr>
+        <w:t xml:space="preserve">Le moniteur remplacé ne facture pas cette heure. Elle apparaît uniquement sur la facture du remplaçant, avec la mention « en remplacement de… ».</w:t>
+      </w:r>
+    </w:p>
+    <w:p>
+      <w:pPr>
+        <w:pStyle w:val="ListParagraph"/>
+        <w:numPr>
+          <w:ilvl w:val="0"/>
+          <w:numId w:val="2"/>
+        </w:numPr>
+        <w:spacing w:after="60" w:line="264"/>
+      </w:pPr>
+      <w:r>
+        <w:rPr>
+          <w:rFonts w:ascii="Calibri" w:cs="Calibri" w:eastAsia="Calibri" w:hAnsi="Calibri"/>
+          <w:color w:val="2E2E2E"/>
+          <w:sz w:val="21"/>
+          <w:szCs w:val="21"/>
+        </w:rPr>
+        <w:t xml:space="preserve">Les remplacements sont vérifiés à la fin de chaque période de comptage, pas en fin de saison.</w:t>
+      </w:r>
+    </w:p>
+    <w:p>
+      <w:pPr>
+        <w:spacing w:after="100" w:before="0" w:line="276"/>
+      </w:pPr>
+      <w:r>
+        <w:rPr>
+          <w:rFonts w:ascii="Calibri" w:cs="Calibri" w:eastAsia="Calibri" w:hAnsi="Calibri"/>
+          <w:color w:val="2E2E2E"/>
+          <w:sz w:val="21"/>
+          <w:szCs w:val="21"/>
+        </w:rPr>
+        <w:t xml:space="preserve"/>
+      </w:r>
+    </w:p>
+    <w:tbl>
+      <w:tblPr>
+        <w:tblW w:type="dxa" w:w="9637"/>
+        <w:tblBorders>
+          <w:top w:val="single" w:color="8A9E28" w:sz="6"/>
+          <w:left w:val="single" w:color="C0392B" w:sz="24"/>
+          <w:bottom w:val="single" w:color="8A9E28" w:sz="6"/>
+          <w:right w:val="single" w:color="8A9E28" w:sz="6"/>
+          <w:insideH w:val="none" w:color="FFFFFF" w:sz="0"/>
+          <w:insideV w:val="none" w:color="FFFFFF" w:sz="0"/>
+        </w:tblBorders>
+      </w:tblPr>
+      <w:tblGrid>
+        <w:gridCol w:w="9637"/>
+      </w:tblGrid>
+      <w:tr>
+        <w:tc>
+          <w:tcPr>
+            <w:tcW w:type="dxa" w:w="9637"/>
+            <w:shd w:fill="F4F6EA" w:color="auto" w:val="clear"/>
+            <w:tcMar>
+              <w:top w:type="dxa" w:w="170"/>
+              <w:left w:type="dxa" w:w="226"/>
+              <w:bottom w:type="dxa" w:w="170"/>
+              <w:right w:type="dxa" w:w="226"/>
+            </w:tcMar>
+          </w:tcPr>
+          <w:p>
+            <w:pPr>
+              <w:spacing w:after="80" w:before="0" w:line="276"/>
+            </w:pPr>
+            <w:r>
+              <w:rPr>
+                <w:rFonts w:ascii="Calibri" w:cs="Calibri" w:eastAsia="Calibri" w:hAnsi="Calibri"/>
+                <w:b/>
+                <w:bCs/>
+                <w:color w:val="C0392B"/>
+                <w:sz w:val="22"/>
+                <w:szCs w:val="22"/>
+              </w:rPr>
+              <w:t xml:space="preserve">Pas de ligne dans l’Excel, pas de paiement.</w:t>
+            </w:r>
+          </w:p>
+          <w:p>
+            <w:pPr>
+              <w:spacing w:after="0" w:before="0" w:line="276"/>
+            </w:pPr>
+            <w:r>
+              <w:rPr>
+                <w:rFonts w:ascii="Calibri" w:cs="Calibri" w:eastAsia="Calibri" w:hAnsi="Calibri"/>
+                <w:color w:val="2E2E2E"/>
+                <w:sz w:val="21"/>
+                <w:szCs w:val="21"/>
+              </w:rPr>
+              <w:t xml:space="preserve">Une heure qui ne figure pas à votre horaire et qui n’a pas été déclarée comme remplacement ne sera pas payée. C’est la seule règle qui rend le système fiable.</w:t>
+            </w:r>
+          </w:p>
+        </w:tc>
+      </w:tr>
+    </w:tbl>
+    <w:p>
+      <w:pPr>
+        <w:spacing w:after="140" w:before="0" w:line="276"/>
+      </w:pPr>
+      <w:r>
+        <w:rPr>
+          <w:rFonts w:ascii="Calibri" w:cs="Calibri" w:eastAsia="Calibri" w:hAnsi="Calibri"/>
+          <w:color w:val="2E2E2E"/>
+          <w:sz w:val="21"/>
+          <w:szCs w:val="21"/>
+        </w:rPr>
+        <w:t xml:space="preserve"/>
+      </w:r>
+    </w:p>
+    <w:p>
+      <w:pPr>
+        <w:keepNext/>
+        <w:spacing w:after="60" w:before="140"/>
+      </w:pPr>
+      <w:r>
+        <w:rPr>
+          <w:rFonts w:ascii="Calibri" w:cs="Calibri" w:eastAsia="Calibri" w:hAnsi="Calibri"/>
+          <w:b/>
+          <w:bCs/>
+          <w:color w:val="8A9E28"/>
+          <w:sz w:val="21"/>
+          <w:szCs w:val="21"/>
+        </w:rPr>
+        <w:t xml:space="preserve">Les parents</w:t>
+      </w:r>
+    </w:p>
+    <w:p>
+      <w:pPr>
+        <w:pStyle w:val="ListParagraph"/>
+        <w:numPr>
+          <w:ilvl w:val="0"/>
+          <w:numId w:val="2"/>
+        </w:numPr>
+        <w:spacing w:after="60" w:line="264"/>
+      </w:pPr>
+      <w:r>
+        <w:rPr>
+          <w:rFonts w:ascii="Calibri" w:cs="Calibri" w:eastAsia="Calibri" w:hAnsi="Calibri"/>
+          <w:color w:val="2E2E2E"/>
+          <w:sz w:val="21"/>
+          <w:szCs w:val="21"/>
+        </w:rPr>
+        <w:t xml:space="preserve">Inutile de prévenir les parents à l’avance : le remplaçant se signale simplement au début du cours.</w:t>
       </w:r>
     </w:p>
     <w:p>
@@ -3439,7 +3610,7 @@
           <w:sz w:val="26"/>
           <w:szCs w:val="26"/>
         </w:rPr>
-        <w:t xml:space="preserve">5. </w:t>
+        <w:t xml:space="preserve">6. </w:t>
       </w:r>
       <w:r>
         <w:rPr>
@@ -3450,104 +3621,107 @@
           <w:sz w:val="26"/>
           <w:szCs w:val="26"/>
         </w:rPr>
-        <w:t xml:space="preserve">Vacances et remplacements</w:t>
-      </w:r>
-    </w:p>
-    <w:p>
-      <w:pPr>
-        <w:pStyle w:val="ListParagraph"/>
-        <w:numPr>
-          <w:ilvl w:val="0"/>
-          <w:numId w:val="2"/>
-        </w:numPr>
-        <w:spacing w:after="60" w:line="264"/>
-      </w:pPr>
-      <w:r>
-        <w:rPr>
-          <w:rFonts w:ascii="Calibri" w:cs="Calibri" w:eastAsia="Calibri" w:hAnsi="Calibri"/>
-          <w:color w:val="2E2E2E"/>
-          <w:sz w:val="21"/>
-          <w:szCs w:val="21"/>
-        </w:rPr>
-        <w:t xml:space="preserve">Prévenez le plus tôt possible, et toujours par écrit.</w:t>
-      </w:r>
-    </w:p>
-    <w:p>
-      <w:pPr>
-        <w:pStyle w:val="ListParagraph"/>
-        <w:numPr>
-          <w:ilvl w:val="0"/>
-          <w:numId w:val="2"/>
-        </w:numPr>
-        <w:spacing w:after="60" w:line="264"/>
-      </w:pPr>
-      <w:r>
-        <w:rPr>
-          <w:rFonts w:ascii="Calibri" w:cs="Calibri" w:eastAsia="Calibri" w:hAnsi="Calibri"/>
-          <w:color w:val="2E2E2E"/>
-          <w:sz w:val="21"/>
-          <w:szCs w:val="21"/>
-        </w:rPr>
-        <w:t xml:space="preserve">Proposez vous-même un remplaçant au sein de l’équipe : c’est à vous de trouver la solution, pas au club.</w:t>
-      </w:r>
-    </w:p>
-    <w:p>
-      <w:pPr>
-        <w:pStyle w:val="ListParagraph"/>
-        <w:numPr>
-          <w:ilvl w:val="0"/>
-          <w:numId w:val="2"/>
-        </w:numPr>
-        <w:spacing w:after="60" w:line="264"/>
-      </w:pPr>
-      <w:r>
-        <w:rPr>
-          <w:rFonts w:ascii="Calibri" w:cs="Calibri" w:eastAsia="Calibri" w:hAnsi="Calibri"/>
-          <w:color w:val="2E2E2E"/>
-          <w:sz w:val="21"/>
-          <w:szCs w:val="21"/>
-        </w:rPr>
-        <w:t xml:space="preserve">Un remplacement n’est effectif qu’une fois confirmé par Marc.</w:t>
-      </w:r>
-    </w:p>
-    <w:p>
-      <w:pPr>
-        <w:pStyle w:val="ListParagraph"/>
-        <w:numPr>
-          <w:ilvl w:val="0"/>
-          <w:numId w:val="2"/>
-        </w:numPr>
-        <w:spacing w:after="60" w:line="264"/>
-      </w:pPr>
-      <w:r>
-        <w:rPr>
-          <w:rFonts w:ascii="Calibri" w:cs="Calibri" w:eastAsia="Calibri" w:hAnsi="Calibri"/>
-          <w:color w:val="2E2E2E"/>
-          <w:sz w:val="21"/>
-          <w:szCs w:val="21"/>
-        </w:rPr>
-        <w:t xml:space="preserve">Le remplaçant doit recevoir le programme du cours et la liste des élèves.</w:t>
-      </w:r>
-    </w:p>
-    <w:p>
-      <w:pPr>
-        <w:pStyle w:val="ListParagraph"/>
-        <w:numPr>
-          <w:ilvl w:val="0"/>
-          <w:numId w:val="2"/>
-        </w:numPr>
-        <w:spacing w:after="60" w:line="264"/>
-      </w:pPr>
-      <w:r>
-        <w:rPr>
-          <w:rFonts w:ascii="Calibri" w:cs="Calibri" w:eastAsia="Calibri" w:hAnsi="Calibri"/>
-          <w:i/>
-          <w:iCs/>
-          <w:color w:val="6E6E6E"/>
-          <w:sz w:val="20"/>
-          <w:szCs w:val="20"/>
-        </w:rPr>
-        <w:t xml:space="preserve">À compléter : délai minimum de prévenance (une semaine ? deux ?)</w:t>
+        <w:t xml:space="preserve">Ponctualité, présences, League Cup et rassemblements</w:t>
+      </w:r>
+    </w:p>
+    <w:p>
+      <w:pPr>
+        <w:pStyle w:val="ListParagraph"/>
+        <w:numPr>
+          <w:ilvl w:val="0"/>
+          <w:numId w:val="2"/>
+        </w:numPr>
+        <w:spacing w:after="60" w:line="264"/>
+      </w:pPr>
+      <w:r>
+        <w:rPr>
+          <w:rFonts w:ascii="Calibri" w:cs="Calibri" w:eastAsia="Calibri" w:hAnsi="Calibri"/>
+          <w:b/>
+          <w:bCs/>
+          <w:color w:val="2E2E2E"/>
+          <w:sz w:val="21"/>
+          <w:szCs w:val="21"/>
+        </w:rPr>
+        <w:t xml:space="preserve">Arriver 15 minutes en avance</w:t>
+      </w:r>
+      <w:r>
+        <w:rPr>
+          <w:rFonts w:ascii="Calibri" w:cs="Calibri" w:eastAsia="Calibri" w:hAnsi="Calibri"/>
+          <w:color w:val="2E2E2E"/>
+          <w:sz w:val="21"/>
+          <w:szCs w:val="21"/>
+        </w:rPr>
+        <w:t xml:space="preserve">, pas à l’heure : le cours commence à l’heure dite, pas au moment où vous ouvrez le kot.</w:t>
+      </w:r>
+    </w:p>
+    <w:p>
+      <w:pPr>
+        <w:pStyle w:val="ListParagraph"/>
+        <w:numPr>
+          <w:ilvl w:val="0"/>
+          <w:numId w:val="2"/>
+        </w:numPr>
+        <w:spacing w:after="60" w:line="264"/>
+      </w:pPr>
+      <w:r>
+        <w:rPr>
+          <w:rFonts w:ascii="Calibri" w:cs="Calibri" w:eastAsia="Calibri" w:hAnsi="Calibri"/>
+          <w:b/>
+          <w:bCs/>
+          <w:color w:val="2E2E2E"/>
+          <w:sz w:val="21"/>
+          <w:szCs w:val="21"/>
+        </w:rPr>
+        <w:t xml:space="preserve">League Cup et rassemblements du samedi : les deux moniteurs doivent être présents</w:t>
+      </w:r>
+      <w:r>
+        <w:rPr>
+          <w:rFonts w:ascii="Calibri" w:cs="Calibri" w:eastAsia="Calibri" w:hAnsi="Calibri"/>
+          <w:color w:val="2E2E2E"/>
+          <w:sz w:val="21"/>
+          <w:szCs w:val="21"/>
+        </w:rPr>
+        <w:t xml:space="preserve">, ou prévenir en cas d’absence. C’est non négociable.</w:t>
+      </w:r>
+    </w:p>
+    <w:p>
+      <w:pPr>
+        <w:pStyle w:val="ListParagraph"/>
+        <w:numPr>
+          <w:ilvl w:val="0"/>
+          <w:numId w:val="2"/>
+        </w:numPr>
+        <w:spacing w:after="60" w:line="264"/>
+      </w:pPr>
+      <w:r>
+        <w:rPr>
+          <w:rFonts w:ascii="Calibri" w:cs="Calibri" w:eastAsia="Calibri" w:hAnsi="Calibri"/>
+          <w:b/>
+          <w:bCs/>
+          <w:color w:val="C0392B"/>
+          <w:sz w:val="21"/>
+          <w:szCs w:val="21"/>
+        </w:rPr>
+        <w:t xml:space="preserve">En stage, force est de constater que les horaires ne sont pas respectés.</w:t>
+      </w:r>
+    </w:p>
+    <w:p>
+      <w:pPr>
+        <w:pStyle w:val="ListParagraph"/>
+        <w:numPr>
+          <w:ilvl w:val="0"/>
+          <w:numId w:val="2"/>
+        </w:numPr>
+        <w:spacing w:after="60" w:line="264"/>
+      </w:pPr>
+      <w:r>
+        <w:rPr>
+          <w:rFonts w:ascii="Calibri" w:cs="Calibri" w:eastAsia="Calibri" w:hAnsi="Calibri"/>
+          <w:color w:val="2E2E2E"/>
+          <w:sz w:val="21"/>
+          <w:szCs w:val="21"/>
+        </w:rPr>
+        <w:t xml:space="preserve">Toute absence non annoncée met un collègue en difficulté et se voit immédiatement côté parents.</w:t>
       </w:r>
     </w:p>
     <w:p>
@@ -3567,7 +3741,7 @@
           <w:sz w:val="26"/>
           <w:szCs w:val="26"/>
         </w:rPr>
-        <w:t xml:space="preserve">6. </w:t>
+        <w:t xml:space="preserve">7. </w:t>
       </w:r>
       <w:r>
         <w:rPr>
@@ -3578,147 +3752,6 @@
           <w:sz w:val="26"/>
           <w:szCs w:val="26"/>
         </w:rPr>
-        <w:t xml:space="preserve">Ponctualité, présences et League Cup</w:t>
-      </w:r>
-    </w:p>
-    <w:p>
-      <w:pPr>
-        <w:pStyle w:val="ListParagraph"/>
-        <w:numPr>
-          <w:ilvl w:val="0"/>
-          <w:numId w:val="2"/>
-        </w:numPr>
-        <w:spacing w:after="60" w:line="264"/>
-      </w:pPr>
-      <w:r>
-        <w:rPr>
-          <w:rFonts w:ascii="Calibri" w:cs="Calibri" w:eastAsia="Calibri" w:hAnsi="Calibri"/>
-          <w:color w:val="2E2E2E"/>
-          <w:sz w:val="21"/>
-          <w:szCs w:val="21"/>
-        </w:rPr>
-        <w:t xml:space="preserve">Arriver en avance, pas à l’heure : le cours commence à l’heure dite, pas au moment où vous ouvrez le kot.</w:t>
-      </w:r>
-    </w:p>
-    <w:p>
-      <w:pPr>
-        <w:pStyle w:val="ListParagraph"/>
-        <w:numPr>
-          <w:ilvl w:val="0"/>
-          <w:numId w:val="2"/>
-        </w:numPr>
-        <w:spacing w:after="60" w:line="264"/>
-      </w:pPr>
-      <w:r>
-        <w:rPr>
-          <w:rFonts w:ascii="Calibri" w:cs="Calibri" w:eastAsia="Calibri" w:hAnsi="Calibri"/>
-          <w:b/>
-          <w:bCs/>
-          <w:color w:val="2E2E2E"/>
-          <w:sz w:val="21"/>
-          <w:szCs w:val="21"/>
-        </w:rPr>
-        <w:t xml:space="preserve">League Cup : les deux moniteurs doivent être présents</w:t>
-      </w:r>
-      <w:r>
-        <w:rPr>
-          <w:rFonts w:ascii="Calibri" w:cs="Calibri" w:eastAsia="Calibri" w:hAnsi="Calibri"/>
-          <w:color w:val="2E2E2E"/>
-          <w:sz w:val="21"/>
-          <w:szCs w:val="21"/>
-        </w:rPr>
-        <w:t xml:space="preserve">, ou prévenir en cas d’absence. C’est non négociable.</w:t>
-      </w:r>
-    </w:p>
-    <w:p>
-      <w:pPr>
-        <w:pStyle w:val="ListParagraph"/>
-        <w:numPr>
-          <w:ilvl w:val="0"/>
-          <w:numId w:val="2"/>
-        </w:numPr>
-        <w:spacing w:after="60" w:line="264"/>
-      </w:pPr>
-      <w:r>
-        <w:rPr>
-          <w:rFonts w:ascii="Calibri" w:cs="Calibri" w:eastAsia="Calibri" w:hAnsi="Calibri"/>
-          <w:color w:val="2E2E2E"/>
-          <w:sz w:val="21"/>
-          <w:szCs w:val="21"/>
-        </w:rPr>
-        <w:t xml:space="preserve">Toute absence non annoncée met un collègue en difficulté et se voit immédiatement côté parents.</w:t>
-      </w:r>
-    </w:p>
-    <w:p>
-      <w:pPr>
-        <w:pStyle w:val="ListParagraph"/>
-        <w:numPr>
-          <w:ilvl w:val="0"/>
-          <w:numId w:val="2"/>
-        </w:numPr>
-        <w:spacing w:after="60" w:line="264"/>
-      </w:pPr>
-      <w:r>
-        <w:rPr>
-          <w:rFonts w:ascii="Calibri" w:cs="Calibri" w:eastAsia="Calibri" w:hAnsi="Calibri"/>
-          <w:i/>
-          <w:iCs/>
-          <w:color w:val="6E6E6E"/>
-          <w:sz w:val="20"/>
-          <w:szCs w:val="20"/>
-        </w:rPr>
-        <w:t xml:space="preserve">À compléter : nombre de minutes d’avance attendues avant le début du cours</w:t>
-      </w:r>
-    </w:p>
-    <w:p>
-      <w:pPr>
-        <w:pStyle w:val="ListParagraph"/>
-        <w:numPr>
-          <w:ilvl w:val="0"/>
-          <w:numId w:val="2"/>
-        </w:numPr>
-        <w:spacing w:after="60" w:line="264"/>
-      </w:pPr>
-      <w:r>
-        <w:rPr>
-          <w:rFonts w:ascii="Calibri" w:cs="Calibri" w:eastAsia="Calibri" w:hAnsi="Calibri"/>
-          <w:i/>
-          <w:iCs/>
-          <w:color w:val="6E6E6E"/>
-          <w:sz w:val="20"/>
-          <w:szCs w:val="20"/>
-        </w:rPr>
-        <w:t xml:space="preserve">À compléter : dates des League Cup de la saison</w:t>
-      </w:r>
-    </w:p>
-    <w:p>
-      <w:pPr>
-        <w:keepNext/>
-        <w:pBdr>
-          <w:bottom w:val="single" w:color="8A9E28" w:sz="8" w:space="4"/>
-        </w:pBdr>
-        <w:spacing w:after="140" w:before="320"/>
-      </w:pPr>
-      <w:r>
-        <w:rPr>
-          <w:rFonts w:ascii="Calibri" w:cs="Calibri" w:eastAsia="Calibri" w:hAnsi="Calibri"/>
-          <w:b/>
-          <w:bCs/>
-          <w:color w:val="8A9E28"/>
-          <w:sz w:val="26"/>
-          <w:szCs w:val="26"/>
-        </w:rPr>
-        <w:t xml:space="preserve">7. </w:t>
-      </w:r>
-      <w:r>
-        <w:rPr>
-          <w:rFonts w:ascii="Calibri" w:cs="Calibri" w:eastAsia="Calibri" w:hAnsi="Calibri"/>
-          <w:b/>
-          <w:bCs/>
-          <w:color w:val="C0392B"/>
-          <w:sz w:val="26"/>
-          <w:szCs w:val="26"/>
-        </w:rPr>
         <w:t xml:space="preserve">Les règles de base</w:t>
       </w:r>
     </w:p>
@@ -3882,6 +3915,36 @@
           <w:szCs w:val="21"/>
         </w:rPr>
         <w:t xml:space="preserve">Cigarettes : jamais devant les élèves, jamais sur les terrains, jamais en tenue de moniteur à l’entrée du club.</w:t>
+      </w:r>
+    </w:p>
+    <w:p>
+      <w:pPr>
+        <w:pStyle w:val="ListParagraph"/>
+        <w:numPr>
+          <w:ilvl w:val="0"/>
+          <w:numId w:val="2"/>
+        </w:numPr>
+        <w:spacing w:after="60" w:line="264"/>
+      </w:pPr>
+      <w:r>
+        <w:rPr>
+          <w:rFonts w:ascii="Calibri" w:cs="Calibri" w:eastAsia="Calibri" w:hAnsi="Calibri"/>
+          <w:b/>
+          <w:bCs/>
+          <w:color w:val="2E2E2E"/>
+          <w:sz w:val="21"/>
+          <w:szCs w:val="21"/>
+        </w:rPr>
+        <w:t xml:space="preserve">Après le cours : </w:t>
+      </w:r>
+      <w:r>
+        <w:rPr>
+          <w:rFonts w:ascii="Calibri" w:cs="Calibri" w:eastAsia="Calibri" w:hAnsi="Calibri"/>
+          <w:color w:val="2E2E2E"/>
+          <w:sz w:val="21"/>
+          <w:szCs w:val="21"/>
+        </w:rPr>
+        <w:t xml:space="preserve">rangez votre matériel aux endroits prévus, ne le laissez pas dans les paniers. Fermez le kot et remettez la clé en place.</w:t>
       </w:r>
     </w:p>
     <w:p>

</xml_diff>

<commit_message>
Retire le délai de prévenance et la mention des absences non annoncées
Le point 5 n'appelle plus de délai minimum à fixer, et le point 6 s'en
tient au constat sur les stages.

Co-Authored-By: Claude Opus 5 <noreply@anthropic.com>
Claude-Session: https://claude.ai/code/session_01RsDkbcD3KwyPviDTcs72WZ
</commit_message>
<xml_diff>
--- a/Reunion_moniteurs_2026-2027.docx
+++ b/Reunion_moniteurs_2026-2027.docx
@@ -3356,27 +3356,6 @@
     </w:p>
     <w:p>
       <w:pPr>
-        <w:pStyle w:val="ListParagraph"/>
-        <w:numPr>
-          <w:ilvl w:val="0"/>
-          <w:numId w:val="2"/>
-        </w:numPr>
-        <w:spacing w:after="60" w:line="264"/>
-      </w:pPr>
-      <w:r>
-        <w:rPr>
-          <w:rFonts w:ascii="Calibri" w:cs="Calibri" w:eastAsia="Calibri" w:hAnsi="Calibri"/>
-          <w:i/>
-          <w:iCs/>
-          <w:color w:val="6E6E6E"/>
-          <w:sz w:val="20"/>
-          <w:szCs w:val="20"/>
-        </w:rPr>
-        <w:t xml:space="preserve">À compléter : délai minimum de prévenance (une semaine ? deux ?)</w:t>
-      </w:r>
-    </w:p>
-    <w:p>
-      <w:pPr>
         <w:keepNext/>
         <w:spacing w:after="60" w:before="140"/>
       </w:pPr>
@@ -3703,25 +3682,6 @@
           <w:szCs w:val="21"/>
         </w:rPr>
         <w:t xml:space="preserve">En stage, force est de constater que les horaires ne sont pas respectés.</w:t>
-      </w:r>
-    </w:p>
-    <w:p>
-      <w:pPr>
-        <w:pStyle w:val="ListParagraph"/>
-        <w:numPr>
-          <w:ilvl w:val="0"/>
-          <w:numId w:val="2"/>
-        </w:numPr>
-        <w:spacing w:after="60" w:line="264"/>
-      </w:pPr>
-      <w:r>
-        <w:rPr>
-          <w:rFonts w:ascii="Calibri" w:cs="Calibri" w:eastAsia="Calibri" w:hAnsi="Calibri"/>
-          <w:color w:val="2E2E2E"/>
-          <w:sz w:val="21"/>
-          <w:szCs w:val="21"/>
-        </w:rPr>
-        <w:t xml:space="preserve">Toute absence non annoncée met un collègue en difficulté et se voit immédiatement côté parents.</w:t>
       </w:r>
     </w:p>
     <w:p>

</xml_diff>

<commit_message>
Clé nominative, avertissement sur le kot et cadre de signature
Chaque moniteur reçoit sa propre clé : le boîtier disparaît, la clé
devient nominative et se restitue en fin de saison. Le rangement du kot
fait l'objet d'un avertissement explicite, sans sanction appliquée cette
saison. Une page « Pour accord » en fin de document recueille l'accord
écrit de chaque moniteur, condition des retenues sur facture.

Intègre par ailleurs les corrections relues des points 5 à 7.

Co-Authored-By: Claude Opus 5 <noreply@anthropic.com>
Claude-Session: https://claude.ai/code/session_01RsDkbcD3KwyPviDTcs72WZ
</commit_message>
<xml_diff>
--- a/Reunion_moniteurs_2026-2027.docx
+++ b/Reunion_moniteurs_2026-2027.docx
@@ -3294,7 +3294,7 @@
           <w:sz w:val="21"/>
           <w:szCs w:val="21"/>
         </w:rPr>
-        <w:t xml:space="preserve">Prévenez le plus tôt possible, et toujours par écrit.</w:t>
+        <w:t xml:space="preserve">Prévenez le plus tôt possible, et toujours par écrit, dans le groupe WhatsApp des profs.</w:t>
       </w:r>
     </w:p>
     <w:p>
@@ -3445,7 +3445,7 @@
           <w:sz w:val="21"/>
           <w:szCs w:val="21"/>
         </w:rPr>
-        <w:t xml:space="preserve">Les remplacements sont vérifiés à la fin de chaque période de comptage, pas en fin de saison.</w:t>
+        <w:t xml:space="preserve">Les remplacements sont vérifiés à la fin de chaque mois, à la réception des factures.</w:t>
       </w:r>
     </w:p>
     <w:p>
@@ -3516,62 +3516,12 @@
                 <w:sz w:val="21"/>
                 <w:szCs w:val="21"/>
               </w:rPr>
-              <w:t xml:space="preserve">Une heure qui ne figure pas à votre horaire et qui n’a pas été déclarée comme remplacement ne sera pas payée. C’est la seule règle qui rend le système fiable.</w:t>
+              <w:t xml:space="preserve">Une heure qui ne figure pas à votre horaire et qui n’a pas été déclarée comme remplacement ne sera pas payée.</w:t>
             </w:r>
           </w:p>
         </w:tc>
       </w:tr>
     </w:tbl>
-    <w:p>
-      <w:pPr>
-        <w:spacing w:after="140" w:before="0" w:line="276"/>
-      </w:pPr>
-      <w:r>
-        <w:rPr>
-          <w:rFonts w:ascii="Calibri" w:cs="Calibri" w:eastAsia="Calibri" w:hAnsi="Calibri"/>
-          <w:color w:val="2E2E2E"/>
-          <w:sz w:val="21"/>
-          <w:szCs w:val="21"/>
-        </w:rPr>
-        <w:t xml:space="preserve"/>
-      </w:r>
-    </w:p>
-    <w:p>
-      <w:pPr>
-        <w:keepNext/>
-        <w:spacing w:after="60" w:before="140"/>
-      </w:pPr>
-      <w:r>
-        <w:rPr>
-          <w:rFonts w:ascii="Calibri" w:cs="Calibri" w:eastAsia="Calibri" w:hAnsi="Calibri"/>
-          <w:b/>
-          <w:bCs/>
-          <w:color w:val="8A9E28"/>
-          <w:sz w:val="21"/>
-          <w:szCs w:val="21"/>
-        </w:rPr>
-        <w:t xml:space="preserve">Les parents</w:t>
-      </w:r>
-    </w:p>
-    <w:p>
-      <w:pPr>
-        <w:pStyle w:val="ListParagraph"/>
-        <w:numPr>
-          <w:ilvl w:val="0"/>
-          <w:numId w:val="2"/>
-        </w:numPr>
-        <w:spacing w:after="60" w:line="264"/>
-      </w:pPr>
-      <w:r>
-        <w:rPr>
-          <w:rFonts w:ascii="Calibri" w:cs="Calibri" w:eastAsia="Calibri" w:hAnsi="Calibri"/>
-          <w:color w:val="2E2E2E"/>
-          <w:sz w:val="21"/>
-          <w:szCs w:val="21"/>
-        </w:rPr>
-        <w:t xml:space="preserve">Inutile de prévenir les parents à l’avance : le remplaçant se signale simplement au début du cours.</w:t>
-      </w:r>
-    </w:p>
     <w:p>
       <w:pPr>
         <w:keepNext/>
@@ -3681,7 +3631,18 @@
           <w:sz w:val="21"/>
           <w:szCs w:val="21"/>
         </w:rPr>
-        <w:t xml:space="preserve">En stage, force est de constater que les horaires ne sont pas respectés.</w:t>
+        <w:t xml:space="preserve">En stage, force est de constater que les horaires ne sont pas respectés. </w:t>
+      </w:r>
+      <w:r>
+        <w:rPr>
+          <w:rFonts w:ascii="Calibri" w:cs="Calibri" w:eastAsia="Calibri" w:hAnsi="Calibri"/>
+          <w:b/>
+          <w:bCs/>
+          <w:color w:val="C0392B"/>
+          <w:sz w:val="21"/>
+          <w:szCs w:val="21"/>
+        </w:rPr>
+        <w:t xml:space="preserve">Si cela ne s’améliore pas, des sanctions seront prises à l’avenir.</w:t>
       </w:r>
     </w:p>
     <w:p>
@@ -3759,7 +3720,7 @@
           <w:sz w:val="21"/>
           <w:szCs w:val="21"/>
         </w:rPr>
-        <w:t xml:space="preserve">rangé, hors de vue, pas d’utilisation pendant le cours. Sauf urgence réelle.</w:t>
+        <w:t xml:space="preserve">rangé, hors de vue, pas d’utilisation pendant le cours ou le stage. Sauf urgence réelle.</w:t>
       </w:r>
     </w:p>
     <w:p>
@@ -3789,7 +3750,7 @@
           <w:sz w:val="21"/>
           <w:szCs w:val="21"/>
         </w:rPr>
-        <w:t xml:space="preserve">pendant un cours : les enfants ne restent jamais seuls.</w:t>
+        <w:t xml:space="preserve">pendant un cours, sauf pour aller aux toilettes : les enfants ne restent jamais seuls.</w:t>
       </w:r>
     </w:p>
     <w:p>
@@ -3879,41 +3840,8 @@
     </w:p>
     <w:p>
       <w:pPr>
-        <w:pStyle w:val="ListParagraph"/>
-        <w:numPr>
-          <w:ilvl w:val="0"/>
-          <w:numId w:val="2"/>
-        </w:numPr>
-        <w:spacing w:after="60" w:line="264"/>
-      </w:pPr>
-      <w:r>
-        <w:rPr>
-          <w:rFonts w:ascii="Calibri" w:cs="Calibri" w:eastAsia="Calibri" w:hAnsi="Calibri"/>
-          <w:b/>
-          <w:bCs/>
-          <w:color w:val="2E2E2E"/>
-          <w:sz w:val="21"/>
-          <w:szCs w:val="21"/>
-        </w:rPr>
-        <w:t xml:space="preserve">Après le cours : </w:t>
-      </w:r>
-      <w:r>
-        <w:rPr>
-          <w:rFonts w:ascii="Calibri" w:cs="Calibri" w:eastAsia="Calibri" w:hAnsi="Calibri"/>
-          <w:color w:val="2E2E2E"/>
-          <w:sz w:val="21"/>
-          <w:szCs w:val="21"/>
-        </w:rPr>
-        <w:t xml:space="preserve">rangez votre matériel aux endroits prévus, ne le laissez pas dans les paniers. Fermez le kot et remettez la clé en place.</w:t>
-      </w:r>
-    </w:p>
-    <w:p>
-      <w:pPr>
         <w:keepNext/>
-        <w:pBdr>
-          <w:bottom w:val="single" w:color="8A9E28" w:sz="8" w:space="4"/>
-        </w:pBdr>
-        <w:spacing w:after="140" w:before="320"/>
+        <w:spacing w:after="60" w:before="140"/>
       </w:pPr>
       <w:r>
         <w:rPr>
@@ -3921,155 +3849,84 @@
           <w:b/>
           <w:bCs/>
           <w:color w:val="8A9E28"/>
-          <w:sz w:val="26"/>
-          <w:szCs w:val="26"/>
-        </w:rPr>
-        <w:t xml:space="preserve">8. </w:t>
-      </w:r>
-      <w:r>
-        <w:rPr>
-          <w:rFonts w:ascii="Calibri" w:cs="Calibri" w:eastAsia="Calibri" w:hAnsi="Calibri"/>
-          <w:b/>
-          <w:bCs/>
-          <w:color w:val="C0392B"/>
-          <w:sz w:val="26"/>
-          <w:szCs w:val="26"/>
-        </w:rPr>
-        <w:t xml:space="preserve">Formations</w:t>
-      </w:r>
-    </w:p>
-    <w:p>
-      <w:pPr>
-        <w:pStyle w:val="ListParagraph"/>
-        <w:numPr>
-          <w:ilvl w:val="0"/>
-          <w:numId w:val="2"/>
-        </w:numPr>
-        <w:spacing w:after="60" w:line="264"/>
-      </w:pPr>
-      <w:r>
-        <w:rPr>
-          <w:rFonts w:ascii="Calibri" w:cs="Calibri" w:eastAsia="Calibri" w:hAnsi="Calibri"/>
-          <w:color w:val="2E2E2E"/>
-          <w:sz w:val="21"/>
-          <w:szCs w:val="21"/>
-        </w:rPr>
-        <w:t xml:space="preserve">Le club rembourse la formation et une hausse salariale suit l’obtention du niveau.</w:t>
-      </w:r>
-    </w:p>
-    <w:p>
-      <w:pPr>
-        <w:pStyle w:val="ListParagraph"/>
-        <w:numPr>
-          <w:ilvl w:val="0"/>
-          <w:numId w:val="2"/>
-        </w:numPr>
-        <w:spacing w:after="60" w:line="264"/>
-      </w:pPr>
-      <w:r>
-        <w:rPr>
-          <w:rFonts w:ascii="Calibri" w:cs="Calibri" w:eastAsia="Calibri" w:hAnsi="Calibri"/>
-          <w:b/>
-          <w:bCs/>
-          <w:color w:val="C0392B"/>
-          <w:sz w:val="21"/>
-          <w:szCs w:val="21"/>
-        </w:rPr>
-        <w:t xml:space="preserve">Question posée à chacun : qui s’engage à faire son niveau 1 cette saison ?</w:t>
-      </w:r>
-    </w:p>
-    <w:p>
-      <w:pPr>
-        <w:pStyle w:val="ListParagraph"/>
-        <w:numPr>
-          <w:ilvl w:val="0"/>
-          <w:numId w:val="2"/>
-        </w:numPr>
-        <w:spacing w:after="60" w:line="264"/>
-      </w:pPr>
-      <w:r>
-        <w:rPr>
-          <w:rFonts w:ascii="Calibri" w:cs="Calibri" w:eastAsia="Calibri" w:hAnsi="Calibri"/>
-          <w:i/>
-          <w:iCs/>
-          <w:color w:val="6E6E6E"/>
-          <w:sz w:val="20"/>
-          <w:szCs w:val="20"/>
-        </w:rPr>
-        <w:t xml:space="preserve">À compléter : conditions exactes du remboursement (avance, remboursement après réussite, engagement de durée)</w:t>
-      </w:r>
-    </w:p>
-    <w:p>
-      <w:pPr>
-        <w:pStyle w:val="ListParagraph"/>
-        <w:numPr>
-          <w:ilvl w:val="0"/>
-          <w:numId w:val="2"/>
-        </w:numPr>
-        <w:spacing w:after="60" w:line="264"/>
-      </w:pPr>
-      <w:r>
-        <w:rPr>
-          <w:rFonts w:ascii="Calibri" w:cs="Calibri" w:eastAsia="Calibri" w:hAnsi="Calibri"/>
-          <w:i/>
-          <w:iCs/>
-          <w:color w:val="6E6E6E"/>
-          <w:sz w:val="20"/>
-          <w:szCs w:val="20"/>
-        </w:rPr>
-        <w:t xml:space="preserve">À compléter : barème salarial par niveau de formation</w:t>
-      </w:r>
-    </w:p>
-    <w:p>
-      <w:pPr>
-        <w:pStyle w:val="ListParagraph"/>
-        <w:numPr>
-          <w:ilvl w:val="0"/>
-          <w:numId w:val="2"/>
-        </w:numPr>
-        <w:spacing w:after="60" w:line="264"/>
-      </w:pPr>
-      <w:r>
-        <w:rPr>
-          <w:rFonts w:ascii="Calibri" w:cs="Calibri" w:eastAsia="Calibri" w:hAnsi="Calibri"/>
-          <w:i/>
-          <w:iCs/>
-          <w:color w:val="6E6E6E"/>
-          <w:sz w:val="20"/>
-          <w:szCs w:val="20"/>
-        </w:rPr>
-        <w:t xml:space="preserve">À compléter : dates et lieux des sessions de formation</w:t>
-      </w:r>
-    </w:p>
-    <w:p>
-      <w:pPr>
-        <w:keepNext/>
-        <w:pBdr>
-          <w:bottom w:val="single" w:color="8A9E28" w:sz="8" w:space="4"/>
-        </w:pBdr>
-        <w:spacing w:after="140" w:before="320"/>
-      </w:pPr>
-      <w:r>
-        <w:rPr>
-          <w:rFonts w:ascii="Calibri" w:cs="Calibri" w:eastAsia="Calibri" w:hAnsi="Calibri"/>
-          <w:b/>
-          <w:bCs/>
-          <w:color w:val="8A9E28"/>
-          <w:sz w:val="26"/>
-          <w:szCs w:val="26"/>
-        </w:rPr>
-        <w:t xml:space="preserve">9. </w:t>
-      </w:r>
-      <w:r>
-        <w:rPr>
-          <w:rFonts w:ascii="Calibri" w:cs="Calibri" w:eastAsia="Calibri" w:hAnsi="Calibri"/>
-          <w:b/>
-          <w:bCs/>
-          <w:color w:val="C0392B"/>
-          <w:sz w:val="26"/>
-          <w:szCs w:val="26"/>
-        </w:rPr>
-        <w:t xml:space="preserve">Tenue vestimentaire et savoir-être</w:t>
+          <w:sz w:val="21"/>
+          <w:szCs w:val="21"/>
+        </w:rPr>
+        <w:t xml:space="preserve">Après le cours</w:t>
+      </w:r>
+    </w:p>
+    <w:p>
+      <w:pPr>
+        <w:pStyle w:val="ListParagraph"/>
+        <w:numPr>
+          <w:ilvl w:val="0"/>
+          <w:numId w:val="2"/>
+        </w:numPr>
+        <w:spacing w:after="60" w:line="264"/>
+      </w:pPr>
+      <w:r>
+        <w:rPr>
+          <w:rFonts w:ascii="Calibri" w:cs="Calibri" w:eastAsia="Calibri" w:hAnsi="Calibri"/>
+          <w:b/>
+          <w:bCs/>
+          <w:color w:val="2E2E2E"/>
+          <w:sz w:val="21"/>
+          <w:szCs w:val="21"/>
+        </w:rPr>
+        <w:t xml:space="preserve">Rangez votre matériel aux endroits prévus</w:t>
+      </w:r>
+      <w:r>
+        <w:rPr>
+          <w:rFonts w:ascii="Calibri" w:cs="Calibri" w:eastAsia="Calibri" w:hAnsi="Calibri"/>
+          <w:color w:val="2E2E2E"/>
+          <w:sz w:val="21"/>
+          <w:szCs w:val="21"/>
+        </w:rPr>
+        <w:t xml:space="preserve">, ne le laissez pas dans les paniers.</w:t>
+      </w:r>
+    </w:p>
+    <w:p>
+      <w:pPr>
+        <w:pStyle w:val="ListParagraph"/>
+        <w:numPr>
+          <w:ilvl w:val="0"/>
+          <w:numId w:val="2"/>
+        </w:numPr>
+        <w:spacing w:after="60" w:line="264"/>
+      </w:pPr>
+      <w:r>
+        <w:rPr>
+          <w:rFonts w:ascii="Calibri" w:cs="Calibri" w:eastAsia="Calibri" w:hAnsi="Calibri"/>
+          <w:b/>
+          <w:bCs/>
+          <w:color w:val="2E2E2E"/>
+          <w:sz w:val="21"/>
+          <w:szCs w:val="21"/>
+        </w:rPr>
+        <w:t xml:space="preserve">Fermez le kot en partant. </w:t>
+      </w:r>
+      <w:r>
+        <w:rPr>
+          <w:rFonts w:ascii="Calibri" w:cs="Calibri" w:eastAsia="Calibri" w:hAnsi="Calibri"/>
+          <w:color w:val="2E2E2E"/>
+          <w:sz w:val="21"/>
+          <w:szCs w:val="21"/>
+        </w:rPr>
+        <w:t xml:space="preserve">Chaque moniteur reçoit sa propre clé cette saison : plus de boîtier, plus de clé à remettre en place. En contrepartie, la clé est nominative — l’état du kot engage celui qui l’a fermé.</w:t>
+      </w:r>
+    </w:p>
+    <w:p>
+      <w:pPr>
+        <w:spacing w:after="100" w:before="0" w:line="276"/>
+      </w:pPr>
+      <w:r>
+        <w:rPr>
+          <w:rFonts w:ascii="Calibri" w:cs="Calibri" w:eastAsia="Calibri" w:hAnsi="Calibri"/>
+          <w:color w:val="2E2E2E"/>
+          <w:sz w:val="21"/>
+          <w:szCs w:val="21"/>
+        </w:rPr>
+        <w:t xml:space="preserve"/>
       </w:r>
     </w:p>
     <w:tbl>
@@ -4112,12 +3969,12 @@
                 <w:sz w:val="22"/>
                 <w:szCs w:val="22"/>
               </w:rPr>
-              <w:t xml:space="preserve">La tenue est OBLIGATOIRE à chaque cours.</w:t>
-            </w:r>
-          </w:p>
-          <w:p>
-            <w:pPr>
-              <w:spacing w:after="0" w:before="0" w:line="276"/>
+              <w:t xml:space="preserve">Un avertissement, pas encore une sanction.</w:t>
+            </w:r>
+          </w:p>
+          <w:p>
+            <w:pPr>
+              <w:spacing w:after="80" w:before="0" w:line="276"/>
             </w:pPr>
             <w:r>
               <w:rPr>
@@ -4126,7 +3983,23 @@
                 <w:sz w:val="21"/>
                 <w:szCs w:val="21"/>
               </w:rPr>
-              <w:t xml:space="preserve">Tenue Babolat ou vêtements à l’effigie du club. Pas d’exception, pas d’oubli.</w:t>
+              <w:t xml:space="preserve">Le rangement du kot est le point qui a le plus dérapé ces dernières saisons. Si rien ne change, nous mettrons en place un système de constats : rappel nominatif, puis retenue forfaitaire sur facture, puis retrait de la clé.</w:t>
+            </w:r>
+          </w:p>
+          <w:p>
+            <w:pPr>
+              <w:spacing w:after="0" w:before="0" w:line="276"/>
+            </w:pPr>
+            <w:r>
+              <w:rPr>
+                <w:rFonts w:ascii="Calibri" w:cs="Calibri" w:eastAsia="Calibri" w:hAnsi="Calibri"/>
+                <w:b/>
+                <w:bCs/>
+                <w:color w:val="2E2E2E"/>
+                <w:sz w:val="21"/>
+                <w:szCs w:val="21"/>
+              </w:rPr>
+              <w:t xml:space="preserve">Rien de cela n’est appliqué aujourd’hui. C’est à nous tous de faire que ce ne soit jamais nécessaire.</w:t>
             </w:r>
           </w:p>
         </w:tc>
@@ -4134,7 +4007,7 @@
     </w:tbl>
     <w:p>
       <w:pPr>
-        <w:spacing w:after="120" w:before="0" w:line="276"/>
+        <w:spacing w:after="140" w:before="0" w:line="276"/>
       </w:pPr>
       <w:r>
         <w:rPr>
@@ -4144,97 +4017,6 @@
           <w:szCs w:val="21"/>
         </w:rPr>
         <w:t xml:space="preserve"/>
-      </w:r>
-    </w:p>
-    <w:p>
-      <w:pPr>
-        <w:keepNext/>
-        <w:spacing w:after="60" w:before="140"/>
-      </w:pPr>
-      <w:r>
-        <w:rPr>
-          <w:rFonts w:ascii="Calibri" w:cs="Calibri" w:eastAsia="Calibri" w:hAnsi="Calibri"/>
-          <w:b/>
-          <w:bCs/>
-          <w:color w:val="8A9E28"/>
-          <w:sz w:val="21"/>
-          <w:szCs w:val="21"/>
-        </w:rPr>
-        <w:t xml:space="preserve">Les raquettes</w:t>
-      </w:r>
-    </w:p>
-    <w:p>
-      <w:pPr>
-        <w:pStyle w:val="ListParagraph"/>
-        <w:numPr>
-          <w:ilvl w:val="0"/>
-          <w:numId w:val="2"/>
-        </w:numPr>
-        <w:spacing w:after="60" w:line="264"/>
-      </w:pPr>
-      <w:r>
-        <w:rPr>
-          <w:rFonts w:ascii="Calibri" w:cs="Calibri" w:eastAsia="Calibri" w:hAnsi="Calibri"/>
-          <w:color w:val="2E2E2E"/>
-          <w:sz w:val="21"/>
-          <w:szCs w:val="21"/>
-        </w:rPr>
-        <w:t xml:space="preserve">Les raquettes qui se trouvent dans le kot sont réservées aux élèves. Elles ne sont pas là pour vous dépanner.</w:t>
-      </w:r>
-    </w:p>
-    <w:p>
-      <w:pPr>
-        <w:keepNext/>
-        <w:spacing w:after="60" w:before="140"/>
-      </w:pPr>
-      <w:r>
-        <w:rPr>
-          <w:rFonts w:ascii="Calibri" w:cs="Calibri" w:eastAsia="Calibri" w:hAnsi="Calibri"/>
-          <w:b/>
-          <w:bCs/>
-          <w:color w:val="8A9E28"/>
-          <w:sz w:val="21"/>
-          <w:szCs w:val="21"/>
-        </w:rPr>
-        <w:t xml:space="preserve">Le savoir-être</w:t>
-      </w:r>
-    </w:p>
-    <w:p>
-      <w:pPr>
-        <w:pStyle w:val="ListParagraph"/>
-        <w:numPr>
-          <w:ilvl w:val="0"/>
-          <w:numId w:val="2"/>
-        </w:numPr>
-        <w:spacing w:after="60" w:line="264"/>
-      </w:pPr>
-      <w:r>
-        <w:rPr>
-          <w:rFonts w:ascii="Calibri" w:cs="Calibri" w:eastAsia="Calibri" w:hAnsi="Calibri"/>
-          <w:color w:val="2E2E2E"/>
-          <w:sz w:val="21"/>
-          <w:szCs w:val="21"/>
-        </w:rPr>
-        <w:t xml:space="preserve">Vocabulaire et attitude corrects avec les élèves, les parents et les membres du club.</w:t>
-      </w:r>
-    </w:p>
-    <w:p>
-      <w:pPr>
-        <w:pStyle w:val="ListParagraph"/>
-        <w:numPr>
-          <w:ilvl w:val="0"/>
-          <w:numId w:val="2"/>
-        </w:numPr>
-        <w:spacing w:after="60" w:line="264"/>
-      </w:pPr>
-      <w:r>
-        <w:rPr>
-          <w:rFonts w:ascii="Calibri" w:cs="Calibri" w:eastAsia="Calibri" w:hAnsi="Calibri"/>
-          <w:color w:val="2E2E2E"/>
-          <w:sz w:val="21"/>
-          <w:szCs w:val="21"/>
-        </w:rPr>
-        <w:t xml:space="preserve">Vous représentez le club dès que vous franchissez la grille, pas seulement pendant votre heure de cours.</w:t>
       </w:r>
     </w:p>
     <w:p>
@@ -4254,7 +4036,7 @@
           <w:sz w:val="26"/>
           <w:szCs w:val="26"/>
         </w:rPr>
-        <w:t xml:space="preserve">10. </w:t>
+        <w:t xml:space="preserve">8. </w:t>
       </w:r>
       <w:r>
         <w:rPr>
@@ -4265,64 +4047,47 @@
           <w:sz w:val="26"/>
           <w:szCs w:val="26"/>
         </w:rPr>
-        <w:t xml:space="preserve">Esprit d’équipe</w:t>
-      </w:r>
-    </w:p>
-    <w:p>
-      <w:pPr>
-        <w:pStyle w:val="ListParagraph"/>
-        <w:numPr>
-          <w:ilvl w:val="0"/>
-          <w:numId w:val="2"/>
-        </w:numPr>
-        <w:spacing w:after="60" w:line="264"/>
-      </w:pPr>
-      <w:r>
-        <w:rPr>
-          <w:rFonts w:ascii="Calibri" w:cs="Calibri" w:eastAsia="Calibri" w:hAnsi="Calibri"/>
-          <w:color w:val="2E2E2E"/>
-          <w:sz w:val="21"/>
-          <w:szCs w:val="21"/>
-        </w:rPr>
-        <w:t xml:space="preserve">On se soutient : un collègue en difficulté sur un groupe, on l’aide.</w:t>
-      </w:r>
-    </w:p>
-    <w:p>
-      <w:pPr>
-        <w:pStyle w:val="ListParagraph"/>
-        <w:numPr>
-          <w:ilvl w:val="0"/>
-          <w:numId w:val="2"/>
-        </w:numPr>
-        <w:spacing w:after="60" w:line="264"/>
-      </w:pPr>
-      <w:r>
-        <w:rPr>
-          <w:rFonts w:ascii="Calibri" w:cs="Calibri" w:eastAsia="Calibri" w:hAnsi="Calibri"/>
-          <w:color w:val="2E2E2E"/>
-          <w:sz w:val="21"/>
-          <w:szCs w:val="21"/>
-        </w:rPr>
-        <w:t xml:space="preserve">On partage ce qui fonctionne : exercices, jeux, façons de gérer un groupe difficile.</w:t>
-      </w:r>
-    </w:p>
-    <w:p>
-      <w:pPr>
-        <w:pStyle w:val="ListParagraph"/>
-        <w:numPr>
-          <w:ilvl w:val="0"/>
-          <w:numId w:val="2"/>
-        </w:numPr>
-        <w:spacing w:after="60" w:line="264"/>
-      </w:pPr>
-      <w:r>
-        <w:rPr>
-          <w:rFonts w:ascii="Calibri" w:cs="Calibri" w:eastAsia="Calibri" w:hAnsi="Calibri"/>
-          <w:color w:val="2E2E2E"/>
-          <w:sz w:val="21"/>
-          <w:szCs w:val="21"/>
-        </w:rPr>
-        <w:t xml:space="preserve">Les désaccords se règlent entre nous, jamais devant les élèves ou les parents.</w:t>
+        <w:t xml:space="preserve">Formations</w:t>
+      </w:r>
+    </w:p>
+    <w:p>
+      <w:pPr>
+        <w:pStyle w:val="ListParagraph"/>
+        <w:numPr>
+          <w:ilvl w:val="0"/>
+          <w:numId w:val="2"/>
+        </w:numPr>
+        <w:spacing w:after="60" w:line="264"/>
+      </w:pPr>
+      <w:r>
+        <w:rPr>
+          <w:rFonts w:ascii="Calibri" w:cs="Calibri" w:eastAsia="Calibri" w:hAnsi="Calibri"/>
+          <w:color w:val="2E2E2E"/>
+          <w:sz w:val="21"/>
+          <w:szCs w:val="21"/>
+        </w:rPr>
+        <w:t xml:space="preserve">Le club rembourse la formation et une hausse salariale suit l’obtention du niveau.</w:t>
+      </w:r>
+    </w:p>
+    <w:p>
+      <w:pPr>
+        <w:pStyle w:val="ListParagraph"/>
+        <w:numPr>
+          <w:ilvl w:val="0"/>
+          <w:numId w:val="2"/>
+        </w:numPr>
+        <w:spacing w:after="60" w:line="264"/>
+      </w:pPr>
+      <w:r>
+        <w:rPr>
+          <w:rFonts w:ascii="Calibri" w:cs="Calibri" w:eastAsia="Calibri" w:hAnsi="Calibri"/>
+          <w:b/>
+          <w:bCs/>
+          <w:color w:val="C0392B"/>
+          <w:sz w:val="21"/>
+          <w:szCs w:val="21"/>
+        </w:rPr>
+        <w:t xml:space="preserve">Question posée à chacun : qui s’engage à faire son niveau 1 cette saison ?</w:t>
       </w:r>
     </w:p>
     <w:p>
@@ -4343,7 +4108,49 @@
           <w:sz w:val="20"/>
           <w:szCs w:val="20"/>
         </w:rPr>
-        <w:t xml:space="preserve">À compléter : canal de communication de l’équipe pour la saison</w:t>
+        <w:t xml:space="preserve">À compléter : conditions exactes du remboursement (avance, remboursement après réussite, engagement de durée)</w:t>
+      </w:r>
+    </w:p>
+    <w:p>
+      <w:pPr>
+        <w:pStyle w:val="ListParagraph"/>
+        <w:numPr>
+          <w:ilvl w:val="0"/>
+          <w:numId w:val="2"/>
+        </w:numPr>
+        <w:spacing w:after="60" w:line="264"/>
+      </w:pPr>
+      <w:r>
+        <w:rPr>
+          <w:rFonts w:ascii="Calibri" w:cs="Calibri" w:eastAsia="Calibri" w:hAnsi="Calibri"/>
+          <w:i/>
+          <w:iCs/>
+          <w:color w:val="6E6E6E"/>
+          <w:sz w:val="20"/>
+          <w:szCs w:val="20"/>
+        </w:rPr>
+        <w:t xml:space="preserve">À compléter : barème salarial par niveau de formation</w:t>
+      </w:r>
+    </w:p>
+    <w:p>
+      <w:pPr>
+        <w:pStyle w:val="ListParagraph"/>
+        <w:numPr>
+          <w:ilvl w:val="0"/>
+          <w:numId w:val="2"/>
+        </w:numPr>
+        <w:spacing w:after="60" w:line="264"/>
+      </w:pPr>
+      <w:r>
+        <w:rPr>
+          <w:rFonts w:ascii="Calibri" w:cs="Calibri" w:eastAsia="Calibri" w:hAnsi="Calibri"/>
+          <w:i/>
+          <w:iCs/>
+          <w:color w:val="6E6E6E"/>
+          <w:sz w:val="20"/>
+          <w:szCs w:val="20"/>
+        </w:rPr>
+        <w:t xml:space="preserve">À compléter : dates et lieux des sessions de formation</w:t>
       </w:r>
     </w:p>
     <w:p>
@@ -4363,7 +4170,7 @@
           <w:sz w:val="26"/>
           <w:szCs w:val="26"/>
         </w:rPr>
-        <w:t xml:space="preserve">11. </w:t>
+        <w:t xml:space="preserve">9. </w:t>
       </w:r>
       <w:r>
         <w:rPr>
@@ -4374,537 +4181,7 @@
           <w:sz w:val="26"/>
           <w:szCs w:val="26"/>
         </w:rPr>
-        <w:t xml:space="preserve">Le kot : ordre et accès</w:t>
-      </w:r>
-    </w:p>
-    <w:p>
-      <w:pPr>
-        <w:pStyle w:val="ListParagraph"/>
-        <w:numPr>
-          <w:ilvl w:val="0"/>
-          <w:numId w:val="2"/>
-        </w:numPr>
-        <w:spacing w:after="60" w:line="264"/>
-      </w:pPr>
-      <w:r>
-        <w:rPr>
-          <w:rFonts w:ascii="Calibri" w:cs="Calibri" w:eastAsia="Calibri" w:hAnsi="Calibri"/>
-          <w:color w:val="2E2E2E"/>
-          <w:sz w:val="21"/>
-          <w:szCs w:val="21"/>
-        </w:rPr>
-        <w:t xml:space="preserve">Rangement après chaque cours : paniers, cônes, filets, plots. Le kot se rend dans l’état où on l’a trouvé.</w:t>
-      </w:r>
-    </w:p>
-    <w:p>
-      <w:pPr>
-        <w:pStyle w:val="ListParagraph"/>
-        <w:numPr>
-          <w:ilvl w:val="0"/>
-          <w:numId w:val="2"/>
-        </w:numPr>
-        <w:spacing w:after="60" w:line="264"/>
-      </w:pPr>
-      <w:r>
-        <w:rPr>
-          <w:rFonts w:ascii="Calibri" w:cs="Calibri" w:eastAsia="Calibri" w:hAnsi="Calibri"/>
-          <w:color w:val="2E2E2E"/>
-          <w:sz w:val="21"/>
-          <w:szCs w:val="21"/>
-        </w:rPr>
-        <w:t xml:space="preserve">Pas d’affaires personnelles laissées sur place.</w:t>
-      </w:r>
-    </w:p>
-    <w:p>
-      <w:pPr>
-        <w:pStyle w:val="ListParagraph"/>
-        <w:numPr>
-          <w:ilvl w:val="0"/>
-          <w:numId w:val="2"/>
-        </w:numPr>
-        <w:spacing w:after="60" w:line="264"/>
-      </w:pPr>
-      <w:r>
-        <w:rPr>
-          <w:rFonts w:ascii="Calibri" w:cs="Calibri" w:eastAsia="Calibri" w:hAnsi="Calibri"/>
-          <w:color w:val="2E2E2E"/>
-          <w:sz w:val="21"/>
-          <w:szCs w:val="21"/>
-        </w:rPr>
-        <w:t xml:space="preserve">Le matériel commun (paniers, cônes, filets, plots) reste sous la responsabilité de tous : on le range après chaque cours.</w:t>
-      </w:r>
-    </w:p>
-    <w:p>
-      <w:pPr>
-        <w:pStyle w:val="ListParagraph"/>
-        <w:numPr>
-          <w:ilvl w:val="0"/>
-          <w:numId w:val="2"/>
-        </w:numPr>
-        <w:spacing w:after="60" w:line="264"/>
-      </w:pPr>
-      <w:r>
-        <w:rPr>
-          <w:rFonts w:ascii="Calibri" w:cs="Calibri" w:eastAsia="Calibri" w:hAnsi="Calibri"/>
-          <w:i/>
-          <w:iCs/>
-          <w:color w:val="6E6E6E"/>
-          <w:sz w:val="20"/>
-          <w:szCs w:val="20"/>
-        </w:rPr>
-        <w:t xml:space="preserve">À compléter : qui dispose d’une clé, et règles de restitution en fin de saison</w:t>
-      </w:r>
-    </w:p>
-    <w:p>
-      <w:pPr>
-        <w:keepNext/>
-        <w:pBdr>
-          <w:bottom w:val="single" w:color="8A9E28" w:sz="8" w:space="4"/>
-        </w:pBdr>
-        <w:spacing w:after="140" w:before="320"/>
-      </w:pPr>
-      <w:r>
-        <w:rPr>
-          <w:rFonts w:ascii="Calibri" w:cs="Calibri" w:eastAsia="Calibri" w:hAnsi="Calibri"/>
-          <w:b/>
-          <w:bCs/>
-          <w:color w:val="8A9E28"/>
-          <w:sz w:val="26"/>
-          <w:szCs w:val="26"/>
-        </w:rPr>
-        <w:t xml:space="preserve">12. </w:t>
-      </w:r>
-      <w:r>
-        <w:rPr>
-          <w:rFonts w:ascii="Calibri" w:cs="Calibri" w:eastAsia="Calibri" w:hAnsi="Calibri"/>
-          <w:b/>
-          <w:bCs/>
-          <w:color w:val="C0392B"/>
-          <w:sz w:val="26"/>
-          <w:szCs w:val="26"/>
-        </w:rPr>
-        <w:t xml:space="preserve">Les cours privés</w:t>
-      </w:r>
-    </w:p>
-    <w:p>
-      <w:pPr>
-        <w:spacing w:after="120" w:before="0" w:line="276"/>
-      </w:pPr>
-      <w:r>
-        <w:rPr>
-          <w:rFonts w:ascii="Calibri" w:cs="Calibri" w:eastAsia="Calibri" w:hAnsi="Calibri"/>
-          <w:color w:val="2E2E2E"/>
-          <w:sz w:val="21"/>
-          <w:szCs w:val="21"/>
-        </w:rPr>
-        <w:t xml:space="preserve">Lorsqu’une demande de cours privé arrive au club, je transmets aux parents vos tarifs, votre niveau de formation et vos années d’expérience. Le choix leur revient ensuite.</w:t>
-      </w:r>
-    </w:p>
-    <w:p>
-      <w:pPr>
-        <w:keepNext/>
-        <w:spacing w:after="60" w:before="140"/>
-      </w:pPr>
-      <w:r>
-        <w:rPr>
-          <w:rFonts w:ascii="Calibri" w:cs="Calibri" w:eastAsia="Calibri" w:hAnsi="Calibri"/>
-          <w:b/>
-          <w:bCs/>
-          <w:color w:val="8A9E28"/>
-          <w:sz w:val="21"/>
-          <w:szCs w:val="21"/>
-        </w:rPr>
-        <w:t xml:space="preserve">Le terrain</w:t>
-      </w:r>
-    </w:p>
-    <w:p>
-      <w:pPr>
-        <w:pStyle w:val="ListParagraph"/>
-        <w:numPr>
-          <w:ilvl w:val="0"/>
-          <w:numId w:val="2"/>
-        </w:numPr>
-        <w:spacing w:after="60" w:line="264"/>
-      </w:pPr>
-      <w:r>
-        <w:rPr>
-          <w:rFonts w:ascii="Calibri" w:cs="Calibri" w:eastAsia="Calibri" w:hAnsi="Calibri"/>
-          <w:b/>
-          <w:bCs/>
-          <w:color w:val="C0392B"/>
-          <w:sz w:val="21"/>
-          <w:szCs w:val="21"/>
-        </w:rPr>
-        <w:t xml:space="preserve">15 € de l’heure</w:t>
-      </w:r>
-      <w:r>
-        <w:rPr>
-          <w:rFonts w:ascii="Calibri" w:cs="Calibri" w:eastAsia="Calibri" w:hAnsi="Calibri"/>
-          <w:color w:val="2E2E2E"/>
-          <w:sz w:val="21"/>
-          <w:szCs w:val="21"/>
-        </w:rPr>
-        <w:t xml:space="preserve">, à remettre en cash, sous enveloppe, à Marc à la fin du mois.</w:t>
-      </w:r>
-    </w:p>
-    <w:p>
-      <w:pPr>
-        <w:pStyle w:val="ListParagraph"/>
-        <w:numPr>
-          <w:ilvl w:val="0"/>
-          <w:numId w:val="2"/>
-        </w:numPr>
-        <w:spacing w:after="60" w:line="264"/>
-      </w:pPr>
-      <w:r>
-        <w:rPr>
-          <w:rFonts w:ascii="Calibri" w:cs="Calibri" w:eastAsia="Calibri" w:hAnsi="Calibri"/>
-          <w:color w:val="2E2E2E"/>
-          <w:sz w:val="21"/>
-          <w:szCs w:val="21"/>
-        </w:rPr>
-        <w:t xml:space="preserve">L’enveloppe porte votre nom et le nombre d’heures jouées.</w:t>
-      </w:r>
-    </w:p>
-    <w:p>
-      <w:pPr>
-        <w:pStyle w:val="ListParagraph"/>
-        <w:numPr>
-          <w:ilvl w:val="0"/>
-          <w:numId w:val="2"/>
-        </w:numPr>
-        <w:spacing w:after="60" w:line="264"/>
-      </w:pPr>
-      <w:r>
-        <w:rPr>
-          <w:rFonts w:ascii="Calibri" w:cs="Calibri" w:eastAsia="Calibri" w:hAnsi="Calibri"/>
-          <w:i/>
-          <w:iCs/>
-          <w:color w:val="6E6E6E"/>
-          <w:sz w:val="20"/>
-          <w:szCs w:val="20"/>
-        </w:rPr>
-        <w:t xml:space="preserve">À compléter : procédure de réservation des terrains pour les cours privés</w:t>
-      </w:r>
-    </w:p>
-    <w:p>
-      <w:pPr>
-        <w:pStyle w:val="ListParagraph"/>
-        <w:numPr>
-          <w:ilvl w:val="0"/>
-          <w:numId w:val="2"/>
-        </w:numPr>
-        <w:spacing w:after="60" w:line="264"/>
-      </w:pPr>
-      <w:r>
-        <w:rPr>
-          <w:rFonts w:ascii="Calibri" w:cs="Calibri" w:eastAsia="Calibri" w:hAnsi="Calibri"/>
-          <w:i/>
-          <w:iCs/>
-          <w:color w:val="6E6E6E"/>
-          <w:sz w:val="20"/>
-          <w:szCs w:val="20"/>
-        </w:rPr>
-        <w:t xml:space="preserve">À compléter : chacun communique son tarif horaire pour la saison</w:t>
-      </w:r>
-    </w:p>
-    <w:p>
-      <w:pPr>
-        <w:keepNext/>
-        <w:pBdr>
-          <w:bottom w:val="single" w:color="8A9E28" w:sz="8" w:space="4"/>
-        </w:pBdr>
-        <w:spacing w:after="140" w:before="320"/>
-      </w:pPr>
-      <w:r>
-        <w:rPr>
-          <w:rFonts w:ascii="Calibri" w:cs="Calibri" w:eastAsia="Calibri" w:hAnsi="Calibri"/>
-          <w:b/>
-          <w:bCs/>
-          <w:color w:val="8A9E28"/>
-          <w:sz w:val="26"/>
-          <w:szCs w:val="26"/>
-        </w:rPr>
-        <w:t xml:space="preserve">13. </w:t>
-      </w:r>
-      <w:r>
-        <w:rPr>
-          <w:rFonts w:ascii="Calibri" w:cs="Calibri" w:eastAsia="Calibri" w:hAnsi="Calibri"/>
-          <w:b/>
-          <w:bCs/>
-          <w:color w:val="C0392B"/>
-          <w:sz w:val="26"/>
-          <w:szCs w:val="26"/>
-        </w:rPr>
-        <w:t xml:space="preserve">Assurances et responsabilité</w:t>
-      </w:r>
-    </w:p>
-    <w:p>
-      <w:pPr>
-        <w:spacing w:after="120" w:before="0" w:line="276"/>
-      </w:pPr>
-      <w:r>
-        <w:rPr>
-          <w:rFonts w:ascii="Calibri" w:cs="Calibri" w:eastAsia="Calibri" w:hAnsi="Calibri"/>
-          <w:i/>
-          <w:iCs/>
-          <w:color w:val="6E6E6E"/>
-          <w:sz w:val="20"/>
-          <w:szCs w:val="20"/>
-        </w:rPr>
-        <w:t xml:space="preserve">Point resté ouvert l’an dernier. Nous le clôturons cette année.</w:t>
-      </w:r>
-    </w:p>
-    <w:p>
-      <w:pPr>
-        <w:pStyle w:val="ListParagraph"/>
-        <w:numPr>
-          <w:ilvl w:val="0"/>
-          <w:numId w:val="2"/>
-        </w:numPr>
-        <w:spacing w:after="60" w:line="264"/>
-      </w:pPr>
-      <w:r>
-        <w:rPr>
-          <w:rFonts w:ascii="Calibri" w:cs="Calibri" w:eastAsia="Calibri" w:hAnsi="Calibri"/>
-          <w:color w:val="2E2E2E"/>
-          <w:sz w:val="21"/>
-          <w:szCs w:val="21"/>
-        </w:rPr>
-        <w:t xml:space="preserve">Vérification de la responsabilité civile de chaque moniteur.</w:t>
-      </w:r>
-    </w:p>
-    <w:p>
-      <w:pPr>
-        <w:pStyle w:val="ListParagraph"/>
-        <w:numPr>
-          <w:ilvl w:val="0"/>
-          <w:numId w:val="2"/>
-        </w:numPr>
-        <w:spacing w:after="60" w:line="264"/>
-      </w:pPr>
-      <w:r>
-        <w:rPr>
-          <w:rFonts w:ascii="Calibri" w:cs="Calibri" w:eastAsia="Calibri" w:hAnsi="Calibri"/>
-          <w:color w:val="2E2E2E"/>
-          <w:sz w:val="21"/>
-          <w:szCs w:val="21"/>
-        </w:rPr>
-        <w:t xml:space="preserve">Une assurance individuelle est-elle obligatoire, ou la couverture du club suffit-elle ?</w:t>
-      </w:r>
-    </w:p>
-    <w:p>
-      <w:pPr>
-        <w:pStyle w:val="ListParagraph"/>
-        <w:numPr>
-          <w:ilvl w:val="0"/>
-          <w:numId w:val="2"/>
-        </w:numPr>
-        <w:spacing w:after="60" w:line="264"/>
-      </w:pPr>
-      <w:r>
-        <w:rPr>
-          <w:rFonts w:ascii="Calibri" w:cs="Calibri" w:eastAsia="Calibri" w:hAnsi="Calibri"/>
-          <w:b/>
-          <w:bCs/>
-          <w:color w:val="2E2E2E"/>
-          <w:sz w:val="21"/>
-          <w:szCs w:val="21"/>
-        </w:rPr>
-        <w:t xml:space="preserve">Qui a la responsabilité des enfants lorsque le cours se termine ?</w:t>
-      </w:r>
-      <w:r>
-        <w:rPr>
-          <w:rFonts w:ascii="Calibri" w:cs="Calibri" w:eastAsia="Calibri" w:hAnsi="Calibri"/>
-          <w:color w:val="2E2E2E"/>
-          <w:sz w:val="21"/>
-          <w:szCs w:val="21"/>
-        </w:rPr>
-        <w:t xml:space="preserve"> Jusqu’à quel moment, et jusqu’où ?</w:t>
-      </w:r>
-    </w:p>
-    <w:p>
-      <w:pPr>
-        <w:pStyle w:val="ListParagraph"/>
-        <w:numPr>
-          <w:ilvl w:val="0"/>
-          <w:numId w:val="2"/>
-        </w:numPr>
-        <w:spacing w:after="60" w:line="264"/>
-      </w:pPr>
-      <w:r>
-        <w:rPr>
-          <w:rFonts w:ascii="Calibri" w:cs="Calibri" w:eastAsia="Calibri" w:hAnsi="Calibri"/>
-          <w:i/>
-          <w:iCs/>
-          <w:color w:val="6E6E6E"/>
-          <w:sz w:val="20"/>
-          <w:szCs w:val="20"/>
-        </w:rPr>
-        <w:t xml:space="preserve">À compléter : réponse obtenue auprès de la fédération / de l’assureur du club</w:t>
-      </w:r>
-    </w:p>
-    <w:p>
-      <w:pPr>
-        <w:pStyle w:val="ListParagraph"/>
-        <w:numPr>
-          <w:ilvl w:val="0"/>
-          <w:numId w:val="2"/>
-        </w:numPr>
-        <w:spacing w:after="60" w:line="264"/>
-      </w:pPr>
-      <w:r>
-        <w:rPr>
-          <w:rFonts w:ascii="Calibri" w:cs="Calibri" w:eastAsia="Calibri" w:hAnsi="Calibri"/>
-          <w:i/>
-          <w:iCs/>
-          <w:color w:val="6E6E6E"/>
-          <w:sz w:val="20"/>
-          <w:szCs w:val="20"/>
-        </w:rPr>
-        <w:t xml:space="preserve">À compléter : document à faire signer par chaque moniteur, le cas échéant</w:t>
-      </w:r>
-    </w:p>
-    <w:p>
-      <w:pPr>
-        <w:keepNext/>
-        <w:pBdr>
-          <w:bottom w:val="single" w:color="8A9E28" w:sz="8" w:space="4"/>
-        </w:pBdr>
-        <w:spacing w:after="140" w:before="320"/>
-      </w:pPr>
-      <w:r>
-        <w:rPr>
-          <w:rFonts w:ascii="Calibri" w:cs="Calibri" w:eastAsia="Calibri" w:hAnsi="Calibri"/>
-          <w:b/>
-          <w:bCs/>
-          <w:color w:val="8A9E28"/>
-          <w:sz w:val="26"/>
-          <w:szCs w:val="26"/>
-        </w:rPr>
-        <w:t xml:space="preserve">14. </w:t>
-      </w:r>
-      <w:r>
-        <w:rPr>
-          <w:rFonts w:ascii="Calibri" w:cs="Calibri" w:eastAsia="Calibri" w:hAnsi="Calibri"/>
-          <w:b/>
-          <w:bCs/>
-          <w:color w:val="C0392B"/>
-          <w:sz w:val="26"/>
-          <w:szCs w:val="26"/>
-        </w:rPr>
-        <w:t xml:space="preserve">Programme pédagogique</w:t>
-      </w:r>
-    </w:p>
-    <w:p>
-      <w:pPr>
-        <w:spacing w:after="120" w:before="0" w:line="276"/>
-      </w:pPr>
-      <w:r>
-        <w:rPr>
-          <w:rFonts w:ascii="Calibri" w:cs="Calibri" w:eastAsia="Calibri" w:hAnsi="Calibri"/>
-          <w:color w:val="2E2E2E"/>
-          <w:sz w:val="21"/>
-          <w:szCs w:val="21"/>
-        </w:rPr>
-        <w:t xml:space="preserve">Nous parcourons ensemble le document « Thèmes des cours », qui donne la trame pédagogique de la saison par niveau.</w:t>
-      </w:r>
-    </w:p>
-    <w:p>
-      <w:pPr>
-        <w:pStyle w:val="ListParagraph"/>
-        <w:numPr>
-          <w:ilvl w:val="0"/>
-          <w:numId w:val="2"/>
-        </w:numPr>
-        <w:spacing w:after="60" w:line="264"/>
-      </w:pPr>
-      <w:r>
-        <w:rPr>
-          <w:rFonts w:ascii="Calibri" w:cs="Calibri" w:eastAsia="Calibri" w:hAnsi="Calibri"/>
-          <w:i/>
-          <w:iCs/>
-          <w:color w:val="6E6E6E"/>
-          <w:sz w:val="20"/>
-          <w:szCs w:val="20"/>
-        </w:rPr>
-        <w:t xml:space="preserve">À compléter : joindre le document « Thèmes des cours » en annexe</w:t>
-      </w:r>
-    </w:p>
-    <w:p>
-      <w:pPr>
-        <w:keepNext/>
-        <w:pBdr>
-          <w:bottom w:val="single" w:color="8A9E28" w:sz="8" w:space="4"/>
-        </w:pBdr>
-        <w:spacing w:after="140" w:before="320"/>
-      </w:pPr>
-      <w:r>
-        <w:rPr>
-          <w:rFonts w:ascii="Calibri" w:cs="Calibri" w:eastAsia="Calibri" w:hAnsi="Calibri"/>
-          <w:b/>
-          <w:bCs/>
-          <w:color w:val="8A9E28"/>
-          <w:sz w:val="26"/>
-          <w:szCs w:val="26"/>
-        </w:rPr>
-        <w:t xml:space="preserve">15. </w:t>
-      </w:r>
-      <w:r>
-        <w:rPr>
-          <w:rFonts w:ascii="Calibri" w:cs="Calibri" w:eastAsia="Calibri" w:hAnsi="Calibri"/>
-          <w:b/>
-          <w:bCs/>
-          <w:color w:val="C0392B"/>
-          <w:sz w:val="26"/>
-          <w:szCs w:val="26"/>
-        </w:rPr>
-        <w:t xml:space="preserve">Remarques, suggestions, tour de table</w:t>
-      </w:r>
-    </w:p>
-    <w:p>
-      <w:pPr>
-        <w:spacing w:after="120" w:before="0" w:line="276"/>
-      </w:pPr>
-      <w:r>
-        <w:rPr>
-          <w:rFonts w:ascii="Calibri" w:cs="Calibri" w:eastAsia="Calibri" w:hAnsi="Calibri"/>
-          <w:color w:val="2E2E2E"/>
-          <w:sz w:val="21"/>
-          <w:szCs w:val="21"/>
-        </w:rPr>
-        <w:t xml:space="preserve">La parole est à vous. Questions, propositions, difficultés rencontrées l’an dernier : c’est le moment.</w:t>
-      </w:r>
-    </w:p>
-    <w:p>
-      <w:pPr>
-        <w:keepNext/>
-        <w:pBdr>
-          <w:bottom w:val="single" w:color="8A9E28" w:sz="8" w:space="4"/>
-        </w:pBdr>
-        <w:spacing w:after="140" w:before="320"/>
-      </w:pPr>
-      <w:r>
-        <w:rPr>
-          <w:rFonts w:ascii="Calibri" w:cs="Calibri" w:eastAsia="Calibri" w:hAnsi="Calibri"/>
-          <w:b/>
-          <w:bCs/>
-          <w:color w:val="8A9E28"/>
-          <w:sz w:val="26"/>
-          <w:szCs w:val="26"/>
-        </w:rPr>
-        <w:t xml:space="preserve">16. </w:t>
-      </w:r>
-      <w:r>
-        <w:rPr>
-          <w:rFonts w:ascii="Calibri" w:cs="Calibri" w:eastAsia="Calibri" w:hAnsi="Calibri"/>
-          <w:b/>
-          <w:bCs/>
-          <w:color w:val="C0392B"/>
-          <w:sz w:val="26"/>
-          <w:szCs w:val="26"/>
-        </w:rPr>
-        <w:t xml:space="preserve">Programmes, terrains et listes d’élèves</w:t>
+        <w:t xml:space="preserve">Tenue vestimentaire et savoir-être</w:t>
       </w:r>
     </w:p>
     <w:tbl>
@@ -4947,12 +4224,12 @@
                 <w:sz w:val="22"/>
                 <w:szCs w:val="22"/>
               </w:rPr>
-              <w:t xml:space="preserve">ATTENTION – LES TERRAINS ONT CHANGÉ.</w:t>
-            </w:r>
-          </w:p>
-          <w:p>
-            <w:pPr>
-              <w:spacing w:after="80" w:before="0" w:line="276"/>
+              <w:t xml:space="preserve">La tenue est OBLIGATOIRE à chaque cours.</w:t>
+            </w:r>
+          </w:p>
+          <w:p>
+            <w:pPr>
+              <w:spacing w:after="0" w:before="0" w:line="276"/>
             </w:pPr>
             <w:r>
               <w:rPr>
@@ -4961,23 +4238,7 @@
                 <w:sz w:val="21"/>
                 <w:szCs w:val="21"/>
               </w:rPr>
-              <w:t xml:space="preserve">Vérifiez votre affectation avant chaque cours : ce n’est plus celle de l’an dernier.</w:t>
-            </w:r>
-          </w:p>
-          <w:p>
-            <w:pPr>
-              <w:spacing w:after="0" w:before="0" w:line="276"/>
-            </w:pPr>
-            <w:r>
-              <w:rPr>
-                <w:rFonts w:ascii="Calibri" w:cs="Calibri" w:eastAsia="Calibri" w:hAnsi="Calibri"/>
-                <w:b/>
-                <w:bCs/>
-                <w:color w:val="2E2E2E"/>
-                <w:sz w:val="21"/>
-                <w:szCs w:val="21"/>
-              </w:rPr>
-              <w:t xml:space="preserve">N’utilisez QUE la dernière version du programme que je vous envoie.</w:t>
+              <w:t xml:space="preserve">Tenue Babolat ou vêtements à l’effigie du club. Pas d’exception, pas d’oubli.</w:t>
             </w:r>
           </w:p>
         </w:tc>
@@ -4999,59 +4260,181 @@
     </w:p>
     <w:p>
       <w:pPr>
-        <w:pStyle w:val="ListParagraph"/>
-        <w:numPr>
-          <w:ilvl w:val="0"/>
-          <w:numId w:val="2"/>
-        </w:numPr>
-        <w:spacing w:after="60" w:line="264"/>
-      </w:pPr>
-      <w:r>
-        <w:rPr>
-          <w:rFonts w:ascii="Calibri" w:cs="Calibri" w:eastAsia="Calibri" w:hAnsi="Calibri"/>
-          <w:color w:val="2E2E2E"/>
-          <w:sz w:val="21"/>
-          <w:szCs w:val="21"/>
-        </w:rPr>
-        <w:t xml:space="preserve">Les listes d’élèves peuvent encore bouger jusqu’au dernier moment : arrivées, départs, changements de groupe.</w:t>
-      </w:r>
-    </w:p>
-    <w:p>
-      <w:pPr>
-        <w:pStyle w:val="ListParagraph"/>
-        <w:numPr>
-          <w:ilvl w:val="0"/>
-          <w:numId w:val="2"/>
-        </w:numPr>
-        <w:spacing w:after="60" w:line="264"/>
-      </w:pPr>
-      <w:r>
-        <w:rPr>
-          <w:rFonts w:ascii="Calibri" w:cs="Calibri" w:eastAsia="Calibri" w:hAnsi="Calibri"/>
-          <w:color w:val="2E2E2E"/>
-          <w:sz w:val="21"/>
-          <w:szCs w:val="21"/>
-        </w:rPr>
-        <w:t xml:space="preserve">Une mise à jour est envoyée chaque matin, avant le début des cours.</w:t>
-      </w:r>
-    </w:p>
-    <w:p>
-      <w:pPr>
-        <w:pStyle w:val="ListParagraph"/>
-        <w:numPr>
-          <w:ilvl w:val="0"/>
-          <w:numId w:val="2"/>
-        </w:numPr>
-        <w:spacing w:after="60" w:line="264"/>
-      </w:pPr>
-      <w:r>
-        <w:rPr>
-          <w:rFonts w:ascii="Calibri" w:cs="Calibri" w:eastAsia="Calibri" w:hAnsi="Calibri"/>
-          <w:color w:val="2E2E2E"/>
-          <w:sz w:val="21"/>
-          <w:szCs w:val="21"/>
-        </w:rPr>
-        <w:t xml:space="preserve">Une ancienne version = un élève qui attend sur le mauvais terrain. Supprimez les anciennes.</w:t>
+        <w:keepNext/>
+        <w:spacing w:after="60" w:before="140"/>
+      </w:pPr>
+      <w:r>
+        <w:rPr>
+          <w:rFonts w:ascii="Calibri" w:cs="Calibri" w:eastAsia="Calibri" w:hAnsi="Calibri"/>
+          <w:b/>
+          <w:bCs/>
+          <w:color w:val="8A9E28"/>
+          <w:sz w:val="21"/>
+          <w:szCs w:val="21"/>
+        </w:rPr>
+        <w:t xml:space="preserve">Les raquettes</w:t>
+      </w:r>
+    </w:p>
+    <w:p>
+      <w:pPr>
+        <w:pStyle w:val="ListParagraph"/>
+        <w:numPr>
+          <w:ilvl w:val="0"/>
+          <w:numId w:val="2"/>
+        </w:numPr>
+        <w:spacing w:after="60" w:line="264"/>
+      </w:pPr>
+      <w:r>
+        <w:rPr>
+          <w:rFonts w:ascii="Calibri" w:cs="Calibri" w:eastAsia="Calibri" w:hAnsi="Calibri"/>
+          <w:color w:val="2E2E2E"/>
+          <w:sz w:val="21"/>
+          <w:szCs w:val="21"/>
+        </w:rPr>
+        <w:t xml:space="preserve">Les raquettes qui se trouvent dans le kot sont réservées aux élèves. Elles ne sont pas là pour vous dépanner.</w:t>
+      </w:r>
+    </w:p>
+    <w:p>
+      <w:pPr>
+        <w:keepNext/>
+        <w:spacing w:after="60" w:before="140"/>
+      </w:pPr>
+      <w:r>
+        <w:rPr>
+          <w:rFonts w:ascii="Calibri" w:cs="Calibri" w:eastAsia="Calibri" w:hAnsi="Calibri"/>
+          <w:b/>
+          <w:bCs/>
+          <w:color w:val="8A9E28"/>
+          <w:sz w:val="21"/>
+          <w:szCs w:val="21"/>
+        </w:rPr>
+        <w:t xml:space="preserve">Le savoir-être</w:t>
+      </w:r>
+    </w:p>
+    <w:p>
+      <w:pPr>
+        <w:pStyle w:val="ListParagraph"/>
+        <w:numPr>
+          <w:ilvl w:val="0"/>
+          <w:numId w:val="2"/>
+        </w:numPr>
+        <w:spacing w:after="60" w:line="264"/>
+      </w:pPr>
+      <w:r>
+        <w:rPr>
+          <w:rFonts w:ascii="Calibri" w:cs="Calibri" w:eastAsia="Calibri" w:hAnsi="Calibri"/>
+          <w:color w:val="2E2E2E"/>
+          <w:sz w:val="21"/>
+          <w:szCs w:val="21"/>
+        </w:rPr>
+        <w:t xml:space="preserve">Vocabulaire et attitude corrects avec les élèves, les parents et les membres du club.</w:t>
+      </w:r>
+    </w:p>
+    <w:p>
+      <w:pPr>
+        <w:pStyle w:val="ListParagraph"/>
+        <w:numPr>
+          <w:ilvl w:val="0"/>
+          <w:numId w:val="2"/>
+        </w:numPr>
+        <w:spacing w:after="60" w:line="264"/>
+      </w:pPr>
+      <w:r>
+        <w:rPr>
+          <w:rFonts w:ascii="Calibri" w:cs="Calibri" w:eastAsia="Calibri" w:hAnsi="Calibri"/>
+          <w:color w:val="2E2E2E"/>
+          <w:sz w:val="21"/>
+          <w:szCs w:val="21"/>
+        </w:rPr>
+        <w:t xml:space="preserve">Vous représentez le club dès que vous franchissez la grille, pas seulement pendant votre heure de cours.</w:t>
+      </w:r>
+    </w:p>
+    <w:p>
+      <w:pPr>
+        <w:keepNext/>
+        <w:pBdr>
+          <w:bottom w:val="single" w:color="8A9E28" w:sz="8" w:space="4"/>
+        </w:pBdr>
+        <w:spacing w:after="140" w:before="320"/>
+      </w:pPr>
+      <w:r>
+        <w:rPr>
+          <w:rFonts w:ascii="Calibri" w:cs="Calibri" w:eastAsia="Calibri" w:hAnsi="Calibri"/>
+          <w:b/>
+          <w:bCs/>
+          <w:color w:val="8A9E28"/>
+          <w:sz w:val="26"/>
+          <w:szCs w:val="26"/>
+        </w:rPr>
+        <w:t xml:space="preserve">10. </w:t>
+      </w:r>
+      <w:r>
+        <w:rPr>
+          <w:rFonts w:ascii="Calibri" w:cs="Calibri" w:eastAsia="Calibri" w:hAnsi="Calibri"/>
+          <w:b/>
+          <w:bCs/>
+          <w:color w:val="C0392B"/>
+          <w:sz w:val="26"/>
+          <w:szCs w:val="26"/>
+        </w:rPr>
+        <w:t xml:space="preserve">Esprit d’équipe</w:t>
+      </w:r>
+    </w:p>
+    <w:p>
+      <w:pPr>
+        <w:pStyle w:val="ListParagraph"/>
+        <w:numPr>
+          <w:ilvl w:val="0"/>
+          <w:numId w:val="2"/>
+        </w:numPr>
+        <w:spacing w:after="60" w:line="264"/>
+      </w:pPr>
+      <w:r>
+        <w:rPr>
+          <w:rFonts w:ascii="Calibri" w:cs="Calibri" w:eastAsia="Calibri" w:hAnsi="Calibri"/>
+          <w:color w:val="2E2E2E"/>
+          <w:sz w:val="21"/>
+          <w:szCs w:val="21"/>
+        </w:rPr>
+        <w:t xml:space="preserve">On se soutient : un collègue en difficulté sur un groupe, on l’aide.</w:t>
+      </w:r>
+    </w:p>
+    <w:p>
+      <w:pPr>
+        <w:pStyle w:val="ListParagraph"/>
+        <w:numPr>
+          <w:ilvl w:val="0"/>
+          <w:numId w:val="2"/>
+        </w:numPr>
+        <w:spacing w:after="60" w:line="264"/>
+      </w:pPr>
+      <w:r>
+        <w:rPr>
+          <w:rFonts w:ascii="Calibri" w:cs="Calibri" w:eastAsia="Calibri" w:hAnsi="Calibri"/>
+          <w:color w:val="2E2E2E"/>
+          <w:sz w:val="21"/>
+          <w:szCs w:val="21"/>
+        </w:rPr>
+        <w:t xml:space="preserve">On partage ce qui fonctionne : exercices, jeux, façons de gérer un groupe difficile.</w:t>
+      </w:r>
+    </w:p>
+    <w:p>
+      <w:pPr>
+        <w:pStyle w:val="ListParagraph"/>
+        <w:numPr>
+          <w:ilvl w:val="0"/>
+          <w:numId w:val="2"/>
+        </w:numPr>
+        <w:spacing w:after="60" w:line="264"/>
+      </w:pPr>
+      <w:r>
+        <w:rPr>
+          <w:rFonts w:ascii="Calibri" w:cs="Calibri" w:eastAsia="Calibri" w:hAnsi="Calibri"/>
+          <w:color w:val="2E2E2E"/>
+          <w:sz w:val="21"/>
+          <w:szCs w:val="21"/>
+        </w:rPr>
+        <w:t xml:space="preserve">Les désaccords se règlent entre nous, jamais devant les élèves ou les parents.</w:t>
       </w:r>
     </w:p>
     <w:p>
@@ -5072,21 +4455,7 @@
           <w:sz w:val="20"/>
           <w:szCs w:val="20"/>
         </w:rPr>
-        <w:t xml:space="preserve">À compléter : préciser le canal d’envoi des mises à jour (e-mail, WhatsApp, autre)</w:t>
-      </w:r>
-    </w:p>
-    <w:p>
-      <w:pPr>
-        <w:spacing w:after="200" w:before="0" w:line="276"/>
-      </w:pPr>
-      <w:r>
-        <w:rPr>
-          <w:rFonts w:ascii="Calibri" w:cs="Calibri" w:eastAsia="Calibri" w:hAnsi="Calibri"/>
-          <w:color w:val="2E2E2E"/>
-          <w:sz w:val="21"/>
-          <w:szCs w:val="21"/>
-        </w:rPr>
-        <w:t xml:space="preserve"/>
+        <w:t xml:space="preserve">À compléter : canal de communication de l’équipe pour la saison</w:t>
       </w:r>
     </w:p>
     <w:p>
@@ -5102,10 +4471,762 @@
           <w:rFonts w:ascii="Calibri" w:cs="Calibri" w:eastAsia="Calibri" w:hAnsi="Calibri"/>
           <w:b/>
           <w:bCs/>
+          <w:color w:val="8A9E28"/>
+          <w:sz w:val="26"/>
+          <w:szCs w:val="26"/>
+        </w:rPr>
+        <w:t xml:space="preserve">11. </w:t>
+      </w:r>
+      <w:r>
+        <w:rPr>
+          <w:rFonts w:ascii="Calibri" w:cs="Calibri" w:eastAsia="Calibri" w:hAnsi="Calibri"/>
+          <w:b/>
+          <w:bCs/>
           <w:color w:val="C0392B"/>
           <w:sz w:val="26"/>
           <w:szCs w:val="26"/>
         </w:rPr>
+        <w:t xml:space="preserve">Le kot : ordre et accès</w:t>
+      </w:r>
+    </w:p>
+    <w:p>
+      <w:pPr>
+        <w:pStyle w:val="ListParagraph"/>
+        <w:numPr>
+          <w:ilvl w:val="0"/>
+          <w:numId w:val="2"/>
+        </w:numPr>
+        <w:spacing w:after="60" w:line="264"/>
+      </w:pPr>
+      <w:r>
+        <w:rPr>
+          <w:rFonts w:ascii="Calibri" w:cs="Calibri" w:eastAsia="Calibri" w:hAnsi="Calibri"/>
+          <w:color w:val="2E2E2E"/>
+          <w:sz w:val="21"/>
+          <w:szCs w:val="21"/>
+        </w:rPr>
+        <w:t xml:space="preserve">Rangement après chaque cours : paniers, cônes, filets, plots. Le kot se rend dans l’état où on l’a trouvé.</w:t>
+      </w:r>
+    </w:p>
+    <w:p>
+      <w:pPr>
+        <w:pStyle w:val="ListParagraph"/>
+        <w:numPr>
+          <w:ilvl w:val="0"/>
+          <w:numId w:val="2"/>
+        </w:numPr>
+        <w:spacing w:after="60" w:line="264"/>
+      </w:pPr>
+      <w:r>
+        <w:rPr>
+          <w:rFonts w:ascii="Calibri" w:cs="Calibri" w:eastAsia="Calibri" w:hAnsi="Calibri"/>
+          <w:color w:val="2E2E2E"/>
+          <w:sz w:val="21"/>
+          <w:szCs w:val="21"/>
+        </w:rPr>
+        <w:t xml:space="preserve">Pas d’affaires personnelles laissées sur place.</w:t>
+      </w:r>
+    </w:p>
+    <w:p>
+      <w:pPr>
+        <w:pStyle w:val="ListParagraph"/>
+        <w:numPr>
+          <w:ilvl w:val="0"/>
+          <w:numId w:val="2"/>
+        </w:numPr>
+        <w:spacing w:after="60" w:line="264"/>
+      </w:pPr>
+      <w:r>
+        <w:rPr>
+          <w:rFonts w:ascii="Calibri" w:cs="Calibri" w:eastAsia="Calibri" w:hAnsi="Calibri"/>
+          <w:b/>
+          <w:bCs/>
+          <w:color w:val="2E2E2E"/>
+          <w:sz w:val="21"/>
+          <w:szCs w:val="21"/>
+        </w:rPr>
+        <w:t xml:space="preserve">Chaque moniteur reçoit sa propre clé pour la saison. </w:t>
+      </w:r>
+      <w:r>
+        <w:rPr>
+          <w:rFonts w:ascii="Calibri" w:cs="Calibri" w:eastAsia="Calibri" w:hAnsi="Calibri"/>
+          <w:color w:val="2E2E2E"/>
+          <w:sz w:val="21"/>
+          <w:szCs w:val="21"/>
+        </w:rPr>
+        <w:t xml:space="preserve">Elle est nominative et se restitue en fin de saison.</w:t>
+      </w:r>
+    </w:p>
+    <w:p>
+      <w:pPr>
+        <w:pStyle w:val="ListParagraph"/>
+        <w:numPr>
+          <w:ilvl w:val="0"/>
+          <w:numId w:val="2"/>
+        </w:numPr>
+        <w:spacing w:after="60" w:line="264"/>
+      </w:pPr>
+      <w:r>
+        <w:rPr>
+          <w:rFonts w:ascii="Calibri" w:cs="Calibri" w:eastAsia="Calibri" w:hAnsi="Calibri"/>
+          <w:color w:val="2E2E2E"/>
+          <w:sz w:val="21"/>
+          <w:szCs w:val="21"/>
+        </w:rPr>
+        <w:t xml:space="preserve">Le matériel commun reste sous la responsabilité de tous : on le range après chaque cours.</w:t>
+      </w:r>
+    </w:p>
+    <w:p>
+      <w:pPr>
+        <w:keepNext/>
+        <w:pBdr>
+          <w:bottom w:val="single" w:color="8A9E28" w:sz="8" w:space="4"/>
+        </w:pBdr>
+        <w:spacing w:after="140" w:before="320"/>
+      </w:pPr>
+      <w:r>
+        <w:rPr>
+          <w:rFonts w:ascii="Calibri" w:cs="Calibri" w:eastAsia="Calibri" w:hAnsi="Calibri"/>
+          <w:b/>
+          <w:bCs/>
+          <w:color w:val="8A9E28"/>
+          <w:sz w:val="26"/>
+          <w:szCs w:val="26"/>
+        </w:rPr>
+        <w:t xml:space="preserve">12. </w:t>
+      </w:r>
+      <w:r>
+        <w:rPr>
+          <w:rFonts w:ascii="Calibri" w:cs="Calibri" w:eastAsia="Calibri" w:hAnsi="Calibri"/>
+          <w:b/>
+          <w:bCs/>
+          <w:color w:val="C0392B"/>
+          <w:sz w:val="26"/>
+          <w:szCs w:val="26"/>
+        </w:rPr>
+        <w:t xml:space="preserve">Les cours privés</w:t>
+      </w:r>
+    </w:p>
+    <w:p>
+      <w:pPr>
+        <w:spacing w:after="120" w:before="0" w:line="276"/>
+      </w:pPr>
+      <w:r>
+        <w:rPr>
+          <w:rFonts w:ascii="Calibri" w:cs="Calibri" w:eastAsia="Calibri" w:hAnsi="Calibri"/>
+          <w:color w:val="2E2E2E"/>
+          <w:sz w:val="21"/>
+          <w:szCs w:val="21"/>
+        </w:rPr>
+        <w:t xml:space="preserve">Lorsqu’une demande de cours privé arrive au club, je transmets aux parents vos tarifs, votre niveau de formation et vos années d’expérience. Le choix leur revient ensuite.</w:t>
+      </w:r>
+    </w:p>
+    <w:p>
+      <w:pPr>
+        <w:keepNext/>
+        <w:spacing w:after="60" w:before="140"/>
+      </w:pPr>
+      <w:r>
+        <w:rPr>
+          <w:rFonts w:ascii="Calibri" w:cs="Calibri" w:eastAsia="Calibri" w:hAnsi="Calibri"/>
+          <w:b/>
+          <w:bCs/>
+          <w:color w:val="8A9E28"/>
+          <w:sz w:val="21"/>
+          <w:szCs w:val="21"/>
+        </w:rPr>
+        <w:t xml:space="preserve">Le terrain</w:t>
+      </w:r>
+    </w:p>
+    <w:p>
+      <w:pPr>
+        <w:pStyle w:val="ListParagraph"/>
+        <w:numPr>
+          <w:ilvl w:val="0"/>
+          <w:numId w:val="2"/>
+        </w:numPr>
+        <w:spacing w:after="60" w:line="264"/>
+      </w:pPr>
+      <w:r>
+        <w:rPr>
+          <w:rFonts w:ascii="Calibri" w:cs="Calibri" w:eastAsia="Calibri" w:hAnsi="Calibri"/>
+          <w:b/>
+          <w:bCs/>
+          <w:color w:val="C0392B"/>
+          <w:sz w:val="21"/>
+          <w:szCs w:val="21"/>
+        </w:rPr>
+        <w:t xml:space="preserve">15 € de l’heure</w:t>
+      </w:r>
+      <w:r>
+        <w:rPr>
+          <w:rFonts w:ascii="Calibri" w:cs="Calibri" w:eastAsia="Calibri" w:hAnsi="Calibri"/>
+          <w:color w:val="2E2E2E"/>
+          <w:sz w:val="21"/>
+          <w:szCs w:val="21"/>
+        </w:rPr>
+        <w:t xml:space="preserve">, à remettre en cash, sous enveloppe, à Marc à la fin du mois.</w:t>
+      </w:r>
+    </w:p>
+    <w:p>
+      <w:pPr>
+        <w:pStyle w:val="ListParagraph"/>
+        <w:numPr>
+          <w:ilvl w:val="0"/>
+          <w:numId w:val="2"/>
+        </w:numPr>
+        <w:spacing w:after="60" w:line="264"/>
+      </w:pPr>
+      <w:r>
+        <w:rPr>
+          <w:rFonts w:ascii="Calibri" w:cs="Calibri" w:eastAsia="Calibri" w:hAnsi="Calibri"/>
+          <w:color w:val="2E2E2E"/>
+          <w:sz w:val="21"/>
+          <w:szCs w:val="21"/>
+        </w:rPr>
+        <w:t xml:space="preserve">L’enveloppe porte votre nom et le nombre d’heures jouées.</w:t>
+      </w:r>
+    </w:p>
+    <w:p>
+      <w:pPr>
+        <w:pStyle w:val="ListParagraph"/>
+        <w:numPr>
+          <w:ilvl w:val="0"/>
+          <w:numId w:val="2"/>
+        </w:numPr>
+        <w:spacing w:after="60" w:line="264"/>
+      </w:pPr>
+      <w:r>
+        <w:rPr>
+          <w:rFonts w:ascii="Calibri" w:cs="Calibri" w:eastAsia="Calibri" w:hAnsi="Calibri"/>
+          <w:i/>
+          <w:iCs/>
+          <w:color w:val="6E6E6E"/>
+          <w:sz w:val="20"/>
+          <w:szCs w:val="20"/>
+        </w:rPr>
+        <w:t xml:space="preserve">À compléter : procédure de réservation des terrains pour les cours privés</w:t>
+      </w:r>
+    </w:p>
+    <w:p>
+      <w:pPr>
+        <w:pStyle w:val="ListParagraph"/>
+        <w:numPr>
+          <w:ilvl w:val="0"/>
+          <w:numId w:val="2"/>
+        </w:numPr>
+        <w:spacing w:after="60" w:line="264"/>
+      </w:pPr>
+      <w:r>
+        <w:rPr>
+          <w:rFonts w:ascii="Calibri" w:cs="Calibri" w:eastAsia="Calibri" w:hAnsi="Calibri"/>
+          <w:i/>
+          <w:iCs/>
+          <w:color w:val="6E6E6E"/>
+          <w:sz w:val="20"/>
+          <w:szCs w:val="20"/>
+        </w:rPr>
+        <w:t xml:space="preserve">À compléter : chacun communique son tarif horaire pour la saison</w:t>
+      </w:r>
+    </w:p>
+    <w:p>
+      <w:pPr>
+        <w:keepNext/>
+        <w:pBdr>
+          <w:bottom w:val="single" w:color="8A9E28" w:sz="8" w:space="4"/>
+        </w:pBdr>
+        <w:spacing w:after="140" w:before="320"/>
+      </w:pPr>
+      <w:r>
+        <w:rPr>
+          <w:rFonts w:ascii="Calibri" w:cs="Calibri" w:eastAsia="Calibri" w:hAnsi="Calibri"/>
+          <w:b/>
+          <w:bCs/>
+          <w:color w:val="8A9E28"/>
+          <w:sz w:val="26"/>
+          <w:szCs w:val="26"/>
+        </w:rPr>
+        <w:t xml:space="preserve">13. </w:t>
+      </w:r>
+      <w:r>
+        <w:rPr>
+          <w:rFonts w:ascii="Calibri" w:cs="Calibri" w:eastAsia="Calibri" w:hAnsi="Calibri"/>
+          <w:b/>
+          <w:bCs/>
+          <w:color w:val="C0392B"/>
+          <w:sz w:val="26"/>
+          <w:szCs w:val="26"/>
+        </w:rPr>
+        <w:t xml:space="preserve">Assurances et responsabilité</w:t>
+      </w:r>
+    </w:p>
+    <w:p>
+      <w:pPr>
+        <w:spacing w:after="120" w:before="0" w:line="276"/>
+      </w:pPr>
+      <w:r>
+        <w:rPr>
+          <w:rFonts w:ascii="Calibri" w:cs="Calibri" w:eastAsia="Calibri" w:hAnsi="Calibri"/>
+          <w:i/>
+          <w:iCs/>
+          <w:color w:val="6E6E6E"/>
+          <w:sz w:val="20"/>
+          <w:szCs w:val="20"/>
+        </w:rPr>
+        <w:t xml:space="preserve">Point resté ouvert l’an dernier. Nous le clôturons cette année.</w:t>
+      </w:r>
+    </w:p>
+    <w:p>
+      <w:pPr>
+        <w:pStyle w:val="ListParagraph"/>
+        <w:numPr>
+          <w:ilvl w:val="0"/>
+          <w:numId w:val="2"/>
+        </w:numPr>
+        <w:spacing w:after="60" w:line="264"/>
+      </w:pPr>
+      <w:r>
+        <w:rPr>
+          <w:rFonts w:ascii="Calibri" w:cs="Calibri" w:eastAsia="Calibri" w:hAnsi="Calibri"/>
+          <w:color w:val="2E2E2E"/>
+          <w:sz w:val="21"/>
+          <w:szCs w:val="21"/>
+        </w:rPr>
+        <w:t xml:space="preserve">Vérification de la responsabilité civile de chaque moniteur.</w:t>
+      </w:r>
+    </w:p>
+    <w:p>
+      <w:pPr>
+        <w:pStyle w:val="ListParagraph"/>
+        <w:numPr>
+          <w:ilvl w:val="0"/>
+          <w:numId w:val="2"/>
+        </w:numPr>
+        <w:spacing w:after="60" w:line="264"/>
+      </w:pPr>
+      <w:r>
+        <w:rPr>
+          <w:rFonts w:ascii="Calibri" w:cs="Calibri" w:eastAsia="Calibri" w:hAnsi="Calibri"/>
+          <w:color w:val="2E2E2E"/>
+          <w:sz w:val="21"/>
+          <w:szCs w:val="21"/>
+        </w:rPr>
+        <w:t xml:space="preserve">Une assurance individuelle est-elle obligatoire, ou la couverture du club suffit-elle ?</w:t>
+      </w:r>
+    </w:p>
+    <w:p>
+      <w:pPr>
+        <w:pStyle w:val="ListParagraph"/>
+        <w:numPr>
+          <w:ilvl w:val="0"/>
+          <w:numId w:val="2"/>
+        </w:numPr>
+        <w:spacing w:after="60" w:line="264"/>
+      </w:pPr>
+      <w:r>
+        <w:rPr>
+          <w:rFonts w:ascii="Calibri" w:cs="Calibri" w:eastAsia="Calibri" w:hAnsi="Calibri"/>
+          <w:b/>
+          <w:bCs/>
+          <w:color w:val="2E2E2E"/>
+          <w:sz w:val="21"/>
+          <w:szCs w:val="21"/>
+        </w:rPr>
+        <w:t xml:space="preserve">Qui a la responsabilité des enfants lorsque le cours se termine ?</w:t>
+      </w:r>
+      <w:r>
+        <w:rPr>
+          <w:rFonts w:ascii="Calibri" w:cs="Calibri" w:eastAsia="Calibri" w:hAnsi="Calibri"/>
+          <w:color w:val="2E2E2E"/>
+          <w:sz w:val="21"/>
+          <w:szCs w:val="21"/>
+        </w:rPr>
+        <w:t xml:space="preserve"> Jusqu’à quel moment, et jusqu’où ?</w:t>
+      </w:r>
+    </w:p>
+    <w:p>
+      <w:pPr>
+        <w:pStyle w:val="ListParagraph"/>
+        <w:numPr>
+          <w:ilvl w:val="0"/>
+          <w:numId w:val="2"/>
+        </w:numPr>
+        <w:spacing w:after="60" w:line="264"/>
+      </w:pPr>
+      <w:r>
+        <w:rPr>
+          <w:rFonts w:ascii="Calibri" w:cs="Calibri" w:eastAsia="Calibri" w:hAnsi="Calibri"/>
+          <w:i/>
+          <w:iCs/>
+          <w:color w:val="6E6E6E"/>
+          <w:sz w:val="20"/>
+          <w:szCs w:val="20"/>
+        </w:rPr>
+        <w:t xml:space="preserve">À compléter : réponse obtenue auprès de la fédération / de l’assureur du club</w:t>
+      </w:r>
+    </w:p>
+    <w:p>
+      <w:pPr>
+        <w:pStyle w:val="ListParagraph"/>
+        <w:numPr>
+          <w:ilvl w:val="0"/>
+          <w:numId w:val="2"/>
+        </w:numPr>
+        <w:spacing w:after="60" w:line="264"/>
+      </w:pPr>
+      <w:r>
+        <w:rPr>
+          <w:rFonts w:ascii="Calibri" w:cs="Calibri" w:eastAsia="Calibri" w:hAnsi="Calibri"/>
+          <w:i/>
+          <w:iCs/>
+          <w:color w:val="6E6E6E"/>
+          <w:sz w:val="20"/>
+          <w:szCs w:val="20"/>
+        </w:rPr>
+        <w:t xml:space="preserve">À compléter : document à faire signer par chaque moniteur, le cas échéant</w:t>
+      </w:r>
+    </w:p>
+    <w:p>
+      <w:pPr>
+        <w:keepNext/>
+        <w:pBdr>
+          <w:bottom w:val="single" w:color="8A9E28" w:sz="8" w:space="4"/>
+        </w:pBdr>
+        <w:spacing w:after="140" w:before="320"/>
+      </w:pPr>
+      <w:r>
+        <w:rPr>
+          <w:rFonts w:ascii="Calibri" w:cs="Calibri" w:eastAsia="Calibri" w:hAnsi="Calibri"/>
+          <w:b/>
+          <w:bCs/>
+          <w:color w:val="8A9E28"/>
+          <w:sz w:val="26"/>
+          <w:szCs w:val="26"/>
+        </w:rPr>
+        <w:t xml:space="preserve">14. </w:t>
+      </w:r>
+      <w:r>
+        <w:rPr>
+          <w:rFonts w:ascii="Calibri" w:cs="Calibri" w:eastAsia="Calibri" w:hAnsi="Calibri"/>
+          <w:b/>
+          <w:bCs/>
+          <w:color w:val="C0392B"/>
+          <w:sz w:val="26"/>
+          <w:szCs w:val="26"/>
+        </w:rPr>
+        <w:t xml:space="preserve">Programme pédagogique</w:t>
+      </w:r>
+    </w:p>
+    <w:p>
+      <w:pPr>
+        <w:spacing w:after="120" w:before="0" w:line="276"/>
+      </w:pPr>
+      <w:r>
+        <w:rPr>
+          <w:rFonts w:ascii="Calibri" w:cs="Calibri" w:eastAsia="Calibri" w:hAnsi="Calibri"/>
+          <w:color w:val="2E2E2E"/>
+          <w:sz w:val="21"/>
+          <w:szCs w:val="21"/>
+        </w:rPr>
+        <w:t xml:space="preserve">Nous parcourons ensemble le document « Thèmes des cours », qui donne la trame pédagogique de la saison par niveau.</w:t>
+      </w:r>
+    </w:p>
+    <w:p>
+      <w:pPr>
+        <w:pStyle w:val="ListParagraph"/>
+        <w:numPr>
+          <w:ilvl w:val="0"/>
+          <w:numId w:val="2"/>
+        </w:numPr>
+        <w:spacing w:after="60" w:line="264"/>
+      </w:pPr>
+      <w:r>
+        <w:rPr>
+          <w:rFonts w:ascii="Calibri" w:cs="Calibri" w:eastAsia="Calibri" w:hAnsi="Calibri"/>
+          <w:i/>
+          <w:iCs/>
+          <w:color w:val="6E6E6E"/>
+          <w:sz w:val="20"/>
+          <w:szCs w:val="20"/>
+        </w:rPr>
+        <w:t xml:space="preserve">À compléter : joindre le document « Thèmes des cours » en annexe</w:t>
+      </w:r>
+    </w:p>
+    <w:p>
+      <w:pPr>
+        <w:keepNext/>
+        <w:pBdr>
+          <w:bottom w:val="single" w:color="8A9E28" w:sz="8" w:space="4"/>
+        </w:pBdr>
+        <w:spacing w:after="140" w:before="320"/>
+      </w:pPr>
+      <w:r>
+        <w:rPr>
+          <w:rFonts w:ascii="Calibri" w:cs="Calibri" w:eastAsia="Calibri" w:hAnsi="Calibri"/>
+          <w:b/>
+          <w:bCs/>
+          <w:color w:val="8A9E28"/>
+          <w:sz w:val="26"/>
+          <w:szCs w:val="26"/>
+        </w:rPr>
+        <w:t xml:space="preserve">15. </w:t>
+      </w:r>
+      <w:r>
+        <w:rPr>
+          <w:rFonts w:ascii="Calibri" w:cs="Calibri" w:eastAsia="Calibri" w:hAnsi="Calibri"/>
+          <w:b/>
+          <w:bCs/>
+          <w:color w:val="C0392B"/>
+          <w:sz w:val="26"/>
+          <w:szCs w:val="26"/>
+        </w:rPr>
+        <w:t xml:space="preserve">Remarques, suggestions, tour de table</w:t>
+      </w:r>
+    </w:p>
+    <w:p>
+      <w:pPr>
+        <w:spacing w:after="120" w:before="0" w:line="276"/>
+      </w:pPr>
+      <w:r>
+        <w:rPr>
+          <w:rFonts w:ascii="Calibri" w:cs="Calibri" w:eastAsia="Calibri" w:hAnsi="Calibri"/>
+          <w:color w:val="2E2E2E"/>
+          <w:sz w:val="21"/>
+          <w:szCs w:val="21"/>
+        </w:rPr>
+        <w:t xml:space="preserve">La parole est à vous. Questions, propositions, difficultés rencontrées l’an dernier : c’est le moment.</w:t>
+      </w:r>
+    </w:p>
+    <w:p>
+      <w:pPr>
+        <w:keepNext/>
+        <w:pBdr>
+          <w:bottom w:val="single" w:color="8A9E28" w:sz="8" w:space="4"/>
+        </w:pBdr>
+        <w:spacing w:after="140" w:before="320"/>
+      </w:pPr>
+      <w:r>
+        <w:rPr>
+          <w:rFonts w:ascii="Calibri" w:cs="Calibri" w:eastAsia="Calibri" w:hAnsi="Calibri"/>
+          <w:b/>
+          <w:bCs/>
+          <w:color w:val="8A9E28"/>
+          <w:sz w:val="26"/>
+          <w:szCs w:val="26"/>
+        </w:rPr>
+        <w:t xml:space="preserve">16. </w:t>
+      </w:r>
+      <w:r>
+        <w:rPr>
+          <w:rFonts w:ascii="Calibri" w:cs="Calibri" w:eastAsia="Calibri" w:hAnsi="Calibri"/>
+          <w:b/>
+          <w:bCs/>
+          <w:color w:val="C0392B"/>
+          <w:sz w:val="26"/>
+          <w:szCs w:val="26"/>
+        </w:rPr>
+        <w:t xml:space="preserve">Programmes, terrains et listes d’élèves</w:t>
+      </w:r>
+    </w:p>
+    <w:tbl>
+      <w:tblPr>
+        <w:tblW w:type="dxa" w:w="9637"/>
+        <w:tblBorders>
+          <w:top w:val="single" w:color="8A9E28" w:sz="6"/>
+          <w:left w:val="single" w:color="C0392B" w:sz="24"/>
+          <w:bottom w:val="single" w:color="8A9E28" w:sz="6"/>
+          <w:right w:val="single" w:color="8A9E28" w:sz="6"/>
+          <w:insideH w:val="none" w:color="FFFFFF" w:sz="0"/>
+          <w:insideV w:val="none" w:color="FFFFFF" w:sz="0"/>
+        </w:tblBorders>
+      </w:tblPr>
+      <w:tblGrid>
+        <w:gridCol w:w="9637"/>
+      </w:tblGrid>
+      <w:tr>
+        <w:tc>
+          <w:tcPr>
+            <w:tcW w:type="dxa" w:w="9637"/>
+            <w:shd w:fill="F4F6EA" w:color="auto" w:val="clear"/>
+            <w:tcMar>
+              <w:top w:type="dxa" w:w="170"/>
+              <w:left w:type="dxa" w:w="226"/>
+              <w:bottom w:type="dxa" w:w="170"/>
+              <w:right w:type="dxa" w:w="226"/>
+            </w:tcMar>
+          </w:tcPr>
+          <w:p>
+            <w:pPr>
+              <w:spacing w:after="80" w:before="0" w:line="276"/>
+            </w:pPr>
+            <w:r>
+              <w:rPr>
+                <w:rFonts w:ascii="Calibri" w:cs="Calibri" w:eastAsia="Calibri" w:hAnsi="Calibri"/>
+                <w:b/>
+                <w:bCs/>
+                <w:color w:val="C0392B"/>
+                <w:sz w:val="22"/>
+                <w:szCs w:val="22"/>
+              </w:rPr>
+              <w:t xml:space="preserve">ATTENTION – LES TERRAINS ONT CHANGÉ.</w:t>
+            </w:r>
+          </w:p>
+          <w:p>
+            <w:pPr>
+              <w:spacing w:after="80" w:before="0" w:line="276"/>
+            </w:pPr>
+            <w:r>
+              <w:rPr>
+                <w:rFonts w:ascii="Calibri" w:cs="Calibri" w:eastAsia="Calibri" w:hAnsi="Calibri"/>
+                <w:color w:val="2E2E2E"/>
+                <w:sz w:val="21"/>
+                <w:szCs w:val="21"/>
+              </w:rPr>
+              <w:t xml:space="preserve">Vérifiez votre affectation avant chaque cours : ce n’est plus celle de l’an dernier.</w:t>
+            </w:r>
+          </w:p>
+          <w:p>
+            <w:pPr>
+              <w:spacing w:after="0" w:before="0" w:line="276"/>
+            </w:pPr>
+            <w:r>
+              <w:rPr>
+                <w:rFonts w:ascii="Calibri" w:cs="Calibri" w:eastAsia="Calibri" w:hAnsi="Calibri"/>
+                <w:b/>
+                <w:bCs/>
+                <w:color w:val="2E2E2E"/>
+                <w:sz w:val="21"/>
+                <w:szCs w:val="21"/>
+              </w:rPr>
+              <w:t xml:space="preserve">N’utilisez QUE la dernière version du programme que je vous envoie.</w:t>
+            </w:r>
+          </w:p>
+        </w:tc>
+      </w:tr>
+    </w:tbl>
+    <w:p>
+      <w:pPr>
+        <w:spacing w:after="120" w:before="0" w:line="276"/>
+      </w:pPr>
+      <w:r>
+        <w:rPr>
+          <w:rFonts w:ascii="Calibri" w:cs="Calibri" w:eastAsia="Calibri" w:hAnsi="Calibri"/>
+          <w:color w:val="2E2E2E"/>
+          <w:sz w:val="21"/>
+          <w:szCs w:val="21"/>
+        </w:rPr>
+        <w:t xml:space="preserve"/>
+      </w:r>
+    </w:p>
+    <w:p>
+      <w:pPr>
+        <w:pStyle w:val="ListParagraph"/>
+        <w:numPr>
+          <w:ilvl w:val="0"/>
+          <w:numId w:val="2"/>
+        </w:numPr>
+        <w:spacing w:after="60" w:line="264"/>
+      </w:pPr>
+      <w:r>
+        <w:rPr>
+          <w:rFonts w:ascii="Calibri" w:cs="Calibri" w:eastAsia="Calibri" w:hAnsi="Calibri"/>
+          <w:color w:val="2E2E2E"/>
+          <w:sz w:val="21"/>
+          <w:szCs w:val="21"/>
+        </w:rPr>
+        <w:t xml:space="preserve">Les listes d’élèves peuvent encore bouger jusqu’au dernier moment : arrivées, départs, changements de groupe.</w:t>
+      </w:r>
+    </w:p>
+    <w:p>
+      <w:pPr>
+        <w:pStyle w:val="ListParagraph"/>
+        <w:numPr>
+          <w:ilvl w:val="0"/>
+          <w:numId w:val="2"/>
+        </w:numPr>
+        <w:spacing w:after="60" w:line="264"/>
+      </w:pPr>
+      <w:r>
+        <w:rPr>
+          <w:rFonts w:ascii="Calibri" w:cs="Calibri" w:eastAsia="Calibri" w:hAnsi="Calibri"/>
+          <w:color w:val="2E2E2E"/>
+          <w:sz w:val="21"/>
+          <w:szCs w:val="21"/>
+        </w:rPr>
+        <w:t xml:space="preserve">Une mise à jour est envoyée chaque matin, avant le début des cours.</w:t>
+      </w:r>
+    </w:p>
+    <w:p>
+      <w:pPr>
+        <w:pStyle w:val="ListParagraph"/>
+        <w:numPr>
+          <w:ilvl w:val="0"/>
+          <w:numId w:val="2"/>
+        </w:numPr>
+        <w:spacing w:after="60" w:line="264"/>
+      </w:pPr>
+      <w:r>
+        <w:rPr>
+          <w:rFonts w:ascii="Calibri" w:cs="Calibri" w:eastAsia="Calibri" w:hAnsi="Calibri"/>
+          <w:color w:val="2E2E2E"/>
+          <w:sz w:val="21"/>
+          <w:szCs w:val="21"/>
+        </w:rPr>
+        <w:t xml:space="preserve">Une ancienne version = un élève qui attend sur le mauvais terrain. Supprimez les anciennes.</w:t>
+      </w:r>
+    </w:p>
+    <w:p>
+      <w:pPr>
+        <w:pStyle w:val="ListParagraph"/>
+        <w:numPr>
+          <w:ilvl w:val="0"/>
+          <w:numId w:val="2"/>
+        </w:numPr>
+        <w:spacing w:after="60" w:line="264"/>
+      </w:pPr>
+      <w:r>
+        <w:rPr>
+          <w:rFonts w:ascii="Calibri" w:cs="Calibri" w:eastAsia="Calibri" w:hAnsi="Calibri"/>
+          <w:i/>
+          <w:iCs/>
+          <w:color w:val="6E6E6E"/>
+          <w:sz w:val="20"/>
+          <w:szCs w:val="20"/>
+        </w:rPr>
+        <w:t xml:space="preserve">À compléter : préciser le canal d’envoi des mises à jour (e-mail, WhatsApp, autre)</w:t>
+      </w:r>
+    </w:p>
+    <w:p>
+      <w:pPr>
+        <w:spacing w:after="200" w:before="0" w:line="276"/>
+      </w:pPr>
+      <w:r>
+        <w:rPr>
+          <w:rFonts w:ascii="Calibri" w:cs="Calibri" w:eastAsia="Calibri" w:hAnsi="Calibri"/>
+          <w:color w:val="2E2E2E"/>
+          <w:sz w:val="21"/>
+          <w:szCs w:val="21"/>
+        </w:rPr>
+        <w:t xml:space="preserve"/>
+      </w:r>
+    </w:p>
+    <w:p>
+      <w:pPr>
+        <w:keepNext/>
+        <w:pBdr>
+          <w:bottom w:val="single" w:color="8A9E28" w:sz="8" w:space="4"/>
+        </w:pBdr>
+        <w:spacing w:after="140" w:before="320"/>
+      </w:pPr>
+      <w:r>
+        <w:rPr>
+          <w:rFonts w:ascii="Calibri" w:cs="Calibri" w:eastAsia="Calibri" w:hAnsi="Calibri"/>
+          <w:b/>
+          <w:bCs/>
+          <w:color w:val="C0392B"/>
+          <w:sz w:val="26"/>
+          <w:szCs w:val="26"/>
+        </w:rPr>
         <w:t xml:space="preserve">Et pour finir : le repas</w:t>
       </w:r>
     </w:p>
@@ -5121,6 +5242,344 @@
           <w:szCs w:val="21"/>
         </w:rPr>
         <w:t xml:space="preserve">La réunion se termine autour d’un repas. Bonne saison à toutes et à tous !</w:t>
+      </w:r>
+    </w:p>
+    <w:p>
+      <w:r>
+        <w:br w:type="page"/>
+      </w:r>
+    </w:p>
+    <w:p>
+      <w:pPr>
+        <w:keepNext/>
+        <w:pBdr>
+          <w:bottom w:val="single" w:color="8A9E28" w:sz="8" w:space="4"/>
+        </w:pBdr>
+        <w:spacing w:after="140" w:before="320"/>
+      </w:pPr>
+      <w:r>
+        <w:rPr>
+          <w:rFonts w:ascii="Calibri" w:cs="Calibri" w:eastAsia="Calibri" w:hAnsi="Calibri"/>
+          <w:b/>
+          <w:bCs/>
+          <w:color w:val="C0392B"/>
+          <w:sz w:val="26"/>
+          <w:szCs w:val="26"/>
+        </w:rPr>
+        <w:t xml:space="preserve">Pour accord</w:t>
+      </w:r>
+    </w:p>
+    <w:p>
+      <w:pPr>
+        <w:spacing w:after="160" w:before="0" w:line="276"/>
+      </w:pPr>
+      <w:r>
+        <w:rPr>
+          <w:rFonts w:ascii="Calibri" w:cs="Calibri" w:eastAsia="Calibri" w:hAnsi="Calibri"/>
+          <w:color w:val="2E2E2E"/>
+          <w:sz w:val="21"/>
+          <w:szCs w:val="21"/>
+        </w:rPr>
+        <w:t xml:space="preserve">Les règles reprises dans ce document s’appliquent à l’ensemble des moniteurs de l’école de tennis pour la saison 2026-2027. Certaines d’entre elles prévoient des retenues sur facture, notamment au point 4 pour les balles et le matériel. Elles ne peuvent s’appliquer qu’avec votre accord écrit.</w:t>
+      </w:r>
+    </w:p>
+    <w:p>
+      <w:pPr>
+        <w:spacing w:after="260" w:before="0" w:line="276"/>
+      </w:pPr>
+      <w:r>
+        <w:rPr>
+          <w:rFonts w:ascii="Calibri" w:cs="Calibri" w:eastAsia="Calibri" w:hAnsi="Calibri"/>
+          <w:i/>
+          <w:iCs/>
+          <w:color w:val="6E6E6E"/>
+          <w:sz w:val="20"/>
+          <w:szCs w:val="20"/>
+        </w:rPr>
+        <w:t xml:space="preserve">Merci de compléter et de signer ce cadre, puis de remettre cette page à Thibault.</w:t>
+      </w:r>
+    </w:p>
+    <w:tbl>
+      <w:tblPr>
+        <w:tblW w:type="dxa" w:w="9637"/>
+        <w:tblBorders>
+          <w:top w:val="single" w:color="8A9E28" w:sz="6"/>
+          <w:left w:val="single" w:color="8A9E28" w:sz="6"/>
+          <w:bottom w:val="single" w:color="8A9E28" w:sz="6"/>
+          <w:right w:val="single" w:color="8A9E28" w:sz="6"/>
+          <w:insideH w:val="single" w:color="CCCCCC" w:sz="4"/>
+          <w:insideV w:val="single" w:color="CCCCCC" w:sz="4"/>
+        </w:tblBorders>
+      </w:tblPr>
+      <w:tblGrid>
+        <w:gridCol w:w="3118"/>
+        <w:gridCol w:w="6519"/>
+      </w:tblGrid>
+      <w:tr>
+        <w:tc>
+          <w:tcPr>
+            <w:tcW w:type="dxa" w:w="9637"/>
+            <w:gridSpan w:val="2"/>
+            <w:shd w:fill="F4F6EA" w:color="auto" w:val="clear"/>
+            <w:tcMar>
+              <w:top w:type="dxa" w:w="170"/>
+              <w:left w:type="dxa" w:w="226"/>
+              <w:bottom w:type="dxa" w:w="170"/>
+              <w:right w:type="dxa" w:w="226"/>
+            </w:tcMar>
+          </w:tcPr>
+          <w:p>
+            <w:pPr>
+              <w:spacing w:after="0" w:before="0" w:line="276"/>
+            </w:pPr>
+            <w:r>
+              <w:rPr>
+                <w:rFonts w:ascii="Calibri" w:cs="Calibri" w:eastAsia="Calibri" w:hAnsi="Calibri"/>
+                <w:color w:val="2E2E2E"/>
+                <w:sz w:val="20"/>
+                <w:szCs w:val="20"/>
+              </w:rPr>
+              <w:t xml:space="preserve">Je soussigné(e) déclare avoir pris connaissance des règles reprises dans ce document pour la saison 2026-2027 et en accepter les modalités, en ce compris les retenues sur facture qui y sont prévues.</w:t>
+            </w:r>
+          </w:p>
+        </w:tc>
+      </w:tr>
+      <w:tr>
+        <w:trPr>
+          <w:trHeight w:val="680" w:hRule="atLeast"/>
+        </w:trPr>
+        <w:tc>
+          <w:tcPr>
+            <w:tcW w:type="dxa" w:w="3118"/>
+            <w:shd w:fill="F7F7F5" w:color="auto" w:val="clear"/>
+            <w:tcMar>
+              <w:top w:type="dxa" w:w="170"/>
+              <w:left w:type="dxa" w:w="226"/>
+              <w:bottom w:type="dxa" w:w="170"/>
+              <w:right w:type="dxa" w:w="170"/>
+            </w:tcMar>
+            <w:vAlign w:val="center"/>
+          </w:tcPr>
+          <w:p>
+            <w:pPr>
+              <w:spacing w:after="0" w:before="0" w:line="276"/>
+            </w:pPr>
+            <w:r>
+              <w:rPr>
+                <w:rFonts w:ascii="Calibri" w:cs="Calibri" w:eastAsia="Calibri" w:hAnsi="Calibri"/>
+                <w:b/>
+                <w:bCs/>
+                <w:color w:val="2E2E2E"/>
+                <w:sz w:val="20"/>
+                <w:szCs w:val="20"/>
+              </w:rPr>
+              <w:t xml:space="preserve">Nom et prénom</w:t>
+            </w:r>
+          </w:p>
+        </w:tc>
+        <w:tc>
+          <w:tcPr>
+            <w:tcW w:type="dxa" w:w="6519"/>
+            <w:tcMar>
+              <w:top w:type="dxa" w:w="170"/>
+              <w:left w:type="dxa" w:w="226"/>
+              <w:bottom w:type="dxa" w:w="170"/>
+              <w:right w:type="dxa" w:w="170"/>
+            </w:tcMar>
+          </w:tcPr>
+          <w:p>
+            <w:pPr>
+              <w:spacing w:after="120" w:before="0" w:line="276"/>
+            </w:pPr>
+            <w:r>
+              <w:rPr>
+                <w:rFonts w:ascii="Calibri" w:cs="Calibri" w:eastAsia="Calibri" w:hAnsi="Calibri"/>
+                <w:color w:val="2E2E2E"/>
+                <w:sz w:val="21"/>
+                <w:szCs w:val="21"/>
+              </w:rPr>
+              <w:t xml:space="preserve"/>
+            </w:r>
+          </w:p>
+        </w:tc>
+      </w:tr>
+      <w:tr>
+        <w:trPr>
+          <w:trHeight w:val="680" w:hRule="atLeast"/>
+        </w:trPr>
+        <w:tc>
+          <w:tcPr>
+            <w:tcW w:type="dxa" w:w="3118"/>
+            <w:shd w:fill="F7F7F5" w:color="auto" w:val="clear"/>
+            <w:tcMar>
+              <w:top w:type="dxa" w:w="170"/>
+              <w:left w:type="dxa" w:w="226"/>
+              <w:bottom w:type="dxa" w:w="170"/>
+              <w:right w:type="dxa" w:w="170"/>
+            </w:tcMar>
+            <w:vAlign w:val="center"/>
+          </w:tcPr>
+          <w:p>
+            <w:pPr>
+              <w:spacing w:after="0" w:before="0" w:line="276"/>
+            </w:pPr>
+            <w:r>
+              <w:rPr>
+                <w:rFonts w:ascii="Calibri" w:cs="Calibri" w:eastAsia="Calibri" w:hAnsi="Calibri"/>
+                <w:b/>
+                <w:bCs/>
+                <w:color w:val="2E2E2E"/>
+                <w:sz w:val="20"/>
+                <w:szCs w:val="20"/>
+              </w:rPr>
+              <w:t xml:space="preserve">Date</w:t>
+            </w:r>
+          </w:p>
+        </w:tc>
+        <w:tc>
+          <w:tcPr>
+            <w:tcW w:type="dxa" w:w="6519"/>
+            <w:tcMar>
+              <w:top w:type="dxa" w:w="170"/>
+              <w:left w:type="dxa" w:w="226"/>
+              <w:bottom w:type="dxa" w:w="170"/>
+              <w:right w:type="dxa" w:w="170"/>
+            </w:tcMar>
+          </w:tcPr>
+          <w:p>
+            <w:pPr>
+              <w:spacing w:after="120" w:before="0" w:line="276"/>
+            </w:pPr>
+            <w:r>
+              <w:rPr>
+                <w:rFonts w:ascii="Calibri" w:cs="Calibri" w:eastAsia="Calibri" w:hAnsi="Calibri"/>
+                <w:color w:val="2E2E2E"/>
+                <w:sz w:val="21"/>
+                <w:szCs w:val="21"/>
+              </w:rPr>
+              <w:t xml:space="preserve"/>
+            </w:r>
+          </w:p>
+        </w:tc>
+      </w:tr>
+      <w:tr>
+        <w:trPr>
+          <w:trHeight w:val="1474" w:hRule="atLeast"/>
+        </w:trPr>
+        <w:tc>
+          <w:tcPr>
+            <w:tcW w:type="dxa" w:w="3118"/>
+            <w:shd w:fill="F7F7F5" w:color="auto" w:val="clear"/>
+            <w:tcMar>
+              <w:top w:type="dxa" w:w="170"/>
+              <w:left w:type="dxa" w:w="226"/>
+              <w:bottom w:type="dxa" w:w="170"/>
+              <w:right w:type="dxa" w:w="170"/>
+            </w:tcMar>
+            <w:vAlign w:val="center"/>
+          </w:tcPr>
+          <w:p>
+            <w:pPr>
+              <w:spacing w:after="0" w:before="0" w:line="276"/>
+            </w:pPr>
+            <w:r>
+              <w:rPr>
+                <w:rFonts w:ascii="Calibri" w:cs="Calibri" w:eastAsia="Calibri" w:hAnsi="Calibri"/>
+                <w:b/>
+                <w:bCs/>
+                <w:color w:val="2E2E2E"/>
+                <w:sz w:val="20"/>
+                <w:szCs w:val="20"/>
+              </w:rPr>
+              <w:t xml:space="preserve">Signature</w:t>
+            </w:r>
+          </w:p>
+        </w:tc>
+        <w:tc>
+          <w:tcPr>
+            <w:tcW w:type="dxa" w:w="6519"/>
+            <w:tcMar>
+              <w:top w:type="dxa" w:w="170"/>
+              <w:left w:type="dxa" w:w="226"/>
+              <w:bottom w:type="dxa" w:w="170"/>
+              <w:right w:type="dxa" w:w="170"/>
+            </w:tcMar>
+          </w:tcPr>
+          <w:p>
+            <w:pPr>
+              <w:spacing w:after="120" w:before="0" w:line="276"/>
+            </w:pPr>
+            <w:r>
+              <w:rPr>
+                <w:rFonts w:ascii="Calibri" w:cs="Calibri" w:eastAsia="Calibri" w:hAnsi="Calibri"/>
+                <w:color w:val="2E2E2E"/>
+                <w:sz w:val="21"/>
+                <w:szCs w:val="21"/>
+              </w:rPr>
+              <w:t xml:space="preserve"/>
+            </w:r>
+          </w:p>
+        </w:tc>
+      </w:tr>
+      <w:tr>
+        <w:tc>
+          <w:tcPr>
+            <w:tcW w:type="dxa" w:w="9637"/>
+            <w:gridSpan w:val="2"/>
+            <w:tcMar>
+              <w:top w:type="dxa" w:w="113"/>
+              <w:left w:type="dxa" w:w="226"/>
+              <w:bottom w:type="dxa" w:w="113"/>
+              <w:right w:type="dxa" w:w="226"/>
+            </w:tcMar>
+          </w:tcPr>
+          <w:p>
+            <w:pPr>
+              <w:spacing w:after="0" w:before="0" w:line="276"/>
+            </w:pPr>
+            <w:r>
+              <w:rPr>
+                <w:rFonts w:ascii="Calibri" w:cs="Calibri" w:eastAsia="Calibri" w:hAnsi="Calibri"/>
+                <w:i/>
+                <w:iCs/>
+                <w:color w:val="6E6E6E"/>
+                <w:sz w:val="17"/>
+                <w:szCs w:val="17"/>
+              </w:rPr>
+              <w:t xml:space="preserve">Signature à faire précéder de la mention manuscrite « lu et approuvé ».</w:t>
+            </w:r>
+          </w:p>
+        </w:tc>
+      </w:tr>
+    </w:tbl>
+    <w:p>
+      <w:pPr>
+        <w:spacing w:after="200" w:before="0" w:line="276"/>
+      </w:pPr>
+      <w:r>
+        <w:rPr>
+          <w:rFonts w:ascii="Calibri" w:cs="Calibri" w:eastAsia="Calibri" w:hAnsi="Calibri"/>
+          <w:color w:val="2E2E2E"/>
+          <w:sz w:val="21"/>
+          <w:szCs w:val="21"/>
+        </w:rPr>
+        <w:t xml:space="preserve"/>
+      </w:r>
+    </w:p>
+    <w:p>
+      <w:pPr>
+        <w:spacing w:after="120" w:before="0" w:line="276"/>
+      </w:pPr>
+      <w:r>
+        <w:rPr>
+          <w:rFonts w:ascii="Calibri" w:cs="Calibri" w:eastAsia="Calibri" w:hAnsi="Calibri"/>
+          <w:i/>
+          <w:iCs/>
+          <w:color w:val="6E6E6E"/>
+          <w:sz w:val="18"/>
+          <w:szCs w:val="18"/>
+        </w:rPr>
+        <w:t xml:space="preserve">Un exemplaire signé est conservé par l’école. Vous pouvez en demander une copie à tout moment.</w:t>
       </w:r>
     </w:p>
     <w:sectPr>

</xml_diff>

<commit_message>
Ajoute la liste des cours privés et intègre les corrections relues
Nouvelle feuille A4 paysage à faire circuler en réunion : une ligne par
moniteur, avec téléphone, niveau, âge, expérience, tarifs 1 et 2
personnes et signature valant accord de transmission.

Côté document de réunion : l'avertissement sur le kot passe au point 11,
les conditions de remboursement des formations sont précisées, la tenue
annonce des sanctions à venir, et les points 10 et 12 sont complétés.

Co-Authored-By: Claude Opus 5 <noreply@anthropic.com>
Claude-Session: https://claude.ai/code/session_01RsDkbcD3KwyPviDTcs72WZ
</commit_message>
<xml_diff>
--- a/Reunion_moniteurs_2026-2027.docx
+++ b/Reunion_moniteurs_2026-2027.docx
@@ -3917,16 +3917,144 @@
     </w:p>
     <w:p>
       <w:pPr>
-        <w:spacing w:after="100" w:before="0" w:line="276"/>
-      </w:pPr>
-      <w:r>
-        <w:rPr>
-          <w:rFonts w:ascii="Calibri" w:cs="Calibri" w:eastAsia="Calibri" w:hAnsi="Calibri"/>
-          <w:color w:val="2E2E2E"/>
-          <w:sz w:val="21"/>
-          <w:szCs w:val="21"/>
-        </w:rPr>
-        <w:t xml:space="preserve"/>
+        <w:keepNext/>
+        <w:pBdr>
+          <w:bottom w:val="single" w:color="8A9E28" w:sz="8" w:space="4"/>
+        </w:pBdr>
+        <w:spacing w:after="140" w:before="320"/>
+      </w:pPr>
+      <w:r>
+        <w:rPr>
+          <w:rFonts w:ascii="Calibri" w:cs="Calibri" w:eastAsia="Calibri" w:hAnsi="Calibri"/>
+          <w:b/>
+          <w:bCs/>
+          <w:color w:val="8A9E28"/>
+          <w:sz w:val="26"/>
+          <w:szCs w:val="26"/>
+        </w:rPr>
+        <w:t xml:space="preserve">8. </w:t>
+      </w:r>
+      <w:r>
+        <w:rPr>
+          <w:rFonts w:ascii="Calibri" w:cs="Calibri" w:eastAsia="Calibri" w:hAnsi="Calibri"/>
+          <w:b/>
+          <w:bCs/>
+          <w:color w:val="C0392B"/>
+          <w:sz w:val="26"/>
+          <w:szCs w:val="26"/>
+        </w:rPr>
+        <w:t xml:space="preserve">Formations</w:t>
+      </w:r>
+    </w:p>
+    <w:p>
+      <w:pPr>
+        <w:pStyle w:val="ListParagraph"/>
+        <w:numPr>
+          <w:ilvl w:val="0"/>
+          <w:numId w:val="2"/>
+        </w:numPr>
+        <w:spacing w:after="60" w:line="264"/>
+      </w:pPr>
+      <w:r>
+        <w:rPr>
+          <w:rFonts w:ascii="Calibri" w:cs="Calibri" w:eastAsia="Calibri" w:hAnsi="Calibri"/>
+          <w:color w:val="2E2E2E"/>
+          <w:sz w:val="21"/>
+          <w:szCs w:val="21"/>
+        </w:rPr>
+        <w:t xml:space="preserve">Le club rembourse la formation </w:t>
+      </w:r>
+      <w:r>
+        <w:rPr>
+          <w:rFonts w:ascii="Calibri" w:cs="Calibri" w:eastAsia="Calibri" w:hAnsi="Calibri"/>
+          <w:b/>
+          <w:bCs/>
+          <w:color w:val="2E2E2E"/>
+          <w:sz w:val="21"/>
+          <w:szCs w:val="21"/>
+        </w:rPr>
+        <w:t xml:space="preserve">si elle est réussie</w:t>
+      </w:r>
+      <w:r>
+        <w:rPr>
+          <w:rFonts w:ascii="Calibri" w:cs="Calibri" w:eastAsia="Calibri" w:hAnsi="Calibri"/>
+          <w:color w:val="2E2E2E"/>
+          <w:sz w:val="21"/>
+          <w:szCs w:val="21"/>
+        </w:rPr>
+        <w:t xml:space="preserve">. La hausse salariale suit l’obtention du niveau, une fois la formation </w:t>
+      </w:r>
+      <w:r>
+        <w:rPr>
+          <w:rFonts w:ascii="Calibri" w:cs="Calibri" w:eastAsia="Calibri" w:hAnsi="Calibri"/>
+          <w:b/>
+          <w:bCs/>
+          <w:color w:val="2E2E2E"/>
+          <w:sz w:val="21"/>
+          <w:szCs w:val="21"/>
+        </w:rPr>
+        <w:t xml:space="preserve">entièrement terminée — donc après le stage</w:t>
+      </w:r>
+      <w:r>
+        <w:rPr>
+          <w:rFonts w:ascii="Calibri" w:cs="Calibri" w:eastAsia="Calibri" w:hAnsi="Calibri"/>
+          <w:color w:val="2E2E2E"/>
+          <w:sz w:val="21"/>
+          <w:szCs w:val="21"/>
+        </w:rPr>
+        <w:t xml:space="preserve">.</w:t>
+      </w:r>
+    </w:p>
+    <w:p>
+      <w:pPr>
+        <w:pStyle w:val="ListParagraph"/>
+        <w:numPr>
+          <w:ilvl w:val="0"/>
+          <w:numId w:val="2"/>
+        </w:numPr>
+        <w:spacing w:after="60" w:line="264"/>
+      </w:pPr>
+      <w:r>
+        <w:rPr>
+          <w:rFonts w:ascii="Calibri" w:cs="Calibri" w:eastAsia="Calibri" w:hAnsi="Calibri"/>
+          <w:b/>
+          <w:bCs/>
+          <w:color w:val="C0392B"/>
+          <w:sz w:val="21"/>
+          <w:szCs w:val="21"/>
+        </w:rPr>
+        <w:t xml:space="preserve">Question posée à chacun : qui s’engage à faire son niveau 1 cette saison ?</w:t>
+      </w:r>
+    </w:p>
+    <w:p>
+      <w:pPr>
+        <w:keepNext/>
+        <w:pBdr>
+          <w:bottom w:val="single" w:color="8A9E28" w:sz="8" w:space="4"/>
+        </w:pBdr>
+        <w:spacing w:after="140" w:before="320"/>
+      </w:pPr>
+      <w:r>
+        <w:rPr>
+          <w:rFonts w:ascii="Calibri" w:cs="Calibri" w:eastAsia="Calibri" w:hAnsi="Calibri"/>
+          <w:b/>
+          <w:bCs/>
+          <w:color w:val="8A9E28"/>
+          <w:sz w:val="26"/>
+          <w:szCs w:val="26"/>
+        </w:rPr>
+        <w:t xml:space="preserve">9. </w:t>
+      </w:r>
+      <w:r>
+        <w:rPr>
+          <w:rFonts w:ascii="Calibri" w:cs="Calibri" w:eastAsia="Calibri" w:hAnsi="Calibri"/>
+          <w:b/>
+          <w:bCs/>
+          <w:color w:val="C0392B"/>
+          <w:sz w:val="26"/>
+          <w:szCs w:val="26"/>
+        </w:rPr>
+        <w:t xml:space="preserve">Tenue vestimentaire et savoir-être</w:t>
       </w:r>
     </w:p>
     <w:tbl>
@@ -3969,7 +4097,7 @@
                 <w:sz w:val="22"/>
                 <w:szCs w:val="22"/>
               </w:rPr>
-              <w:t xml:space="preserve">Un avertissement, pas encore une sanction.</w:t>
+              <w:t xml:space="preserve">La tenue suivante est OBLIGATOIRE à chaque cours.</w:t>
             </w:r>
           </w:p>
           <w:p>
@@ -3983,7 +4111,7 @@
                 <w:sz w:val="21"/>
                 <w:szCs w:val="21"/>
               </w:rPr>
-              <w:t xml:space="preserve">Le rangement du kot est le point qui a le plus dérapé ces dernières saisons. Si rien ne change, nous mettrons en place un système de constats : rappel nominatif, puis retenue forfaitaire sur facture, puis retrait de la clé.</w:t>
+              <w:t xml:space="preserve">Tenue Babolat ou vêtements à l’effigie du club. Pas d’exception, pas d’oubli.</w:t>
             </w:r>
           </w:p>
           <w:p>
@@ -3999,7 +4127,7 @@
                 <w:sz w:val="21"/>
                 <w:szCs w:val="21"/>
               </w:rPr>
-              <w:t xml:space="preserve">Rien de cela n’est appliqué aujourd’hui. C’est à nous tous de faire que ce ne soit jamais nécessaire.</w:t>
+              <w:t xml:space="preserve">Comme pour le respect du matériel, des sanctions sont prévues à l’avenir en cas de non-respect.</w:t>
             </w:r>
           </w:p>
         </w:tc>
@@ -4007,7 +4135,7 @@
     </w:tbl>
     <w:p>
       <w:pPr>
-        <w:spacing w:after="140" w:before="0" w:line="276"/>
+        <w:spacing w:after="120" w:before="0" w:line="276"/>
       </w:pPr>
       <w:r>
         <w:rPr>
@@ -4017,6 +4145,97 @@
           <w:szCs w:val="21"/>
         </w:rPr>
         <w:t xml:space="preserve"/>
+      </w:r>
+    </w:p>
+    <w:p>
+      <w:pPr>
+        <w:keepNext/>
+        <w:spacing w:after="60" w:before="140"/>
+      </w:pPr>
+      <w:r>
+        <w:rPr>
+          <w:rFonts w:ascii="Calibri" w:cs="Calibri" w:eastAsia="Calibri" w:hAnsi="Calibri"/>
+          <w:b/>
+          <w:bCs/>
+          <w:color w:val="8A9E28"/>
+          <w:sz w:val="21"/>
+          <w:szCs w:val="21"/>
+        </w:rPr>
+        <w:t xml:space="preserve">Les raquettes</w:t>
+      </w:r>
+    </w:p>
+    <w:p>
+      <w:pPr>
+        <w:pStyle w:val="ListParagraph"/>
+        <w:numPr>
+          <w:ilvl w:val="0"/>
+          <w:numId w:val="2"/>
+        </w:numPr>
+        <w:spacing w:after="60" w:line="264"/>
+      </w:pPr>
+      <w:r>
+        <w:rPr>
+          <w:rFonts w:ascii="Calibri" w:cs="Calibri" w:eastAsia="Calibri" w:hAnsi="Calibri"/>
+          <w:color w:val="2E2E2E"/>
+          <w:sz w:val="21"/>
+          <w:szCs w:val="21"/>
+        </w:rPr>
+        <w:t xml:space="preserve">Les raquettes qui se trouvent dans le kot sont réservées aux élèves. Elles ne sont pas là pour vous dépanner.</w:t>
+      </w:r>
+    </w:p>
+    <w:p>
+      <w:pPr>
+        <w:keepNext/>
+        <w:spacing w:after="60" w:before="140"/>
+      </w:pPr>
+      <w:r>
+        <w:rPr>
+          <w:rFonts w:ascii="Calibri" w:cs="Calibri" w:eastAsia="Calibri" w:hAnsi="Calibri"/>
+          <w:b/>
+          <w:bCs/>
+          <w:color w:val="8A9E28"/>
+          <w:sz w:val="21"/>
+          <w:szCs w:val="21"/>
+        </w:rPr>
+        <w:t xml:space="preserve">Le savoir-être</w:t>
+      </w:r>
+    </w:p>
+    <w:p>
+      <w:pPr>
+        <w:pStyle w:val="ListParagraph"/>
+        <w:numPr>
+          <w:ilvl w:val="0"/>
+          <w:numId w:val="2"/>
+        </w:numPr>
+        <w:spacing w:after="60" w:line="264"/>
+      </w:pPr>
+      <w:r>
+        <w:rPr>
+          <w:rFonts w:ascii="Calibri" w:cs="Calibri" w:eastAsia="Calibri" w:hAnsi="Calibri"/>
+          <w:color w:val="2E2E2E"/>
+          <w:sz w:val="21"/>
+          <w:szCs w:val="21"/>
+        </w:rPr>
+        <w:t xml:space="preserve">Vocabulaire et attitude corrects avec les élèves, les parents et les membres du club.</w:t>
+      </w:r>
+    </w:p>
+    <w:p>
+      <w:pPr>
+        <w:pStyle w:val="ListParagraph"/>
+        <w:numPr>
+          <w:ilvl w:val="0"/>
+          <w:numId w:val="2"/>
+        </w:numPr>
+        <w:spacing w:after="60" w:line="264"/>
+      </w:pPr>
+      <w:r>
+        <w:rPr>
+          <w:rFonts w:ascii="Calibri" w:cs="Calibri" w:eastAsia="Calibri" w:hAnsi="Calibri"/>
+          <w:color w:val="2E2E2E"/>
+          <w:sz w:val="21"/>
+          <w:szCs w:val="21"/>
+        </w:rPr>
+        <w:t xml:space="preserve">Vous représentez le club dès que vous franchissez la grille, pas seulement pendant votre heure de cours.</w:t>
       </w:r>
     </w:p>
     <w:p>
@@ -4036,7 +4255,7 @@
           <w:sz w:val="26"/>
           <w:szCs w:val="26"/>
         </w:rPr>
-        <w:t xml:space="preserve">8. </w:t>
+        <w:t xml:space="preserve">10. </w:t>
       </w:r>
       <w:r>
         <w:rPr>
@@ -4047,110 +4266,83 @@
           <w:sz w:val="26"/>
           <w:szCs w:val="26"/>
         </w:rPr>
-        <w:t xml:space="preserve">Formations</w:t>
-      </w:r>
-    </w:p>
-    <w:p>
-      <w:pPr>
-        <w:pStyle w:val="ListParagraph"/>
-        <w:numPr>
-          <w:ilvl w:val="0"/>
-          <w:numId w:val="2"/>
-        </w:numPr>
-        <w:spacing w:after="60" w:line="264"/>
-      </w:pPr>
-      <w:r>
-        <w:rPr>
-          <w:rFonts w:ascii="Calibri" w:cs="Calibri" w:eastAsia="Calibri" w:hAnsi="Calibri"/>
-          <w:color w:val="2E2E2E"/>
-          <w:sz w:val="21"/>
-          <w:szCs w:val="21"/>
-        </w:rPr>
-        <w:t xml:space="preserve">Le club rembourse la formation et une hausse salariale suit l’obtention du niveau.</w:t>
-      </w:r>
-    </w:p>
-    <w:p>
-      <w:pPr>
-        <w:pStyle w:val="ListParagraph"/>
-        <w:numPr>
-          <w:ilvl w:val="0"/>
-          <w:numId w:val="2"/>
-        </w:numPr>
-        <w:spacing w:after="60" w:line="264"/>
-      </w:pPr>
-      <w:r>
-        <w:rPr>
-          <w:rFonts w:ascii="Calibri" w:cs="Calibri" w:eastAsia="Calibri" w:hAnsi="Calibri"/>
-          <w:b/>
-          <w:bCs/>
-          <w:color w:val="C0392B"/>
-          <w:sz w:val="21"/>
-          <w:szCs w:val="21"/>
-        </w:rPr>
-        <w:t xml:space="preserve">Question posée à chacun : qui s’engage à faire son niveau 1 cette saison ?</w:t>
-      </w:r>
-    </w:p>
-    <w:p>
-      <w:pPr>
-        <w:pStyle w:val="ListParagraph"/>
-        <w:numPr>
-          <w:ilvl w:val="0"/>
-          <w:numId w:val="2"/>
-        </w:numPr>
-        <w:spacing w:after="60" w:line="264"/>
-      </w:pPr>
-      <w:r>
-        <w:rPr>
-          <w:rFonts w:ascii="Calibri" w:cs="Calibri" w:eastAsia="Calibri" w:hAnsi="Calibri"/>
-          <w:i/>
-          <w:iCs/>
-          <w:color w:val="6E6E6E"/>
-          <w:sz w:val="20"/>
-          <w:szCs w:val="20"/>
-        </w:rPr>
-        <w:t xml:space="preserve">À compléter : conditions exactes du remboursement (avance, remboursement après réussite, engagement de durée)</w:t>
-      </w:r>
-    </w:p>
-    <w:p>
-      <w:pPr>
-        <w:pStyle w:val="ListParagraph"/>
-        <w:numPr>
-          <w:ilvl w:val="0"/>
-          <w:numId w:val="2"/>
-        </w:numPr>
-        <w:spacing w:after="60" w:line="264"/>
-      </w:pPr>
-      <w:r>
-        <w:rPr>
-          <w:rFonts w:ascii="Calibri" w:cs="Calibri" w:eastAsia="Calibri" w:hAnsi="Calibri"/>
-          <w:i/>
-          <w:iCs/>
-          <w:color w:val="6E6E6E"/>
-          <w:sz w:val="20"/>
-          <w:szCs w:val="20"/>
-        </w:rPr>
-        <w:t xml:space="preserve">À compléter : barème salarial par niveau de formation</w:t>
-      </w:r>
-    </w:p>
-    <w:p>
-      <w:pPr>
-        <w:pStyle w:val="ListParagraph"/>
-        <w:numPr>
-          <w:ilvl w:val="0"/>
-          <w:numId w:val="2"/>
-        </w:numPr>
-        <w:spacing w:after="60" w:line="264"/>
-      </w:pPr>
-      <w:r>
-        <w:rPr>
-          <w:rFonts w:ascii="Calibri" w:cs="Calibri" w:eastAsia="Calibri" w:hAnsi="Calibri"/>
-          <w:i/>
-          <w:iCs/>
-          <w:color w:val="6E6E6E"/>
-          <w:sz w:val="20"/>
-          <w:szCs w:val="20"/>
-        </w:rPr>
-        <w:t xml:space="preserve">À compléter : dates et lieux des sessions de formation</w:t>
+        <w:t xml:space="preserve">Esprit d’équipe</w:t>
+      </w:r>
+    </w:p>
+    <w:p>
+      <w:pPr>
+        <w:pStyle w:val="ListParagraph"/>
+        <w:numPr>
+          <w:ilvl w:val="0"/>
+          <w:numId w:val="2"/>
+        </w:numPr>
+        <w:spacing w:after="60" w:line="264"/>
+      </w:pPr>
+      <w:r>
+        <w:rPr>
+          <w:rFonts w:ascii="Calibri" w:cs="Calibri" w:eastAsia="Calibri" w:hAnsi="Calibri"/>
+          <w:color w:val="2E2E2E"/>
+          <w:sz w:val="21"/>
+          <w:szCs w:val="21"/>
+        </w:rPr>
+        <w:t xml:space="preserve">On se soutient : un collègue en difficulté sur un groupe, on l’aide.</w:t>
+      </w:r>
+    </w:p>
+    <w:p>
+      <w:pPr>
+        <w:pStyle w:val="ListParagraph"/>
+        <w:numPr>
+          <w:ilvl w:val="0"/>
+          <w:numId w:val="2"/>
+        </w:numPr>
+        <w:spacing w:after="60" w:line="264"/>
+      </w:pPr>
+      <w:r>
+        <w:rPr>
+          <w:rFonts w:ascii="Calibri" w:cs="Calibri" w:eastAsia="Calibri" w:hAnsi="Calibri"/>
+          <w:color w:val="2E2E2E"/>
+          <w:sz w:val="21"/>
+          <w:szCs w:val="21"/>
+        </w:rPr>
+        <w:t xml:space="preserve">On partage ce qui fonctionne : exercices, jeux, façons de gérer un groupe difficile.</w:t>
+      </w:r>
+    </w:p>
+    <w:p>
+      <w:pPr>
+        <w:pStyle w:val="ListParagraph"/>
+        <w:numPr>
+          <w:ilvl w:val="0"/>
+          <w:numId w:val="2"/>
+        </w:numPr>
+        <w:spacing w:after="60" w:line="264"/>
+      </w:pPr>
+      <w:r>
+        <w:rPr>
+          <w:rFonts w:ascii="Calibri" w:cs="Calibri" w:eastAsia="Calibri" w:hAnsi="Calibri"/>
+          <w:color w:val="2E2E2E"/>
+          <w:sz w:val="21"/>
+          <w:szCs w:val="21"/>
+        </w:rPr>
+        <w:t xml:space="preserve">Les désaccords se règlent entre nous, jamais devant les élèves ou les parents.</w:t>
+      </w:r>
+    </w:p>
+    <w:p>
+      <w:pPr>
+        <w:pStyle w:val="ListParagraph"/>
+        <w:numPr>
+          <w:ilvl w:val="0"/>
+          <w:numId w:val="2"/>
+        </w:numPr>
+        <w:spacing w:after="60" w:line="264"/>
+      </w:pPr>
+      <w:r>
+        <w:rPr>
+          <w:rFonts w:ascii="Calibri" w:cs="Calibri" w:eastAsia="Calibri" w:hAnsi="Calibri"/>
+          <w:color w:val="2E2E2E"/>
+          <w:sz w:val="21"/>
+          <w:szCs w:val="21"/>
+        </w:rPr>
+        <w:t xml:space="preserve">Un groupe WhatsApp est utilisé à cet effet.</w:t>
       </w:r>
     </w:p>
     <w:p>
@@ -4170,7 +4362,7 @@
           <w:sz w:val="26"/>
           <w:szCs w:val="26"/>
         </w:rPr>
-        <w:t xml:space="preserve">9. </w:t>
+        <w:t xml:space="preserve">11. </w:t>
       </w:r>
       <w:r>
         <w:rPr>
@@ -4181,7 +4373,108 @@
           <w:sz w:val="26"/>
           <w:szCs w:val="26"/>
         </w:rPr>
-        <w:t xml:space="preserve">Tenue vestimentaire et savoir-être</w:t>
+        <w:t xml:space="preserve">Le kot : ordre et accès</w:t>
+      </w:r>
+    </w:p>
+    <w:p>
+      <w:pPr>
+        <w:pStyle w:val="ListParagraph"/>
+        <w:numPr>
+          <w:ilvl w:val="0"/>
+          <w:numId w:val="2"/>
+        </w:numPr>
+        <w:spacing w:after="60" w:line="264"/>
+      </w:pPr>
+      <w:r>
+        <w:rPr>
+          <w:rFonts w:ascii="Calibri" w:cs="Calibri" w:eastAsia="Calibri" w:hAnsi="Calibri"/>
+          <w:color w:val="2E2E2E"/>
+          <w:sz w:val="21"/>
+          <w:szCs w:val="21"/>
+        </w:rPr>
+        <w:t xml:space="preserve">Rangement après chaque cours : paniers, cônes, filets, plots. Le kot se rend dans l’état où on l’a trouvé.</w:t>
+      </w:r>
+    </w:p>
+    <w:p>
+      <w:pPr>
+        <w:pStyle w:val="ListParagraph"/>
+        <w:numPr>
+          <w:ilvl w:val="0"/>
+          <w:numId w:val="2"/>
+        </w:numPr>
+        <w:spacing w:after="60" w:line="264"/>
+      </w:pPr>
+      <w:r>
+        <w:rPr>
+          <w:rFonts w:ascii="Calibri" w:cs="Calibri" w:eastAsia="Calibri" w:hAnsi="Calibri"/>
+          <w:color w:val="2E2E2E"/>
+          <w:sz w:val="21"/>
+          <w:szCs w:val="21"/>
+        </w:rPr>
+        <w:t xml:space="preserve">Pas d’affaires personnelles laissées sur place.</w:t>
+      </w:r>
+    </w:p>
+    <w:p>
+      <w:pPr>
+        <w:pStyle w:val="ListParagraph"/>
+        <w:numPr>
+          <w:ilvl w:val="0"/>
+          <w:numId w:val="2"/>
+        </w:numPr>
+        <w:spacing w:after="60" w:line="264"/>
+      </w:pPr>
+      <w:r>
+        <w:rPr>
+          <w:rFonts w:ascii="Calibri" w:cs="Calibri" w:eastAsia="Calibri" w:hAnsi="Calibri"/>
+          <w:b/>
+          <w:bCs/>
+          <w:color w:val="2E2E2E"/>
+          <w:sz w:val="21"/>
+          <w:szCs w:val="21"/>
+        </w:rPr>
+        <w:t xml:space="preserve">Chaque moniteur reçoit sa propre clé pour la saison. </w:t>
+      </w:r>
+      <w:r>
+        <w:rPr>
+          <w:rFonts w:ascii="Calibri" w:cs="Calibri" w:eastAsia="Calibri" w:hAnsi="Calibri"/>
+          <w:color w:val="2E2E2E"/>
+          <w:sz w:val="21"/>
+          <w:szCs w:val="21"/>
+        </w:rPr>
+        <w:t xml:space="preserve">Elle est nominative et se restitue en fin de saison.</w:t>
+      </w:r>
+    </w:p>
+    <w:p>
+      <w:pPr>
+        <w:pStyle w:val="ListParagraph"/>
+        <w:numPr>
+          <w:ilvl w:val="0"/>
+          <w:numId w:val="2"/>
+        </w:numPr>
+        <w:spacing w:after="60" w:line="264"/>
+      </w:pPr>
+      <w:r>
+        <w:rPr>
+          <w:rFonts w:ascii="Calibri" w:cs="Calibri" w:eastAsia="Calibri" w:hAnsi="Calibri"/>
+          <w:color w:val="2E2E2E"/>
+          <w:sz w:val="21"/>
+          <w:szCs w:val="21"/>
+        </w:rPr>
+        <w:t xml:space="preserve">Le matériel commun reste sous la responsabilité de tous : on le range après chaque cours.</w:t>
+      </w:r>
+    </w:p>
+    <w:p>
+      <w:pPr>
+        <w:spacing w:after="100" w:before="0" w:line="276"/>
+      </w:pPr>
+      <w:r>
+        <w:rPr>
+          <w:rFonts w:ascii="Calibri" w:cs="Calibri" w:eastAsia="Calibri" w:hAnsi="Calibri"/>
+          <w:color w:val="2E2E2E"/>
+          <w:sz w:val="21"/>
+          <w:szCs w:val="21"/>
+        </w:rPr>
+        <w:t xml:space="preserve"/>
       </w:r>
     </w:p>
     <w:tbl>
@@ -4224,12 +4517,12 @@
                 <w:sz w:val="22"/>
                 <w:szCs w:val="22"/>
               </w:rPr>
-              <w:t xml:space="preserve">La tenue est OBLIGATOIRE à chaque cours.</w:t>
-            </w:r>
-          </w:p>
-          <w:p>
-            <w:pPr>
-              <w:spacing w:after="0" w:before="0" w:line="276"/>
+              <w:t xml:space="preserve">Un avertissement, pas encore une sanction.</w:t>
+            </w:r>
+          </w:p>
+          <w:p>
+            <w:pPr>
+              <w:spacing w:after="80" w:before="0" w:line="276"/>
             </w:pPr>
             <w:r>
               <w:rPr>
@@ -4238,7 +4531,23 @@
                 <w:sz w:val="21"/>
                 <w:szCs w:val="21"/>
               </w:rPr>
-              <w:t xml:space="preserve">Tenue Babolat ou vêtements à l’effigie du club. Pas d’exception, pas d’oubli.</w:t>
+              <w:t xml:space="preserve">Le rangement du kot est le point qui a le plus dérapé ces dernières saisons. Si rien ne change, nous mettrons en place un système de constats : rappel nominatif, puis retenue forfaitaire sur facture, puis retrait de la clé.</w:t>
+            </w:r>
+          </w:p>
+          <w:p>
+            <w:pPr>
+              <w:spacing w:after="0" w:before="0" w:line="276"/>
+            </w:pPr>
+            <w:r>
+              <w:rPr>
+                <w:rFonts w:ascii="Calibri" w:cs="Calibri" w:eastAsia="Calibri" w:hAnsi="Calibri"/>
+                <w:b/>
+                <w:bCs/>
+                <w:color w:val="2E2E2E"/>
+                <w:sz w:val="21"/>
+                <w:szCs w:val="21"/>
+              </w:rPr>
+              <w:t xml:space="preserve">Rien de cela n’est appliqué aujourd’hui. C’est à nous tous de faire que ce ne soit jamais nécessaire.</w:t>
             </w:r>
           </w:p>
         </w:tc>
@@ -4246,7 +4555,7 @@
     </w:tbl>
     <w:p>
       <w:pPr>
-        <w:spacing w:after="120" w:before="0" w:line="276"/>
+        <w:spacing w:after="140" w:before="0" w:line="276"/>
       </w:pPr>
       <w:r>
         <w:rPr>
@@ -4256,97 +4565,6 @@
           <w:szCs w:val="21"/>
         </w:rPr>
         <w:t xml:space="preserve"/>
-      </w:r>
-    </w:p>
-    <w:p>
-      <w:pPr>
-        <w:keepNext/>
-        <w:spacing w:after="60" w:before="140"/>
-      </w:pPr>
-      <w:r>
-        <w:rPr>
-          <w:rFonts w:ascii="Calibri" w:cs="Calibri" w:eastAsia="Calibri" w:hAnsi="Calibri"/>
-          <w:b/>
-          <w:bCs/>
-          <w:color w:val="8A9E28"/>
-          <w:sz w:val="21"/>
-          <w:szCs w:val="21"/>
-        </w:rPr>
-        <w:t xml:space="preserve">Les raquettes</w:t>
-      </w:r>
-    </w:p>
-    <w:p>
-      <w:pPr>
-        <w:pStyle w:val="ListParagraph"/>
-        <w:numPr>
-          <w:ilvl w:val="0"/>
-          <w:numId w:val="2"/>
-        </w:numPr>
-        <w:spacing w:after="60" w:line="264"/>
-      </w:pPr>
-      <w:r>
-        <w:rPr>
-          <w:rFonts w:ascii="Calibri" w:cs="Calibri" w:eastAsia="Calibri" w:hAnsi="Calibri"/>
-          <w:color w:val="2E2E2E"/>
-          <w:sz w:val="21"/>
-          <w:szCs w:val="21"/>
-        </w:rPr>
-        <w:t xml:space="preserve">Les raquettes qui se trouvent dans le kot sont réservées aux élèves. Elles ne sont pas là pour vous dépanner.</w:t>
-      </w:r>
-    </w:p>
-    <w:p>
-      <w:pPr>
-        <w:keepNext/>
-        <w:spacing w:after="60" w:before="140"/>
-      </w:pPr>
-      <w:r>
-        <w:rPr>
-          <w:rFonts w:ascii="Calibri" w:cs="Calibri" w:eastAsia="Calibri" w:hAnsi="Calibri"/>
-          <w:b/>
-          <w:bCs/>
-          <w:color w:val="8A9E28"/>
-          <w:sz w:val="21"/>
-          <w:szCs w:val="21"/>
-        </w:rPr>
-        <w:t xml:space="preserve">Le savoir-être</w:t>
-      </w:r>
-    </w:p>
-    <w:p>
-      <w:pPr>
-        <w:pStyle w:val="ListParagraph"/>
-        <w:numPr>
-          <w:ilvl w:val="0"/>
-          <w:numId w:val="2"/>
-        </w:numPr>
-        <w:spacing w:after="60" w:line="264"/>
-      </w:pPr>
-      <w:r>
-        <w:rPr>
-          <w:rFonts w:ascii="Calibri" w:cs="Calibri" w:eastAsia="Calibri" w:hAnsi="Calibri"/>
-          <w:color w:val="2E2E2E"/>
-          <w:sz w:val="21"/>
-          <w:szCs w:val="21"/>
-        </w:rPr>
-        <w:t xml:space="preserve">Vocabulaire et attitude corrects avec les élèves, les parents et les membres du club.</w:t>
-      </w:r>
-    </w:p>
-    <w:p>
-      <w:pPr>
-        <w:pStyle w:val="ListParagraph"/>
-        <w:numPr>
-          <w:ilvl w:val="0"/>
-          <w:numId w:val="2"/>
-        </w:numPr>
-        <w:spacing w:after="60" w:line="264"/>
-      </w:pPr>
-      <w:r>
-        <w:rPr>
-          <w:rFonts w:ascii="Calibri" w:cs="Calibri" w:eastAsia="Calibri" w:hAnsi="Calibri"/>
-          <w:color w:val="2E2E2E"/>
-          <w:sz w:val="21"/>
-          <w:szCs w:val="21"/>
-        </w:rPr>
-        <w:t xml:space="preserve">Vous représentez le club dès que vous franchissez la grille, pas seulement pendant votre heure de cours.</w:t>
       </w:r>
     </w:p>
     <w:p>
@@ -4366,7 +4584,7 @@
           <w:sz w:val="26"/>
           <w:szCs w:val="26"/>
         </w:rPr>
-        <w:t xml:space="preserve">10. </w:t>
+        <w:t xml:space="preserve">12. </w:t>
       </w:r>
       <w:r>
         <w:rPr>
@@ -4377,233 +4595,6 @@
           <w:sz w:val="26"/>
           <w:szCs w:val="26"/>
         </w:rPr>
-        <w:t xml:space="preserve">Esprit d’équipe</w:t>
-      </w:r>
-    </w:p>
-    <w:p>
-      <w:pPr>
-        <w:pStyle w:val="ListParagraph"/>
-        <w:numPr>
-          <w:ilvl w:val="0"/>
-          <w:numId w:val="2"/>
-        </w:numPr>
-        <w:spacing w:after="60" w:line="264"/>
-      </w:pPr>
-      <w:r>
-        <w:rPr>
-          <w:rFonts w:ascii="Calibri" w:cs="Calibri" w:eastAsia="Calibri" w:hAnsi="Calibri"/>
-          <w:color w:val="2E2E2E"/>
-          <w:sz w:val="21"/>
-          <w:szCs w:val="21"/>
-        </w:rPr>
-        <w:t xml:space="preserve">On se soutient : un collègue en difficulté sur un groupe, on l’aide.</w:t>
-      </w:r>
-    </w:p>
-    <w:p>
-      <w:pPr>
-        <w:pStyle w:val="ListParagraph"/>
-        <w:numPr>
-          <w:ilvl w:val="0"/>
-          <w:numId w:val="2"/>
-        </w:numPr>
-        <w:spacing w:after="60" w:line="264"/>
-      </w:pPr>
-      <w:r>
-        <w:rPr>
-          <w:rFonts w:ascii="Calibri" w:cs="Calibri" w:eastAsia="Calibri" w:hAnsi="Calibri"/>
-          <w:color w:val="2E2E2E"/>
-          <w:sz w:val="21"/>
-          <w:szCs w:val="21"/>
-        </w:rPr>
-        <w:t xml:space="preserve">On partage ce qui fonctionne : exercices, jeux, façons de gérer un groupe difficile.</w:t>
-      </w:r>
-    </w:p>
-    <w:p>
-      <w:pPr>
-        <w:pStyle w:val="ListParagraph"/>
-        <w:numPr>
-          <w:ilvl w:val="0"/>
-          <w:numId w:val="2"/>
-        </w:numPr>
-        <w:spacing w:after="60" w:line="264"/>
-      </w:pPr>
-      <w:r>
-        <w:rPr>
-          <w:rFonts w:ascii="Calibri" w:cs="Calibri" w:eastAsia="Calibri" w:hAnsi="Calibri"/>
-          <w:color w:val="2E2E2E"/>
-          <w:sz w:val="21"/>
-          <w:szCs w:val="21"/>
-        </w:rPr>
-        <w:t xml:space="preserve">Les désaccords se règlent entre nous, jamais devant les élèves ou les parents.</w:t>
-      </w:r>
-    </w:p>
-    <w:p>
-      <w:pPr>
-        <w:pStyle w:val="ListParagraph"/>
-        <w:numPr>
-          <w:ilvl w:val="0"/>
-          <w:numId w:val="2"/>
-        </w:numPr>
-        <w:spacing w:after="60" w:line="264"/>
-      </w:pPr>
-      <w:r>
-        <w:rPr>
-          <w:rFonts w:ascii="Calibri" w:cs="Calibri" w:eastAsia="Calibri" w:hAnsi="Calibri"/>
-          <w:i/>
-          <w:iCs/>
-          <w:color w:val="6E6E6E"/>
-          <w:sz w:val="20"/>
-          <w:szCs w:val="20"/>
-        </w:rPr>
-        <w:t xml:space="preserve">À compléter : canal de communication de l’équipe pour la saison</w:t>
-      </w:r>
-    </w:p>
-    <w:p>
-      <w:pPr>
-        <w:keepNext/>
-        <w:pBdr>
-          <w:bottom w:val="single" w:color="8A9E28" w:sz="8" w:space="4"/>
-        </w:pBdr>
-        <w:spacing w:after="140" w:before="320"/>
-      </w:pPr>
-      <w:r>
-        <w:rPr>
-          <w:rFonts w:ascii="Calibri" w:cs="Calibri" w:eastAsia="Calibri" w:hAnsi="Calibri"/>
-          <w:b/>
-          <w:bCs/>
-          <w:color w:val="8A9E28"/>
-          <w:sz w:val="26"/>
-          <w:szCs w:val="26"/>
-        </w:rPr>
-        <w:t xml:space="preserve">11. </w:t>
-      </w:r>
-      <w:r>
-        <w:rPr>
-          <w:rFonts w:ascii="Calibri" w:cs="Calibri" w:eastAsia="Calibri" w:hAnsi="Calibri"/>
-          <w:b/>
-          <w:bCs/>
-          <w:color w:val="C0392B"/>
-          <w:sz w:val="26"/>
-          <w:szCs w:val="26"/>
-        </w:rPr>
-        <w:t xml:space="preserve">Le kot : ordre et accès</w:t>
-      </w:r>
-    </w:p>
-    <w:p>
-      <w:pPr>
-        <w:pStyle w:val="ListParagraph"/>
-        <w:numPr>
-          <w:ilvl w:val="0"/>
-          <w:numId w:val="2"/>
-        </w:numPr>
-        <w:spacing w:after="60" w:line="264"/>
-      </w:pPr>
-      <w:r>
-        <w:rPr>
-          <w:rFonts w:ascii="Calibri" w:cs="Calibri" w:eastAsia="Calibri" w:hAnsi="Calibri"/>
-          <w:color w:val="2E2E2E"/>
-          <w:sz w:val="21"/>
-          <w:szCs w:val="21"/>
-        </w:rPr>
-        <w:t xml:space="preserve">Rangement après chaque cours : paniers, cônes, filets, plots. Le kot se rend dans l’état où on l’a trouvé.</w:t>
-      </w:r>
-    </w:p>
-    <w:p>
-      <w:pPr>
-        <w:pStyle w:val="ListParagraph"/>
-        <w:numPr>
-          <w:ilvl w:val="0"/>
-          <w:numId w:val="2"/>
-        </w:numPr>
-        <w:spacing w:after="60" w:line="264"/>
-      </w:pPr>
-      <w:r>
-        <w:rPr>
-          <w:rFonts w:ascii="Calibri" w:cs="Calibri" w:eastAsia="Calibri" w:hAnsi="Calibri"/>
-          <w:color w:val="2E2E2E"/>
-          <w:sz w:val="21"/>
-          <w:szCs w:val="21"/>
-        </w:rPr>
-        <w:t xml:space="preserve">Pas d’affaires personnelles laissées sur place.</w:t>
-      </w:r>
-    </w:p>
-    <w:p>
-      <w:pPr>
-        <w:pStyle w:val="ListParagraph"/>
-        <w:numPr>
-          <w:ilvl w:val="0"/>
-          <w:numId w:val="2"/>
-        </w:numPr>
-        <w:spacing w:after="60" w:line="264"/>
-      </w:pPr>
-      <w:r>
-        <w:rPr>
-          <w:rFonts w:ascii="Calibri" w:cs="Calibri" w:eastAsia="Calibri" w:hAnsi="Calibri"/>
-          <w:b/>
-          <w:bCs/>
-          <w:color w:val="2E2E2E"/>
-          <w:sz w:val="21"/>
-          <w:szCs w:val="21"/>
-        </w:rPr>
-        <w:t xml:space="preserve">Chaque moniteur reçoit sa propre clé pour la saison. </w:t>
-      </w:r>
-      <w:r>
-        <w:rPr>
-          <w:rFonts w:ascii="Calibri" w:cs="Calibri" w:eastAsia="Calibri" w:hAnsi="Calibri"/>
-          <w:color w:val="2E2E2E"/>
-          <w:sz w:val="21"/>
-          <w:szCs w:val="21"/>
-        </w:rPr>
-        <w:t xml:space="preserve">Elle est nominative et se restitue en fin de saison.</w:t>
-      </w:r>
-    </w:p>
-    <w:p>
-      <w:pPr>
-        <w:pStyle w:val="ListParagraph"/>
-        <w:numPr>
-          <w:ilvl w:val="0"/>
-          <w:numId w:val="2"/>
-        </w:numPr>
-        <w:spacing w:after="60" w:line="264"/>
-      </w:pPr>
-      <w:r>
-        <w:rPr>
-          <w:rFonts w:ascii="Calibri" w:cs="Calibri" w:eastAsia="Calibri" w:hAnsi="Calibri"/>
-          <w:color w:val="2E2E2E"/>
-          <w:sz w:val="21"/>
-          <w:szCs w:val="21"/>
-        </w:rPr>
-        <w:t xml:space="preserve">Le matériel commun reste sous la responsabilité de tous : on le range après chaque cours.</w:t>
-      </w:r>
-    </w:p>
-    <w:p>
-      <w:pPr>
-        <w:keepNext/>
-        <w:pBdr>
-          <w:bottom w:val="single" w:color="8A9E28" w:sz="8" w:space="4"/>
-        </w:pBdr>
-        <w:spacing w:after="140" w:before="320"/>
-      </w:pPr>
-      <w:r>
-        <w:rPr>
-          <w:rFonts w:ascii="Calibri" w:cs="Calibri" w:eastAsia="Calibri" w:hAnsi="Calibri"/>
-          <w:b/>
-          <w:bCs/>
-          <w:color w:val="8A9E28"/>
-          <w:sz w:val="26"/>
-          <w:szCs w:val="26"/>
-        </w:rPr>
-        <w:t xml:space="preserve">12. </w:t>
-      </w:r>
-      <w:r>
-        <w:rPr>
-          <w:rFonts w:ascii="Calibri" w:cs="Calibri" w:eastAsia="Calibri" w:hAnsi="Calibri"/>
-          <w:b/>
-          <w:bCs/>
-          <w:color w:val="C0392B"/>
-          <w:sz w:val="26"/>
-          <w:szCs w:val="26"/>
-        </w:rPr>
         <w:t xml:space="preserve">Les cours privés</w:t>
       </w:r>
     </w:p>
@@ -4689,44 +4680,105 @@
     </w:p>
     <w:p>
       <w:pPr>
-        <w:pStyle w:val="ListParagraph"/>
-        <w:numPr>
-          <w:ilvl w:val="0"/>
-          <w:numId w:val="2"/>
-        </w:numPr>
-        <w:spacing w:after="60" w:line="264"/>
-      </w:pPr>
-      <w:r>
-        <w:rPr>
-          <w:rFonts w:ascii="Calibri" w:cs="Calibri" w:eastAsia="Calibri" w:hAnsi="Calibri"/>
-          <w:i/>
-          <w:iCs/>
-          <w:color w:val="6E6E6E"/>
-          <w:sz w:val="20"/>
-          <w:szCs w:val="20"/>
-        </w:rPr>
-        <w:t xml:space="preserve">À compléter : procédure de réservation des terrains pour les cours privés</w:t>
-      </w:r>
-    </w:p>
-    <w:p>
-      <w:pPr>
-        <w:pStyle w:val="ListParagraph"/>
-        <w:numPr>
-          <w:ilvl w:val="0"/>
-          <w:numId w:val="2"/>
-        </w:numPr>
-        <w:spacing w:after="60" w:line="264"/>
-      </w:pPr>
-      <w:r>
-        <w:rPr>
-          <w:rFonts w:ascii="Calibri" w:cs="Calibri" w:eastAsia="Calibri" w:hAnsi="Calibri"/>
-          <w:i/>
-          <w:iCs/>
-          <w:color w:val="6E6E6E"/>
-          <w:sz w:val="20"/>
-          <w:szCs w:val="20"/>
-        </w:rPr>
-        <w:t xml:space="preserve">À compléter : chacun communique son tarif horaire pour la saison</w:t>
+        <w:keepNext/>
+        <w:spacing w:after="60" w:before="140"/>
+      </w:pPr>
+      <w:r>
+        <w:rPr>
+          <w:rFonts w:ascii="Calibri" w:cs="Calibri" w:eastAsia="Calibri" w:hAnsi="Calibri"/>
+          <w:b/>
+          <w:bCs/>
+          <w:color w:val="8A9E28"/>
+          <w:sz w:val="21"/>
+          <w:szCs w:val="21"/>
+        </w:rPr>
+        <w:t xml:space="preserve">La réservation</w:t>
+      </w:r>
+    </w:p>
+    <w:p>
+      <w:pPr>
+        <w:pStyle w:val="ListParagraph"/>
+        <w:numPr>
+          <w:ilvl w:val="0"/>
+          <w:numId w:val="2"/>
+        </w:numPr>
+        <w:spacing w:after="60" w:line="264"/>
+      </w:pPr>
+      <w:r>
+        <w:rPr>
+          <w:rFonts w:ascii="Calibri" w:cs="Calibri" w:eastAsia="Calibri" w:hAnsi="Calibri"/>
+          <w:b/>
+          <w:bCs/>
+          <w:color w:val="2E2E2E"/>
+          <w:sz w:val="21"/>
+          <w:szCs w:val="21"/>
+        </w:rPr>
+        <w:t xml:space="preserve">Réservation de terrain : chez Marc. </w:t>
+      </w:r>
+      <w:r>
+        <w:rPr>
+          <w:rFonts w:ascii="Calibri" w:cs="Calibri" w:eastAsia="Calibri" w:hAnsi="Calibri"/>
+          <w:color w:val="2E2E2E"/>
+          <w:sz w:val="21"/>
+          <w:szCs w:val="21"/>
+        </w:rPr>
+        <w:t xml:space="preserve">Au printemps, précisez s’il s’agit d’un membre ou d’un non-membre.</w:t>
+      </w:r>
+    </w:p>
+    <w:p>
+      <w:pPr>
+        <w:keepNext/>
+        <w:spacing w:after="60" w:before="140"/>
+      </w:pPr>
+      <w:r>
+        <w:rPr>
+          <w:rFonts w:ascii="Calibri" w:cs="Calibri" w:eastAsia="Calibri" w:hAnsi="Calibri"/>
+          <w:b/>
+          <w:bCs/>
+          <w:color w:val="8A9E28"/>
+          <w:sz w:val="21"/>
+          <w:szCs w:val="21"/>
+        </w:rPr>
+        <w:t xml:space="preserve">Vos tarifs</w:t>
+      </w:r>
+    </w:p>
+    <w:p>
+      <w:pPr>
+        <w:pStyle w:val="ListParagraph"/>
+        <w:numPr>
+          <w:ilvl w:val="0"/>
+          <w:numId w:val="2"/>
+        </w:numPr>
+        <w:spacing w:after="60" w:line="264"/>
+      </w:pPr>
+      <w:r>
+        <w:rPr>
+          <w:rFonts w:ascii="Calibri" w:cs="Calibri" w:eastAsia="Calibri" w:hAnsi="Calibri"/>
+          <w:color w:val="2E2E2E"/>
+          <w:sz w:val="21"/>
+          <w:szCs w:val="21"/>
+        </w:rPr>
+        <w:t xml:space="preserve">Chacun communique son tarif horaire pour la saison sur la fiche </w:t>
+      </w:r>
+      <w:r>
+        <w:rPr>
+          <w:rFonts w:ascii="Calibri" w:cs="Calibri" w:eastAsia="Calibri" w:hAnsi="Calibri"/>
+          <w:b/>
+          <w:bCs/>
+          <w:color w:val="2E2E2E"/>
+          <w:sz w:val="21"/>
+          <w:szCs w:val="21"/>
+        </w:rPr>
+        <w:t xml:space="preserve">« Cours privés — liste des moniteurs »</w:t>
+      </w:r>
+      <w:r>
+        <w:rPr>
+          <w:rFonts w:ascii="Calibri" w:cs="Calibri" w:eastAsia="Calibri" w:hAnsi="Calibri"/>
+          <w:color w:val="2E2E2E"/>
+          <w:sz w:val="21"/>
+          <w:szCs w:val="21"/>
+        </w:rPr>
+        <w:t xml:space="preserve">, à compléter aujourd’hui.</w:t>
       </w:r>
     </w:p>
     <w:p>

</xml_diff>

<commit_message>
Supprime les sauts de page du point 4 et ajoute la règle des repas
Le point 4 s'enchaîne désormais après le point 3, et « Le nouveau
système » suit le constat sans rupture : le document passe de neuf à
huit pages. Ajoute au point 7 la consigne sur les repas pendant les
pauses.

Co-Authored-By: Claude Opus 5 <noreply@anthropic.com>
Claude-Session: https://claude.ai/code/session_01RsDkbcD3KwyPviDTcs72WZ
</commit_message>
<xml_diff>
--- a/Reunion_moniteurs_2026-2027.docx
+++ b/Reunion_moniteurs_2026-2027.docx
@@ -1580,11 +1580,6 @@
       </w:r>
     </w:p>
     <w:p>
-      <w:r>
-        <w:br w:type="page"/>
-      </w:r>
-    </w:p>
-    <w:p>
       <w:pPr>
         <w:keepNext/>
         <w:pBdr>
@@ -1824,11 +1819,6 @@
           <w:szCs w:val="22"/>
         </w:rPr>
         <w:t xml:space="preserve">Résultat : toujours la même négligence. Le système ne fonctionne pas.</w:t>
-      </w:r>
-    </w:p>
-    <w:p>
-      <w:r>
-        <w:br w:type="page"/>
       </w:r>
     </w:p>
     <w:p>
@@ -3781,6 +3771,36 @@
           <w:szCs w:val="21"/>
         </w:rPr>
         <w:t xml:space="preserve">Un cours qui déborde décale tout le monde.</w:t>
+      </w:r>
+    </w:p>
+    <w:p>
+      <w:pPr>
+        <w:pStyle w:val="ListParagraph"/>
+        <w:numPr>
+          <w:ilvl w:val="0"/>
+          <w:numId w:val="2"/>
+        </w:numPr>
+        <w:spacing w:after="60" w:line="264"/>
+      </w:pPr>
+      <w:r>
+        <w:rPr>
+          <w:rFonts w:ascii="Calibri" w:cs="Calibri" w:eastAsia="Calibri" w:hAnsi="Calibri"/>
+          <w:b/>
+          <w:bCs/>
+          <w:color w:val="2E2E2E"/>
+          <w:sz w:val="21"/>
+          <w:szCs w:val="21"/>
+        </w:rPr>
+        <w:t xml:space="preserve">Repas : </w:t>
+      </w:r>
+      <w:r>
+        <w:rPr>
+          <w:rFonts w:ascii="Calibri" w:cs="Calibri" w:eastAsia="Calibri" w:hAnsi="Calibri"/>
+          <w:color w:val="2E2E2E"/>
+          <w:sz w:val="21"/>
+          <w:szCs w:val="21"/>
+        </w:rPr>
+        <w:t xml:space="preserve">profitez de vos pauses pour manger. N’attendez pas que la pause soit terminée pour manger votre sandwich sur le terrain, que vous veniez d’avoir une pause ou que vous veniez de commencer.</w:t>
       </w:r>
     </w:p>
     <w:p>

</xml_diff>